<commit_message>
fixed a file igi_1.docx change by screenshots
</commit_message>
<xml_diff>
--- a/IGI/LR1/igi_1.docx
+++ b/IGI/LR1/igi_1.docx
@@ -70,23 +70,13 @@
         </w:rPr>
         <w:t>Цель</w:t>
       </w:r>
-      <w:proofErr w:type="gramStart"/>
-      <w:r>
-        <w:rPr>
-          <w:rFonts w:ascii="Times New Roman" w:hAnsi="Times New Roman" w:cs="Times New Roman"/>
-          <w:sz w:val="24"/>
-          <w:szCs w:val="24"/>
-        </w:rPr>
-        <w:t>: Познакомиться</w:t>
-      </w:r>
-      <w:proofErr w:type="gramEnd"/>
-      <w:r>
-        <w:rPr>
-          <w:rFonts w:ascii="Times New Roman" w:hAnsi="Times New Roman" w:cs="Times New Roman"/>
-          <w:sz w:val="24"/>
-          <w:szCs w:val="24"/>
-        </w:rPr>
-        <w:t xml:space="preserve"> с возможностями и получить практические навыки работы с системой контроля версий </w:t>
+      <w:r>
+        <w:rPr>
+          <w:rFonts w:ascii="Times New Roman" w:hAnsi="Times New Roman" w:cs="Times New Roman"/>
+          <w:sz w:val="24"/>
+          <w:szCs w:val="24"/>
+        </w:rPr>
+        <w:t xml:space="preserve">: Познакомиться с возможностями и получить практические навыки работы с системой контроля версий </w:t>
       </w:r>
       <w:r>
         <w:rPr>
@@ -187,50 +177,20 @@
           <w:szCs w:val="24"/>
           <w:shd w:val="clear" w:color="auto" w:fill="FFFFFF"/>
         </w:rPr>
-        <w:t xml:space="preserve">Подготовьте рабочее окружение в соответствии с типом вашей операционной </w:t>
-      </w:r>
-      <w:proofErr w:type="gramStart"/>
-      <w:r>
-        <w:rPr>
-          <w:rFonts w:ascii="Times New Roman" w:hAnsi="Times New Roman" w:cs="Times New Roman"/>
-          <w:i/>
-          <w:color w:val="252525"/>
-          <w:sz w:val="24"/>
-          <w:szCs w:val="24"/>
-          <w:shd w:val="clear" w:color="auto" w:fill="FFFFFF"/>
-        </w:rPr>
-        <w:t>системы(</w:t>
-      </w:r>
-      <w:proofErr w:type="gramEnd"/>
-      <w:r>
-        <w:fldChar w:fldCharType="begin"/>
-      </w:r>
-      <w:r>
-        <w:instrText xml:space="preserve"> HYPERLINK "https://smartiqa.ru/courses/git/lesson-1" </w:instrText>
-      </w:r>
-      <w:r>
-        <w:fldChar w:fldCharType="separate"/>
-      </w:r>
-      <w:r>
-        <w:rPr>
-          <w:rStyle w:val="a3"/>
-          <w:rFonts w:cs="Times New Roman"/>
-          <w:i/>
-          <w:sz w:val="24"/>
-          <w:shd w:val="clear" w:color="auto" w:fill="FFFFFF"/>
-        </w:rPr>
-        <w:t>https://smartiqa.ru/courses/git/lesson-1</w:t>
-      </w:r>
-      <w:r>
-        <w:rPr>
-          <w:rStyle w:val="a3"/>
-          <w:rFonts w:cs="Times New Roman"/>
-          <w:i/>
-          <w:sz w:val="24"/>
-          <w:shd w:val="clear" w:color="auto" w:fill="FFFFFF"/>
-        </w:rPr>
-        <w:fldChar w:fldCharType="end"/>
-      </w:r>
+        <w:t>Подготовьте рабочее окружение в соответствии с типом вашей операционной системы(</w:t>
+      </w:r>
+      <w:hyperlink r:id="rId5" w:history="1">
+        <w:r>
+          <w:rPr>
+            <w:rStyle w:val="a3"/>
+            <w:rFonts w:cs="Times New Roman"/>
+            <w:i/>
+            <w:sz w:val="24"/>
+            <w:shd w:val="clear" w:color="auto" w:fill="FFFFFF"/>
+          </w:rPr>
+          <w:t>https://smartiqa.ru/courses/git/lesson-1</w:t>
+        </w:r>
+      </w:hyperlink>
       <w:r>
         <w:rPr>
           <w:rFonts w:ascii="Times New Roman" w:hAnsi="Times New Roman" w:cs="Times New Roman"/>
@@ -266,20 +226,8 @@
           <w:szCs w:val="24"/>
           <w:shd w:val="clear" w:color="auto" w:fill="FFFFFF"/>
         </w:rPr>
-        <w:t xml:space="preserve">Установите </w:t>
-      </w:r>
-      <w:proofErr w:type="spellStart"/>
-      <w:r>
-        <w:rPr>
-          <w:rFonts w:ascii="Times New Roman" w:hAnsi="Times New Roman" w:cs="Times New Roman"/>
-          <w:color w:val="252525"/>
-          <w:sz w:val="24"/>
-          <w:szCs w:val="24"/>
-          <w:shd w:val="clear" w:color="auto" w:fill="FFFFFF"/>
-        </w:rPr>
-        <w:t>Git</w:t>
-      </w:r>
-      <w:proofErr w:type="spellEnd"/>
+        <w:t>Установите Git</w:t>
+      </w:r>
     </w:p>
     <w:p>
       <w:pPr>
@@ -317,7 +265,7 @@
                     </pic:cNvPicPr>
                   </pic:nvPicPr>
                   <pic:blipFill>
-                    <a:blip r:embed="rId5">
+                    <a:blip r:embed="rId6">
                       <a:extLst>
                         <a:ext uri="{28A0092B-C50C-407E-A947-70E740481C1C}">
                           <a14:useLocalDpi xmlns:a14="http://schemas.microsoft.com/office/drawing/2010/main" val="0"/>
@@ -411,7 +359,7 @@
                     </pic:cNvPicPr>
                   </pic:nvPicPr>
                   <pic:blipFill>
-                    <a:blip r:embed="rId6">
+                    <a:blip r:embed="rId7">
                       <a:extLst>
                         <a:ext uri="{28A0092B-C50C-407E-A947-70E740481C1C}">
                           <a14:useLocalDpi xmlns:a14="http://schemas.microsoft.com/office/drawing/2010/main" val="0"/>
@@ -539,7 +487,7 @@
                     </pic:cNvPicPr>
                   </pic:nvPicPr>
                   <pic:blipFill>
-                    <a:blip r:embed="rId7">
+                    <a:blip r:embed="rId8">
                       <a:extLst>
                         <a:ext uri="{28A0092B-C50C-407E-A947-70E740481C1C}">
                           <a14:useLocalDpi xmlns:a14="http://schemas.microsoft.com/office/drawing/2010/main" val="0"/>
@@ -607,7 +555,7 @@
                     </pic:cNvPicPr>
                   </pic:nvPicPr>
                   <pic:blipFill>
-                    <a:blip r:embed="rId8">
+                    <a:blip r:embed="rId9">
                       <a:extLst>
                         <a:ext uri="{28A0092B-C50C-407E-A947-70E740481C1C}">
                           <a14:useLocalDpi xmlns:a14="http://schemas.microsoft.com/office/drawing/2010/main" val="0"/>
@@ -666,7 +614,7 @@
                     </pic:cNvPicPr>
                   </pic:nvPicPr>
                   <pic:blipFill>
-                    <a:blip r:embed="rId9">
+                    <a:blip r:embed="rId10">
                       <a:extLst>
                         <a:ext uri="{28A0092B-C50C-407E-A947-70E740481C1C}">
                           <a14:useLocalDpi xmlns:a14="http://schemas.microsoft.com/office/drawing/2010/main" val="0"/>
@@ -725,7 +673,7 @@
                     </pic:cNvPicPr>
                   </pic:nvPicPr>
                   <pic:blipFill>
-                    <a:blip r:embed="rId10">
+                    <a:blip r:embed="rId11">
                       <a:extLst>
                         <a:ext uri="{28A0092B-C50C-407E-A947-70E740481C1C}">
                           <a14:useLocalDpi xmlns:a14="http://schemas.microsoft.com/office/drawing/2010/main" val="0"/>
@@ -785,7 +733,7 @@
                     </pic:cNvPicPr>
                   </pic:nvPicPr>
                   <pic:blipFill>
-                    <a:blip r:embed="rId11">
+                    <a:blip r:embed="rId12">
                       <a:extLst>
                         <a:ext uri="{28A0092B-C50C-407E-A947-70E740481C1C}">
                           <a14:useLocalDpi xmlns:a14="http://schemas.microsoft.com/office/drawing/2010/main" val="0"/>
@@ -932,7 +880,7 @@
                     </pic:cNvPicPr>
                   </pic:nvPicPr>
                   <pic:blipFill>
-                    <a:blip r:embed="rId12">
+                    <a:blip r:embed="rId13">
                       <a:extLst>
                         <a:ext uri="{28A0092B-C50C-407E-A947-70E740481C1C}">
                           <a14:useLocalDpi xmlns:a14="http://schemas.microsoft.com/office/drawing/2010/main" val="0"/>
@@ -1015,73 +963,7 @@
           <w:szCs w:val="24"/>
           <w:shd w:val="clear" w:color="auto" w:fill="FFFFFF"/>
         </w:rPr>
-        <w:t xml:space="preserve">сделайте индексацию нескольких файлов в вашем </w:t>
-      </w:r>
-      <w:proofErr w:type="spellStart"/>
-      <w:r>
-        <w:rPr>
-          <w:rFonts w:ascii="Times New Roman" w:hAnsi="Times New Roman" w:cs="Times New Roman"/>
-          <w:color w:val="252525"/>
-          <w:sz w:val="24"/>
-          <w:szCs w:val="24"/>
-          <w:shd w:val="clear" w:color="auto" w:fill="FFFFFF"/>
-        </w:rPr>
-        <w:t>Git</w:t>
-      </w:r>
-      <w:proofErr w:type="spellEnd"/>
-      <w:r>
-        <w:rPr>
-          <w:rFonts w:ascii="Times New Roman" w:hAnsi="Times New Roman" w:cs="Times New Roman"/>
-          <w:color w:val="252525"/>
-          <w:sz w:val="24"/>
-          <w:szCs w:val="24"/>
-          <w:shd w:val="clear" w:color="auto" w:fill="FFFFFF"/>
-        </w:rPr>
-        <w:t>-репозитории (</w:t>
-      </w:r>
-      <w:proofErr w:type="spellStart"/>
-      <w:r>
-        <w:rPr>
-          <w:rFonts w:ascii="Times New Roman" w:hAnsi="Times New Roman" w:cs="Times New Roman"/>
-          <w:color w:val="252525"/>
-          <w:sz w:val="24"/>
-          <w:szCs w:val="24"/>
-          <w:shd w:val="clear" w:color="auto" w:fill="FFFFFF"/>
-        </w:rPr>
-        <w:t>git</w:t>
-      </w:r>
-      <w:proofErr w:type="spellEnd"/>
-      <w:r>
-        <w:rPr>
-          <w:rFonts w:ascii="Times New Roman" w:hAnsi="Times New Roman" w:cs="Times New Roman"/>
-          <w:color w:val="252525"/>
-          <w:sz w:val="24"/>
-          <w:szCs w:val="24"/>
-          <w:shd w:val="clear" w:color="auto" w:fill="FFFFFF"/>
-        </w:rPr>
-        <w:t xml:space="preserve"> </w:t>
-      </w:r>
-      <w:proofErr w:type="spellStart"/>
-      <w:r>
-        <w:rPr>
-          <w:rFonts w:ascii="Times New Roman" w:hAnsi="Times New Roman" w:cs="Times New Roman"/>
-          <w:color w:val="252525"/>
-          <w:sz w:val="24"/>
-          <w:szCs w:val="24"/>
-          <w:shd w:val="clear" w:color="auto" w:fill="FFFFFF"/>
-        </w:rPr>
-        <w:t>add</w:t>
-      </w:r>
-      <w:proofErr w:type="spellEnd"/>
-      <w:r>
-        <w:rPr>
-          <w:rFonts w:ascii="Times New Roman" w:hAnsi="Times New Roman" w:cs="Times New Roman"/>
-          <w:color w:val="252525"/>
-          <w:sz w:val="24"/>
-          <w:szCs w:val="24"/>
-          <w:shd w:val="clear" w:color="auto" w:fill="FFFFFF"/>
-        </w:rPr>
-        <w:t xml:space="preserve"> …), </w:t>
+        <w:t xml:space="preserve">сделайте индексацию нескольких файлов в вашем Git-репозитории (git add …), </w:t>
       </w:r>
       <w:r>
         <w:rPr>
@@ -1105,7 +987,7 @@
                     </pic:cNvPicPr>
                   </pic:nvPicPr>
                   <pic:blipFill>
-                    <a:blip r:embed="rId13">
+                    <a:blip r:embed="rId14">
                       <a:extLst>
                         <a:ext uri="{28A0092B-C50C-407E-A947-70E740481C1C}">
                           <a14:useLocalDpi xmlns:a14="http://schemas.microsoft.com/office/drawing/2010/main" val="0"/>
@@ -1177,7 +1059,7 @@
                     </pic:cNvPicPr>
                   </pic:nvPicPr>
                   <pic:blipFill>
-                    <a:blip r:embed="rId14">
+                    <a:blip r:embed="rId15">
                       <a:extLst>
                         <a:ext uri="{28A0092B-C50C-407E-A947-70E740481C1C}">
                           <a14:useLocalDpi xmlns:a14="http://schemas.microsoft.com/office/drawing/2010/main" val="0"/>
@@ -1249,7 +1131,7 @@
                     </pic:cNvPicPr>
                   </pic:nvPicPr>
                   <pic:blipFill>
-                    <a:blip r:embed="rId15">
+                    <a:blip r:embed="rId16">
                       <a:extLst>
                         <a:ext uri="{28A0092B-C50C-407E-A947-70E740481C1C}">
                           <a14:useLocalDpi xmlns:a14="http://schemas.microsoft.com/office/drawing/2010/main" val="0"/>
@@ -1349,7 +1231,7 @@
                     </pic:cNvPicPr>
                   </pic:nvPicPr>
                   <pic:blipFill>
-                    <a:blip r:embed="rId16">
+                    <a:blip r:embed="rId17">
                       <a:extLst>
                         <a:ext uri="{28A0092B-C50C-407E-A947-70E740481C1C}">
                           <a14:useLocalDpi xmlns:a14="http://schemas.microsoft.com/office/drawing/2010/main" val="0"/>
@@ -1422,7 +1304,7 @@
                     </pic:cNvPicPr>
                   </pic:nvPicPr>
                   <pic:blipFill>
-                    <a:blip r:embed="rId17" cstate="print">
+                    <a:blip r:embed="rId18" cstate="print">
                       <a:extLst>
                         <a:ext uri="{28A0092B-C50C-407E-A947-70E740481C1C}">
                           <a14:useLocalDpi xmlns:a14="http://schemas.microsoft.com/office/drawing/2010/main" val="0"/>
@@ -1479,29 +1361,7 @@
           <w:szCs w:val="24"/>
           <w:shd w:val="clear" w:color="auto" w:fill="FFFFFF"/>
         </w:rPr>
-        <w:t xml:space="preserve">выполните коммиты к </w:t>
-      </w:r>
-      <w:proofErr w:type="gramStart"/>
-      <w:r>
-        <w:rPr>
-          <w:rFonts w:ascii="Times New Roman" w:hAnsi="Times New Roman" w:cs="Times New Roman"/>
-          <w:color w:val="252525"/>
-          <w:sz w:val="24"/>
-          <w:szCs w:val="24"/>
-          <w:shd w:val="clear" w:color="auto" w:fill="FFFFFF"/>
-        </w:rPr>
-        <w:t>проиндексированным  файлам</w:t>
-      </w:r>
-      <w:proofErr w:type="gramEnd"/>
-      <w:r>
-        <w:rPr>
-          <w:rFonts w:ascii="Times New Roman" w:hAnsi="Times New Roman" w:cs="Times New Roman"/>
-          <w:color w:val="252525"/>
-          <w:sz w:val="24"/>
-          <w:szCs w:val="24"/>
-          <w:shd w:val="clear" w:color="auto" w:fill="FFFFFF"/>
-        </w:rPr>
-        <w:t xml:space="preserve">, </w:t>
+        <w:t xml:space="preserve">выполните коммиты к проиндексированным  файлам, </w:t>
       </w:r>
     </w:p>
     <w:p>
@@ -1544,7 +1404,7 @@
                     </pic:cNvPicPr>
                   </pic:nvPicPr>
                   <pic:blipFill>
-                    <a:blip r:embed="rId18">
+                    <a:blip r:embed="rId19">
                       <a:extLst>
                         <a:ext uri="{28A0092B-C50C-407E-A947-70E740481C1C}">
                           <a14:useLocalDpi xmlns:a14="http://schemas.microsoft.com/office/drawing/2010/main" val="0"/>
@@ -1644,7 +1504,7 @@
                     </pic:cNvPicPr>
                   </pic:nvPicPr>
                   <pic:blipFill>
-                    <a:blip r:embed="rId19">
+                    <a:blip r:embed="rId20">
                       <a:extLst>
                         <a:ext uri="{28A0092B-C50C-407E-A947-70E740481C1C}">
                           <a14:useLocalDpi xmlns:a14="http://schemas.microsoft.com/office/drawing/2010/main" val="0"/>
@@ -1716,7 +1576,7 @@
                     </pic:cNvPicPr>
                   </pic:nvPicPr>
                   <pic:blipFill>
-                    <a:blip r:embed="rId20">
+                    <a:blip r:embed="rId21">
                       <a:extLst>
                         <a:ext uri="{28A0092B-C50C-407E-A947-70E740481C1C}">
                           <a14:useLocalDpi xmlns:a14="http://schemas.microsoft.com/office/drawing/2010/main" val="0"/>
@@ -1788,7 +1648,7 @@
                     </pic:cNvPicPr>
                   </pic:nvPicPr>
                   <pic:blipFill>
-                    <a:blip r:embed="rId21">
+                    <a:blip r:embed="rId22">
                       <a:extLst>
                         <a:ext uri="{28A0092B-C50C-407E-A947-70E740481C1C}">
                           <a14:useLocalDpi xmlns:a14="http://schemas.microsoft.com/office/drawing/2010/main" val="0"/>
@@ -1860,7 +1720,7 @@
                     </pic:cNvPicPr>
                   </pic:nvPicPr>
                   <pic:blipFill>
-                    <a:blip r:embed="rId22">
+                    <a:blip r:embed="rId23">
                       <a:extLst>
                         <a:ext uri="{28A0092B-C50C-407E-A947-70E740481C1C}">
                           <a14:useLocalDpi xmlns:a14="http://schemas.microsoft.com/office/drawing/2010/main" val="0"/>
@@ -1961,7 +1821,7 @@
                     </pic:cNvPicPr>
                   </pic:nvPicPr>
                   <pic:blipFill>
-                    <a:blip r:embed="rId23">
+                    <a:blip r:embed="rId24">
                       <a:extLst>
                         <a:ext uri="{28A0092B-C50C-407E-A947-70E740481C1C}">
                           <a14:useLocalDpi xmlns:a14="http://schemas.microsoft.com/office/drawing/2010/main" val="0"/>
@@ -2033,7 +1893,7 @@
                     </pic:cNvPicPr>
                   </pic:nvPicPr>
                   <pic:blipFill>
-                    <a:blip r:embed="rId24">
+                    <a:blip r:embed="rId25">
                       <a:extLst>
                         <a:ext uri="{28A0092B-C50C-407E-A947-70E740481C1C}">
                           <a14:useLocalDpi xmlns:a14="http://schemas.microsoft.com/office/drawing/2010/main" val="0"/>
@@ -2152,7 +2012,7 @@
                     <pic:cNvPicPr/>
                   </pic:nvPicPr>
                   <pic:blipFill>
-                    <a:blip r:embed="rId25"/>
+                    <a:blip r:embed="rId26"/>
                     <a:stretch>
                       <a:fillRect/>
                     </a:stretch>
@@ -2200,67 +2060,6 @@
             <wp:extent cx="4841875" cy="1622067"/>
             <wp:effectExtent l="0" t="0" r="0" b="0"/>
             <wp:docPr id="2" name="Рисунок 2"/>
-            <wp:cNvGraphicFramePr>
-              <a:graphicFrameLocks xmlns:a="http://schemas.openxmlformats.org/drawingml/2006/main" noChangeAspect="1"/>
-            </wp:cNvGraphicFramePr>
-            <a:graphic xmlns:a="http://schemas.openxmlformats.org/drawingml/2006/main">
-              <a:graphicData uri="http://schemas.openxmlformats.org/drawingml/2006/picture">
-                <pic:pic xmlns:pic="http://schemas.openxmlformats.org/drawingml/2006/picture">
-                  <pic:nvPicPr>
-                    <pic:cNvPr id="1" name=""/>
-                    <pic:cNvPicPr/>
-                  </pic:nvPicPr>
-                  <pic:blipFill>
-                    <a:blip r:embed="rId26"/>
-                    <a:stretch>
-                      <a:fillRect/>
-                    </a:stretch>
-                  </pic:blipFill>
-                  <pic:spPr>
-                    <a:xfrm>
-                      <a:off x="0" y="0"/>
-                      <a:ext cx="4860230" cy="1628216"/>
-                    </a:xfrm>
-                    <a:prstGeom prst="rect">
-                      <a:avLst/>
-                    </a:prstGeom>
-                  </pic:spPr>
-                </pic:pic>
-              </a:graphicData>
-            </a:graphic>
-          </wp:inline>
-        </w:drawing>
-      </w:r>
-    </w:p>
-    <w:p>
-      <w:pPr>
-        <w:pStyle w:val="a4"/>
-        <w:spacing w:after="0"/>
-        <w:ind w:left="0"/>
-        <w:rPr>
-          <w:rFonts w:ascii="Times New Roman" w:hAnsi="Times New Roman" w:cs="Times New Roman"/>
-          <w:color w:val="252525"/>
-          <w:sz w:val="24"/>
-          <w:szCs w:val="24"/>
-          <w:shd w:val="clear" w:color="auto" w:fill="FFFFFF"/>
-          <w:lang w:val="en-US"/>
-        </w:rPr>
-      </w:pPr>
-      <w:r>
-        <w:rPr>
-          <w:rFonts w:ascii="Times New Roman" w:hAnsi="Times New Roman" w:cs="Times New Roman"/>
-          <w:noProof/>
-          <w:color w:val="252525"/>
-          <w:sz w:val="24"/>
-          <w:szCs w:val="24"/>
-          <w:shd w:val="clear" w:color="auto" w:fill="FFFFFF"/>
-          <w:lang w:val="en-US"/>
-        </w:rPr>
-        <w:drawing>
-          <wp:inline distT="0" distB="0" distL="0" distR="0" wp14:anchorId="231875A5" wp14:editId="3E5E47BE">
-            <wp:extent cx="4868883" cy="2804227"/>
-            <wp:effectExtent l="0" t="0" r="8255" b="0"/>
-            <wp:docPr id="3" name="Рисунок 3"/>
             <wp:cNvGraphicFramePr>
               <a:graphicFrameLocks xmlns:a="http://schemas.openxmlformats.org/drawingml/2006/main" noChangeAspect="1"/>
             </wp:cNvGraphicFramePr>
@@ -2280,7 +2079,7 @@
                   <pic:spPr>
                     <a:xfrm>
                       <a:off x="0" y="0"/>
-                      <a:ext cx="4876137" cy="2808405"/>
+                      <a:ext cx="4860230" cy="1628216"/>
                     </a:xfrm>
                     <a:prstGeom prst="rect">
                       <a:avLst/>
@@ -2304,6 +2103,7 @@
           <w:sz w:val="24"/>
           <w:szCs w:val="24"/>
           <w:shd w:val="clear" w:color="auto" w:fill="FFFFFF"/>
+          <w:lang w:val="en-US"/>
         </w:rPr>
       </w:pPr>
       <w:r>
@@ -2314,13 +2114,13 @@
           <w:sz w:val="24"/>
           <w:szCs w:val="24"/>
           <w:shd w:val="clear" w:color="auto" w:fill="FFFFFF"/>
-        </w:rPr>
-        <w:lastRenderedPageBreak/>
+          <w:lang w:val="en-US"/>
+        </w:rPr>
         <w:drawing>
-          <wp:inline distT="0" distB="0" distL="0" distR="0" wp14:anchorId="0DFBD5C4" wp14:editId="571916B9">
-            <wp:extent cx="4910446" cy="2279644"/>
-            <wp:effectExtent l="0" t="0" r="5080" b="6985"/>
-            <wp:docPr id="6" name="Рисунок 6"/>
+          <wp:inline distT="0" distB="0" distL="0" distR="0" wp14:anchorId="231875A5" wp14:editId="3E5E47BE">
+            <wp:extent cx="4868883" cy="2804227"/>
+            <wp:effectExtent l="0" t="0" r="8255" b="0"/>
+            <wp:docPr id="3" name="Рисунок 3"/>
             <wp:cNvGraphicFramePr>
               <a:graphicFrameLocks xmlns:a="http://schemas.openxmlformats.org/drawingml/2006/main" noChangeAspect="1"/>
             </wp:cNvGraphicFramePr>
@@ -2340,7 +2140,7 @@
                   <pic:spPr>
                     <a:xfrm>
                       <a:off x="0" y="0"/>
-                      <a:ext cx="4924667" cy="2286246"/>
+                      <a:ext cx="4876137" cy="2808405"/>
                     </a:xfrm>
                     <a:prstGeom prst="rect">
                       <a:avLst/>
@@ -2366,20 +2166,6 @@
           <w:shd w:val="clear" w:color="auto" w:fill="FFFFFF"/>
         </w:rPr>
       </w:pPr>
-    </w:p>
-    <w:p>
-      <w:pPr>
-        <w:pStyle w:val="a4"/>
-        <w:spacing w:after="0"/>
-        <w:ind w:left="0"/>
-        <w:rPr>
-          <w:rFonts w:ascii="Times New Roman" w:hAnsi="Times New Roman" w:cs="Times New Roman"/>
-          <w:color w:val="252525"/>
-          <w:sz w:val="24"/>
-          <w:szCs w:val="24"/>
-          <w:shd w:val="clear" w:color="auto" w:fill="FFFFFF"/>
-        </w:rPr>
-      </w:pPr>
       <w:r>
         <w:rPr>
           <w:rFonts w:ascii="Times New Roman" w:hAnsi="Times New Roman" w:cs="Times New Roman"/>
@@ -2389,11 +2175,12 @@
           <w:szCs w:val="24"/>
           <w:shd w:val="clear" w:color="auto" w:fill="FFFFFF"/>
         </w:rPr>
+        <w:lastRenderedPageBreak/>
         <w:drawing>
-          <wp:inline distT="0" distB="0" distL="0" distR="0" wp14:anchorId="1ECB6972" wp14:editId="5A0B8D09">
-            <wp:extent cx="5940425" cy="3855720"/>
-            <wp:effectExtent l="0" t="0" r="3175" b="0"/>
-            <wp:docPr id="8" name="Рисунок 8"/>
+          <wp:inline distT="0" distB="0" distL="0" distR="0" wp14:anchorId="0DFBD5C4" wp14:editId="571916B9">
+            <wp:extent cx="4910446" cy="2279644"/>
+            <wp:effectExtent l="0" t="0" r="5080" b="6985"/>
+            <wp:docPr id="6" name="Рисунок 6"/>
             <wp:cNvGraphicFramePr>
               <a:graphicFrameLocks xmlns:a="http://schemas.openxmlformats.org/drawingml/2006/main" noChangeAspect="1"/>
             </wp:cNvGraphicFramePr>
@@ -2413,7 +2200,7 @@
                   <pic:spPr>
                     <a:xfrm>
                       <a:off x="0" y="0"/>
-                      <a:ext cx="5940425" cy="3855720"/>
+                      <a:ext cx="4924667" cy="2286246"/>
                     </a:xfrm>
                     <a:prstGeom prst="rect">
                       <a:avLst/>
@@ -2439,6 +2226,20 @@
           <w:shd w:val="clear" w:color="auto" w:fill="FFFFFF"/>
         </w:rPr>
       </w:pPr>
+    </w:p>
+    <w:p>
+      <w:pPr>
+        <w:pStyle w:val="a4"/>
+        <w:spacing w:after="0"/>
+        <w:ind w:left="0"/>
+        <w:rPr>
+          <w:rFonts w:ascii="Times New Roman" w:hAnsi="Times New Roman" w:cs="Times New Roman"/>
+          <w:color w:val="252525"/>
+          <w:sz w:val="24"/>
+          <w:szCs w:val="24"/>
+          <w:shd w:val="clear" w:color="auto" w:fill="FFFFFF"/>
+        </w:rPr>
+      </w:pPr>
       <w:r>
         <w:rPr>
           <w:rFonts w:ascii="Times New Roman" w:hAnsi="Times New Roman" w:cs="Times New Roman"/>
@@ -2448,12 +2249,11 @@
           <w:szCs w:val="24"/>
           <w:shd w:val="clear" w:color="auto" w:fill="FFFFFF"/>
         </w:rPr>
-        <w:lastRenderedPageBreak/>
         <w:drawing>
-          <wp:inline distT="0" distB="0" distL="0" distR="0" wp14:anchorId="7ED251EA" wp14:editId="76B1E676">
-            <wp:extent cx="5940425" cy="2978150"/>
+          <wp:inline distT="0" distB="0" distL="0" distR="0" wp14:anchorId="1ECB6972" wp14:editId="5A0B8D09">
+            <wp:extent cx="5940425" cy="3855720"/>
             <wp:effectExtent l="0" t="0" r="3175" b="0"/>
-            <wp:docPr id="31" name="Рисунок 31"/>
+            <wp:docPr id="8" name="Рисунок 8"/>
             <wp:cNvGraphicFramePr>
               <a:graphicFrameLocks xmlns:a="http://schemas.openxmlformats.org/drawingml/2006/main" noChangeAspect="1"/>
             </wp:cNvGraphicFramePr>
@@ -2473,7 +2273,7 @@
                   <pic:spPr>
                     <a:xfrm>
                       <a:off x="0" y="0"/>
-                      <a:ext cx="5940425" cy="2978150"/>
+                      <a:ext cx="5940425" cy="3855720"/>
                     </a:xfrm>
                     <a:prstGeom prst="rect">
                       <a:avLst/>
@@ -2508,11 +2308,12 @@
           <w:szCs w:val="24"/>
           <w:shd w:val="clear" w:color="auto" w:fill="FFFFFF"/>
         </w:rPr>
+        <w:lastRenderedPageBreak/>
         <w:drawing>
-          <wp:inline distT="0" distB="0" distL="0" distR="0" wp14:anchorId="1AADFD9D" wp14:editId="05313C52">
-            <wp:extent cx="5940425" cy="2718435"/>
-            <wp:effectExtent l="0" t="0" r="3175" b="5715"/>
-            <wp:docPr id="32" name="Рисунок 32"/>
+          <wp:inline distT="0" distB="0" distL="0" distR="0" wp14:anchorId="7ED251EA" wp14:editId="76B1E676">
+            <wp:extent cx="5940425" cy="2978150"/>
+            <wp:effectExtent l="0" t="0" r="3175" b="0"/>
+            <wp:docPr id="31" name="Рисунок 31"/>
             <wp:cNvGraphicFramePr>
               <a:graphicFrameLocks xmlns:a="http://schemas.openxmlformats.org/drawingml/2006/main" noChangeAspect="1"/>
             </wp:cNvGraphicFramePr>
@@ -2532,7 +2333,7 @@
                   <pic:spPr>
                     <a:xfrm>
                       <a:off x="0" y="0"/>
-                      <a:ext cx="5940425" cy="2718435"/>
+                      <a:ext cx="5940425" cy="2978150"/>
                     </a:xfrm>
                     <a:prstGeom prst="rect">
                       <a:avLst/>
@@ -2568,10 +2369,10 @@
           <w:shd w:val="clear" w:color="auto" w:fill="FFFFFF"/>
         </w:rPr>
         <w:drawing>
-          <wp:inline distT="0" distB="0" distL="0" distR="0" wp14:anchorId="70694184" wp14:editId="00DEBB53">
-            <wp:extent cx="5940425" cy="2296795"/>
-            <wp:effectExtent l="0" t="0" r="3175" b="8255"/>
-            <wp:docPr id="56" name="Рисунок 56"/>
+          <wp:inline distT="0" distB="0" distL="0" distR="0" wp14:anchorId="1AADFD9D" wp14:editId="05313C52">
+            <wp:extent cx="5940425" cy="2718435"/>
+            <wp:effectExtent l="0" t="0" r="3175" b="5715"/>
+            <wp:docPr id="32" name="Рисунок 32"/>
             <wp:cNvGraphicFramePr>
               <a:graphicFrameLocks xmlns:a="http://schemas.openxmlformats.org/drawingml/2006/main" noChangeAspect="1"/>
             </wp:cNvGraphicFramePr>
@@ -2591,6 +2392,65 @@
                   <pic:spPr>
                     <a:xfrm>
                       <a:off x="0" y="0"/>
+                      <a:ext cx="5940425" cy="2718435"/>
+                    </a:xfrm>
+                    <a:prstGeom prst="rect">
+                      <a:avLst/>
+                    </a:prstGeom>
+                  </pic:spPr>
+                </pic:pic>
+              </a:graphicData>
+            </a:graphic>
+          </wp:inline>
+        </w:drawing>
+      </w:r>
+    </w:p>
+    <w:p>
+      <w:pPr>
+        <w:pStyle w:val="a4"/>
+        <w:spacing w:after="0"/>
+        <w:ind w:left="0"/>
+        <w:rPr>
+          <w:rFonts w:ascii="Times New Roman" w:hAnsi="Times New Roman" w:cs="Times New Roman"/>
+          <w:color w:val="252525"/>
+          <w:sz w:val="24"/>
+          <w:szCs w:val="24"/>
+          <w:shd w:val="clear" w:color="auto" w:fill="FFFFFF"/>
+        </w:rPr>
+      </w:pPr>
+      <w:r>
+        <w:rPr>
+          <w:rFonts w:ascii="Times New Roman" w:hAnsi="Times New Roman" w:cs="Times New Roman"/>
+          <w:noProof/>
+          <w:color w:val="252525"/>
+          <w:sz w:val="24"/>
+          <w:szCs w:val="24"/>
+          <w:shd w:val="clear" w:color="auto" w:fill="FFFFFF"/>
+        </w:rPr>
+        <w:drawing>
+          <wp:inline distT="0" distB="0" distL="0" distR="0" wp14:anchorId="70694184" wp14:editId="00DEBB53">
+            <wp:extent cx="5940425" cy="2296795"/>
+            <wp:effectExtent l="0" t="0" r="3175" b="8255"/>
+            <wp:docPr id="56" name="Рисунок 56"/>
+            <wp:cNvGraphicFramePr>
+              <a:graphicFrameLocks xmlns:a="http://schemas.openxmlformats.org/drawingml/2006/main" noChangeAspect="1"/>
+            </wp:cNvGraphicFramePr>
+            <a:graphic xmlns:a="http://schemas.openxmlformats.org/drawingml/2006/main">
+              <a:graphicData uri="http://schemas.openxmlformats.org/drawingml/2006/picture">
+                <pic:pic xmlns:pic="http://schemas.openxmlformats.org/drawingml/2006/picture">
+                  <pic:nvPicPr>
+                    <pic:cNvPr id="1" name=""/>
+                    <pic:cNvPicPr/>
+                  </pic:nvPicPr>
+                  <pic:blipFill>
+                    <a:blip r:embed="rId33"/>
+                    <a:stretch>
+                      <a:fillRect/>
+                    </a:stretch>
+                  </pic:blipFill>
+                  <pic:spPr>
+                    <a:xfrm>
+                      <a:off x="0" y="0"/>
                       <a:ext cx="5940425" cy="2296795"/>
                     </a:xfrm>
                     <a:prstGeom prst="rect">
@@ -2643,163 +2503,9 @@
           <w:szCs w:val="24"/>
           <w:shd w:val="clear" w:color="auto" w:fill="FFFFFF"/>
         </w:rPr>
-        <w:t xml:space="preserve">выведите историю коммитов: полностью и с ограничением вывода – отобрать только последние,  до и после указанной даты, по автору файлов, коммитов (флаги n, </w:t>
-      </w:r>
-      <w:proofErr w:type="spellStart"/>
-      <w:r>
-        <w:rPr>
-          <w:rFonts w:ascii="Times New Roman" w:hAnsi="Times New Roman" w:cs="Times New Roman"/>
-          <w:color w:val="252525"/>
-          <w:sz w:val="24"/>
-          <w:szCs w:val="24"/>
-          <w:shd w:val="clear" w:color="auto" w:fill="FFFFFF"/>
-        </w:rPr>
-        <w:t>since</w:t>
-      </w:r>
-      <w:proofErr w:type="spellEnd"/>
-      <w:r>
-        <w:rPr>
-          <w:rFonts w:ascii="Times New Roman" w:hAnsi="Times New Roman" w:cs="Times New Roman"/>
-          <w:color w:val="252525"/>
-          <w:sz w:val="24"/>
-          <w:szCs w:val="24"/>
-          <w:shd w:val="clear" w:color="auto" w:fill="FFFFFF"/>
-        </w:rPr>
-        <w:t xml:space="preserve">, </w:t>
-      </w:r>
-      <w:proofErr w:type="spellStart"/>
-      <w:r>
-        <w:rPr>
-          <w:rFonts w:ascii="Times New Roman" w:hAnsi="Times New Roman" w:cs="Times New Roman"/>
-          <w:color w:val="252525"/>
-          <w:sz w:val="24"/>
-          <w:szCs w:val="24"/>
-          <w:shd w:val="clear" w:color="auto" w:fill="FFFFFF"/>
-        </w:rPr>
-        <w:t>after</w:t>
-      </w:r>
-      <w:proofErr w:type="spellEnd"/>
-      <w:r>
-        <w:rPr>
-          <w:rFonts w:ascii="Times New Roman" w:hAnsi="Times New Roman" w:cs="Times New Roman"/>
-          <w:color w:val="252525"/>
-          <w:sz w:val="24"/>
-          <w:szCs w:val="24"/>
-          <w:shd w:val="clear" w:color="auto" w:fill="FFFFFF"/>
-        </w:rPr>
-        <w:t xml:space="preserve">, </w:t>
-      </w:r>
-      <w:proofErr w:type="spellStart"/>
-      <w:r>
-        <w:rPr>
-          <w:rFonts w:ascii="Times New Roman" w:hAnsi="Times New Roman" w:cs="Times New Roman"/>
-          <w:color w:val="252525"/>
-          <w:sz w:val="24"/>
-          <w:szCs w:val="24"/>
-          <w:shd w:val="clear" w:color="auto" w:fill="FFFFFF"/>
-        </w:rPr>
-        <w:t>until</w:t>
-      </w:r>
-      <w:proofErr w:type="spellEnd"/>
-      <w:r>
-        <w:rPr>
-          <w:rFonts w:ascii="Times New Roman" w:hAnsi="Times New Roman" w:cs="Times New Roman"/>
-          <w:color w:val="252525"/>
-          <w:sz w:val="24"/>
-          <w:szCs w:val="24"/>
-          <w:shd w:val="clear" w:color="auto" w:fill="FFFFFF"/>
-        </w:rPr>
-        <w:t xml:space="preserve">, </w:t>
-      </w:r>
-      <w:proofErr w:type="spellStart"/>
-      <w:r>
-        <w:rPr>
-          <w:rFonts w:ascii="Times New Roman" w:hAnsi="Times New Roman" w:cs="Times New Roman"/>
-          <w:color w:val="252525"/>
-          <w:sz w:val="24"/>
-          <w:szCs w:val="24"/>
-          <w:shd w:val="clear" w:color="auto" w:fill="FFFFFF"/>
-        </w:rPr>
-        <w:t>before</w:t>
-      </w:r>
-      <w:proofErr w:type="spellEnd"/>
-      <w:r>
-        <w:rPr>
-          <w:rFonts w:ascii="Times New Roman" w:hAnsi="Times New Roman" w:cs="Times New Roman"/>
-          <w:color w:val="252525"/>
-          <w:sz w:val="24"/>
-          <w:szCs w:val="24"/>
-          <w:shd w:val="clear" w:color="auto" w:fill="FFFFFF"/>
-        </w:rPr>
-        <w:t xml:space="preserve">, </w:t>
-      </w:r>
-      <w:proofErr w:type="spellStart"/>
-      <w:r>
-        <w:rPr>
-          <w:rFonts w:ascii="Times New Roman" w:hAnsi="Times New Roman" w:cs="Times New Roman"/>
-          <w:color w:val="252525"/>
-          <w:sz w:val="24"/>
-          <w:szCs w:val="24"/>
-          <w:shd w:val="clear" w:color="auto" w:fill="FFFFFF"/>
-        </w:rPr>
-        <w:t>author</w:t>
-      </w:r>
-      <w:proofErr w:type="spellEnd"/>
-      <w:r>
-        <w:rPr>
-          <w:rFonts w:ascii="Times New Roman" w:hAnsi="Times New Roman" w:cs="Times New Roman"/>
-          <w:color w:val="252525"/>
-          <w:sz w:val="24"/>
-          <w:szCs w:val="24"/>
-          <w:shd w:val="clear" w:color="auto" w:fill="FFFFFF"/>
-        </w:rPr>
-        <w:t xml:space="preserve">, </w:t>
-      </w:r>
-      <w:proofErr w:type="spellStart"/>
-      <w:r>
-        <w:rPr>
-          <w:rFonts w:ascii="Times New Roman" w:hAnsi="Times New Roman" w:cs="Times New Roman"/>
-          <w:color w:val="252525"/>
-          <w:sz w:val="24"/>
-          <w:szCs w:val="24"/>
-          <w:shd w:val="clear" w:color="auto" w:fill="FFFFFF"/>
-        </w:rPr>
-        <w:t>committer</w:t>
-      </w:r>
-      <w:proofErr w:type="spellEnd"/>
-      <w:r>
-        <w:rPr>
-          <w:rFonts w:ascii="Times New Roman" w:hAnsi="Times New Roman" w:cs="Times New Roman"/>
-          <w:color w:val="252525"/>
-          <w:sz w:val="24"/>
-          <w:szCs w:val="24"/>
-          <w:shd w:val="clear" w:color="auto" w:fill="FFFFFF"/>
-        </w:rPr>
-        <w:t xml:space="preserve">, </w:t>
-      </w:r>
-      <w:proofErr w:type="spellStart"/>
-      <w:r>
-        <w:rPr>
-          <w:rFonts w:ascii="Times New Roman" w:hAnsi="Times New Roman" w:cs="Times New Roman"/>
-          <w:color w:val="252525"/>
-          <w:sz w:val="24"/>
-          <w:szCs w:val="24"/>
-          <w:shd w:val="clear" w:color="auto" w:fill="FFFFFF"/>
-        </w:rPr>
-        <w:t>grep</w:t>
-      </w:r>
-      <w:proofErr w:type="spellEnd"/>
-      <w:r>
-        <w:rPr>
-          <w:rFonts w:ascii="Times New Roman" w:hAnsi="Times New Roman" w:cs="Times New Roman"/>
-          <w:color w:val="252525"/>
-          <w:sz w:val="24"/>
-          <w:szCs w:val="24"/>
-          <w:shd w:val="clear" w:color="auto" w:fill="FFFFFF"/>
-        </w:rPr>
-        <w:t xml:space="preserve">) </w:t>
-      </w:r>
-      <w:hyperlink r:id="rId33" w:history="1">
+        <w:t xml:space="preserve">выведите историю коммитов: полностью и с ограничением вывода – отобрать только последние,  до и после указанной даты, по автору файлов, коммитов (флаги n, since, after, until, before, author, committer, grep) </w:t>
+      </w:r>
+      <w:hyperlink r:id="rId34" w:history="1">
         <w:r>
           <w:rPr>
             <w:rStyle w:val="a3"/>
@@ -2849,65 +2555,6 @@
             <wp:extent cx="5940425" cy="2144395"/>
             <wp:effectExtent l="0" t="0" r="3175" b="8255"/>
             <wp:docPr id="58" name="Рисунок 58"/>
-            <wp:cNvGraphicFramePr>
-              <a:graphicFrameLocks xmlns:a="http://schemas.openxmlformats.org/drawingml/2006/main" noChangeAspect="1"/>
-            </wp:cNvGraphicFramePr>
-            <a:graphic xmlns:a="http://schemas.openxmlformats.org/drawingml/2006/main">
-              <a:graphicData uri="http://schemas.openxmlformats.org/drawingml/2006/picture">
-                <pic:pic xmlns:pic="http://schemas.openxmlformats.org/drawingml/2006/picture">
-                  <pic:nvPicPr>
-                    <pic:cNvPr id="1" name=""/>
-                    <pic:cNvPicPr/>
-                  </pic:nvPicPr>
-                  <pic:blipFill>
-                    <a:blip r:embed="rId34"/>
-                    <a:stretch>
-                      <a:fillRect/>
-                    </a:stretch>
-                  </pic:blipFill>
-                  <pic:spPr>
-                    <a:xfrm>
-                      <a:off x="0" y="0"/>
-                      <a:ext cx="5940425" cy="2144395"/>
-                    </a:xfrm>
-                    <a:prstGeom prst="rect">
-                      <a:avLst/>
-                    </a:prstGeom>
-                  </pic:spPr>
-                </pic:pic>
-              </a:graphicData>
-            </a:graphic>
-          </wp:inline>
-        </w:drawing>
-      </w:r>
-    </w:p>
-    <w:p>
-      <w:pPr>
-        <w:pStyle w:val="a4"/>
-        <w:spacing w:after="0"/>
-        <w:ind w:left="0"/>
-        <w:rPr>
-          <w:rFonts w:ascii="Times New Roman" w:hAnsi="Times New Roman" w:cs="Times New Roman"/>
-          <w:color w:val="252525"/>
-          <w:sz w:val="24"/>
-          <w:szCs w:val="24"/>
-          <w:shd w:val="clear" w:color="auto" w:fill="FFFFFF"/>
-        </w:rPr>
-      </w:pPr>
-      <w:r>
-        <w:rPr>
-          <w:rFonts w:ascii="Times New Roman" w:hAnsi="Times New Roman" w:cs="Times New Roman"/>
-          <w:noProof/>
-          <w:color w:val="252525"/>
-          <w:sz w:val="24"/>
-          <w:szCs w:val="24"/>
-          <w:shd w:val="clear" w:color="auto" w:fill="FFFFFF"/>
-        </w:rPr>
-        <w:drawing>
-          <wp:inline distT="0" distB="0" distL="0" distR="0" wp14:anchorId="22A8703D" wp14:editId="11CC93CC">
-            <wp:extent cx="5940425" cy="3717290"/>
-            <wp:effectExtent l="0" t="0" r="3175" b="0"/>
-            <wp:docPr id="59" name="Рисунок 59"/>
             <wp:cNvGraphicFramePr>
               <a:graphicFrameLocks xmlns:a="http://schemas.openxmlformats.org/drawingml/2006/main" noChangeAspect="1"/>
             </wp:cNvGraphicFramePr>
@@ -2927,7 +2574,7 @@
                   <pic:spPr>
                     <a:xfrm>
                       <a:off x="0" y="0"/>
-                      <a:ext cx="5940425" cy="3717290"/>
+                      <a:ext cx="5940425" cy="2144395"/>
                     </a:xfrm>
                     <a:prstGeom prst="rect">
                       <a:avLst/>
@@ -2951,7 +2598,6 @@
           <w:sz w:val="24"/>
           <w:szCs w:val="24"/>
           <w:shd w:val="clear" w:color="auto" w:fill="FFFFFF"/>
-          <w:lang w:val="en-US"/>
         </w:rPr>
       </w:pPr>
       <w:r>
@@ -2964,10 +2610,10 @@
           <w:shd w:val="clear" w:color="auto" w:fill="FFFFFF"/>
         </w:rPr>
         <w:drawing>
-          <wp:inline distT="0" distB="0" distL="0" distR="0" wp14:anchorId="46CF79B8" wp14:editId="035DF2A9">
-            <wp:extent cx="5940425" cy="427355"/>
+          <wp:inline distT="0" distB="0" distL="0" distR="0" wp14:anchorId="22A8703D" wp14:editId="11CC93CC">
+            <wp:extent cx="5940425" cy="3717290"/>
             <wp:effectExtent l="0" t="0" r="3175" b="0"/>
-            <wp:docPr id="60" name="Рисунок 60"/>
+            <wp:docPr id="59" name="Рисунок 59"/>
             <wp:cNvGraphicFramePr>
               <a:graphicFrameLocks xmlns:a="http://schemas.openxmlformats.org/drawingml/2006/main" noChangeAspect="1"/>
             </wp:cNvGraphicFramePr>
@@ -2987,7 +2633,7 @@
                   <pic:spPr>
                     <a:xfrm>
                       <a:off x="0" y="0"/>
-                      <a:ext cx="5940425" cy="427355"/>
+                      <a:ext cx="5940425" cy="3717290"/>
                     </a:xfrm>
                     <a:prstGeom prst="rect">
                       <a:avLst/>
@@ -3022,13 +2668,12 @@
           <w:sz w:val="24"/>
           <w:szCs w:val="24"/>
           <w:shd w:val="clear" w:color="auto" w:fill="FFFFFF"/>
-          <w:lang w:val="en-US"/>
         </w:rPr>
         <w:drawing>
-          <wp:inline distT="0" distB="0" distL="0" distR="0" wp14:anchorId="517744A6" wp14:editId="31496D2E">
-            <wp:extent cx="5940425" cy="1268730"/>
-            <wp:effectExtent l="0" t="0" r="3175" b="7620"/>
-            <wp:docPr id="61" name="Рисунок 61"/>
+          <wp:inline distT="0" distB="0" distL="0" distR="0" wp14:anchorId="46CF79B8" wp14:editId="035DF2A9">
+            <wp:extent cx="5940425" cy="427355"/>
+            <wp:effectExtent l="0" t="0" r="3175" b="0"/>
+            <wp:docPr id="60" name="Рисунок 60"/>
             <wp:cNvGraphicFramePr>
               <a:graphicFrameLocks xmlns:a="http://schemas.openxmlformats.org/drawingml/2006/main" noChangeAspect="1"/>
             </wp:cNvGraphicFramePr>
@@ -3048,7 +2693,7 @@
                   <pic:spPr>
                     <a:xfrm>
                       <a:off x="0" y="0"/>
-                      <a:ext cx="5940425" cy="1268730"/>
+                      <a:ext cx="5940425" cy="427355"/>
                     </a:xfrm>
                     <a:prstGeom prst="rect">
                       <a:avLst/>
@@ -3072,6 +2717,7 @@
           <w:sz w:val="24"/>
           <w:szCs w:val="24"/>
           <w:shd w:val="clear" w:color="auto" w:fill="FFFFFF"/>
+          <w:lang w:val="en-US"/>
         </w:rPr>
       </w:pPr>
       <w:r>
@@ -3082,13 +2728,13 @@
           <w:sz w:val="24"/>
           <w:szCs w:val="24"/>
           <w:shd w:val="clear" w:color="auto" w:fill="FFFFFF"/>
-        </w:rPr>
-        <w:lastRenderedPageBreak/>
+          <w:lang w:val="en-US"/>
+        </w:rPr>
         <w:drawing>
-          <wp:inline distT="0" distB="0" distL="0" distR="0" wp14:anchorId="2B694548" wp14:editId="0837CA7B">
-            <wp:extent cx="5940425" cy="2840355"/>
-            <wp:effectExtent l="0" t="0" r="3175" b="0"/>
-            <wp:docPr id="62" name="Рисунок 62"/>
+          <wp:inline distT="0" distB="0" distL="0" distR="0" wp14:anchorId="517744A6" wp14:editId="31496D2E">
+            <wp:extent cx="5940425" cy="1268730"/>
+            <wp:effectExtent l="0" t="0" r="3175" b="7620"/>
+            <wp:docPr id="61" name="Рисунок 61"/>
             <wp:cNvGraphicFramePr>
               <a:graphicFrameLocks xmlns:a="http://schemas.openxmlformats.org/drawingml/2006/main" noChangeAspect="1"/>
             </wp:cNvGraphicFramePr>
@@ -3108,7 +2754,7 @@
                   <pic:spPr>
                     <a:xfrm>
                       <a:off x="0" y="0"/>
-                      <a:ext cx="5940425" cy="2840355"/>
+                      <a:ext cx="5940425" cy="1268730"/>
                     </a:xfrm>
                     <a:prstGeom prst="rect">
                       <a:avLst/>
@@ -3143,11 +2789,12 @@
           <w:szCs w:val="24"/>
           <w:shd w:val="clear" w:color="auto" w:fill="FFFFFF"/>
         </w:rPr>
+        <w:lastRenderedPageBreak/>
         <w:drawing>
-          <wp:inline distT="0" distB="0" distL="0" distR="0" wp14:anchorId="2CDFDD39" wp14:editId="38084DE2">
-            <wp:extent cx="5940425" cy="2839720"/>
+          <wp:inline distT="0" distB="0" distL="0" distR="0" wp14:anchorId="2B694548" wp14:editId="0837CA7B">
+            <wp:extent cx="5940425" cy="2840355"/>
             <wp:effectExtent l="0" t="0" r="3175" b="0"/>
-            <wp:docPr id="63" name="Рисунок 63"/>
+            <wp:docPr id="62" name="Рисунок 62"/>
             <wp:cNvGraphicFramePr>
               <a:graphicFrameLocks xmlns:a="http://schemas.openxmlformats.org/drawingml/2006/main" noChangeAspect="1"/>
             </wp:cNvGraphicFramePr>
@@ -3167,7 +2814,7 @@
                   <pic:spPr>
                     <a:xfrm>
                       <a:off x="0" y="0"/>
-                      <a:ext cx="5940425" cy="2839720"/>
+                      <a:ext cx="5940425" cy="2840355"/>
                     </a:xfrm>
                     <a:prstGeom prst="rect">
                       <a:avLst/>
@@ -3203,10 +2850,10 @@
           <w:shd w:val="clear" w:color="auto" w:fill="FFFFFF"/>
         </w:rPr>
         <w:drawing>
-          <wp:inline distT="0" distB="0" distL="0" distR="0" wp14:anchorId="3AB904CC" wp14:editId="215A4E01">
-            <wp:extent cx="5940425" cy="1995805"/>
-            <wp:effectExtent l="0" t="0" r="3175" b="4445"/>
-            <wp:docPr id="64" name="Рисунок 64"/>
+          <wp:inline distT="0" distB="0" distL="0" distR="0" wp14:anchorId="2CDFDD39" wp14:editId="38084DE2">
+            <wp:extent cx="5940425" cy="2839720"/>
+            <wp:effectExtent l="0" t="0" r="3175" b="0"/>
+            <wp:docPr id="63" name="Рисунок 63"/>
             <wp:cNvGraphicFramePr>
               <a:graphicFrameLocks xmlns:a="http://schemas.openxmlformats.org/drawingml/2006/main" noChangeAspect="1"/>
             </wp:cNvGraphicFramePr>
@@ -3226,7 +2873,7 @@
                   <pic:spPr>
                     <a:xfrm>
                       <a:off x="0" y="0"/>
-                      <a:ext cx="5940425" cy="1995805"/>
+                      <a:ext cx="5940425" cy="2839720"/>
                     </a:xfrm>
                     <a:prstGeom prst="rect">
                       <a:avLst/>
@@ -3261,12 +2908,11 @@
           <w:szCs w:val="24"/>
           <w:shd w:val="clear" w:color="auto" w:fill="FFFFFF"/>
         </w:rPr>
-        <w:lastRenderedPageBreak/>
         <w:drawing>
-          <wp:inline distT="0" distB="0" distL="0" distR="0" wp14:anchorId="4D528750" wp14:editId="1B95CFF4">
-            <wp:extent cx="5940425" cy="2016760"/>
-            <wp:effectExtent l="0" t="0" r="3175" b="2540"/>
-            <wp:docPr id="65" name="Рисунок 65"/>
+          <wp:inline distT="0" distB="0" distL="0" distR="0" wp14:anchorId="3AB904CC" wp14:editId="215A4E01">
+            <wp:extent cx="5940425" cy="1995805"/>
+            <wp:effectExtent l="0" t="0" r="3175" b="4445"/>
+            <wp:docPr id="64" name="Рисунок 64"/>
             <wp:cNvGraphicFramePr>
               <a:graphicFrameLocks xmlns:a="http://schemas.openxmlformats.org/drawingml/2006/main" noChangeAspect="1"/>
             </wp:cNvGraphicFramePr>
@@ -3286,7 +2932,7 @@
                   <pic:spPr>
                     <a:xfrm>
                       <a:off x="0" y="0"/>
-                      <a:ext cx="5940425" cy="2016760"/>
+                      <a:ext cx="5940425" cy="1995805"/>
                     </a:xfrm>
                     <a:prstGeom prst="rect">
                       <a:avLst/>
@@ -3310,167 +2956,6 @@
           <w:sz w:val="24"/>
           <w:szCs w:val="24"/>
           <w:shd w:val="clear" w:color="auto" w:fill="FFFFFF"/>
-          <w:lang w:val="en-US"/>
-        </w:rPr>
-      </w:pPr>
-    </w:p>
-    <w:p>
-      <w:pPr>
-        <w:pStyle w:val="a4"/>
-        <w:spacing w:after="0"/>
-        <w:ind w:left="0"/>
-        <w:rPr>
-          <w:rFonts w:ascii="Times New Roman" w:hAnsi="Times New Roman" w:cs="Times New Roman"/>
-          <w:color w:val="252525"/>
-          <w:sz w:val="24"/>
-          <w:szCs w:val="24"/>
-          <w:shd w:val="clear" w:color="auto" w:fill="FFFFFF"/>
-          <w:lang w:val="en-US"/>
-        </w:rPr>
-      </w:pPr>
-    </w:p>
-    <w:p>
-      <w:pPr>
-        <w:pStyle w:val="a4"/>
-        <w:numPr>
-          <w:ilvl w:val="1"/>
-          <w:numId w:val="1"/>
-        </w:numPr>
-        <w:spacing w:after="0"/>
-        <w:ind w:left="0"/>
-        <w:rPr>
-          <w:rFonts w:ascii="Times New Roman" w:hAnsi="Times New Roman" w:cs="Times New Roman"/>
-          <w:color w:val="252525"/>
-          <w:sz w:val="24"/>
-          <w:szCs w:val="24"/>
-          <w:shd w:val="clear" w:color="auto" w:fill="FFFFFF"/>
-          <w:lang w:val="en-US"/>
-        </w:rPr>
-      </w:pPr>
-      <w:r>
-        <w:rPr>
-          <w:rFonts w:ascii="Times New Roman" w:hAnsi="Times New Roman" w:cs="Times New Roman"/>
-          <w:color w:val="252525"/>
-          <w:sz w:val="24"/>
-          <w:szCs w:val="24"/>
-          <w:shd w:val="clear" w:color="auto" w:fill="FFFFFF"/>
-        </w:rPr>
-        <w:t>исследуйте</w:t>
-      </w:r>
-      <w:r>
-        <w:rPr>
-          <w:rFonts w:ascii="Times New Roman" w:hAnsi="Times New Roman" w:cs="Times New Roman"/>
-          <w:color w:val="252525"/>
-          <w:sz w:val="24"/>
-          <w:szCs w:val="24"/>
-          <w:shd w:val="clear" w:color="auto" w:fill="FFFFFF"/>
-          <w:lang w:val="en-US"/>
-        </w:rPr>
-        <w:t xml:space="preserve"> </w:t>
-      </w:r>
-      <w:r>
-        <w:rPr>
-          <w:rFonts w:ascii="Times New Roman" w:hAnsi="Times New Roman" w:cs="Times New Roman"/>
-          <w:color w:val="252525"/>
-          <w:sz w:val="24"/>
-          <w:szCs w:val="24"/>
-          <w:shd w:val="clear" w:color="auto" w:fill="FFFFFF"/>
-        </w:rPr>
-        <w:t>флаги</w:t>
-      </w:r>
-      <w:r>
-        <w:rPr>
-          <w:rFonts w:ascii="Times New Roman" w:hAnsi="Times New Roman" w:cs="Times New Roman"/>
-          <w:color w:val="252525"/>
-          <w:sz w:val="24"/>
-          <w:szCs w:val="24"/>
-          <w:shd w:val="clear" w:color="auto" w:fill="FFFFFF"/>
-          <w:lang w:val="en-US"/>
-        </w:rPr>
-        <w:t xml:space="preserve"> </w:t>
-      </w:r>
-      <w:r>
-        <w:rPr>
-          <w:rFonts w:ascii="Times New Roman" w:hAnsi="Times New Roman" w:cs="Times New Roman"/>
-          <w:color w:val="252525"/>
-          <w:sz w:val="24"/>
-          <w:szCs w:val="24"/>
-          <w:shd w:val="clear" w:color="auto" w:fill="FFFFFF"/>
-        </w:rPr>
-        <w:t>для</w:t>
-      </w:r>
-      <w:r>
-        <w:rPr>
-          <w:rFonts w:ascii="Times New Roman" w:hAnsi="Times New Roman" w:cs="Times New Roman"/>
-          <w:color w:val="252525"/>
-          <w:sz w:val="24"/>
-          <w:szCs w:val="24"/>
-          <w:shd w:val="clear" w:color="auto" w:fill="FFFFFF"/>
-          <w:lang w:val="en-US"/>
-        </w:rPr>
-        <w:t xml:space="preserve"> git log: </w:t>
-      </w:r>
-      <w:proofErr w:type="gramStart"/>
-      <w:r>
-        <w:rPr>
-          <w:rFonts w:ascii="Times New Roman" w:hAnsi="Times New Roman" w:cs="Times New Roman"/>
-          <w:color w:val="252525"/>
-          <w:sz w:val="24"/>
-          <w:szCs w:val="24"/>
-          <w:shd w:val="clear" w:color="auto" w:fill="FFFFFF"/>
-          <w:lang w:val="en-US"/>
-        </w:rPr>
-        <w:t>p ,</w:t>
-      </w:r>
-      <w:proofErr w:type="gramEnd"/>
-      <w:r>
-        <w:rPr>
-          <w:rFonts w:ascii="Times New Roman" w:hAnsi="Times New Roman" w:cs="Times New Roman"/>
-          <w:color w:val="252525"/>
-          <w:sz w:val="24"/>
-          <w:szCs w:val="24"/>
-          <w:shd w:val="clear" w:color="auto" w:fill="FFFFFF"/>
-          <w:lang w:val="en-US"/>
-        </w:rPr>
-        <w:t xml:space="preserve"> stat ,</w:t>
-      </w:r>
-      <w:proofErr w:type="spellStart"/>
-      <w:r>
-        <w:rPr>
-          <w:rFonts w:ascii="Times New Roman" w:hAnsi="Times New Roman" w:cs="Times New Roman"/>
-          <w:color w:val="252525"/>
-          <w:sz w:val="24"/>
-          <w:szCs w:val="24"/>
-          <w:shd w:val="clear" w:color="auto" w:fill="FFFFFF"/>
-          <w:lang w:val="en-US"/>
-        </w:rPr>
-        <w:t>shortstat</w:t>
-      </w:r>
-      <w:proofErr w:type="spellEnd"/>
-      <w:r>
-        <w:rPr>
-          <w:rFonts w:ascii="Times New Roman" w:hAnsi="Times New Roman" w:cs="Times New Roman"/>
-          <w:color w:val="252525"/>
-          <w:sz w:val="24"/>
-          <w:szCs w:val="24"/>
-          <w:shd w:val="clear" w:color="auto" w:fill="FFFFFF"/>
-          <w:lang w:val="en-US"/>
-        </w:rPr>
-        <w:t xml:space="preserve">, name-only, name-status, relative-date, pretty, graph, </w:t>
-      </w:r>
-    </w:p>
-    <w:p>
-      <w:pPr>
-        <w:pStyle w:val="a4"/>
-        <w:spacing w:after="0"/>
-        <w:ind w:left="0"/>
-        <w:rPr>
-          <w:rFonts w:ascii="Times New Roman" w:hAnsi="Times New Roman" w:cs="Times New Roman"/>
-          <w:color w:val="252525"/>
-          <w:sz w:val="24"/>
-          <w:szCs w:val="24"/>
-          <w:shd w:val="clear" w:color="auto" w:fill="FFFFFF"/>
-          <w:lang w:val="en-US"/>
         </w:rPr>
       </w:pPr>
       <w:r>
@@ -3481,13 +2966,13 @@
           <w:sz w:val="24"/>
           <w:szCs w:val="24"/>
           <w:shd w:val="clear" w:color="auto" w:fill="FFFFFF"/>
-          <w:lang w:val="en-US"/>
-        </w:rPr>
+        </w:rPr>
+        <w:lastRenderedPageBreak/>
         <w:drawing>
-          <wp:inline distT="0" distB="0" distL="0" distR="0" wp14:anchorId="413BB9C1" wp14:editId="1BB40C16">
-            <wp:extent cx="5940425" cy="4204335"/>
-            <wp:effectExtent l="0" t="0" r="3175" b="5715"/>
-            <wp:docPr id="67" name="Рисунок 67"/>
+          <wp:inline distT="0" distB="0" distL="0" distR="0" wp14:anchorId="4D528750" wp14:editId="1B95CFF4">
+            <wp:extent cx="5940425" cy="2016760"/>
+            <wp:effectExtent l="0" t="0" r="3175" b="2540"/>
+            <wp:docPr id="65" name="Рисунок 65"/>
             <wp:cNvGraphicFramePr>
               <a:graphicFrameLocks xmlns:a="http://schemas.openxmlformats.org/drawingml/2006/main" noChangeAspect="1"/>
             </wp:cNvGraphicFramePr>
@@ -3507,7 +2992,7 @@
                   <pic:spPr>
                     <a:xfrm>
                       <a:off x="0" y="0"/>
-                      <a:ext cx="5940425" cy="4204335"/>
+                      <a:ext cx="5940425" cy="2016760"/>
                     </a:xfrm>
                     <a:prstGeom prst="rect">
                       <a:avLst/>
@@ -3534,6 +3019,118 @@
           <w:lang w:val="en-US"/>
         </w:rPr>
       </w:pPr>
+    </w:p>
+    <w:p>
+      <w:pPr>
+        <w:pStyle w:val="a4"/>
+        <w:spacing w:after="0"/>
+        <w:ind w:left="0"/>
+        <w:rPr>
+          <w:rFonts w:ascii="Times New Roman" w:hAnsi="Times New Roman" w:cs="Times New Roman"/>
+          <w:color w:val="252525"/>
+          <w:sz w:val="24"/>
+          <w:szCs w:val="24"/>
+          <w:shd w:val="clear" w:color="auto" w:fill="FFFFFF"/>
+          <w:lang w:val="en-US"/>
+        </w:rPr>
+      </w:pPr>
+    </w:p>
+    <w:p>
+      <w:pPr>
+        <w:pStyle w:val="a4"/>
+        <w:numPr>
+          <w:ilvl w:val="1"/>
+          <w:numId w:val="1"/>
+        </w:numPr>
+        <w:spacing w:after="0"/>
+        <w:ind w:left="0"/>
+        <w:rPr>
+          <w:rFonts w:ascii="Times New Roman" w:hAnsi="Times New Roman" w:cs="Times New Roman"/>
+          <w:color w:val="252525"/>
+          <w:sz w:val="24"/>
+          <w:szCs w:val="24"/>
+          <w:shd w:val="clear" w:color="auto" w:fill="FFFFFF"/>
+          <w:lang w:val="en-US"/>
+        </w:rPr>
+      </w:pPr>
+      <w:r>
+        <w:rPr>
+          <w:rFonts w:ascii="Times New Roman" w:hAnsi="Times New Roman" w:cs="Times New Roman"/>
+          <w:color w:val="252525"/>
+          <w:sz w:val="24"/>
+          <w:szCs w:val="24"/>
+          <w:shd w:val="clear" w:color="auto" w:fill="FFFFFF"/>
+        </w:rPr>
+        <w:t>исследуйте</w:t>
+      </w:r>
+      <w:r>
+        <w:rPr>
+          <w:rFonts w:ascii="Times New Roman" w:hAnsi="Times New Roman" w:cs="Times New Roman"/>
+          <w:color w:val="252525"/>
+          <w:sz w:val="24"/>
+          <w:szCs w:val="24"/>
+          <w:shd w:val="clear" w:color="auto" w:fill="FFFFFF"/>
+          <w:lang w:val="en-US"/>
+        </w:rPr>
+        <w:t xml:space="preserve"> </w:t>
+      </w:r>
+      <w:r>
+        <w:rPr>
+          <w:rFonts w:ascii="Times New Roman" w:hAnsi="Times New Roman" w:cs="Times New Roman"/>
+          <w:color w:val="252525"/>
+          <w:sz w:val="24"/>
+          <w:szCs w:val="24"/>
+          <w:shd w:val="clear" w:color="auto" w:fill="FFFFFF"/>
+        </w:rPr>
+        <w:t>флаги</w:t>
+      </w:r>
+      <w:r>
+        <w:rPr>
+          <w:rFonts w:ascii="Times New Roman" w:hAnsi="Times New Roman" w:cs="Times New Roman"/>
+          <w:color w:val="252525"/>
+          <w:sz w:val="24"/>
+          <w:szCs w:val="24"/>
+          <w:shd w:val="clear" w:color="auto" w:fill="FFFFFF"/>
+          <w:lang w:val="en-US"/>
+        </w:rPr>
+        <w:t xml:space="preserve"> </w:t>
+      </w:r>
+      <w:r>
+        <w:rPr>
+          <w:rFonts w:ascii="Times New Roman" w:hAnsi="Times New Roman" w:cs="Times New Roman"/>
+          <w:color w:val="252525"/>
+          <w:sz w:val="24"/>
+          <w:szCs w:val="24"/>
+          <w:shd w:val="clear" w:color="auto" w:fill="FFFFFF"/>
+        </w:rPr>
+        <w:t>для</w:t>
+      </w:r>
+      <w:r>
+        <w:rPr>
+          <w:rFonts w:ascii="Times New Roman" w:hAnsi="Times New Roman" w:cs="Times New Roman"/>
+          <w:color w:val="252525"/>
+          <w:sz w:val="24"/>
+          <w:szCs w:val="24"/>
+          <w:shd w:val="clear" w:color="auto" w:fill="FFFFFF"/>
+          <w:lang w:val="en-US"/>
+        </w:rPr>
+        <w:t xml:space="preserve"> git log: p , stat ,shortstat, name-only, name-status, relative-date, pretty, graph, </w:t>
+      </w:r>
+    </w:p>
+    <w:p>
+      <w:pPr>
+        <w:pStyle w:val="a4"/>
+        <w:spacing w:after="0"/>
+        <w:ind w:left="0"/>
+        <w:rPr>
+          <w:rFonts w:ascii="Times New Roman" w:hAnsi="Times New Roman" w:cs="Times New Roman"/>
+          <w:color w:val="252525"/>
+          <w:sz w:val="24"/>
+          <w:szCs w:val="24"/>
+          <w:shd w:val="clear" w:color="auto" w:fill="FFFFFF"/>
+          <w:lang w:val="en-US"/>
+        </w:rPr>
+      </w:pPr>
       <w:r>
         <w:rPr>
           <w:rFonts w:ascii="Times New Roman" w:hAnsi="Times New Roman" w:cs="Times New Roman"/>
@@ -3544,12 +3141,11 @@
           <w:shd w:val="clear" w:color="auto" w:fill="FFFFFF"/>
           <w:lang w:val="en-US"/>
         </w:rPr>
-        <w:lastRenderedPageBreak/>
         <w:drawing>
-          <wp:inline distT="0" distB="0" distL="0" distR="0" wp14:anchorId="02DA1C06" wp14:editId="619E405E">
-            <wp:extent cx="5940425" cy="4196715"/>
-            <wp:effectExtent l="0" t="0" r="3175" b="0"/>
-            <wp:docPr id="68" name="Рисунок 68"/>
+          <wp:inline distT="0" distB="0" distL="0" distR="0" wp14:anchorId="413BB9C1" wp14:editId="1BB40C16">
+            <wp:extent cx="5940425" cy="4204335"/>
+            <wp:effectExtent l="0" t="0" r="3175" b="5715"/>
+            <wp:docPr id="67" name="Рисунок 67"/>
             <wp:cNvGraphicFramePr>
               <a:graphicFrameLocks xmlns:a="http://schemas.openxmlformats.org/drawingml/2006/main" noChangeAspect="1"/>
             </wp:cNvGraphicFramePr>
@@ -3569,7 +3165,7 @@
                   <pic:spPr>
                     <a:xfrm>
                       <a:off x="0" y="0"/>
-                      <a:ext cx="5940425" cy="4196715"/>
+                      <a:ext cx="5940425" cy="4204335"/>
                     </a:xfrm>
                     <a:prstGeom prst="rect">
                       <a:avLst/>
@@ -3606,11 +3202,12 @@
           <w:shd w:val="clear" w:color="auto" w:fill="FFFFFF"/>
           <w:lang w:val="en-US"/>
         </w:rPr>
+        <w:lastRenderedPageBreak/>
         <w:drawing>
-          <wp:inline distT="0" distB="0" distL="0" distR="0" wp14:anchorId="4AC01B11" wp14:editId="6DEA6581">
-            <wp:extent cx="5940425" cy="3616960"/>
-            <wp:effectExtent l="0" t="0" r="3175" b="2540"/>
-            <wp:docPr id="69" name="Рисунок 69"/>
+          <wp:inline distT="0" distB="0" distL="0" distR="0" wp14:anchorId="02DA1C06" wp14:editId="619E405E">
+            <wp:extent cx="5940425" cy="4196715"/>
+            <wp:effectExtent l="0" t="0" r="3175" b="0"/>
+            <wp:docPr id="68" name="Рисунок 68"/>
             <wp:cNvGraphicFramePr>
               <a:graphicFrameLocks xmlns:a="http://schemas.openxmlformats.org/drawingml/2006/main" noChangeAspect="1"/>
             </wp:cNvGraphicFramePr>
@@ -3630,7 +3227,7 @@
                   <pic:spPr>
                     <a:xfrm>
                       <a:off x="0" y="0"/>
-                      <a:ext cx="5940425" cy="3616960"/>
+                      <a:ext cx="5940425" cy="4196715"/>
                     </a:xfrm>
                     <a:prstGeom prst="rect">
                       <a:avLst/>
@@ -3667,12 +3264,11 @@
           <w:shd w:val="clear" w:color="auto" w:fill="FFFFFF"/>
           <w:lang w:val="en-US"/>
         </w:rPr>
-        <w:lastRenderedPageBreak/>
         <w:drawing>
-          <wp:inline distT="0" distB="0" distL="0" distR="0" wp14:anchorId="03885DA4" wp14:editId="433FA6CE">
-            <wp:extent cx="5940425" cy="2629535"/>
-            <wp:effectExtent l="0" t="0" r="3175" b="0"/>
-            <wp:docPr id="70" name="Рисунок 70"/>
+          <wp:inline distT="0" distB="0" distL="0" distR="0" wp14:anchorId="4AC01B11" wp14:editId="6DEA6581">
+            <wp:extent cx="5940425" cy="3616960"/>
+            <wp:effectExtent l="0" t="0" r="3175" b="2540"/>
+            <wp:docPr id="69" name="Рисунок 69"/>
             <wp:cNvGraphicFramePr>
               <a:graphicFrameLocks xmlns:a="http://schemas.openxmlformats.org/drawingml/2006/main" noChangeAspect="1"/>
             </wp:cNvGraphicFramePr>
@@ -3692,7 +3288,7 @@
                   <pic:spPr>
                     <a:xfrm>
                       <a:off x="0" y="0"/>
-                      <a:ext cx="5940425" cy="2629535"/>
+                      <a:ext cx="5940425" cy="3616960"/>
                     </a:xfrm>
                     <a:prstGeom prst="rect">
                       <a:avLst/>
@@ -3729,11 +3325,12 @@
           <w:shd w:val="clear" w:color="auto" w:fill="FFFFFF"/>
           <w:lang w:val="en-US"/>
         </w:rPr>
+        <w:lastRenderedPageBreak/>
         <w:drawing>
-          <wp:inline distT="0" distB="0" distL="0" distR="0" wp14:anchorId="78D03E18" wp14:editId="1DC1F123">
-            <wp:extent cx="5940425" cy="2702560"/>
-            <wp:effectExtent l="0" t="0" r="3175" b="2540"/>
-            <wp:docPr id="71" name="Рисунок 71"/>
+          <wp:inline distT="0" distB="0" distL="0" distR="0" wp14:anchorId="03885DA4" wp14:editId="433FA6CE">
+            <wp:extent cx="5940425" cy="2629535"/>
+            <wp:effectExtent l="0" t="0" r="3175" b="0"/>
+            <wp:docPr id="70" name="Рисунок 70"/>
             <wp:cNvGraphicFramePr>
               <a:graphicFrameLocks xmlns:a="http://schemas.openxmlformats.org/drawingml/2006/main" noChangeAspect="1"/>
             </wp:cNvGraphicFramePr>
@@ -3753,7 +3350,7 @@
                   <pic:spPr>
                     <a:xfrm>
                       <a:off x="0" y="0"/>
-                      <a:ext cx="5940425" cy="2702560"/>
+                      <a:ext cx="5940425" cy="2629535"/>
                     </a:xfrm>
                     <a:prstGeom prst="rect">
                       <a:avLst/>
@@ -3791,10 +3388,10 @@
           <w:lang w:val="en-US"/>
         </w:rPr>
         <w:drawing>
-          <wp:inline distT="0" distB="0" distL="0" distR="0" wp14:anchorId="6643D4E2" wp14:editId="7A90BDFA">
-            <wp:extent cx="5940425" cy="2047240"/>
-            <wp:effectExtent l="0" t="0" r="3175" b="0"/>
-            <wp:docPr id="72" name="Рисунок 72"/>
+          <wp:inline distT="0" distB="0" distL="0" distR="0" wp14:anchorId="78D03E18" wp14:editId="1DC1F123">
+            <wp:extent cx="5940425" cy="2702560"/>
+            <wp:effectExtent l="0" t="0" r="3175" b="2540"/>
+            <wp:docPr id="71" name="Рисунок 71"/>
             <wp:cNvGraphicFramePr>
               <a:graphicFrameLocks xmlns:a="http://schemas.openxmlformats.org/drawingml/2006/main" noChangeAspect="1"/>
             </wp:cNvGraphicFramePr>
@@ -3814,7 +3411,7 @@
                   <pic:spPr>
                     <a:xfrm>
                       <a:off x="0" y="0"/>
-                      <a:ext cx="5940425" cy="2047240"/>
+                      <a:ext cx="5940425" cy="2702560"/>
                     </a:xfrm>
                     <a:prstGeom prst="rect">
                       <a:avLst/>
@@ -3851,12 +3448,11 @@
           <w:shd w:val="clear" w:color="auto" w:fill="FFFFFF"/>
           <w:lang w:val="en-US"/>
         </w:rPr>
-        <w:lastRenderedPageBreak/>
         <w:drawing>
-          <wp:inline distT="0" distB="0" distL="0" distR="0" wp14:anchorId="34E66323" wp14:editId="11367FDE">
-            <wp:extent cx="5940425" cy="2527300"/>
-            <wp:effectExtent l="0" t="0" r="3175" b="6350"/>
-            <wp:docPr id="73" name="Рисунок 73"/>
+          <wp:inline distT="0" distB="0" distL="0" distR="0" wp14:anchorId="6643D4E2" wp14:editId="7A90BDFA">
+            <wp:extent cx="5940425" cy="2047240"/>
+            <wp:effectExtent l="0" t="0" r="3175" b="0"/>
+            <wp:docPr id="72" name="Рисунок 72"/>
             <wp:cNvGraphicFramePr>
               <a:graphicFrameLocks xmlns:a="http://schemas.openxmlformats.org/drawingml/2006/main" noChangeAspect="1"/>
             </wp:cNvGraphicFramePr>
@@ -3876,7 +3472,7 @@
                   <pic:spPr>
                     <a:xfrm>
                       <a:off x="0" y="0"/>
-                      <a:ext cx="5940425" cy="2527300"/>
+                      <a:ext cx="5940425" cy="2047240"/>
                     </a:xfrm>
                     <a:prstGeom prst="rect">
                       <a:avLst/>
@@ -3913,11 +3509,12 @@
           <w:shd w:val="clear" w:color="auto" w:fill="FFFFFF"/>
           <w:lang w:val="en-US"/>
         </w:rPr>
+        <w:lastRenderedPageBreak/>
         <w:drawing>
-          <wp:inline distT="0" distB="0" distL="0" distR="0" wp14:anchorId="3127BFA1" wp14:editId="7F9E26E2">
-            <wp:extent cx="5940425" cy="2898775"/>
-            <wp:effectExtent l="0" t="0" r="3175" b="0"/>
-            <wp:docPr id="74" name="Рисунок 74"/>
+          <wp:inline distT="0" distB="0" distL="0" distR="0" wp14:anchorId="34E66323" wp14:editId="11367FDE">
+            <wp:extent cx="5940425" cy="2527300"/>
+            <wp:effectExtent l="0" t="0" r="3175" b="6350"/>
+            <wp:docPr id="73" name="Рисунок 73"/>
             <wp:cNvGraphicFramePr>
               <a:graphicFrameLocks xmlns:a="http://schemas.openxmlformats.org/drawingml/2006/main" noChangeAspect="1"/>
             </wp:cNvGraphicFramePr>
@@ -3937,7 +3534,7 @@
                   <pic:spPr>
                     <a:xfrm>
                       <a:off x="0" y="0"/>
-                      <a:ext cx="5940425" cy="2898775"/>
+                      <a:ext cx="5940425" cy="2527300"/>
                     </a:xfrm>
                     <a:prstGeom prst="rect">
                       <a:avLst/>
@@ -3953,70 +3550,15 @@
     <w:p>
       <w:pPr>
         <w:pStyle w:val="a4"/>
-        <w:numPr>
-          <w:ilvl w:val="1"/>
-          <w:numId w:val="1"/>
-        </w:numPr>
-        <w:spacing w:after="0"/>
-        <w:ind w:left="0"/>
-        <w:rPr>
-          <w:rFonts w:ascii="Times New Roman" w:hAnsi="Times New Roman" w:cs="Times New Roman"/>
-          <w:color w:val="252525"/>
-          <w:sz w:val="24"/>
-          <w:szCs w:val="24"/>
-          <w:shd w:val="clear" w:color="auto" w:fill="FFFFFF"/>
-        </w:rPr>
-      </w:pPr>
-      <w:r>
-        <w:rPr>
-          <w:rFonts w:ascii="Times New Roman" w:hAnsi="Times New Roman" w:cs="Times New Roman"/>
-          <w:color w:val="252525"/>
-          <w:sz w:val="24"/>
-          <w:szCs w:val="24"/>
-          <w:shd w:val="clear" w:color="auto" w:fill="FFFFFF"/>
-        </w:rPr>
-        <w:t>найдите разницу в изменениях для каждого коммита</w:t>
-      </w:r>
-    </w:p>
-    <w:p>
-      <w:pPr>
-        <w:pStyle w:val="a4"/>
-        <w:numPr>
-          <w:ilvl w:val="1"/>
-          <w:numId w:val="1"/>
-        </w:numPr>
-        <w:spacing w:after="0"/>
-        <w:ind w:left="0"/>
-        <w:rPr>
-          <w:rFonts w:ascii="Times New Roman" w:hAnsi="Times New Roman" w:cs="Times New Roman"/>
-          <w:color w:val="252525"/>
-          <w:sz w:val="24"/>
-          <w:szCs w:val="24"/>
-          <w:shd w:val="clear" w:color="auto" w:fill="FFFFFF"/>
-        </w:rPr>
-      </w:pPr>
-      <w:r>
-        <w:rPr>
-          <w:rFonts w:ascii="Times New Roman" w:hAnsi="Times New Roman" w:cs="Times New Roman"/>
-          <w:color w:val="252525"/>
-          <w:sz w:val="24"/>
-          <w:szCs w:val="24"/>
-          <w:shd w:val="clear" w:color="auto" w:fill="FFFFFF"/>
-        </w:rPr>
-        <w:t>создайте новый файл test.txt и вставьте в него строчку 'номер варианта'. затем сделайте коммит и отмените его</w:t>
-      </w:r>
-    </w:p>
-    <w:p>
-      <w:pPr>
-        <w:pStyle w:val="a4"/>
-        <w:spacing w:after="0"/>
-        <w:ind w:left="0"/>
-        <w:rPr>
-          <w:rFonts w:ascii="Times New Roman" w:hAnsi="Times New Roman" w:cs="Times New Roman"/>
-          <w:color w:val="252525"/>
-          <w:sz w:val="24"/>
-          <w:szCs w:val="24"/>
-          <w:shd w:val="clear" w:color="auto" w:fill="FFFFFF"/>
+        <w:spacing w:after="0"/>
+        <w:ind w:left="0"/>
+        <w:rPr>
+          <w:rFonts w:ascii="Times New Roman" w:hAnsi="Times New Roman" w:cs="Times New Roman"/>
+          <w:color w:val="252525"/>
+          <w:sz w:val="24"/>
+          <w:szCs w:val="24"/>
+          <w:shd w:val="clear" w:color="auto" w:fill="FFFFFF"/>
+          <w:lang w:val="en-US"/>
         </w:rPr>
       </w:pPr>
       <w:r>
@@ -4027,12 +3569,13 @@
           <w:sz w:val="24"/>
           <w:szCs w:val="24"/>
           <w:shd w:val="clear" w:color="auto" w:fill="FFFFFF"/>
+          <w:lang w:val="en-US"/>
         </w:rPr>
         <w:drawing>
-          <wp:inline distT="0" distB="0" distL="0" distR="0" wp14:anchorId="0C07CF6B" wp14:editId="13426CA5">
-            <wp:extent cx="5940425" cy="2677160"/>
-            <wp:effectExtent l="0" t="0" r="3175" b="8890"/>
-            <wp:docPr id="75" name="Рисунок 75"/>
+          <wp:inline distT="0" distB="0" distL="0" distR="0" wp14:anchorId="3127BFA1" wp14:editId="7F9E26E2">
+            <wp:extent cx="5940425" cy="2898775"/>
+            <wp:effectExtent l="0" t="0" r="3175" b="0"/>
+            <wp:docPr id="74" name="Рисунок 74"/>
             <wp:cNvGraphicFramePr>
               <a:graphicFrameLocks xmlns:a="http://schemas.openxmlformats.org/drawingml/2006/main" noChangeAspect="1"/>
             </wp:cNvGraphicFramePr>
@@ -4052,7 +3595,7 @@
                   <pic:spPr>
                     <a:xfrm>
                       <a:off x="0" y="0"/>
-                      <a:ext cx="5940425" cy="2677160"/>
+                      <a:ext cx="5940425" cy="2898775"/>
                     </a:xfrm>
                     <a:prstGeom prst="rect">
                       <a:avLst/>
@@ -4068,6 +3611,62 @@
     <w:p>
       <w:pPr>
         <w:pStyle w:val="a4"/>
+        <w:numPr>
+          <w:ilvl w:val="1"/>
+          <w:numId w:val="1"/>
+        </w:numPr>
+        <w:spacing w:after="0"/>
+        <w:ind w:left="0"/>
+        <w:rPr>
+          <w:rFonts w:ascii="Times New Roman" w:hAnsi="Times New Roman" w:cs="Times New Roman"/>
+          <w:color w:val="252525"/>
+          <w:sz w:val="24"/>
+          <w:szCs w:val="24"/>
+          <w:shd w:val="clear" w:color="auto" w:fill="FFFFFF"/>
+        </w:rPr>
+      </w:pPr>
+      <w:r>
+        <w:rPr>
+          <w:rFonts w:ascii="Times New Roman" w:hAnsi="Times New Roman" w:cs="Times New Roman"/>
+          <w:color w:val="252525"/>
+          <w:sz w:val="24"/>
+          <w:szCs w:val="24"/>
+          <w:shd w:val="clear" w:color="auto" w:fill="FFFFFF"/>
+        </w:rPr>
+        <w:t>найдите разницу в изменениях для каждого коммита</w:t>
+      </w:r>
+    </w:p>
+    <w:p>
+      <w:pPr>
+        <w:pStyle w:val="a4"/>
+        <w:numPr>
+          <w:ilvl w:val="1"/>
+          <w:numId w:val="1"/>
+        </w:numPr>
+        <w:spacing w:after="0"/>
+        <w:ind w:left="0"/>
+        <w:rPr>
+          <w:rFonts w:ascii="Times New Roman" w:hAnsi="Times New Roman" w:cs="Times New Roman"/>
+          <w:color w:val="252525"/>
+          <w:sz w:val="24"/>
+          <w:szCs w:val="24"/>
+          <w:shd w:val="clear" w:color="auto" w:fill="FFFFFF"/>
+        </w:rPr>
+      </w:pPr>
+      <w:r>
+        <w:rPr>
+          <w:rFonts w:ascii="Times New Roman" w:hAnsi="Times New Roman" w:cs="Times New Roman"/>
+          <w:color w:val="252525"/>
+          <w:sz w:val="24"/>
+          <w:szCs w:val="24"/>
+          <w:shd w:val="clear" w:color="auto" w:fill="FFFFFF"/>
+        </w:rPr>
+        <w:t>создайте новый файл test.txt и вставьте в него строчку 'номер варианта'. затем сделайте коммит и отмените его</w:t>
+      </w:r>
+    </w:p>
+    <w:p>
+      <w:pPr>
+        <w:pStyle w:val="a4"/>
         <w:spacing w:after="0"/>
         <w:ind w:left="0"/>
         <w:rPr>
@@ -4087,12 +3686,11 @@
           <w:szCs w:val="24"/>
           <w:shd w:val="clear" w:color="auto" w:fill="FFFFFF"/>
         </w:rPr>
-        <w:lastRenderedPageBreak/>
         <w:drawing>
-          <wp:inline distT="0" distB="0" distL="0" distR="0" wp14:anchorId="68383BAB" wp14:editId="50FC5B51">
-            <wp:extent cx="5940425" cy="1995805"/>
-            <wp:effectExtent l="0" t="0" r="3175" b="4445"/>
-            <wp:docPr id="76" name="Рисунок 76"/>
+          <wp:inline distT="0" distB="0" distL="0" distR="0" wp14:anchorId="0C07CF6B" wp14:editId="13426CA5">
+            <wp:extent cx="5940425" cy="2677160"/>
+            <wp:effectExtent l="0" t="0" r="3175" b="8890"/>
+            <wp:docPr id="75" name="Рисунок 75"/>
             <wp:cNvGraphicFramePr>
               <a:graphicFrameLocks xmlns:a="http://schemas.openxmlformats.org/drawingml/2006/main" noChangeAspect="1"/>
             </wp:cNvGraphicFramePr>
@@ -4112,7 +3710,7 @@
                   <pic:spPr>
                     <a:xfrm>
                       <a:off x="0" y="0"/>
-                      <a:ext cx="5940425" cy="1995805"/>
+                      <a:ext cx="5940425" cy="2677160"/>
                     </a:xfrm>
                     <a:prstGeom prst="rect">
                       <a:avLst/>
@@ -4128,56 +3726,6 @@
     <w:p>
       <w:pPr>
         <w:pStyle w:val="a4"/>
-        <w:numPr>
-          <w:ilvl w:val="1"/>
-          <w:numId w:val="1"/>
-        </w:numPr>
-        <w:spacing w:after="0"/>
-        <w:ind w:left="0"/>
-        <w:rPr>
-          <w:rFonts w:ascii="Times New Roman" w:hAnsi="Times New Roman" w:cs="Times New Roman"/>
-          <w:color w:val="252525"/>
-          <w:sz w:val="24"/>
-          <w:szCs w:val="24"/>
-          <w:shd w:val="clear" w:color="auto" w:fill="FFFFFF"/>
-        </w:rPr>
-      </w:pPr>
-      <w:r>
-        <w:rPr>
-          <w:rFonts w:ascii="Times New Roman" w:hAnsi="Times New Roman" w:cs="Times New Roman"/>
-          <w:color w:val="252525"/>
-          <w:sz w:val="24"/>
-          <w:szCs w:val="24"/>
-          <w:shd w:val="clear" w:color="auto" w:fill="FFFFFF"/>
-        </w:rPr>
-        <w:t xml:space="preserve">проиндексируйте файл в вашем </w:t>
-      </w:r>
-      <w:proofErr w:type="spellStart"/>
-      <w:r>
-        <w:rPr>
-          <w:rFonts w:ascii="Times New Roman" w:hAnsi="Times New Roman" w:cs="Times New Roman"/>
-          <w:color w:val="252525"/>
-          <w:sz w:val="24"/>
-          <w:szCs w:val="24"/>
-          <w:shd w:val="clear" w:color="auto" w:fill="FFFFFF"/>
-        </w:rPr>
-        <w:t>Git</w:t>
-      </w:r>
-      <w:proofErr w:type="spellEnd"/>
-      <w:r>
-        <w:rPr>
-          <w:rFonts w:ascii="Times New Roman" w:hAnsi="Times New Roman" w:cs="Times New Roman"/>
-          <w:color w:val="252525"/>
-          <w:sz w:val="24"/>
-          <w:szCs w:val="24"/>
-          <w:shd w:val="clear" w:color="auto" w:fill="FFFFFF"/>
-        </w:rPr>
-        <w:t>-репозитории, затем отмените его индексацию</w:t>
-      </w:r>
-    </w:p>
-    <w:p>
-      <w:pPr>
-        <w:pStyle w:val="a4"/>
         <w:spacing w:after="0"/>
         <w:ind w:left="0"/>
         <w:rPr>
@@ -4197,11 +3745,12 @@
           <w:szCs w:val="24"/>
           <w:shd w:val="clear" w:color="auto" w:fill="FFFFFF"/>
         </w:rPr>
+        <w:lastRenderedPageBreak/>
         <w:drawing>
-          <wp:inline distT="0" distB="0" distL="0" distR="0" wp14:anchorId="5CFA6CC1" wp14:editId="44878D17">
-            <wp:extent cx="5940425" cy="2402205"/>
-            <wp:effectExtent l="0" t="0" r="3175" b="0"/>
-            <wp:docPr id="77" name="Рисунок 77"/>
+          <wp:inline distT="0" distB="0" distL="0" distR="0" wp14:anchorId="68383BAB" wp14:editId="50FC5B51">
+            <wp:extent cx="5940425" cy="1995805"/>
+            <wp:effectExtent l="0" t="0" r="3175" b="4445"/>
+            <wp:docPr id="76" name="Рисунок 76"/>
             <wp:cNvGraphicFramePr>
               <a:graphicFrameLocks xmlns:a="http://schemas.openxmlformats.org/drawingml/2006/main" noChangeAspect="1"/>
             </wp:cNvGraphicFramePr>
@@ -4221,7 +3770,7 @@
                   <pic:spPr>
                     <a:xfrm>
                       <a:off x="0" y="0"/>
-                      <a:ext cx="5940425" cy="2402205"/>
+                      <a:ext cx="5940425" cy="1995805"/>
                     </a:xfrm>
                     <a:prstGeom prst="rect">
                       <a:avLst/>
@@ -4237,6 +3786,34 @@
     <w:p>
       <w:pPr>
         <w:pStyle w:val="a4"/>
+        <w:numPr>
+          <w:ilvl w:val="1"/>
+          <w:numId w:val="1"/>
+        </w:numPr>
+        <w:spacing w:after="0"/>
+        <w:ind w:left="0"/>
+        <w:rPr>
+          <w:rFonts w:ascii="Times New Roman" w:hAnsi="Times New Roman" w:cs="Times New Roman"/>
+          <w:color w:val="252525"/>
+          <w:sz w:val="24"/>
+          <w:szCs w:val="24"/>
+          <w:shd w:val="clear" w:color="auto" w:fill="FFFFFF"/>
+        </w:rPr>
+      </w:pPr>
+      <w:r>
+        <w:rPr>
+          <w:rFonts w:ascii="Times New Roman" w:hAnsi="Times New Roman" w:cs="Times New Roman"/>
+          <w:color w:val="252525"/>
+          <w:sz w:val="24"/>
+          <w:szCs w:val="24"/>
+          <w:shd w:val="clear" w:color="auto" w:fill="FFFFFF"/>
+        </w:rPr>
+        <w:t>проиндексируйте файл в вашем Git-репозитории, затем отмените его индексацию</w:t>
+      </w:r>
+    </w:p>
+    <w:p>
+      <w:pPr>
+        <w:pStyle w:val="a4"/>
         <w:spacing w:after="0"/>
         <w:ind w:left="0"/>
         <w:rPr>
@@ -4257,10 +3834,10 @@
           <w:shd w:val="clear" w:color="auto" w:fill="FFFFFF"/>
         </w:rPr>
         <w:drawing>
-          <wp:inline distT="0" distB="0" distL="0" distR="0" wp14:anchorId="47137FA1" wp14:editId="65F30015">
-            <wp:extent cx="5940425" cy="1958975"/>
-            <wp:effectExtent l="0" t="0" r="3175" b="3175"/>
-            <wp:docPr id="78" name="Рисунок 78"/>
+          <wp:inline distT="0" distB="0" distL="0" distR="0" wp14:anchorId="5CFA6CC1" wp14:editId="44878D17">
+            <wp:extent cx="5940425" cy="2402205"/>
+            <wp:effectExtent l="0" t="0" r="3175" b="0"/>
+            <wp:docPr id="77" name="Рисунок 77"/>
             <wp:cNvGraphicFramePr>
               <a:graphicFrameLocks xmlns:a="http://schemas.openxmlformats.org/drawingml/2006/main" noChangeAspect="1"/>
             </wp:cNvGraphicFramePr>
@@ -4280,7 +3857,7 @@
                   <pic:spPr>
                     <a:xfrm>
                       <a:off x="0" y="0"/>
-                      <a:ext cx="5940425" cy="1958975"/>
+                      <a:ext cx="5940425" cy="2402205"/>
                     </a:xfrm>
                     <a:prstGeom prst="rect">
                       <a:avLst/>
@@ -4296,56 +3873,6 @@
     <w:p>
       <w:pPr>
         <w:pStyle w:val="a4"/>
-        <w:numPr>
-          <w:ilvl w:val="1"/>
-          <w:numId w:val="1"/>
-        </w:numPr>
-        <w:spacing w:after="0"/>
-        <w:ind w:left="0"/>
-        <w:rPr>
-          <w:rFonts w:ascii="Times New Roman" w:hAnsi="Times New Roman" w:cs="Times New Roman"/>
-          <w:color w:val="252525"/>
-          <w:sz w:val="24"/>
-          <w:szCs w:val="24"/>
-          <w:shd w:val="clear" w:color="auto" w:fill="FFFFFF"/>
-        </w:rPr>
-      </w:pPr>
-      <w:r>
-        <w:rPr>
-          <w:rFonts w:ascii="Times New Roman" w:hAnsi="Times New Roman" w:cs="Times New Roman"/>
-          <w:color w:val="252525"/>
-          <w:sz w:val="24"/>
-          <w:szCs w:val="24"/>
-          <w:shd w:val="clear" w:color="auto" w:fill="FFFFFF"/>
-        </w:rPr>
-        <w:t xml:space="preserve">внесите изменения в файл в вашем </w:t>
-      </w:r>
-      <w:proofErr w:type="spellStart"/>
-      <w:r>
-        <w:rPr>
-          <w:rFonts w:ascii="Times New Roman" w:hAnsi="Times New Roman" w:cs="Times New Roman"/>
-          <w:color w:val="252525"/>
-          <w:sz w:val="24"/>
-          <w:szCs w:val="24"/>
-          <w:shd w:val="clear" w:color="auto" w:fill="FFFFFF"/>
-        </w:rPr>
-        <w:t>Git</w:t>
-      </w:r>
-      <w:proofErr w:type="spellEnd"/>
-      <w:r>
-        <w:rPr>
-          <w:rFonts w:ascii="Times New Roman" w:hAnsi="Times New Roman" w:cs="Times New Roman"/>
-          <w:color w:val="252525"/>
-          <w:sz w:val="24"/>
-          <w:szCs w:val="24"/>
-          <w:shd w:val="clear" w:color="auto" w:fill="FFFFFF"/>
-        </w:rPr>
-        <w:t>-репозитории и затем верните его в исходное состояние.</w:t>
-      </w:r>
-    </w:p>
-    <w:p>
-      <w:pPr>
-        <w:pStyle w:val="a4"/>
         <w:spacing w:after="0"/>
         <w:ind w:left="0"/>
         <w:rPr>
@@ -4366,10 +3893,10 @@
           <w:shd w:val="clear" w:color="auto" w:fill="FFFFFF"/>
         </w:rPr>
         <w:drawing>
-          <wp:inline distT="0" distB="0" distL="0" distR="0" wp14:anchorId="32540901" wp14:editId="64E22A39">
-            <wp:extent cx="5940425" cy="1023620"/>
-            <wp:effectExtent l="0" t="0" r="3175" b="5080"/>
-            <wp:docPr id="79" name="Рисунок 79"/>
+          <wp:inline distT="0" distB="0" distL="0" distR="0" wp14:anchorId="47137FA1" wp14:editId="65F30015">
+            <wp:extent cx="5940425" cy="1958975"/>
+            <wp:effectExtent l="0" t="0" r="3175" b="3175"/>
+            <wp:docPr id="78" name="Рисунок 78"/>
             <wp:cNvGraphicFramePr>
               <a:graphicFrameLocks xmlns:a="http://schemas.openxmlformats.org/drawingml/2006/main" noChangeAspect="1"/>
             </wp:cNvGraphicFramePr>
@@ -4389,7 +3916,7 @@
                   <pic:spPr>
                     <a:xfrm>
                       <a:off x="0" y="0"/>
-                      <a:ext cx="5940425" cy="1023620"/>
+                      <a:ext cx="5940425" cy="1958975"/>
                     </a:xfrm>
                     <a:prstGeom prst="rect">
                       <a:avLst/>
@@ -4406,32 +3933,6 @@
       <w:pPr>
         <w:pStyle w:val="a4"/>
         <w:numPr>
-          <w:ilvl w:val="0"/>
-          <w:numId w:val="1"/>
-        </w:numPr>
-        <w:spacing w:after="0"/>
-        <w:ind w:left="0"/>
-        <w:rPr>
-          <w:rFonts w:ascii="Times New Roman" w:hAnsi="Times New Roman" w:cs="Times New Roman"/>
-          <w:i/>
-          <w:sz w:val="24"/>
-          <w:szCs w:val="24"/>
-        </w:rPr>
-      </w:pPr>
-      <w:r>
-        <w:rPr>
-          <w:rFonts w:ascii="Times New Roman" w:hAnsi="Times New Roman" w:cs="Times New Roman"/>
-          <w:i/>
-          <w:sz w:val="24"/>
-          <w:szCs w:val="24"/>
-        </w:rPr>
-        <w:t>Выполните следующие действия с удаленным репозиторием:</w:t>
-      </w:r>
-    </w:p>
-    <w:p>
-      <w:pPr>
-        <w:pStyle w:val="a4"/>
-        <w:numPr>
           <w:ilvl w:val="1"/>
           <w:numId w:val="1"/>
         </w:numPr>
@@ -4453,7 +3954,7 @@
           <w:szCs w:val="24"/>
           <w:shd w:val="clear" w:color="auto" w:fill="FFFFFF"/>
         </w:rPr>
-        <w:t>создайте удаленный репозиторий (на github.com)</w:t>
+        <w:t>внесите изменения в файл в вашем Git-репозитории и затем верните его в исходное состояние.</w:t>
       </w:r>
     </w:p>
     <w:p>
@@ -4479,10 +3980,10 @@
           <w:shd w:val="clear" w:color="auto" w:fill="FFFFFF"/>
         </w:rPr>
         <w:drawing>
-          <wp:inline distT="0" distB="0" distL="0" distR="0" wp14:anchorId="68ED5FEB" wp14:editId="3CD3A7BC">
-            <wp:extent cx="5940425" cy="444500"/>
-            <wp:effectExtent l="0" t="0" r="3175" b="0"/>
-            <wp:docPr id="80" name="Рисунок 80"/>
+          <wp:inline distT="0" distB="0" distL="0" distR="0" wp14:anchorId="32540901" wp14:editId="64E22A39">
+            <wp:extent cx="5940425" cy="1023620"/>
+            <wp:effectExtent l="0" t="0" r="3175" b="5080"/>
+            <wp:docPr id="79" name="Рисунок 79"/>
             <wp:cNvGraphicFramePr>
               <a:graphicFrameLocks xmlns:a="http://schemas.openxmlformats.org/drawingml/2006/main" noChangeAspect="1"/>
             </wp:cNvGraphicFramePr>
@@ -4502,7 +4003,7 @@
                   <pic:spPr>
                     <a:xfrm>
                       <a:off x="0" y="0"/>
-                      <a:ext cx="5940425" cy="444500"/>
+                      <a:ext cx="5940425" cy="1023620"/>
                     </a:xfrm>
                     <a:prstGeom prst="rect">
                       <a:avLst/>
@@ -4518,6 +4019,60 @@
     <w:p>
       <w:pPr>
         <w:pStyle w:val="a4"/>
+        <w:numPr>
+          <w:ilvl w:val="0"/>
+          <w:numId w:val="1"/>
+        </w:numPr>
+        <w:spacing w:after="0"/>
+        <w:ind w:left="0"/>
+        <w:rPr>
+          <w:rFonts w:ascii="Times New Roman" w:hAnsi="Times New Roman" w:cs="Times New Roman"/>
+          <w:i/>
+          <w:sz w:val="24"/>
+          <w:szCs w:val="24"/>
+        </w:rPr>
+      </w:pPr>
+      <w:r>
+        <w:rPr>
+          <w:rFonts w:ascii="Times New Roman" w:hAnsi="Times New Roman" w:cs="Times New Roman"/>
+          <w:i/>
+          <w:sz w:val="24"/>
+          <w:szCs w:val="24"/>
+        </w:rPr>
+        <w:t>Выполните следующие действия с удаленным репозиторием:</w:t>
+      </w:r>
+    </w:p>
+    <w:p>
+      <w:pPr>
+        <w:pStyle w:val="a4"/>
+        <w:numPr>
+          <w:ilvl w:val="1"/>
+          <w:numId w:val="1"/>
+        </w:numPr>
+        <w:spacing w:after="0"/>
+        <w:ind w:left="0"/>
+        <w:rPr>
+          <w:rFonts w:ascii="Times New Roman" w:hAnsi="Times New Roman" w:cs="Times New Roman"/>
+          <w:color w:val="252525"/>
+          <w:sz w:val="24"/>
+          <w:szCs w:val="24"/>
+          <w:shd w:val="clear" w:color="auto" w:fill="FFFFFF"/>
+        </w:rPr>
+      </w:pPr>
+      <w:r>
+        <w:rPr>
+          <w:rFonts w:ascii="Times New Roman" w:hAnsi="Times New Roman" w:cs="Times New Roman"/>
+          <w:color w:val="252525"/>
+          <w:sz w:val="24"/>
+          <w:szCs w:val="24"/>
+          <w:shd w:val="clear" w:color="auto" w:fill="FFFFFF"/>
+        </w:rPr>
+        <w:t>создайте удаленный репозиторий (на github.com)</w:t>
+      </w:r>
+    </w:p>
+    <w:p>
+      <w:pPr>
+        <w:pStyle w:val="a4"/>
         <w:spacing w:after="0"/>
         <w:ind w:left="0"/>
         <w:rPr>
@@ -4537,12 +4092,11 @@
           <w:szCs w:val="24"/>
           <w:shd w:val="clear" w:color="auto" w:fill="FFFFFF"/>
         </w:rPr>
-        <w:lastRenderedPageBreak/>
         <w:drawing>
-          <wp:inline distT="0" distB="0" distL="0" distR="0" wp14:anchorId="25D80A0D" wp14:editId="19A19948">
-            <wp:extent cx="5940425" cy="2586990"/>
-            <wp:effectExtent l="0" t="0" r="3175" b="3810"/>
-            <wp:docPr id="81" name="Рисунок 81"/>
+          <wp:inline distT="0" distB="0" distL="0" distR="0" wp14:anchorId="68ED5FEB" wp14:editId="3CD3A7BC">
+            <wp:extent cx="5940425" cy="444500"/>
+            <wp:effectExtent l="0" t="0" r="3175" b="0"/>
+            <wp:docPr id="80" name="Рисунок 80"/>
             <wp:cNvGraphicFramePr>
               <a:graphicFrameLocks xmlns:a="http://schemas.openxmlformats.org/drawingml/2006/main" noChangeAspect="1"/>
             </wp:cNvGraphicFramePr>
@@ -4562,7 +4116,7 @@
                   <pic:spPr>
                     <a:xfrm>
                       <a:off x="0" y="0"/>
-                      <a:ext cx="5940425" cy="2586990"/>
+                      <a:ext cx="5940425" cy="444500"/>
                     </a:xfrm>
                     <a:prstGeom prst="rect">
                       <a:avLst/>
@@ -4578,102 +4132,31 @@
     <w:p>
       <w:pPr>
         <w:pStyle w:val="a4"/>
-        <w:numPr>
-          <w:ilvl w:val="1"/>
-          <w:numId w:val="1"/>
-        </w:numPr>
-        <w:spacing w:after="0"/>
-        <w:ind w:left="0"/>
-        <w:rPr>
-          <w:rFonts w:ascii="Times New Roman" w:hAnsi="Times New Roman" w:cs="Times New Roman"/>
-          <w:color w:val="252525"/>
-          <w:sz w:val="24"/>
-          <w:szCs w:val="24"/>
-          <w:shd w:val="clear" w:color="auto" w:fill="FFFFFF"/>
-        </w:rPr>
-      </w:pPr>
-      <w:r>
-        <w:rPr>
-          <w:rFonts w:ascii="Times New Roman" w:hAnsi="Times New Roman" w:cs="Times New Roman"/>
-          <w:color w:val="252525"/>
-          <w:sz w:val="24"/>
-          <w:szCs w:val="24"/>
-          <w:shd w:val="clear" w:color="auto" w:fill="FFFFFF"/>
-        </w:rPr>
-        <w:t>просмотрите информацию о нем, внесите изменения и опять просмотрите (</w:t>
-      </w:r>
-      <w:proofErr w:type="spellStart"/>
-      <w:r>
-        <w:rPr>
-          <w:rFonts w:ascii="Times New Roman" w:hAnsi="Times New Roman" w:cs="Times New Roman"/>
-          <w:color w:val="252525"/>
-          <w:sz w:val="24"/>
-          <w:szCs w:val="24"/>
-          <w:shd w:val="clear" w:color="auto" w:fill="FFFFFF"/>
-        </w:rPr>
-        <w:t>remote</w:t>
-      </w:r>
-      <w:proofErr w:type="spellEnd"/>
-      <w:r>
-        <w:rPr>
-          <w:rFonts w:ascii="Times New Roman" w:hAnsi="Times New Roman" w:cs="Times New Roman"/>
-          <w:color w:val="252525"/>
-          <w:sz w:val="24"/>
-          <w:szCs w:val="24"/>
-          <w:shd w:val="clear" w:color="auto" w:fill="FFFFFF"/>
-        </w:rPr>
-        <w:t xml:space="preserve">, </w:t>
-      </w:r>
-      <w:r>
-        <w:rPr>
-          <w:rFonts w:ascii="Times New Roman" w:hAnsi="Times New Roman" w:cs="Times New Roman"/>
-          <w:color w:val="252525"/>
-          <w:sz w:val="24"/>
-          <w:szCs w:val="24"/>
-          <w:shd w:val="clear" w:color="auto" w:fill="FFFFFF"/>
-          <w:lang w:val="en-US"/>
-        </w:rPr>
-        <w:t>fetch</w:t>
-      </w:r>
-      <w:r>
-        <w:rPr>
-          <w:rFonts w:ascii="Times New Roman" w:hAnsi="Times New Roman" w:cs="Times New Roman"/>
-          <w:color w:val="252525"/>
-          <w:sz w:val="24"/>
-          <w:szCs w:val="24"/>
-          <w:shd w:val="clear" w:color="auto" w:fill="FFFFFF"/>
-        </w:rPr>
-        <w:t>).</w:t>
-      </w:r>
-    </w:p>
-    <w:p>
-      <w:pPr>
-        <w:pStyle w:val="a4"/>
-        <w:spacing w:after="0"/>
-        <w:ind w:left="0"/>
-        <w:rPr>
-          <w:rFonts w:ascii="Times New Roman" w:hAnsi="Times New Roman" w:cs="Times New Roman"/>
-          <w:color w:val="252525"/>
-          <w:sz w:val="24"/>
-          <w:szCs w:val="24"/>
-          <w:shd w:val="clear" w:color="auto" w:fill="FFFFFF"/>
-          <w:lang w:val="en-US"/>
-        </w:rPr>
-      </w:pPr>
-      <w:r>
-        <w:rPr>
-          <w:rFonts w:ascii="Times New Roman" w:hAnsi="Times New Roman" w:cs="Times New Roman"/>
-          <w:color w:val="252525"/>
-          <w:sz w:val="24"/>
-          <w:szCs w:val="24"/>
-          <w:shd w:val="clear" w:color="auto" w:fill="FFFFFF"/>
-          <w:lang w:val="en-US"/>
-        </w:rPr>
+        <w:spacing w:after="0"/>
+        <w:ind w:left="0"/>
+        <w:rPr>
+          <w:rFonts w:ascii="Times New Roman" w:hAnsi="Times New Roman" w:cs="Times New Roman"/>
+          <w:color w:val="252525"/>
+          <w:sz w:val="24"/>
+          <w:szCs w:val="24"/>
+          <w:shd w:val="clear" w:color="auto" w:fill="FFFFFF"/>
+        </w:rPr>
+      </w:pPr>
+      <w:r>
+        <w:rPr>
+          <w:rFonts w:ascii="Times New Roman" w:hAnsi="Times New Roman" w:cs="Times New Roman"/>
+          <w:noProof/>
+          <w:color w:val="252525"/>
+          <w:sz w:val="24"/>
+          <w:szCs w:val="24"/>
+          <w:shd w:val="clear" w:color="auto" w:fill="FFFFFF"/>
+        </w:rPr>
+        <w:lastRenderedPageBreak/>
         <w:drawing>
-          <wp:inline distT="0" distB="0" distL="0" distR="0" wp14:anchorId="7854B11E" wp14:editId="4FADF1EC">
-            <wp:extent cx="5940425" cy="728345"/>
-            <wp:effectExtent l="0" t="0" r="3175" b="0"/>
-            <wp:docPr id="7" name="Рисунок 7"/>
+          <wp:inline distT="0" distB="0" distL="0" distR="0" wp14:anchorId="25D80A0D" wp14:editId="19A19948">
+            <wp:extent cx="5940425" cy="2586990"/>
+            <wp:effectExtent l="0" t="0" r="3175" b="3810"/>
+            <wp:docPr id="81" name="Рисунок 81"/>
             <wp:cNvGraphicFramePr>
               <a:graphicFrameLocks xmlns:a="http://schemas.openxmlformats.org/drawingml/2006/main" noChangeAspect="1"/>
             </wp:cNvGraphicFramePr>
@@ -4693,7 +4176,7 @@
                   <pic:spPr>
                     <a:xfrm>
                       <a:off x="0" y="0"/>
-                      <a:ext cx="5940425" cy="728345"/>
+                      <a:ext cx="5940425" cy="2586990"/>
                     </a:xfrm>
                     <a:prstGeom prst="rect">
                       <a:avLst/>
@@ -4709,16 +4192,30 @@
     <w:p>
       <w:pPr>
         <w:pStyle w:val="a4"/>
-        <w:spacing w:after="0"/>
-        <w:ind w:left="0"/>
-        <w:rPr>
-          <w:rFonts w:ascii="Times New Roman" w:hAnsi="Times New Roman" w:cs="Times New Roman"/>
-          <w:color w:val="252525"/>
-          <w:sz w:val="24"/>
-          <w:szCs w:val="24"/>
-          <w:shd w:val="clear" w:color="auto" w:fill="FFFFFF"/>
-        </w:rPr>
-      </w:pPr>
+        <w:numPr>
+          <w:ilvl w:val="1"/>
+          <w:numId w:val="1"/>
+        </w:numPr>
+        <w:spacing w:after="0"/>
+        <w:ind w:left="0"/>
+        <w:rPr>
+          <w:rFonts w:ascii="Times New Roman" w:hAnsi="Times New Roman" w:cs="Times New Roman"/>
+          <w:color w:val="252525"/>
+          <w:sz w:val="24"/>
+          <w:szCs w:val="24"/>
+          <w:shd w:val="clear" w:color="auto" w:fill="FFFFFF"/>
+        </w:rPr>
+      </w:pPr>
+      <w:r>
+        <w:rPr>
+          <w:rFonts w:ascii="Times New Roman" w:hAnsi="Times New Roman" w:cs="Times New Roman"/>
+          <w:color w:val="252525"/>
+          <w:sz w:val="24"/>
+          <w:szCs w:val="24"/>
+          <w:shd w:val="clear" w:color="auto" w:fill="FFFFFF"/>
+        </w:rPr>
+        <w:t xml:space="preserve">просмотрите информацию о нем, внесите изменения и опять просмотрите (remote, </w:t>
+      </w:r>
       <w:r>
         <w:rPr>
           <w:rFonts w:ascii="Times New Roman" w:hAnsi="Times New Roman" w:cs="Times New Roman"/>
@@ -4728,11 +4225,48 @@
           <w:shd w:val="clear" w:color="auto" w:fill="FFFFFF"/>
           <w:lang w:val="en-US"/>
         </w:rPr>
+        <w:t>fetch</w:t>
+      </w:r>
+      <w:r>
+        <w:rPr>
+          <w:rFonts w:ascii="Times New Roman" w:hAnsi="Times New Roman" w:cs="Times New Roman"/>
+          <w:color w:val="252525"/>
+          <w:sz w:val="24"/>
+          <w:szCs w:val="24"/>
+          <w:shd w:val="clear" w:color="auto" w:fill="FFFFFF"/>
+        </w:rPr>
+        <w:t>).</w:t>
+      </w:r>
+    </w:p>
+    <w:p>
+      <w:pPr>
+        <w:pStyle w:val="a4"/>
+        <w:spacing w:after="0"/>
+        <w:ind w:left="0"/>
+        <w:rPr>
+          <w:rFonts w:ascii="Times New Roman" w:hAnsi="Times New Roman" w:cs="Times New Roman"/>
+          <w:color w:val="252525"/>
+          <w:sz w:val="24"/>
+          <w:szCs w:val="24"/>
+          <w:shd w:val="clear" w:color="auto" w:fill="FFFFFF"/>
+          <w:lang w:val="en-US"/>
+        </w:rPr>
+      </w:pPr>
+      <w:r>
+        <w:rPr>
+          <w:rFonts w:ascii="Times New Roman" w:hAnsi="Times New Roman" w:cs="Times New Roman"/>
+          <w:noProof/>
+          <w:color w:val="252525"/>
+          <w:sz w:val="24"/>
+          <w:szCs w:val="24"/>
+          <w:shd w:val="clear" w:color="auto" w:fill="FFFFFF"/>
+          <w:lang w:val="en-US"/>
+        </w:rPr>
         <w:drawing>
-          <wp:inline distT="0" distB="0" distL="0" distR="0" wp14:anchorId="0049A5FE" wp14:editId="7ED393E1">
-            <wp:extent cx="5940425" cy="1166495"/>
+          <wp:inline distT="0" distB="0" distL="0" distR="0" wp14:anchorId="7854B11E" wp14:editId="4FADF1EC">
+            <wp:extent cx="5940425" cy="728345"/>
             <wp:effectExtent l="0" t="0" r="3175" b="0"/>
-            <wp:docPr id="9" name="Рисунок 9"/>
+            <wp:docPr id="7" name="Рисунок 7"/>
             <wp:cNvGraphicFramePr>
               <a:graphicFrameLocks xmlns:a="http://schemas.openxmlformats.org/drawingml/2006/main" noChangeAspect="1"/>
             </wp:cNvGraphicFramePr>
@@ -4752,7 +4286,7 @@
                   <pic:spPr>
                     <a:xfrm>
                       <a:off x="0" y="0"/>
-                      <a:ext cx="5940425" cy="1166495"/>
+                      <a:ext cx="5940425" cy="728345"/>
                     </a:xfrm>
                     <a:prstGeom prst="rect">
                       <a:avLst/>
@@ -4781,16 +4315,18 @@
       <w:r>
         <w:rPr>
           <w:rFonts w:ascii="Times New Roman" w:hAnsi="Times New Roman" w:cs="Times New Roman"/>
-          <w:color w:val="252525"/>
-          <w:sz w:val="24"/>
-          <w:szCs w:val="24"/>
-          <w:shd w:val="clear" w:color="auto" w:fill="FFFFFF"/>
+          <w:noProof/>
+          <w:color w:val="252525"/>
+          <w:sz w:val="24"/>
+          <w:szCs w:val="24"/>
+          <w:shd w:val="clear" w:color="auto" w:fill="FFFFFF"/>
+          <w:lang w:val="en-US"/>
         </w:rPr>
         <w:drawing>
-          <wp:inline distT="0" distB="0" distL="0" distR="0" wp14:anchorId="389B1A96" wp14:editId="0629A6E0">
-            <wp:extent cx="5940425" cy="2996565"/>
+          <wp:inline distT="0" distB="0" distL="0" distR="0" wp14:anchorId="0049A5FE" wp14:editId="7ED393E1">
+            <wp:extent cx="5940425" cy="1166495"/>
             <wp:effectExtent l="0" t="0" r="3175" b="0"/>
-            <wp:docPr id="17" name="Рисунок 17"/>
+            <wp:docPr id="9" name="Рисунок 9"/>
             <wp:cNvGraphicFramePr>
               <a:graphicFrameLocks xmlns:a="http://schemas.openxmlformats.org/drawingml/2006/main" noChangeAspect="1"/>
             </wp:cNvGraphicFramePr>
@@ -4810,6 +4346,65 @@
                   <pic:spPr>
                     <a:xfrm>
                       <a:off x="0" y="0"/>
+                      <a:ext cx="5940425" cy="1166495"/>
+                    </a:xfrm>
+                    <a:prstGeom prst="rect">
+                      <a:avLst/>
+                    </a:prstGeom>
+                  </pic:spPr>
+                </pic:pic>
+              </a:graphicData>
+            </a:graphic>
+          </wp:inline>
+        </w:drawing>
+      </w:r>
+    </w:p>
+    <w:p>
+      <w:pPr>
+        <w:pStyle w:val="a4"/>
+        <w:spacing w:after="0"/>
+        <w:ind w:left="0"/>
+        <w:rPr>
+          <w:rFonts w:ascii="Times New Roman" w:hAnsi="Times New Roman" w:cs="Times New Roman"/>
+          <w:color w:val="252525"/>
+          <w:sz w:val="24"/>
+          <w:szCs w:val="24"/>
+          <w:shd w:val="clear" w:color="auto" w:fill="FFFFFF"/>
+        </w:rPr>
+      </w:pPr>
+      <w:r>
+        <w:rPr>
+          <w:rFonts w:ascii="Times New Roman" w:hAnsi="Times New Roman" w:cs="Times New Roman"/>
+          <w:noProof/>
+          <w:color w:val="252525"/>
+          <w:sz w:val="24"/>
+          <w:szCs w:val="24"/>
+          <w:shd w:val="clear" w:color="auto" w:fill="FFFFFF"/>
+        </w:rPr>
+        <w:drawing>
+          <wp:inline distT="0" distB="0" distL="0" distR="0" wp14:anchorId="389B1A96" wp14:editId="0629A6E0">
+            <wp:extent cx="5940425" cy="2996565"/>
+            <wp:effectExtent l="0" t="0" r="3175" b="0"/>
+            <wp:docPr id="17" name="Рисунок 17"/>
+            <wp:cNvGraphicFramePr>
+              <a:graphicFrameLocks xmlns:a="http://schemas.openxmlformats.org/drawingml/2006/main" noChangeAspect="1"/>
+            </wp:cNvGraphicFramePr>
+            <a:graphic xmlns:a="http://schemas.openxmlformats.org/drawingml/2006/main">
+              <a:graphicData uri="http://schemas.openxmlformats.org/drawingml/2006/picture">
+                <pic:pic xmlns:pic="http://schemas.openxmlformats.org/drawingml/2006/picture">
+                  <pic:nvPicPr>
+                    <pic:cNvPr id="1" name=""/>
+                    <pic:cNvPicPr/>
+                  </pic:nvPicPr>
+                  <pic:blipFill>
+                    <a:blip r:embed="rId60"/>
+                    <a:stretch>
+                      <a:fillRect/>
+                    </a:stretch>
+                  </pic:blipFill>
+                  <pic:spPr>
+                    <a:xfrm>
+                      <a:off x="0" y="0"/>
                       <a:ext cx="5940425" cy="2996565"/>
                     </a:xfrm>
                     <a:prstGeom prst="rect">
@@ -4854,6 +4449,184 @@
     <w:p>
       <w:pPr>
         <w:pStyle w:val="a4"/>
+        <w:spacing w:after="0"/>
+        <w:ind w:left="0"/>
+        <w:rPr>
+          <w:rFonts w:ascii="Times New Roman" w:hAnsi="Times New Roman" w:cs="Times New Roman"/>
+          <w:color w:val="252525"/>
+          <w:sz w:val="24"/>
+          <w:szCs w:val="24"/>
+          <w:shd w:val="clear" w:color="auto" w:fill="FFFFFF"/>
+        </w:rPr>
+      </w:pPr>
+      <w:r>
+        <w:rPr>
+          <w:rFonts w:ascii="Times New Roman" w:hAnsi="Times New Roman" w:cs="Times New Roman"/>
+          <w:color w:val="252525"/>
+          <w:sz w:val="24"/>
+          <w:szCs w:val="24"/>
+          <w:shd w:val="clear" w:color="auto" w:fill="FFFFFF"/>
+        </w:rPr>
+        <w:drawing>
+          <wp:inline distT="0" distB="0" distL="0" distR="0" wp14:anchorId="55F00603" wp14:editId="2BF1F74D">
+            <wp:extent cx="5940425" cy="398145"/>
+            <wp:effectExtent l="0" t="0" r="3175" b="1905"/>
+            <wp:docPr id="15" name="Рисунок 15"/>
+            <wp:cNvGraphicFramePr>
+              <a:graphicFrameLocks xmlns:a="http://schemas.openxmlformats.org/drawingml/2006/main" noChangeAspect="1"/>
+            </wp:cNvGraphicFramePr>
+            <a:graphic xmlns:a="http://schemas.openxmlformats.org/drawingml/2006/main">
+              <a:graphicData uri="http://schemas.openxmlformats.org/drawingml/2006/picture">
+                <pic:pic xmlns:pic="http://schemas.openxmlformats.org/drawingml/2006/picture">
+                  <pic:nvPicPr>
+                    <pic:cNvPr id="1" name=""/>
+                    <pic:cNvPicPr/>
+                  </pic:nvPicPr>
+                  <pic:blipFill>
+                    <a:blip r:embed="rId61"/>
+                    <a:stretch>
+                      <a:fillRect/>
+                    </a:stretch>
+                  </pic:blipFill>
+                  <pic:spPr>
+                    <a:xfrm>
+                      <a:off x="0" y="0"/>
+                      <a:ext cx="5940425" cy="398145"/>
+                    </a:xfrm>
+                    <a:prstGeom prst="rect">
+                      <a:avLst/>
+                    </a:prstGeom>
+                  </pic:spPr>
+                </pic:pic>
+              </a:graphicData>
+            </a:graphic>
+          </wp:inline>
+        </w:drawing>
+      </w:r>
+    </w:p>
+    <w:p>
+      <w:pPr>
+        <w:pStyle w:val="a4"/>
+        <w:spacing w:after="0"/>
+        <w:ind w:left="0"/>
+        <w:rPr>
+          <w:rFonts w:ascii="Times New Roman" w:hAnsi="Times New Roman" w:cs="Times New Roman"/>
+          <w:color w:val="252525"/>
+          <w:sz w:val="24"/>
+          <w:szCs w:val="24"/>
+          <w:shd w:val="clear" w:color="auto" w:fill="FFFFFF"/>
+          <w:lang w:val="en-US"/>
+        </w:rPr>
+      </w:pPr>
+      <w:r>
+        <w:rPr>
+          <w:rFonts w:ascii="Times New Roman" w:hAnsi="Times New Roman" w:cs="Times New Roman"/>
+          <w:color w:val="252525"/>
+          <w:sz w:val="24"/>
+          <w:szCs w:val="24"/>
+          <w:shd w:val="clear" w:color="auto" w:fill="FFFFFF"/>
+        </w:rPr>
+        <w:lastRenderedPageBreak/>
+        <w:drawing>
+          <wp:inline distT="0" distB="0" distL="0" distR="0" wp14:anchorId="05529C94" wp14:editId="5175C629">
+            <wp:extent cx="5940425" cy="2404110"/>
+            <wp:effectExtent l="0" t="0" r="3175" b="0"/>
+            <wp:docPr id="18" name="Рисунок 18"/>
+            <wp:cNvGraphicFramePr>
+              <a:graphicFrameLocks xmlns:a="http://schemas.openxmlformats.org/drawingml/2006/main" noChangeAspect="1"/>
+            </wp:cNvGraphicFramePr>
+            <a:graphic xmlns:a="http://schemas.openxmlformats.org/drawingml/2006/main">
+              <a:graphicData uri="http://schemas.openxmlformats.org/drawingml/2006/picture">
+                <pic:pic xmlns:pic="http://schemas.openxmlformats.org/drawingml/2006/picture">
+                  <pic:nvPicPr>
+                    <pic:cNvPr id="1" name=""/>
+                    <pic:cNvPicPr/>
+                  </pic:nvPicPr>
+                  <pic:blipFill>
+                    <a:blip r:embed="rId62"/>
+                    <a:stretch>
+                      <a:fillRect/>
+                    </a:stretch>
+                  </pic:blipFill>
+                  <pic:spPr>
+                    <a:xfrm>
+                      <a:off x="0" y="0"/>
+                      <a:ext cx="5940425" cy="2404110"/>
+                    </a:xfrm>
+                    <a:prstGeom prst="rect">
+                      <a:avLst/>
+                    </a:prstGeom>
+                  </pic:spPr>
+                </pic:pic>
+              </a:graphicData>
+            </a:graphic>
+          </wp:inline>
+        </w:drawing>
+      </w:r>
+    </w:p>
+    <w:p>
+      <w:pPr>
+        <w:pStyle w:val="a4"/>
+        <w:spacing w:after="0"/>
+        <w:ind w:left="0"/>
+        <w:rPr>
+          <w:rFonts w:ascii="Times New Roman" w:hAnsi="Times New Roman" w:cs="Times New Roman"/>
+          <w:color w:val="252525"/>
+          <w:sz w:val="24"/>
+          <w:szCs w:val="24"/>
+          <w:shd w:val="clear" w:color="auto" w:fill="FFFFFF"/>
+          <w:lang w:val="en-US"/>
+        </w:rPr>
+      </w:pPr>
+      <w:r>
+        <w:rPr>
+          <w:rFonts w:ascii="Times New Roman" w:hAnsi="Times New Roman" w:cs="Times New Roman"/>
+          <w:color w:val="252525"/>
+          <w:sz w:val="24"/>
+          <w:szCs w:val="24"/>
+          <w:shd w:val="clear" w:color="auto" w:fill="FFFFFF"/>
+          <w:lang w:val="en-US"/>
+        </w:rPr>
+        <w:drawing>
+          <wp:inline distT="0" distB="0" distL="0" distR="0" wp14:anchorId="74411D6C" wp14:editId="00A7F633">
+            <wp:extent cx="5940425" cy="1278255"/>
+            <wp:effectExtent l="0" t="0" r="3175" b="0"/>
+            <wp:docPr id="33" name="Рисунок 33"/>
+            <wp:cNvGraphicFramePr>
+              <a:graphicFrameLocks xmlns:a="http://schemas.openxmlformats.org/drawingml/2006/main" noChangeAspect="1"/>
+            </wp:cNvGraphicFramePr>
+            <a:graphic xmlns:a="http://schemas.openxmlformats.org/drawingml/2006/main">
+              <a:graphicData uri="http://schemas.openxmlformats.org/drawingml/2006/picture">
+                <pic:pic xmlns:pic="http://schemas.openxmlformats.org/drawingml/2006/picture">
+                  <pic:nvPicPr>
+                    <pic:cNvPr id="1" name=""/>
+                    <pic:cNvPicPr/>
+                  </pic:nvPicPr>
+                  <pic:blipFill>
+                    <a:blip r:embed="rId63"/>
+                    <a:stretch>
+                      <a:fillRect/>
+                    </a:stretch>
+                  </pic:blipFill>
+                  <pic:spPr>
+                    <a:xfrm>
+                      <a:off x="0" y="0"/>
+                      <a:ext cx="5940425" cy="1278255"/>
+                    </a:xfrm>
+                    <a:prstGeom prst="rect">
+                      <a:avLst/>
+                    </a:prstGeom>
+                  </pic:spPr>
+                </pic:pic>
+              </a:graphicData>
+            </a:graphic>
+          </wp:inline>
+        </w:drawing>
+      </w:r>
+    </w:p>
+    <w:p>
+      <w:pPr>
+        <w:pStyle w:val="a4"/>
         <w:numPr>
           <w:ilvl w:val="1"/>
           <w:numId w:val="1"/>
@@ -4896,7 +4669,6 @@
           <w:shd w:val="clear" w:color="auto" w:fill="FFFFFF"/>
         </w:rPr>
       </w:pPr>
-      <w:proofErr w:type="spellStart"/>
       <w:r>
         <w:rPr>
           <w:rFonts w:ascii="Times New Roman" w:hAnsi="Times New Roman" w:cs="Times New Roman"/>
@@ -4906,105 +4678,8 @@
           <w:shd w:val="clear" w:color="auto" w:fill="FFFFFF"/>
           <w:lang w:val="en-US"/>
         </w:rPr>
-        <w:t>получите</w:t>
-      </w:r>
-      <w:proofErr w:type="spellEnd"/>
-      <w:r>
-        <w:rPr>
-          <w:rFonts w:ascii="Times New Roman" w:hAnsi="Times New Roman" w:cs="Times New Roman"/>
-          <w:color w:val="252525"/>
-          <w:sz w:val="24"/>
-          <w:szCs w:val="24"/>
-          <w:shd w:val="clear" w:color="auto" w:fill="FFFFFF"/>
-          <w:lang w:val="en-US"/>
-        </w:rPr>
-        <w:t xml:space="preserve"> </w:t>
-      </w:r>
-      <w:proofErr w:type="spellStart"/>
-      <w:r>
-        <w:rPr>
-          <w:rFonts w:ascii="Times New Roman" w:hAnsi="Times New Roman" w:cs="Times New Roman"/>
-          <w:color w:val="252525"/>
-          <w:sz w:val="24"/>
-          <w:szCs w:val="24"/>
-          <w:shd w:val="clear" w:color="auto" w:fill="FFFFFF"/>
-          <w:lang w:val="en-US"/>
-        </w:rPr>
-        <w:t>данные</w:t>
-      </w:r>
-      <w:proofErr w:type="spellEnd"/>
-      <w:r>
-        <w:rPr>
-          <w:rFonts w:ascii="Times New Roman" w:hAnsi="Times New Roman" w:cs="Times New Roman"/>
-          <w:color w:val="252525"/>
-          <w:sz w:val="24"/>
-          <w:szCs w:val="24"/>
-          <w:shd w:val="clear" w:color="auto" w:fill="FFFFFF"/>
-          <w:lang w:val="en-US"/>
-        </w:rPr>
-        <w:t xml:space="preserve"> </w:t>
-      </w:r>
-      <w:proofErr w:type="spellStart"/>
-      <w:r>
-        <w:rPr>
-          <w:rFonts w:ascii="Times New Roman" w:hAnsi="Times New Roman" w:cs="Times New Roman"/>
-          <w:color w:val="252525"/>
-          <w:sz w:val="24"/>
-          <w:szCs w:val="24"/>
-          <w:shd w:val="clear" w:color="auto" w:fill="FFFFFF"/>
-          <w:lang w:val="en-US"/>
-        </w:rPr>
-        <w:t>из</w:t>
-      </w:r>
-      <w:proofErr w:type="spellEnd"/>
-      <w:r>
-        <w:rPr>
-          <w:rFonts w:ascii="Times New Roman" w:hAnsi="Times New Roman" w:cs="Times New Roman"/>
-          <w:color w:val="252525"/>
-          <w:sz w:val="24"/>
-          <w:szCs w:val="24"/>
-          <w:shd w:val="clear" w:color="auto" w:fill="FFFFFF"/>
-          <w:lang w:val="en-US"/>
-        </w:rPr>
-        <w:t xml:space="preserve"> </w:t>
-      </w:r>
-      <w:proofErr w:type="spellStart"/>
-      <w:r>
-        <w:rPr>
-          <w:rFonts w:ascii="Times New Roman" w:hAnsi="Times New Roman" w:cs="Times New Roman"/>
-          <w:color w:val="252525"/>
-          <w:sz w:val="24"/>
-          <w:szCs w:val="24"/>
-          <w:shd w:val="clear" w:color="auto" w:fill="FFFFFF"/>
-          <w:lang w:val="en-US"/>
-        </w:rPr>
-        <w:t>удаленного</w:t>
-      </w:r>
-      <w:proofErr w:type="spellEnd"/>
-      <w:r>
-        <w:rPr>
-          <w:rFonts w:ascii="Times New Roman" w:hAnsi="Times New Roman" w:cs="Times New Roman"/>
-          <w:color w:val="252525"/>
-          <w:sz w:val="24"/>
-          <w:szCs w:val="24"/>
-          <w:shd w:val="clear" w:color="auto" w:fill="FFFFFF"/>
-          <w:lang w:val="en-US"/>
-        </w:rPr>
-        <w:t xml:space="preserve"> </w:t>
-      </w:r>
-      <w:proofErr w:type="spellStart"/>
-      <w:r>
-        <w:rPr>
-          <w:rFonts w:ascii="Times New Roman" w:hAnsi="Times New Roman" w:cs="Times New Roman"/>
-          <w:color w:val="252525"/>
-          <w:sz w:val="24"/>
-          <w:szCs w:val="24"/>
-          <w:shd w:val="clear" w:color="auto" w:fill="FFFFFF"/>
-          <w:lang w:val="en-US"/>
-        </w:rPr>
-        <w:t>репозитория</w:t>
-      </w:r>
-      <w:proofErr w:type="spellEnd"/>
+        <w:t>получите данные из удаленного репозитория</w:t>
+      </w:r>
     </w:p>
     <w:p>
       <w:pPr>
@@ -5059,29 +4734,7 @@
           <w:szCs w:val="24"/>
           <w:shd w:val="clear" w:color="auto" w:fill="FFFFFF"/>
         </w:rPr>
-        <w:t xml:space="preserve">создайте дополнительную ветку 1 в удаленном </w:t>
-      </w:r>
-      <w:proofErr w:type="spellStart"/>
-      <w:r>
-        <w:rPr>
-          <w:rFonts w:ascii="Times New Roman" w:hAnsi="Times New Roman" w:cs="Times New Roman"/>
-          <w:color w:val="252525"/>
-          <w:sz w:val="24"/>
-          <w:szCs w:val="24"/>
-          <w:shd w:val="clear" w:color="auto" w:fill="FFFFFF"/>
-        </w:rPr>
-        <w:t>реппозитории</w:t>
-      </w:r>
-      <w:proofErr w:type="spellEnd"/>
-      <w:r>
-        <w:rPr>
-          <w:rFonts w:ascii="Times New Roman" w:hAnsi="Times New Roman" w:cs="Times New Roman"/>
-          <w:color w:val="252525"/>
-          <w:sz w:val="24"/>
-          <w:szCs w:val="24"/>
-          <w:shd w:val="clear" w:color="auto" w:fill="FFFFFF"/>
-        </w:rPr>
-        <w:t>, перенесите в нее два файла из другой ветки, удалите один из файлов</w:t>
+        <w:t>создайте дополнительную ветку 1 в удаленном реппозитории, перенесите в нее два файла из другой ветки, удалите один из файлов</w:t>
       </w:r>
     </w:p>
     <w:p>
@@ -5109,29 +4762,7 @@
           <w:szCs w:val="24"/>
           <w:shd w:val="clear" w:color="auto" w:fill="FFFFFF"/>
         </w:rPr>
-        <w:t xml:space="preserve">создайте дополнительную ветку 2 в удаленном </w:t>
-      </w:r>
-      <w:proofErr w:type="spellStart"/>
-      <w:r>
-        <w:rPr>
-          <w:rFonts w:ascii="Times New Roman" w:hAnsi="Times New Roman" w:cs="Times New Roman"/>
-          <w:color w:val="252525"/>
-          <w:sz w:val="24"/>
-          <w:szCs w:val="24"/>
-          <w:shd w:val="clear" w:color="auto" w:fill="FFFFFF"/>
-        </w:rPr>
-        <w:t>реппозитории</w:t>
-      </w:r>
-      <w:proofErr w:type="spellEnd"/>
-      <w:r>
-        <w:rPr>
-          <w:rFonts w:ascii="Times New Roman" w:hAnsi="Times New Roman" w:cs="Times New Roman"/>
-          <w:color w:val="252525"/>
-          <w:sz w:val="24"/>
-          <w:szCs w:val="24"/>
-          <w:shd w:val="clear" w:color="auto" w:fill="FFFFFF"/>
-        </w:rPr>
-        <w:t>, перенесите в нее два файла из вашего проекта, слить изменения в основную ветку, удалить дополнительную ветку 2</w:t>
+        <w:t>создайте дополнительную ветку 2 в удаленном реппозитории, перенесите в нее два файла из вашего проекта, слить изменения в основную ветку, удалить дополнительную ветку 2</w:t>
       </w:r>
     </w:p>
     <w:p>

</xml_diff>

<commit_message>
fixed a file igi_1.docx change, added new branch branch1
</commit_message>
<xml_diff>
--- a/IGI/LR1/igi_1.docx
+++ b/IGI/LR1/igi_1.docx
@@ -70,13 +70,23 @@
         </w:rPr>
         <w:t>Цель</w:t>
       </w:r>
-      <w:r>
-        <w:rPr>
-          <w:rFonts w:ascii="Times New Roman" w:hAnsi="Times New Roman" w:cs="Times New Roman"/>
-          <w:sz w:val="24"/>
-          <w:szCs w:val="24"/>
-        </w:rPr>
-        <w:t xml:space="preserve">: Познакомиться с возможностями и получить практические навыки работы с системой контроля версий </w:t>
+      <w:proofErr w:type="gramStart"/>
+      <w:r>
+        <w:rPr>
+          <w:rFonts w:ascii="Times New Roman" w:hAnsi="Times New Roman" w:cs="Times New Roman"/>
+          <w:sz w:val="24"/>
+          <w:szCs w:val="24"/>
+        </w:rPr>
+        <w:t>: Познакомиться</w:t>
+      </w:r>
+      <w:proofErr w:type="gramEnd"/>
+      <w:r>
+        <w:rPr>
+          <w:rFonts w:ascii="Times New Roman" w:hAnsi="Times New Roman" w:cs="Times New Roman"/>
+          <w:sz w:val="24"/>
+          <w:szCs w:val="24"/>
+        </w:rPr>
+        <w:t xml:space="preserve"> с возможностями и получить практические навыки работы с системой контроля версий </w:t>
       </w:r>
       <w:r>
         <w:rPr>
@@ -177,20 +187,53 @@
           <w:szCs w:val="24"/>
           <w:shd w:val="clear" w:color="auto" w:fill="FFFFFF"/>
         </w:rPr>
-        <w:t>Подготовьте рабочее окружение в соответствии с типом вашей операционной системы(</w:t>
-      </w:r>
-      <w:hyperlink r:id="rId5" w:history="1">
-        <w:r>
-          <w:rPr>
-            <w:rStyle w:val="a3"/>
-            <w:rFonts w:cs="Times New Roman"/>
-            <w:i/>
-            <w:sz w:val="24"/>
-            <w:shd w:val="clear" w:color="auto" w:fill="FFFFFF"/>
-          </w:rPr>
-          <w:t>https://smartiqa.ru/courses/git/lesson-1</w:t>
-        </w:r>
-      </w:hyperlink>
+        <w:t xml:space="preserve">Подготовьте рабочее окружение в соответствии с типом вашей операционной </w:t>
+      </w:r>
+      <w:proofErr w:type="gramStart"/>
+      <w:r>
+        <w:rPr>
+          <w:rFonts w:ascii="Times New Roman" w:hAnsi="Times New Roman" w:cs="Times New Roman"/>
+          <w:i/>
+          <w:color w:val="252525"/>
+          <w:sz w:val="24"/>
+          <w:szCs w:val="24"/>
+          <w:shd w:val="clear" w:color="auto" w:fill="FFFFFF"/>
+        </w:rPr>
+        <w:t>системы(</w:t>
+      </w:r>
+      <w:proofErr w:type="gramEnd"/>
+      <w:r>
+        <w:fldChar w:fldCharType="begin"/>
+      </w:r>
+      <w:r>
+        <w:instrText xml:space="preserve"> HYPERLINK "ht</w:instrText>
+      </w:r>
+      <w:r>
+        <w:instrText xml:space="preserve">tps://smartiqa.ru/courses/git/lesson-1" </w:instrText>
+      </w:r>
+      <w:r>
+        <w:fldChar w:fldCharType="separate"/>
+      </w:r>
+      <w:r>
+        <w:rPr>
+          <w:rStyle w:val="a3"/>
+          <w:rFonts w:cs="Times New Roman"/>
+          <w:i/>
+          <w:sz w:val="24"/>
+          <w:shd w:val="clear" w:color="auto" w:fill="FFFFFF"/>
+        </w:rPr>
+        <w:t>https://smartiqa.ru/courses/git/lesson-1</w:t>
+      </w:r>
+      <w:r>
+        <w:rPr>
+          <w:rStyle w:val="a3"/>
+          <w:rFonts w:cs="Times New Roman"/>
+          <w:i/>
+          <w:sz w:val="24"/>
+          <w:shd w:val="clear" w:color="auto" w:fill="FFFFFF"/>
+        </w:rPr>
+        <w:fldChar w:fldCharType="end"/>
+      </w:r>
       <w:r>
         <w:rPr>
           <w:rFonts w:ascii="Times New Roman" w:hAnsi="Times New Roman" w:cs="Times New Roman"/>
@@ -226,8 +269,20 @@
           <w:szCs w:val="24"/>
           <w:shd w:val="clear" w:color="auto" w:fill="FFFFFF"/>
         </w:rPr>
-        <w:t>Установите Git</w:t>
-      </w:r>
+        <w:t xml:space="preserve">Установите </w:t>
+      </w:r>
+      <w:proofErr w:type="spellStart"/>
+      <w:r>
+        <w:rPr>
+          <w:rFonts w:ascii="Times New Roman" w:hAnsi="Times New Roman" w:cs="Times New Roman"/>
+          <w:color w:val="252525"/>
+          <w:sz w:val="24"/>
+          <w:szCs w:val="24"/>
+          <w:shd w:val="clear" w:color="auto" w:fill="FFFFFF"/>
+        </w:rPr>
+        <w:t>Git</w:t>
+      </w:r>
+      <w:proofErr w:type="spellEnd"/>
     </w:p>
     <w:p>
       <w:pPr>
@@ -265,7 +320,7 @@
                     </pic:cNvPicPr>
                   </pic:nvPicPr>
                   <pic:blipFill>
-                    <a:blip r:embed="rId6">
+                    <a:blip r:embed="rId5">
                       <a:extLst>
                         <a:ext uri="{28A0092B-C50C-407E-A947-70E740481C1C}">
                           <a14:useLocalDpi xmlns:a14="http://schemas.microsoft.com/office/drawing/2010/main" val="0"/>
@@ -359,7 +414,7 @@
                     </pic:cNvPicPr>
                   </pic:nvPicPr>
                   <pic:blipFill>
-                    <a:blip r:embed="rId7">
+                    <a:blip r:embed="rId6">
                       <a:extLst>
                         <a:ext uri="{28A0092B-C50C-407E-A947-70E740481C1C}">
                           <a14:useLocalDpi xmlns:a14="http://schemas.microsoft.com/office/drawing/2010/main" val="0"/>
@@ -487,7 +542,7 @@
                     </pic:cNvPicPr>
                   </pic:nvPicPr>
                   <pic:blipFill>
-                    <a:blip r:embed="rId8">
+                    <a:blip r:embed="rId7">
                       <a:extLst>
                         <a:ext uri="{28A0092B-C50C-407E-A947-70E740481C1C}">
                           <a14:useLocalDpi xmlns:a14="http://schemas.microsoft.com/office/drawing/2010/main" val="0"/>
@@ -555,7 +610,7 @@
                     </pic:cNvPicPr>
                   </pic:nvPicPr>
                   <pic:blipFill>
-                    <a:blip r:embed="rId9">
+                    <a:blip r:embed="rId8">
                       <a:extLst>
                         <a:ext uri="{28A0092B-C50C-407E-A947-70E740481C1C}">
                           <a14:useLocalDpi xmlns:a14="http://schemas.microsoft.com/office/drawing/2010/main" val="0"/>
@@ -614,7 +669,7 @@
                     </pic:cNvPicPr>
                   </pic:nvPicPr>
                   <pic:blipFill>
-                    <a:blip r:embed="rId10">
+                    <a:blip r:embed="rId9">
                       <a:extLst>
                         <a:ext uri="{28A0092B-C50C-407E-A947-70E740481C1C}">
                           <a14:useLocalDpi xmlns:a14="http://schemas.microsoft.com/office/drawing/2010/main" val="0"/>
@@ -673,7 +728,7 @@
                     </pic:cNvPicPr>
                   </pic:nvPicPr>
                   <pic:blipFill>
-                    <a:blip r:embed="rId11">
+                    <a:blip r:embed="rId10">
                       <a:extLst>
                         <a:ext uri="{28A0092B-C50C-407E-A947-70E740481C1C}">
                           <a14:useLocalDpi xmlns:a14="http://schemas.microsoft.com/office/drawing/2010/main" val="0"/>
@@ -733,7 +788,7 @@
                     </pic:cNvPicPr>
                   </pic:nvPicPr>
                   <pic:blipFill>
-                    <a:blip r:embed="rId12">
+                    <a:blip r:embed="rId11">
                       <a:extLst>
                         <a:ext uri="{28A0092B-C50C-407E-A947-70E740481C1C}">
                           <a14:useLocalDpi xmlns:a14="http://schemas.microsoft.com/office/drawing/2010/main" val="0"/>
@@ -880,7 +935,7 @@
                     </pic:cNvPicPr>
                   </pic:nvPicPr>
                   <pic:blipFill>
-                    <a:blip r:embed="rId13">
+                    <a:blip r:embed="rId12">
                       <a:extLst>
                         <a:ext uri="{28A0092B-C50C-407E-A947-70E740481C1C}">
                           <a14:useLocalDpi xmlns:a14="http://schemas.microsoft.com/office/drawing/2010/main" val="0"/>
@@ -963,7 +1018,73 @@
           <w:szCs w:val="24"/>
           <w:shd w:val="clear" w:color="auto" w:fill="FFFFFF"/>
         </w:rPr>
-        <w:t xml:space="preserve">сделайте индексацию нескольких файлов в вашем Git-репозитории (git add …), </w:t>
+        <w:t xml:space="preserve">сделайте индексацию нескольких файлов в вашем </w:t>
+      </w:r>
+      <w:proofErr w:type="spellStart"/>
+      <w:r>
+        <w:rPr>
+          <w:rFonts w:ascii="Times New Roman" w:hAnsi="Times New Roman" w:cs="Times New Roman"/>
+          <w:color w:val="252525"/>
+          <w:sz w:val="24"/>
+          <w:szCs w:val="24"/>
+          <w:shd w:val="clear" w:color="auto" w:fill="FFFFFF"/>
+        </w:rPr>
+        <w:t>Git</w:t>
+      </w:r>
+      <w:proofErr w:type="spellEnd"/>
+      <w:r>
+        <w:rPr>
+          <w:rFonts w:ascii="Times New Roman" w:hAnsi="Times New Roman" w:cs="Times New Roman"/>
+          <w:color w:val="252525"/>
+          <w:sz w:val="24"/>
+          <w:szCs w:val="24"/>
+          <w:shd w:val="clear" w:color="auto" w:fill="FFFFFF"/>
+        </w:rPr>
+        <w:t>-репозитории (</w:t>
+      </w:r>
+      <w:proofErr w:type="spellStart"/>
+      <w:r>
+        <w:rPr>
+          <w:rFonts w:ascii="Times New Roman" w:hAnsi="Times New Roman" w:cs="Times New Roman"/>
+          <w:color w:val="252525"/>
+          <w:sz w:val="24"/>
+          <w:szCs w:val="24"/>
+          <w:shd w:val="clear" w:color="auto" w:fill="FFFFFF"/>
+        </w:rPr>
+        <w:t>git</w:t>
+      </w:r>
+      <w:proofErr w:type="spellEnd"/>
+      <w:r>
+        <w:rPr>
+          <w:rFonts w:ascii="Times New Roman" w:hAnsi="Times New Roman" w:cs="Times New Roman"/>
+          <w:color w:val="252525"/>
+          <w:sz w:val="24"/>
+          <w:szCs w:val="24"/>
+          <w:shd w:val="clear" w:color="auto" w:fill="FFFFFF"/>
+        </w:rPr>
+        <w:t xml:space="preserve"> </w:t>
+      </w:r>
+      <w:proofErr w:type="spellStart"/>
+      <w:r>
+        <w:rPr>
+          <w:rFonts w:ascii="Times New Roman" w:hAnsi="Times New Roman" w:cs="Times New Roman"/>
+          <w:color w:val="252525"/>
+          <w:sz w:val="24"/>
+          <w:szCs w:val="24"/>
+          <w:shd w:val="clear" w:color="auto" w:fill="FFFFFF"/>
+        </w:rPr>
+        <w:t>add</w:t>
+      </w:r>
+      <w:proofErr w:type="spellEnd"/>
+      <w:r>
+        <w:rPr>
+          <w:rFonts w:ascii="Times New Roman" w:hAnsi="Times New Roman" w:cs="Times New Roman"/>
+          <w:color w:val="252525"/>
+          <w:sz w:val="24"/>
+          <w:szCs w:val="24"/>
+          <w:shd w:val="clear" w:color="auto" w:fill="FFFFFF"/>
+        </w:rPr>
+        <w:t xml:space="preserve"> …), </w:t>
       </w:r>
       <w:r>
         <w:rPr>
@@ -987,7 +1108,7 @@
                     </pic:cNvPicPr>
                   </pic:nvPicPr>
                   <pic:blipFill>
-                    <a:blip r:embed="rId14">
+                    <a:blip r:embed="rId13">
                       <a:extLst>
                         <a:ext uri="{28A0092B-C50C-407E-A947-70E740481C1C}">
                           <a14:useLocalDpi xmlns:a14="http://schemas.microsoft.com/office/drawing/2010/main" val="0"/>
@@ -1059,7 +1180,7 @@
                     </pic:cNvPicPr>
                   </pic:nvPicPr>
                   <pic:blipFill>
-                    <a:blip r:embed="rId15">
+                    <a:blip r:embed="rId14">
                       <a:extLst>
                         <a:ext uri="{28A0092B-C50C-407E-A947-70E740481C1C}">
                           <a14:useLocalDpi xmlns:a14="http://schemas.microsoft.com/office/drawing/2010/main" val="0"/>
@@ -1131,7 +1252,7 @@
                     </pic:cNvPicPr>
                   </pic:nvPicPr>
                   <pic:blipFill>
-                    <a:blip r:embed="rId16">
+                    <a:blip r:embed="rId15">
                       <a:extLst>
                         <a:ext uri="{28A0092B-C50C-407E-A947-70E740481C1C}">
                           <a14:useLocalDpi xmlns:a14="http://schemas.microsoft.com/office/drawing/2010/main" val="0"/>
@@ -1231,7 +1352,7 @@
                     </pic:cNvPicPr>
                   </pic:nvPicPr>
                   <pic:blipFill>
-                    <a:blip r:embed="rId17">
+                    <a:blip r:embed="rId16">
                       <a:extLst>
                         <a:ext uri="{28A0092B-C50C-407E-A947-70E740481C1C}">
                           <a14:useLocalDpi xmlns:a14="http://schemas.microsoft.com/office/drawing/2010/main" val="0"/>
@@ -1304,7 +1425,7 @@
                     </pic:cNvPicPr>
                   </pic:nvPicPr>
                   <pic:blipFill>
-                    <a:blip r:embed="rId18" cstate="print">
+                    <a:blip r:embed="rId17" cstate="print">
                       <a:extLst>
                         <a:ext uri="{28A0092B-C50C-407E-A947-70E740481C1C}">
                           <a14:useLocalDpi xmlns:a14="http://schemas.microsoft.com/office/drawing/2010/main" val="0"/>
@@ -1361,7 +1482,29 @@
           <w:szCs w:val="24"/>
           <w:shd w:val="clear" w:color="auto" w:fill="FFFFFF"/>
         </w:rPr>
-        <w:t xml:space="preserve">выполните коммиты к проиндексированным  файлам, </w:t>
+        <w:t xml:space="preserve">выполните коммиты к </w:t>
+      </w:r>
+      <w:proofErr w:type="gramStart"/>
+      <w:r>
+        <w:rPr>
+          <w:rFonts w:ascii="Times New Roman" w:hAnsi="Times New Roman" w:cs="Times New Roman"/>
+          <w:color w:val="252525"/>
+          <w:sz w:val="24"/>
+          <w:szCs w:val="24"/>
+          <w:shd w:val="clear" w:color="auto" w:fill="FFFFFF"/>
+        </w:rPr>
+        <w:t>проиндексированным  файлам</w:t>
+      </w:r>
+      <w:proofErr w:type="gramEnd"/>
+      <w:r>
+        <w:rPr>
+          <w:rFonts w:ascii="Times New Roman" w:hAnsi="Times New Roman" w:cs="Times New Roman"/>
+          <w:color w:val="252525"/>
+          <w:sz w:val="24"/>
+          <w:szCs w:val="24"/>
+          <w:shd w:val="clear" w:color="auto" w:fill="FFFFFF"/>
+        </w:rPr>
+        <w:t xml:space="preserve">, </w:t>
       </w:r>
     </w:p>
     <w:p>
@@ -1404,7 +1547,7 @@
                     </pic:cNvPicPr>
                   </pic:nvPicPr>
                   <pic:blipFill>
-                    <a:blip r:embed="rId19">
+                    <a:blip r:embed="rId18">
                       <a:extLst>
                         <a:ext uri="{28A0092B-C50C-407E-A947-70E740481C1C}">
                           <a14:useLocalDpi xmlns:a14="http://schemas.microsoft.com/office/drawing/2010/main" val="0"/>
@@ -1504,7 +1647,7 @@
                     </pic:cNvPicPr>
                   </pic:nvPicPr>
                   <pic:blipFill>
-                    <a:blip r:embed="rId20">
+                    <a:blip r:embed="rId19">
                       <a:extLst>
                         <a:ext uri="{28A0092B-C50C-407E-A947-70E740481C1C}">
                           <a14:useLocalDpi xmlns:a14="http://schemas.microsoft.com/office/drawing/2010/main" val="0"/>
@@ -1576,7 +1719,7 @@
                     </pic:cNvPicPr>
                   </pic:nvPicPr>
                   <pic:blipFill>
-                    <a:blip r:embed="rId21">
+                    <a:blip r:embed="rId20">
                       <a:extLst>
                         <a:ext uri="{28A0092B-C50C-407E-A947-70E740481C1C}">
                           <a14:useLocalDpi xmlns:a14="http://schemas.microsoft.com/office/drawing/2010/main" val="0"/>
@@ -1648,7 +1791,7 @@
                     </pic:cNvPicPr>
                   </pic:nvPicPr>
                   <pic:blipFill>
-                    <a:blip r:embed="rId22">
+                    <a:blip r:embed="rId21">
                       <a:extLst>
                         <a:ext uri="{28A0092B-C50C-407E-A947-70E740481C1C}">
                           <a14:useLocalDpi xmlns:a14="http://schemas.microsoft.com/office/drawing/2010/main" val="0"/>
@@ -1720,7 +1863,7 @@
                     </pic:cNvPicPr>
                   </pic:nvPicPr>
                   <pic:blipFill>
-                    <a:blip r:embed="rId23">
+                    <a:blip r:embed="rId22">
                       <a:extLst>
                         <a:ext uri="{28A0092B-C50C-407E-A947-70E740481C1C}">
                           <a14:useLocalDpi xmlns:a14="http://schemas.microsoft.com/office/drawing/2010/main" val="0"/>
@@ -1821,7 +1964,7 @@
                     </pic:cNvPicPr>
                   </pic:nvPicPr>
                   <pic:blipFill>
-                    <a:blip r:embed="rId24">
+                    <a:blip r:embed="rId23">
                       <a:extLst>
                         <a:ext uri="{28A0092B-C50C-407E-A947-70E740481C1C}">
                           <a14:useLocalDpi xmlns:a14="http://schemas.microsoft.com/office/drawing/2010/main" val="0"/>
@@ -1893,7 +2036,7 @@
                     </pic:cNvPicPr>
                   </pic:nvPicPr>
                   <pic:blipFill>
-                    <a:blip r:embed="rId25">
+                    <a:blip r:embed="rId24">
                       <a:extLst>
                         <a:ext uri="{28A0092B-C50C-407E-A947-70E740481C1C}">
                           <a14:useLocalDpi xmlns:a14="http://schemas.microsoft.com/office/drawing/2010/main" val="0"/>
@@ -2012,7 +2155,7 @@
                     <pic:cNvPicPr/>
                   </pic:nvPicPr>
                   <pic:blipFill>
-                    <a:blip r:embed="rId26"/>
+                    <a:blip r:embed="rId25"/>
                     <a:stretch>
                       <a:fillRect/>
                     </a:stretch>
@@ -2060,6 +2203,67 @@
             <wp:extent cx="4841875" cy="1622067"/>
             <wp:effectExtent l="0" t="0" r="0" b="0"/>
             <wp:docPr id="2" name="Рисунок 2"/>
+            <wp:cNvGraphicFramePr>
+              <a:graphicFrameLocks xmlns:a="http://schemas.openxmlformats.org/drawingml/2006/main" noChangeAspect="1"/>
+            </wp:cNvGraphicFramePr>
+            <a:graphic xmlns:a="http://schemas.openxmlformats.org/drawingml/2006/main">
+              <a:graphicData uri="http://schemas.openxmlformats.org/drawingml/2006/picture">
+                <pic:pic xmlns:pic="http://schemas.openxmlformats.org/drawingml/2006/picture">
+                  <pic:nvPicPr>
+                    <pic:cNvPr id="1" name=""/>
+                    <pic:cNvPicPr/>
+                  </pic:nvPicPr>
+                  <pic:blipFill>
+                    <a:blip r:embed="rId26"/>
+                    <a:stretch>
+                      <a:fillRect/>
+                    </a:stretch>
+                  </pic:blipFill>
+                  <pic:spPr>
+                    <a:xfrm>
+                      <a:off x="0" y="0"/>
+                      <a:ext cx="4860230" cy="1628216"/>
+                    </a:xfrm>
+                    <a:prstGeom prst="rect">
+                      <a:avLst/>
+                    </a:prstGeom>
+                  </pic:spPr>
+                </pic:pic>
+              </a:graphicData>
+            </a:graphic>
+          </wp:inline>
+        </w:drawing>
+      </w:r>
+    </w:p>
+    <w:p>
+      <w:pPr>
+        <w:pStyle w:val="a4"/>
+        <w:spacing w:after="0"/>
+        <w:ind w:left="0"/>
+        <w:rPr>
+          <w:rFonts w:ascii="Times New Roman" w:hAnsi="Times New Roman" w:cs="Times New Roman"/>
+          <w:color w:val="252525"/>
+          <w:sz w:val="24"/>
+          <w:szCs w:val="24"/>
+          <w:shd w:val="clear" w:color="auto" w:fill="FFFFFF"/>
+          <w:lang w:val="en-US"/>
+        </w:rPr>
+      </w:pPr>
+      <w:r>
+        <w:rPr>
+          <w:rFonts w:ascii="Times New Roman" w:hAnsi="Times New Roman" w:cs="Times New Roman"/>
+          <w:noProof/>
+          <w:color w:val="252525"/>
+          <w:sz w:val="24"/>
+          <w:szCs w:val="24"/>
+          <w:shd w:val="clear" w:color="auto" w:fill="FFFFFF"/>
+          <w:lang w:val="en-US"/>
+        </w:rPr>
+        <w:drawing>
+          <wp:inline distT="0" distB="0" distL="0" distR="0" wp14:anchorId="231875A5" wp14:editId="3E5E47BE">
+            <wp:extent cx="4868883" cy="2804227"/>
+            <wp:effectExtent l="0" t="0" r="8255" b="0"/>
+            <wp:docPr id="3" name="Рисунок 3"/>
             <wp:cNvGraphicFramePr>
               <a:graphicFrameLocks xmlns:a="http://schemas.openxmlformats.org/drawingml/2006/main" noChangeAspect="1"/>
             </wp:cNvGraphicFramePr>
@@ -2079,7 +2283,7 @@
                   <pic:spPr>
                     <a:xfrm>
                       <a:off x="0" y="0"/>
-                      <a:ext cx="4860230" cy="1628216"/>
+                      <a:ext cx="4876137" cy="2808405"/>
                     </a:xfrm>
                     <a:prstGeom prst="rect">
                       <a:avLst/>
@@ -2103,7 +2307,6 @@
           <w:sz w:val="24"/>
           <w:szCs w:val="24"/>
           <w:shd w:val="clear" w:color="auto" w:fill="FFFFFF"/>
-          <w:lang w:val="en-US"/>
         </w:rPr>
       </w:pPr>
       <w:r>
@@ -2114,13 +2317,13 @@
           <w:sz w:val="24"/>
           <w:szCs w:val="24"/>
           <w:shd w:val="clear" w:color="auto" w:fill="FFFFFF"/>
-          <w:lang w:val="en-US"/>
-        </w:rPr>
+        </w:rPr>
+        <w:lastRenderedPageBreak/>
         <w:drawing>
-          <wp:inline distT="0" distB="0" distL="0" distR="0" wp14:anchorId="231875A5" wp14:editId="3E5E47BE">
-            <wp:extent cx="4868883" cy="2804227"/>
-            <wp:effectExtent l="0" t="0" r="8255" b="0"/>
-            <wp:docPr id="3" name="Рисунок 3"/>
+          <wp:inline distT="0" distB="0" distL="0" distR="0" wp14:anchorId="0DFBD5C4" wp14:editId="571916B9">
+            <wp:extent cx="4910446" cy="2279644"/>
+            <wp:effectExtent l="0" t="0" r="5080" b="6985"/>
+            <wp:docPr id="6" name="Рисунок 6"/>
             <wp:cNvGraphicFramePr>
               <a:graphicFrameLocks xmlns:a="http://schemas.openxmlformats.org/drawingml/2006/main" noChangeAspect="1"/>
             </wp:cNvGraphicFramePr>
@@ -2140,7 +2343,7 @@
                   <pic:spPr>
                     <a:xfrm>
                       <a:off x="0" y="0"/>
-                      <a:ext cx="4876137" cy="2808405"/>
+                      <a:ext cx="4924667" cy="2286246"/>
                     </a:xfrm>
                     <a:prstGeom prst="rect">
                       <a:avLst/>
@@ -2166,6 +2369,20 @@
           <w:shd w:val="clear" w:color="auto" w:fill="FFFFFF"/>
         </w:rPr>
       </w:pPr>
+    </w:p>
+    <w:p>
+      <w:pPr>
+        <w:pStyle w:val="a4"/>
+        <w:spacing w:after="0"/>
+        <w:ind w:left="0"/>
+        <w:rPr>
+          <w:rFonts w:ascii="Times New Roman" w:hAnsi="Times New Roman" w:cs="Times New Roman"/>
+          <w:color w:val="252525"/>
+          <w:sz w:val="24"/>
+          <w:szCs w:val="24"/>
+          <w:shd w:val="clear" w:color="auto" w:fill="FFFFFF"/>
+        </w:rPr>
+      </w:pPr>
       <w:r>
         <w:rPr>
           <w:rFonts w:ascii="Times New Roman" w:hAnsi="Times New Roman" w:cs="Times New Roman"/>
@@ -2175,12 +2392,11 @@
           <w:szCs w:val="24"/>
           <w:shd w:val="clear" w:color="auto" w:fill="FFFFFF"/>
         </w:rPr>
-        <w:lastRenderedPageBreak/>
         <w:drawing>
-          <wp:inline distT="0" distB="0" distL="0" distR="0" wp14:anchorId="0DFBD5C4" wp14:editId="571916B9">
-            <wp:extent cx="4910446" cy="2279644"/>
-            <wp:effectExtent l="0" t="0" r="5080" b="6985"/>
-            <wp:docPr id="6" name="Рисунок 6"/>
+          <wp:inline distT="0" distB="0" distL="0" distR="0" wp14:anchorId="1ECB6972" wp14:editId="5A0B8D09">
+            <wp:extent cx="5940425" cy="3855720"/>
+            <wp:effectExtent l="0" t="0" r="3175" b="0"/>
+            <wp:docPr id="8" name="Рисунок 8"/>
             <wp:cNvGraphicFramePr>
               <a:graphicFrameLocks xmlns:a="http://schemas.openxmlformats.org/drawingml/2006/main" noChangeAspect="1"/>
             </wp:cNvGraphicFramePr>
@@ -2200,7 +2416,7 @@
                   <pic:spPr>
                     <a:xfrm>
                       <a:off x="0" y="0"/>
-                      <a:ext cx="4924667" cy="2286246"/>
+                      <a:ext cx="5940425" cy="3855720"/>
                     </a:xfrm>
                     <a:prstGeom prst="rect">
                       <a:avLst/>
@@ -2226,20 +2442,6 @@
           <w:shd w:val="clear" w:color="auto" w:fill="FFFFFF"/>
         </w:rPr>
       </w:pPr>
-    </w:p>
-    <w:p>
-      <w:pPr>
-        <w:pStyle w:val="a4"/>
-        <w:spacing w:after="0"/>
-        <w:ind w:left="0"/>
-        <w:rPr>
-          <w:rFonts w:ascii="Times New Roman" w:hAnsi="Times New Roman" w:cs="Times New Roman"/>
-          <w:color w:val="252525"/>
-          <w:sz w:val="24"/>
-          <w:szCs w:val="24"/>
-          <w:shd w:val="clear" w:color="auto" w:fill="FFFFFF"/>
-        </w:rPr>
-      </w:pPr>
       <w:r>
         <w:rPr>
           <w:rFonts w:ascii="Times New Roman" w:hAnsi="Times New Roman" w:cs="Times New Roman"/>
@@ -2249,11 +2451,12 @@
           <w:szCs w:val="24"/>
           <w:shd w:val="clear" w:color="auto" w:fill="FFFFFF"/>
         </w:rPr>
+        <w:lastRenderedPageBreak/>
         <w:drawing>
-          <wp:inline distT="0" distB="0" distL="0" distR="0" wp14:anchorId="1ECB6972" wp14:editId="5A0B8D09">
-            <wp:extent cx="5940425" cy="3855720"/>
+          <wp:inline distT="0" distB="0" distL="0" distR="0" wp14:anchorId="7ED251EA" wp14:editId="76B1E676">
+            <wp:extent cx="5940425" cy="2978150"/>
             <wp:effectExtent l="0" t="0" r="3175" b="0"/>
-            <wp:docPr id="8" name="Рисунок 8"/>
+            <wp:docPr id="31" name="Рисунок 31"/>
             <wp:cNvGraphicFramePr>
               <a:graphicFrameLocks xmlns:a="http://schemas.openxmlformats.org/drawingml/2006/main" noChangeAspect="1"/>
             </wp:cNvGraphicFramePr>
@@ -2273,7 +2476,7 @@
                   <pic:spPr>
                     <a:xfrm>
                       <a:off x="0" y="0"/>
-                      <a:ext cx="5940425" cy="3855720"/>
+                      <a:ext cx="5940425" cy="2978150"/>
                     </a:xfrm>
                     <a:prstGeom prst="rect">
                       <a:avLst/>
@@ -2308,12 +2511,11 @@
           <w:szCs w:val="24"/>
           <w:shd w:val="clear" w:color="auto" w:fill="FFFFFF"/>
         </w:rPr>
-        <w:lastRenderedPageBreak/>
         <w:drawing>
-          <wp:inline distT="0" distB="0" distL="0" distR="0" wp14:anchorId="7ED251EA" wp14:editId="76B1E676">
-            <wp:extent cx="5940425" cy="2978150"/>
-            <wp:effectExtent l="0" t="0" r="3175" b="0"/>
-            <wp:docPr id="31" name="Рисунок 31"/>
+          <wp:inline distT="0" distB="0" distL="0" distR="0" wp14:anchorId="1AADFD9D" wp14:editId="05313C52">
+            <wp:extent cx="5940425" cy="2718435"/>
+            <wp:effectExtent l="0" t="0" r="3175" b="5715"/>
+            <wp:docPr id="32" name="Рисунок 32"/>
             <wp:cNvGraphicFramePr>
               <a:graphicFrameLocks xmlns:a="http://schemas.openxmlformats.org/drawingml/2006/main" noChangeAspect="1"/>
             </wp:cNvGraphicFramePr>
@@ -2333,7 +2535,7 @@
                   <pic:spPr>
                     <a:xfrm>
                       <a:off x="0" y="0"/>
-                      <a:ext cx="5940425" cy="2978150"/>
+                      <a:ext cx="5940425" cy="2718435"/>
                     </a:xfrm>
                     <a:prstGeom prst="rect">
                       <a:avLst/>
@@ -2369,10 +2571,10 @@
           <w:shd w:val="clear" w:color="auto" w:fill="FFFFFF"/>
         </w:rPr>
         <w:drawing>
-          <wp:inline distT="0" distB="0" distL="0" distR="0" wp14:anchorId="1AADFD9D" wp14:editId="05313C52">
-            <wp:extent cx="5940425" cy="2718435"/>
-            <wp:effectExtent l="0" t="0" r="3175" b="5715"/>
-            <wp:docPr id="32" name="Рисунок 32"/>
+          <wp:inline distT="0" distB="0" distL="0" distR="0" wp14:anchorId="70694184" wp14:editId="00DEBB53">
+            <wp:extent cx="5940425" cy="2296795"/>
+            <wp:effectExtent l="0" t="0" r="3175" b="8255"/>
+            <wp:docPr id="56" name="Рисунок 56"/>
             <wp:cNvGraphicFramePr>
               <a:graphicFrameLocks xmlns:a="http://schemas.openxmlformats.org/drawingml/2006/main" noChangeAspect="1"/>
             </wp:cNvGraphicFramePr>
@@ -2392,7 +2594,7 @@
                   <pic:spPr>
                     <a:xfrm>
                       <a:off x="0" y="0"/>
-                      <a:ext cx="5940425" cy="2718435"/>
+                      <a:ext cx="5940425" cy="2296795"/>
                     </a:xfrm>
                     <a:prstGeom prst="rect">
                       <a:avLst/>
@@ -2418,6 +2620,223 @@
           <w:shd w:val="clear" w:color="auto" w:fill="FFFFFF"/>
         </w:rPr>
       </w:pPr>
+    </w:p>
+    <w:p>
+      <w:pPr>
+        <w:pStyle w:val="a4"/>
+        <w:numPr>
+          <w:ilvl w:val="1"/>
+          <w:numId w:val="1"/>
+        </w:numPr>
+        <w:spacing w:after="0"/>
+        <w:ind w:left="0"/>
+        <w:rPr>
+          <w:rFonts w:ascii="Times New Roman" w:hAnsi="Times New Roman" w:cs="Times New Roman"/>
+          <w:color w:val="252525"/>
+          <w:sz w:val="24"/>
+          <w:szCs w:val="24"/>
+          <w:shd w:val="clear" w:color="auto" w:fill="FFFFFF"/>
+        </w:rPr>
+      </w:pPr>
+      <w:r>
+        <w:rPr>
+          <w:rFonts w:ascii="Times New Roman" w:hAnsi="Times New Roman" w:cs="Times New Roman"/>
+          <w:color w:val="252525"/>
+          <w:sz w:val="24"/>
+          <w:szCs w:val="24"/>
+          <w:shd w:val="clear" w:color="auto" w:fill="FFFFFF"/>
+        </w:rPr>
+        <w:t xml:space="preserve">выведите историю коммитов: полностью и с ограничением вывода – отобрать только последние,  до и после указанной даты, по автору файлов, коммитов (флаги n, </w:t>
+      </w:r>
+      <w:proofErr w:type="spellStart"/>
+      <w:r>
+        <w:rPr>
+          <w:rFonts w:ascii="Times New Roman" w:hAnsi="Times New Roman" w:cs="Times New Roman"/>
+          <w:color w:val="252525"/>
+          <w:sz w:val="24"/>
+          <w:szCs w:val="24"/>
+          <w:shd w:val="clear" w:color="auto" w:fill="FFFFFF"/>
+        </w:rPr>
+        <w:t>since</w:t>
+      </w:r>
+      <w:proofErr w:type="spellEnd"/>
+      <w:r>
+        <w:rPr>
+          <w:rFonts w:ascii="Times New Roman" w:hAnsi="Times New Roman" w:cs="Times New Roman"/>
+          <w:color w:val="252525"/>
+          <w:sz w:val="24"/>
+          <w:szCs w:val="24"/>
+          <w:shd w:val="clear" w:color="auto" w:fill="FFFFFF"/>
+        </w:rPr>
+        <w:t xml:space="preserve">, </w:t>
+      </w:r>
+      <w:proofErr w:type="spellStart"/>
+      <w:r>
+        <w:rPr>
+          <w:rFonts w:ascii="Times New Roman" w:hAnsi="Times New Roman" w:cs="Times New Roman"/>
+          <w:color w:val="252525"/>
+          <w:sz w:val="24"/>
+          <w:szCs w:val="24"/>
+          <w:shd w:val="clear" w:color="auto" w:fill="FFFFFF"/>
+        </w:rPr>
+        <w:t>after</w:t>
+      </w:r>
+      <w:proofErr w:type="spellEnd"/>
+      <w:r>
+        <w:rPr>
+          <w:rFonts w:ascii="Times New Roman" w:hAnsi="Times New Roman" w:cs="Times New Roman"/>
+          <w:color w:val="252525"/>
+          <w:sz w:val="24"/>
+          <w:szCs w:val="24"/>
+          <w:shd w:val="clear" w:color="auto" w:fill="FFFFFF"/>
+        </w:rPr>
+        <w:t xml:space="preserve">, </w:t>
+      </w:r>
+      <w:proofErr w:type="spellStart"/>
+      <w:r>
+        <w:rPr>
+          <w:rFonts w:ascii="Times New Roman" w:hAnsi="Times New Roman" w:cs="Times New Roman"/>
+          <w:color w:val="252525"/>
+          <w:sz w:val="24"/>
+          <w:szCs w:val="24"/>
+          <w:shd w:val="clear" w:color="auto" w:fill="FFFFFF"/>
+        </w:rPr>
+        <w:t>until</w:t>
+      </w:r>
+      <w:proofErr w:type="spellEnd"/>
+      <w:r>
+        <w:rPr>
+          <w:rFonts w:ascii="Times New Roman" w:hAnsi="Times New Roman" w:cs="Times New Roman"/>
+          <w:color w:val="252525"/>
+          <w:sz w:val="24"/>
+          <w:szCs w:val="24"/>
+          <w:shd w:val="clear" w:color="auto" w:fill="FFFFFF"/>
+        </w:rPr>
+        <w:t xml:space="preserve">, </w:t>
+      </w:r>
+      <w:proofErr w:type="spellStart"/>
+      <w:r>
+        <w:rPr>
+          <w:rFonts w:ascii="Times New Roman" w:hAnsi="Times New Roman" w:cs="Times New Roman"/>
+          <w:color w:val="252525"/>
+          <w:sz w:val="24"/>
+          <w:szCs w:val="24"/>
+          <w:shd w:val="clear" w:color="auto" w:fill="FFFFFF"/>
+        </w:rPr>
+        <w:t>before</w:t>
+      </w:r>
+      <w:proofErr w:type="spellEnd"/>
+      <w:r>
+        <w:rPr>
+          <w:rFonts w:ascii="Times New Roman" w:hAnsi="Times New Roman" w:cs="Times New Roman"/>
+          <w:color w:val="252525"/>
+          <w:sz w:val="24"/>
+          <w:szCs w:val="24"/>
+          <w:shd w:val="clear" w:color="auto" w:fill="FFFFFF"/>
+        </w:rPr>
+        <w:t xml:space="preserve">, </w:t>
+      </w:r>
+      <w:proofErr w:type="spellStart"/>
+      <w:r>
+        <w:rPr>
+          <w:rFonts w:ascii="Times New Roman" w:hAnsi="Times New Roman" w:cs="Times New Roman"/>
+          <w:color w:val="252525"/>
+          <w:sz w:val="24"/>
+          <w:szCs w:val="24"/>
+          <w:shd w:val="clear" w:color="auto" w:fill="FFFFFF"/>
+        </w:rPr>
+        <w:t>author</w:t>
+      </w:r>
+      <w:proofErr w:type="spellEnd"/>
+      <w:r>
+        <w:rPr>
+          <w:rFonts w:ascii="Times New Roman" w:hAnsi="Times New Roman" w:cs="Times New Roman"/>
+          <w:color w:val="252525"/>
+          <w:sz w:val="24"/>
+          <w:szCs w:val="24"/>
+          <w:shd w:val="clear" w:color="auto" w:fill="FFFFFF"/>
+        </w:rPr>
+        <w:t xml:space="preserve">, </w:t>
+      </w:r>
+      <w:proofErr w:type="spellStart"/>
+      <w:r>
+        <w:rPr>
+          <w:rFonts w:ascii="Times New Roman" w:hAnsi="Times New Roman" w:cs="Times New Roman"/>
+          <w:color w:val="252525"/>
+          <w:sz w:val="24"/>
+          <w:szCs w:val="24"/>
+          <w:shd w:val="clear" w:color="auto" w:fill="FFFFFF"/>
+        </w:rPr>
+        <w:t>committer</w:t>
+      </w:r>
+      <w:proofErr w:type="spellEnd"/>
+      <w:r>
+        <w:rPr>
+          <w:rFonts w:ascii="Times New Roman" w:hAnsi="Times New Roman" w:cs="Times New Roman"/>
+          <w:color w:val="252525"/>
+          <w:sz w:val="24"/>
+          <w:szCs w:val="24"/>
+          <w:shd w:val="clear" w:color="auto" w:fill="FFFFFF"/>
+        </w:rPr>
+        <w:t xml:space="preserve">, </w:t>
+      </w:r>
+      <w:proofErr w:type="spellStart"/>
+      <w:r>
+        <w:rPr>
+          <w:rFonts w:ascii="Times New Roman" w:hAnsi="Times New Roman" w:cs="Times New Roman"/>
+          <w:color w:val="252525"/>
+          <w:sz w:val="24"/>
+          <w:szCs w:val="24"/>
+          <w:shd w:val="clear" w:color="auto" w:fill="FFFFFF"/>
+        </w:rPr>
+        <w:t>grep</w:t>
+      </w:r>
+      <w:proofErr w:type="spellEnd"/>
+      <w:r>
+        <w:rPr>
+          <w:rFonts w:ascii="Times New Roman" w:hAnsi="Times New Roman" w:cs="Times New Roman"/>
+          <w:color w:val="252525"/>
+          <w:sz w:val="24"/>
+          <w:szCs w:val="24"/>
+          <w:shd w:val="clear" w:color="auto" w:fill="FFFFFF"/>
+        </w:rPr>
+        <w:t xml:space="preserve">) </w:t>
+      </w:r>
+      <w:hyperlink r:id="rId33" w:history="1">
+        <w:r>
+          <w:rPr>
+            <w:rStyle w:val="a3"/>
+            <w:rFonts w:cs="Times New Roman"/>
+            <w:sz w:val="24"/>
+            <w:shd w:val="clear" w:color="auto" w:fill="FFFFFF"/>
+          </w:rPr>
+          <w:t>https://code.mu/ru/tool/git/basis/limit-output-commit-history-flags/</w:t>
+        </w:r>
+      </w:hyperlink>
+      <w:r>
+        <w:rPr>
+          <w:rFonts w:ascii="Times New Roman" w:hAnsi="Times New Roman" w:cs="Times New Roman"/>
+          <w:color w:val="252525"/>
+          <w:sz w:val="24"/>
+          <w:szCs w:val="24"/>
+          <w:shd w:val="clear" w:color="auto" w:fill="FFFFFF"/>
+        </w:rPr>
+        <w:t xml:space="preserve"> ,</w:t>
+      </w:r>
+    </w:p>
+    <w:p>
+      <w:pPr>
+        <w:pStyle w:val="a4"/>
+        <w:spacing w:after="0"/>
+        <w:ind w:left="0"/>
+        <w:rPr>
+          <w:rFonts w:ascii="Times New Roman" w:hAnsi="Times New Roman" w:cs="Times New Roman"/>
+          <w:color w:val="252525"/>
+          <w:sz w:val="24"/>
+          <w:szCs w:val="24"/>
+          <w:shd w:val="clear" w:color="auto" w:fill="FFFFFF"/>
+        </w:rPr>
+      </w:pPr>
       <w:r>
         <w:rPr>
           <w:rFonts w:ascii="Times New Roman" w:hAnsi="Times New Roman" w:cs="Times New Roman"/>
@@ -2427,11 +2846,12 @@
           <w:szCs w:val="24"/>
           <w:shd w:val="clear" w:color="auto" w:fill="FFFFFF"/>
         </w:rPr>
+        <w:lastRenderedPageBreak/>
         <w:drawing>
-          <wp:inline distT="0" distB="0" distL="0" distR="0" wp14:anchorId="70694184" wp14:editId="00DEBB53">
-            <wp:extent cx="5940425" cy="2296795"/>
+          <wp:inline distT="0" distB="0" distL="0" distR="0" wp14:anchorId="25CCA7DE" wp14:editId="25F51706">
+            <wp:extent cx="5940425" cy="2144395"/>
             <wp:effectExtent l="0" t="0" r="3175" b="8255"/>
-            <wp:docPr id="56" name="Рисунок 56"/>
+            <wp:docPr id="58" name="Рисунок 58"/>
             <wp:cNvGraphicFramePr>
               <a:graphicFrameLocks xmlns:a="http://schemas.openxmlformats.org/drawingml/2006/main" noChangeAspect="1"/>
             </wp:cNvGraphicFramePr>
@@ -2443,7 +2863,7 @@
                     <pic:cNvPicPr/>
                   </pic:nvPicPr>
                   <pic:blipFill>
-                    <a:blip r:embed="rId33"/>
+                    <a:blip r:embed="rId34"/>
                     <a:stretch>
                       <a:fillRect/>
                     </a:stretch>
@@ -2451,7 +2871,7 @@
                   <pic:spPr>
                     <a:xfrm>
                       <a:off x="0" y="0"/>
-                      <a:ext cx="5940425" cy="2296795"/>
+                      <a:ext cx="5940425" cy="2144395"/>
                     </a:xfrm>
                     <a:prstGeom prst="rect">
                       <a:avLst/>
@@ -2477,69 +2897,6 @@
           <w:shd w:val="clear" w:color="auto" w:fill="FFFFFF"/>
         </w:rPr>
       </w:pPr>
-    </w:p>
-    <w:p>
-      <w:pPr>
-        <w:pStyle w:val="a4"/>
-        <w:numPr>
-          <w:ilvl w:val="1"/>
-          <w:numId w:val="1"/>
-        </w:numPr>
-        <w:spacing w:after="0"/>
-        <w:ind w:left="0"/>
-        <w:rPr>
-          <w:rFonts w:ascii="Times New Roman" w:hAnsi="Times New Roman" w:cs="Times New Roman"/>
-          <w:color w:val="252525"/>
-          <w:sz w:val="24"/>
-          <w:szCs w:val="24"/>
-          <w:shd w:val="clear" w:color="auto" w:fill="FFFFFF"/>
-        </w:rPr>
-      </w:pPr>
-      <w:r>
-        <w:rPr>
-          <w:rFonts w:ascii="Times New Roman" w:hAnsi="Times New Roman" w:cs="Times New Roman"/>
-          <w:color w:val="252525"/>
-          <w:sz w:val="24"/>
-          <w:szCs w:val="24"/>
-          <w:shd w:val="clear" w:color="auto" w:fill="FFFFFF"/>
-        </w:rPr>
-        <w:t xml:space="preserve">выведите историю коммитов: полностью и с ограничением вывода – отобрать только последние,  до и после указанной даты, по автору файлов, коммитов (флаги n, since, after, until, before, author, committer, grep) </w:t>
-      </w:r>
-      <w:hyperlink r:id="rId34" w:history="1">
-        <w:r>
-          <w:rPr>
-            <w:rStyle w:val="a3"/>
-            <w:rFonts w:cs="Times New Roman"/>
-            <w:sz w:val="24"/>
-            <w:shd w:val="clear" w:color="auto" w:fill="FFFFFF"/>
-          </w:rPr>
-          <w:t>https://code.mu/ru/tool/git/basis/limit-output-commit-history-flags/</w:t>
-        </w:r>
-      </w:hyperlink>
-      <w:r>
-        <w:rPr>
-          <w:rFonts w:ascii="Times New Roman" w:hAnsi="Times New Roman" w:cs="Times New Roman"/>
-          <w:color w:val="252525"/>
-          <w:sz w:val="24"/>
-          <w:szCs w:val="24"/>
-          <w:shd w:val="clear" w:color="auto" w:fill="FFFFFF"/>
-        </w:rPr>
-        <w:t xml:space="preserve"> ,</w:t>
-      </w:r>
-    </w:p>
-    <w:p>
-      <w:pPr>
-        <w:pStyle w:val="a4"/>
-        <w:spacing w:after="0"/>
-        <w:ind w:left="0"/>
-        <w:rPr>
-          <w:rFonts w:ascii="Times New Roman" w:hAnsi="Times New Roman" w:cs="Times New Roman"/>
-          <w:color w:val="252525"/>
-          <w:sz w:val="24"/>
-          <w:szCs w:val="24"/>
-          <w:shd w:val="clear" w:color="auto" w:fill="FFFFFF"/>
-        </w:rPr>
-      </w:pPr>
       <w:r>
         <w:rPr>
           <w:rFonts w:ascii="Times New Roman" w:hAnsi="Times New Roman" w:cs="Times New Roman"/>
@@ -2549,12 +2906,11 @@
           <w:szCs w:val="24"/>
           <w:shd w:val="clear" w:color="auto" w:fill="FFFFFF"/>
         </w:rPr>
-        <w:lastRenderedPageBreak/>
         <w:drawing>
-          <wp:inline distT="0" distB="0" distL="0" distR="0" wp14:anchorId="25CCA7DE" wp14:editId="25F51706">
-            <wp:extent cx="5940425" cy="2144395"/>
-            <wp:effectExtent l="0" t="0" r="3175" b="8255"/>
-            <wp:docPr id="58" name="Рисунок 58"/>
+          <wp:inline distT="0" distB="0" distL="0" distR="0" wp14:anchorId="22A8703D" wp14:editId="11CC93CC">
+            <wp:extent cx="5940425" cy="3717290"/>
+            <wp:effectExtent l="0" t="0" r="3175" b="0"/>
+            <wp:docPr id="59" name="Рисунок 59"/>
             <wp:cNvGraphicFramePr>
               <a:graphicFrameLocks xmlns:a="http://schemas.openxmlformats.org/drawingml/2006/main" noChangeAspect="1"/>
             </wp:cNvGraphicFramePr>
@@ -2574,7 +2930,7 @@
                   <pic:spPr>
                     <a:xfrm>
                       <a:off x="0" y="0"/>
-                      <a:ext cx="5940425" cy="2144395"/>
+                      <a:ext cx="5940425" cy="3717290"/>
                     </a:xfrm>
                     <a:prstGeom prst="rect">
                       <a:avLst/>
@@ -2598,6 +2954,7 @@
           <w:sz w:val="24"/>
           <w:szCs w:val="24"/>
           <w:shd w:val="clear" w:color="auto" w:fill="FFFFFF"/>
+          <w:lang w:val="en-US"/>
         </w:rPr>
       </w:pPr>
       <w:r>
@@ -2610,10 +2967,10 @@
           <w:shd w:val="clear" w:color="auto" w:fill="FFFFFF"/>
         </w:rPr>
         <w:drawing>
-          <wp:inline distT="0" distB="0" distL="0" distR="0" wp14:anchorId="22A8703D" wp14:editId="11CC93CC">
-            <wp:extent cx="5940425" cy="3717290"/>
+          <wp:inline distT="0" distB="0" distL="0" distR="0" wp14:anchorId="46CF79B8" wp14:editId="035DF2A9">
+            <wp:extent cx="5940425" cy="427355"/>
             <wp:effectExtent l="0" t="0" r="3175" b="0"/>
-            <wp:docPr id="59" name="Рисунок 59"/>
+            <wp:docPr id="60" name="Рисунок 60"/>
             <wp:cNvGraphicFramePr>
               <a:graphicFrameLocks xmlns:a="http://schemas.openxmlformats.org/drawingml/2006/main" noChangeAspect="1"/>
             </wp:cNvGraphicFramePr>
@@ -2633,7 +2990,7 @@
                   <pic:spPr>
                     <a:xfrm>
                       <a:off x="0" y="0"/>
-                      <a:ext cx="5940425" cy="3717290"/>
+                      <a:ext cx="5940425" cy="427355"/>
                     </a:xfrm>
                     <a:prstGeom prst="rect">
                       <a:avLst/>
@@ -2668,12 +3025,13 @@
           <w:sz w:val="24"/>
           <w:szCs w:val="24"/>
           <w:shd w:val="clear" w:color="auto" w:fill="FFFFFF"/>
+          <w:lang w:val="en-US"/>
         </w:rPr>
         <w:drawing>
-          <wp:inline distT="0" distB="0" distL="0" distR="0" wp14:anchorId="46CF79B8" wp14:editId="035DF2A9">
-            <wp:extent cx="5940425" cy="427355"/>
-            <wp:effectExtent l="0" t="0" r="3175" b="0"/>
-            <wp:docPr id="60" name="Рисунок 60"/>
+          <wp:inline distT="0" distB="0" distL="0" distR="0" wp14:anchorId="517744A6" wp14:editId="31496D2E">
+            <wp:extent cx="5940425" cy="1268730"/>
+            <wp:effectExtent l="0" t="0" r="3175" b="7620"/>
+            <wp:docPr id="61" name="Рисунок 61"/>
             <wp:cNvGraphicFramePr>
               <a:graphicFrameLocks xmlns:a="http://schemas.openxmlformats.org/drawingml/2006/main" noChangeAspect="1"/>
             </wp:cNvGraphicFramePr>
@@ -2693,7 +3051,7 @@
                   <pic:spPr>
                     <a:xfrm>
                       <a:off x="0" y="0"/>
-                      <a:ext cx="5940425" cy="427355"/>
+                      <a:ext cx="5940425" cy="1268730"/>
                     </a:xfrm>
                     <a:prstGeom prst="rect">
                       <a:avLst/>
@@ -2717,7 +3075,6 @@
           <w:sz w:val="24"/>
           <w:szCs w:val="24"/>
           <w:shd w:val="clear" w:color="auto" w:fill="FFFFFF"/>
-          <w:lang w:val="en-US"/>
         </w:rPr>
       </w:pPr>
       <w:r>
@@ -2728,13 +3085,13 @@
           <w:sz w:val="24"/>
           <w:szCs w:val="24"/>
           <w:shd w:val="clear" w:color="auto" w:fill="FFFFFF"/>
-          <w:lang w:val="en-US"/>
-        </w:rPr>
+        </w:rPr>
+        <w:lastRenderedPageBreak/>
         <w:drawing>
-          <wp:inline distT="0" distB="0" distL="0" distR="0" wp14:anchorId="517744A6" wp14:editId="31496D2E">
-            <wp:extent cx="5940425" cy="1268730"/>
-            <wp:effectExtent l="0" t="0" r="3175" b="7620"/>
-            <wp:docPr id="61" name="Рисунок 61"/>
+          <wp:inline distT="0" distB="0" distL="0" distR="0" wp14:anchorId="2B694548" wp14:editId="0837CA7B">
+            <wp:extent cx="5940425" cy="2840355"/>
+            <wp:effectExtent l="0" t="0" r="3175" b="0"/>
+            <wp:docPr id="62" name="Рисунок 62"/>
             <wp:cNvGraphicFramePr>
               <a:graphicFrameLocks xmlns:a="http://schemas.openxmlformats.org/drawingml/2006/main" noChangeAspect="1"/>
             </wp:cNvGraphicFramePr>
@@ -2754,7 +3111,7 @@
                   <pic:spPr>
                     <a:xfrm>
                       <a:off x="0" y="0"/>
-                      <a:ext cx="5940425" cy="1268730"/>
+                      <a:ext cx="5940425" cy="2840355"/>
                     </a:xfrm>
                     <a:prstGeom prst="rect">
                       <a:avLst/>
@@ -2789,12 +3146,11 @@
           <w:szCs w:val="24"/>
           <w:shd w:val="clear" w:color="auto" w:fill="FFFFFF"/>
         </w:rPr>
-        <w:lastRenderedPageBreak/>
         <w:drawing>
-          <wp:inline distT="0" distB="0" distL="0" distR="0" wp14:anchorId="2B694548" wp14:editId="0837CA7B">
-            <wp:extent cx="5940425" cy="2840355"/>
+          <wp:inline distT="0" distB="0" distL="0" distR="0" wp14:anchorId="2CDFDD39" wp14:editId="38084DE2">
+            <wp:extent cx="5940425" cy="2839720"/>
             <wp:effectExtent l="0" t="0" r="3175" b="0"/>
-            <wp:docPr id="62" name="Рисунок 62"/>
+            <wp:docPr id="63" name="Рисунок 63"/>
             <wp:cNvGraphicFramePr>
               <a:graphicFrameLocks xmlns:a="http://schemas.openxmlformats.org/drawingml/2006/main" noChangeAspect="1"/>
             </wp:cNvGraphicFramePr>
@@ -2814,7 +3170,7 @@
                   <pic:spPr>
                     <a:xfrm>
                       <a:off x="0" y="0"/>
-                      <a:ext cx="5940425" cy="2840355"/>
+                      <a:ext cx="5940425" cy="2839720"/>
                     </a:xfrm>
                     <a:prstGeom prst="rect">
                       <a:avLst/>
@@ -2850,10 +3206,10 @@
           <w:shd w:val="clear" w:color="auto" w:fill="FFFFFF"/>
         </w:rPr>
         <w:drawing>
-          <wp:inline distT="0" distB="0" distL="0" distR="0" wp14:anchorId="2CDFDD39" wp14:editId="38084DE2">
-            <wp:extent cx="5940425" cy="2839720"/>
-            <wp:effectExtent l="0" t="0" r="3175" b="0"/>
-            <wp:docPr id="63" name="Рисунок 63"/>
+          <wp:inline distT="0" distB="0" distL="0" distR="0" wp14:anchorId="3AB904CC" wp14:editId="215A4E01">
+            <wp:extent cx="5940425" cy="1995805"/>
+            <wp:effectExtent l="0" t="0" r="3175" b="4445"/>
+            <wp:docPr id="64" name="Рисунок 64"/>
             <wp:cNvGraphicFramePr>
               <a:graphicFrameLocks xmlns:a="http://schemas.openxmlformats.org/drawingml/2006/main" noChangeAspect="1"/>
             </wp:cNvGraphicFramePr>
@@ -2873,7 +3229,7 @@
                   <pic:spPr>
                     <a:xfrm>
                       <a:off x="0" y="0"/>
-                      <a:ext cx="5940425" cy="2839720"/>
+                      <a:ext cx="5940425" cy="1995805"/>
                     </a:xfrm>
                     <a:prstGeom prst="rect">
                       <a:avLst/>
@@ -2908,11 +3264,12 @@
           <w:szCs w:val="24"/>
           <w:shd w:val="clear" w:color="auto" w:fill="FFFFFF"/>
         </w:rPr>
+        <w:lastRenderedPageBreak/>
         <w:drawing>
-          <wp:inline distT="0" distB="0" distL="0" distR="0" wp14:anchorId="3AB904CC" wp14:editId="215A4E01">
-            <wp:extent cx="5940425" cy="1995805"/>
-            <wp:effectExtent l="0" t="0" r="3175" b="4445"/>
-            <wp:docPr id="64" name="Рисунок 64"/>
+          <wp:inline distT="0" distB="0" distL="0" distR="0" wp14:anchorId="4D528750" wp14:editId="1B95CFF4">
+            <wp:extent cx="5940425" cy="2016760"/>
+            <wp:effectExtent l="0" t="0" r="3175" b="2540"/>
+            <wp:docPr id="65" name="Рисунок 65"/>
             <wp:cNvGraphicFramePr>
               <a:graphicFrameLocks xmlns:a="http://schemas.openxmlformats.org/drawingml/2006/main" noChangeAspect="1"/>
             </wp:cNvGraphicFramePr>
@@ -2932,7 +3289,7 @@
                   <pic:spPr>
                     <a:xfrm>
                       <a:off x="0" y="0"/>
-                      <a:ext cx="5940425" cy="1995805"/>
+                      <a:ext cx="5940425" cy="2016760"/>
                     </a:xfrm>
                     <a:prstGeom prst="rect">
                       <a:avLst/>
@@ -2956,6 +3313,167 @@
           <w:sz w:val="24"/>
           <w:szCs w:val="24"/>
           <w:shd w:val="clear" w:color="auto" w:fill="FFFFFF"/>
+          <w:lang w:val="en-US"/>
+        </w:rPr>
+      </w:pPr>
+    </w:p>
+    <w:p>
+      <w:pPr>
+        <w:pStyle w:val="a4"/>
+        <w:spacing w:after="0"/>
+        <w:ind w:left="0"/>
+        <w:rPr>
+          <w:rFonts w:ascii="Times New Roman" w:hAnsi="Times New Roman" w:cs="Times New Roman"/>
+          <w:color w:val="252525"/>
+          <w:sz w:val="24"/>
+          <w:szCs w:val="24"/>
+          <w:shd w:val="clear" w:color="auto" w:fill="FFFFFF"/>
+          <w:lang w:val="en-US"/>
+        </w:rPr>
+      </w:pPr>
+    </w:p>
+    <w:p>
+      <w:pPr>
+        <w:pStyle w:val="a4"/>
+        <w:numPr>
+          <w:ilvl w:val="1"/>
+          <w:numId w:val="1"/>
+        </w:numPr>
+        <w:spacing w:after="0"/>
+        <w:ind w:left="0"/>
+        <w:rPr>
+          <w:rFonts w:ascii="Times New Roman" w:hAnsi="Times New Roman" w:cs="Times New Roman"/>
+          <w:color w:val="252525"/>
+          <w:sz w:val="24"/>
+          <w:szCs w:val="24"/>
+          <w:shd w:val="clear" w:color="auto" w:fill="FFFFFF"/>
+          <w:lang w:val="en-US"/>
+        </w:rPr>
+      </w:pPr>
+      <w:r>
+        <w:rPr>
+          <w:rFonts w:ascii="Times New Roman" w:hAnsi="Times New Roman" w:cs="Times New Roman"/>
+          <w:color w:val="252525"/>
+          <w:sz w:val="24"/>
+          <w:szCs w:val="24"/>
+          <w:shd w:val="clear" w:color="auto" w:fill="FFFFFF"/>
+        </w:rPr>
+        <w:t>исследуйте</w:t>
+      </w:r>
+      <w:r>
+        <w:rPr>
+          <w:rFonts w:ascii="Times New Roman" w:hAnsi="Times New Roman" w:cs="Times New Roman"/>
+          <w:color w:val="252525"/>
+          <w:sz w:val="24"/>
+          <w:szCs w:val="24"/>
+          <w:shd w:val="clear" w:color="auto" w:fill="FFFFFF"/>
+          <w:lang w:val="en-US"/>
+        </w:rPr>
+        <w:t xml:space="preserve"> </w:t>
+      </w:r>
+      <w:r>
+        <w:rPr>
+          <w:rFonts w:ascii="Times New Roman" w:hAnsi="Times New Roman" w:cs="Times New Roman"/>
+          <w:color w:val="252525"/>
+          <w:sz w:val="24"/>
+          <w:szCs w:val="24"/>
+          <w:shd w:val="clear" w:color="auto" w:fill="FFFFFF"/>
+        </w:rPr>
+        <w:t>флаги</w:t>
+      </w:r>
+      <w:r>
+        <w:rPr>
+          <w:rFonts w:ascii="Times New Roman" w:hAnsi="Times New Roman" w:cs="Times New Roman"/>
+          <w:color w:val="252525"/>
+          <w:sz w:val="24"/>
+          <w:szCs w:val="24"/>
+          <w:shd w:val="clear" w:color="auto" w:fill="FFFFFF"/>
+          <w:lang w:val="en-US"/>
+        </w:rPr>
+        <w:t xml:space="preserve"> </w:t>
+      </w:r>
+      <w:r>
+        <w:rPr>
+          <w:rFonts w:ascii="Times New Roman" w:hAnsi="Times New Roman" w:cs="Times New Roman"/>
+          <w:color w:val="252525"/>
+          <w:sz w:val="24"/>
+          <w:szCs w:val="24"/>
+          <w:shd w:val="clear" w:color="auto" w:fill="FFFFFF"/>
+        </w:rPr>
+        <w:t>для</w:t>
+      </w:r>
+      <w:r>
+        <w:rPr>
+          <w:rFonts w:ascii="Times New Roman" w:hAnsi="Times New Roman" w:cs="Times New Roman"/>
+          <w:color w:val="252525"/>
+          <w:sz w:val="24"/>
+          <w:szCs w:val="24"/>
+          <w:shd w:val="clear" w:color="auto" w:fill="FFFFFF"/>
+          <w:lang w:val="en-US"/>
+        </w:rPr>
+        <w:t xml:space="preserve"> git log: </w:t>
+      </w:r>
+      <w:proofErr w:type="gramStart"/>
+      <w:r>
+        <w:rPr>
+          <w:rFonts w:ascii="Times New Roman" w:hAnsi="Times New Roman" w:cs="Times New Roman"/>
+          <w:color w:val="252525"/>
+          <w:sz w:val="24"/>
+          <w:szCs w:val="24"/>
+          <w:shd w:val="clear" w:color="auto" w:fill="FFFFFF"/>
+          <w:lang w:val="en-US"/>
+        </w:rPr>
+        <w:t>p ,</w:t>
+      </w:r>
+      <w:proofErr w:type="gramEnd"/>
+      <w:r>
+        <w:rPr>
+          <w:rFonts w:ascii="Times New Roman" w:hAnsi="Times New Roman" w:cs="Times New Roman"/>
+          <w:color w:val="252525"/>
+          <w:sz w:val="24"/>
+          <w:szCs w:val="24"/>
+          <w:shd w:val="clear" w:color="auto" w:fill="FFFFFF"/>
+          <w:lang w:val="en-US"/>
+        </w:rPr>
+        <w:t xml:space="preserve"> stat ,</w:t>
+      </w:r>
+      <w:proofErr w:type="spellStart"/>
+      <w:r>
+        <w:rPr>
+          <w:rFonts w:ascii="Times New Roman" w:hAnsi="Times New Roman" w:cs="Times New Roman"/>
+          <w:color w:val="252525"/>
+          <w:sz w:val="24"/>
+          <w:szCs w:val="24"/>
+          <w:shd w:val="clear" w:color="auto" w:fill="FFFFFF"/>
+          <w:lang w:val="en-US"/>
+        </w:rPr>
+        <w:t>shortstat</w:t>
+      </w:r>
+      <w:proofErr w:type="spellEnd"/>
+      <w:r>
+        <w:rPr>
+          <w:rFonts w:ascii="Times New Roman" w:hAnsi="Times New Roman" w:cs="Times New Roman"/>
+          <w:color w:val="252525"/>
+          <w:sz w:val="24"/>
+          <w:szCs w:val="24"/>
+          <w:shd w:val="clear" w:color="auto" w:fill="FFFFFF"/>
+          <w:lang w:val="en-US"/>
+        </w:rPr>
+        <w:t xml:space="preserve">, name-only, name-status, relative-date, pretty, graph, </w:t>
+      </w:r>
+    </w:p>
+    <w:p>
+      <w:pPr>
+        <w:pStyle w:val="a4"/>
+        <w:spacing w:after="0"/>
+        <w:ind w:left="0"/>
+        <w:rPr>
+          <w:rFonts w:ascii="Times New Roman" w:hAnsi="Times New Roman" w:cs="Times New Roman"/>
+          <w:color w:val="252525"/>
+          <w:sz w:val="24"/>
+          <w:szCs w:val="24"/>
+          <w:shd w:val="clear" w:color="auto" w:fill="FFFFFF"/>
+          <w:lang w:val="en-US"/>
         </w:rPr>
       </w:pPr>
       <w:r>
@@ -2966,13 +3484,13 @@
           <w:sz w:val="24"/>
           <w:szCs w:val="24"/>
           <w:shd w:val="clear" w:color="auto" w:fill="FFFFFF"/>
-        </w:rPr>
-        <w:lastRenderedPageBreak/>
+          <w:lang w:val="en-US"/>
+        </w:rPr>
         <w:drawing>
-          <wp:inline distT="0" distB="0" distL="0" distR="0" wp14:anchorId="4D528750" wp14:editId="1B95CFF4">
-            <wp:extent cx="5940425" cy="2016760"/>
-            <wp:effectExtent l="0" t="0" r="3175" b="2540"/>
-            <wp:docPr id="65" name="Рисунок 65"/>
+          <wp:inline distT="0" distB="0" distL="0" distR="0" wp14:anchorId="413BB9C1" wp14:editId="1BB40C16">
+            <wp:extent cx="5940425" cy="4204335"/>
+            <wp:effectExtent l="0" t="0" r="3175" b="5715"/>
+            <wp:docPr id="67" name="Рисунок 67"/>
             <wp:cNvGraphicFramePr>
               <a:graphicFrameLocks xmlns:a="http://schemas.openxmlformats.org/drawingml/2006/main" noChangeAspect="1"/>
             </wp:cNvGraphicFramePr>
@@ -2992,7 +3510,7 @@
                   <pic:spPr>
                     <a:xfrm>
                       <a:off x="0" y="0"/>
-                      <a:ext cx="5940425" cy="2016760"/>
+                      <a:ext cx="5940425" cy="4204335"/>
                     </a:xfrm>
                     <a:prstGeom prst="rect">
                       <a:avLst/>
@@ -3019,133 +3537,22 @@
           <w:lang w:val="en-US"/>
         </w:rPr>
       </w:pPr>
-    </w:p>
-    <w:p>
-      <w:pPr>
-        <w:pStyle w:val="a4"/>
-        <w:spacing w:after="0"/>
-        <w:ind w:left="0"/>
-        <w:rPr>
-          <w:rFonts w:ascii="Times New Roman" w:hAnsi="Times New Roman" w:cs="Times New Roman"/>
+      <w:r>
+        <w:rPr>
+          <w:rFonts w:ascii="Times New Roman" w:hAnsi="Times New Roman" w:cs="Times New Roman"/>
+          <w:noProof/>
           <w:color w:val="252525"/>
           <w:sz w:val="24"/>
           <w:szCs w:val="24"/>
           <w:shd w:val="clear" w:color="auto" w:fill="FFFFFF"/>
           <w:lang w:val="en-US"/>
         </w:rPr>
-      </w:pPr>
-    </w:p>
-    <w:p>
-      <w:pPr>
-        <w:pStyle w:val="a4"/>
-        <w:numPr>
-          <w:ilvl w:val="1"/>
-          <w:numId w:val="1"/>
-        </w:numPr>
-        <w:spacing w:after="0"/>
-        <w:ind w:left="0"/>
-        <w:rPr>
-          <w:rFonts w:ascii="Times New Roman" w:hAnsi="Times New Roman" w:cs="Times New Roman"/>
-          <w:color w:val="252525"/>
-          <w:sz w:val="24"/>
-          <w:szCs w:val="24"/>
-          <w:shd w:val="clear" w:color="auto" w:fill="FFFFFF"/>
-          <w:lang w:val="en-US"/>
-        </w:rPr>
-      </w:pPr>
-      <w:r>
-        <w:rPr>
-          <w:rFonts w:ascii="Times New Roman" w:hAnsi="Times New Roman" w:cs="Times New Roman"/>
-          <w:color w:val="252525"/>
-          <w:sz w:val="24"/>
-          <w:szCs w:val="24"/>
-          <w:shd w:val="clear" w:color="auto" w:fill="FFFFFF"/>
-        </w:rPr>
-        <w:t>исследуйте</w:t>
-      </w:r>
-      <w:r>
-        <w:rPr>
-          <w:rFonts w:ascii="Times New Roman" w:hAnsi="Times New Roman" w:cs="Times New Roman"/>
-          <w:color w:val="252525"/>
-          <w:sz w:val="24"/>
-          <w:szCs w:val="24"/>
-          <w:shd w:val="clear" w:color="auto" w:fill="FFFFFF"/>
-          <w:lang w:val="en-US"/>
-        </w:rPr>
-        <w:t xml:space="preserve"> </w:t>
-      </w:r>
-      <w:r>
-        <w:rPr>
-          <w:rFonts w:ascii="Times New Roman" w:hAnsi="Times New Roman" w:cs="Times New Roman"/>
-          <w:color w:val="252525"/>
-          <w:sz w:val="24"/>
-          <w:szCs w:val="24"/>
-          <w:shd w:val="clear" w:color="auto" w:fill="FFFFFF"/>
-        </w:rPr>
-        <w:t>флаги</w:t>
-      </w:r>
-      <w:r>
-        <w:rPr>
-          <w:rFonts w:ascii="Times New Roman" w:hAnsi="Times New Roman" w:cs="Times New Roman"/>
-          <w:color w:val="252525"/>
-          <w:sz w:val="24"/>
-          <w:szCs w:val="24"/>
-          <w:shd w:val="clear" w:color="auto" w:fill="FFFFFF"/>
-          <w:lang w:val="en-US"/>
-        </w:rPr>
-        <w:t xml:space="preserve"> </w:t>
-      </w:r>
-      <w:r>
-        <w:rPr>
-          <w:rFonts w:ascii="Times New Roman" w:hAnsi="Times New Roman" w:cs="Times New Roman"/>
-          <w:color w:val="252525"/>
-          <w:sz w:val="24"/>
-          <w:szCs w:val="24"/>
-          <w:shd w:val="clear" w:color="auto" w:fill="FFFFFF"/>
-        </w:rPr>
-        <w:t>для</w:t>
-      </w:r>
-      <w:r>
-        <w:rPr>
-          <w:rFonts w:ascii="Times New Roman" w:hAnsi="Times New Roman" w:cs="Times New Roman"/>
-          <w:color w:val="252525"/>
-          <w:sz w:val="24"/>
-          <w:szCs w:val="24"/>
-          <w:shd w:val="clear" w:color="auto" w:fill="FFFFFF"/>
-          <w:lang w:val="en-US"/>
-        </w:rPr>
-        <w:t xml:space="preserve"> git log: p , stat ,shortstat, name-only, name-status, relative-date, pretty, graph, </w:t>
-      </w:r>
-    </w:p>
-    <w:p>
-      <w:pPr>
-        <w:pStyle w:val="a4"/>
-        <w:spacing w:after="0"/>
-        <w:ind w:left="0"/>
-        <w:rPr>
-          <w:rFonts w:ascii="Times New Roman" w:hAnsi="Times New Roman" w:cs="Times New Roman"/>
-          <w:color w:val="252525"/>
-          <w:sz w:val="24"/>
-          <w:szCs w:val="24"/>
-          <w:shd w:val="clear" w:color="auto" w:fill="FFFFFF"/>
-          <w:lang w:val="en-US"/>
-        </w:rPr>
-      </w:pPr>
-      <w:r>
-        <w:rPr>
-          <w:rFonts w:ascii="Times New Roman" w:hAnsi="Times New Roman" w:cs="Times New Roman"/>
-          <w:noProof/>
-          <w:color w:val="252525"/>
-          <w:sz w:val="24"/>
-          <w:szCs w:val="24"/>
-          <w:shd w:val="clear" w:color="auto" w:fill="FFFFFF"/>
-          <w:lang w:val="en-US"/>
-        </w:rPr>
+        <w:lastRenderedPageBreak/>
         <w:drawing>
-          <wp:inline distT="0" distB="0" distL="0" distR="0" wp14:anchorId="413BB9C1" wp14:editId="1BB40C16">
-            <wp:extent cx="5940425" cy="4204335"/>
-            <wp:effectExtent l="0" t="0" r="3175" b="5715"/>
-            <wp:docPr id="67" name="Рисунок 67"/>
+          <wp:inline distT="0" distB="0" distL="0" distR="0" wp14:anchorId="02DA1C06" wp14:editId="619E405E">
+            <wp:extent cx="5940425" cy="4196715"/>
+            <wp:effectExtent l="0" t="0" r="3175" b="0"/>
+            <wp:docPr id="68" name="Рисунок 68"/>
             <wp:cNvGraphicFramePr>
               <a:graphicFrameLocks xmlns:a="http://schemas.openxmlformats.org/drawingml/2006/main" noChangeAspect="1"/>
             </wp:cNvGraphicFramePr>
@@ -3165,7 +3572,7 @@
                   <pic:spPr>
                     <a:xfrm>
                       <a:off x="0" y="0"/>
-                      <a:ext cx="5940425" cy="4204335"/>
+                      <a:ext cx="5940425" cy="4196715"/>
                     </a:xfrm>
                     <a:prstGeom prst="rect">
                       <a:avLst/>
@@ -3202,12 +3609,11 @@
           <w:shd w:val="clear" w:color="auto" w:fill="FFFFFF"/>
           <w:lang w:val="en-US"/>
         </w:rPr>
-        <w:lastRenderedPageBreak/>
         <w:drawing>
-          <wp:inline distT="0" distB="0" distL="0" distR="0" wp14:anchorId="02DA1C06" wp14:editId="619E405E">
-            <wp:extent cx="5940425" cy="4196715"/>
-            <wp:effectExtent l="0" t="0" r="3175" b="0"/>
-            <wp:docPr id="68" name="Рисунок 68"/>
+          <wp:inline distT="0" distB="0" distL="0" distR="0" wp14:anchorId="4AC01B11" wp14:editId="6DEA6581">
+            <wp:extent cx="5940425" cy="3616960"/>
+            <wp:effectExtent l="0" t="0" r="3175" b="2540"/>
+            <wp:docPr id="69" name="Рисунок 69"/>
             <wp:cNvGraphicFramePr>
               <a:graphicFrameLocks xmlns:a="http://schemas.openxmlformats.org/drawingml/2006/main" noChangeAspect="1"/>
             </wp:cNvGraphicFramePr>
@@ -3227,7 +3633,7 @@
                   <pic:spPr>
                     <a:xfrm>
                       <a:off x="0" y="0"/>
-                      <a:ext cx="5940425" cy="4196715"/>
+                      <a:ext cx="5940425" cy="3616960"/>
                     </a:xfrm>
                     <a:prstGeom prst="rect">
                       <a:avLst/>
@@ -3264,11 +3670,12 @@
           <w:shd w:val="clear" w:color="auto" w:fill="FFFFFF"/>
           <w:lang w:val="en-US"/>
         </w:rPr>
+        <w:lastRenderedPageBreak/>
         <w:drawing>
-          <wp:inline distT="0" distB="0" distL="0" distR="0" wp14:anchorId="4AC01B11" wp14:editId="6DEA6581">
-            <wp:extent cx="5940425" cy="3616960"/>
-            <wp:effectExtent l="0" t="0" r="3175" b="2540"/>
-            <wp:docPr id="69" name="Рисунок 69"/>
+          <wp:inline distT="0" distB="0" distL="0" distR="0" wp14:anchorId="03885DA4" wp14:editId="433FA6CE">
+            <wp:extent cx="5940425" cy="2629535"/>
+            <wp:effectExtent l="0" t="0" r="3175" b="0"/>
+            <wp:docPr id="70" name="Рисунок 70"/>
             <wp:cNvGraphicFramePr>
               <a:graphicFrameLocks xmlns:a="http://schemas.openxmlformats.org/drawingml/2006/main" noChangeAspect="1"/>
             </wp:cNvGraphicFramePr>
@@ -3288,7 +3695,7 @@
                   <pic:spPr>
                     <a:xfrm>
                       <a:off x="0" y="0"/>
-                      <a:ext cx="5940425" cy="3616960"/>
+                      <a:ext cx="5940425" cy="2629535"/>
                     </a:xfrm>
                     <a:prstGeom prst="rect">
                       <a:avLst/>
@@ -3325,12 +3732,11 @@
           <w:shd w:val="clear" w:color="auto" w:fill="FFFFFF"/>
           <w:lang w:val="en-US"/>
         </w:rPr>
-        <w:lastRenderedPageBreak/>
         <w:drawing>
-          <wp:inline distT="0" distB="0" distL="0" distR="0" wp14:anchorId="03885DA4" wp14:editId="433FA6CE">
-            <wp:extent cx="5940425" cy="2629535"/>
-            <wp:effectExtent l="0" t="0" r="3175" b="0"/>
-            <wp:docPr id="70" name="Рисунок 70"/>
+          <wp:inline distT="0" distB="0" distL="0" distR="0" wp14:anchorId="78D03E18" wp14:editId="1DC1F123">
+            <wp:extent cx="5940425" cy="2702560"/>
+            <wp:effectExtent l="0" t="0" r="3175" b="2540"/>
+            <wp:docPr id="71" name="Рисунок 71"/>
             <wp:cNvGraphicFramePr>
               <a:graphicFrameLocks xmlns:a="http://schemas.openxmlformats.org/drawingml/2006/main" noChangeAspect="1"/>
             </wp:cNvGraphicFramePr>
@@ -3350,7 +3756,7 @@
                   <pic:spPr>
                     <a:xfrm>
                       <a:off x="0" y="0"/>
-                      <a:ext cx="5940425" cy="2629535"/>
+                      <a:ext cx="5940425" cy="2702560"/>
                     </a:xfrm>
                     <a:prstGeom prst="rect">
                       <a:avLst/>
@@ -3388,10 +3794,10 @@
           <w:lang w:val="en-US"/>
         </w:rPr>
         <w:drawing>
-          <wp:inline distT="0" distB="0" distL="0" distR="0" wp14:anchorId="78D03E18" wp14:editId="1DC1F123">
-            <wp:extent cx="5940425" cy="2702560"/>
-            <wp:effectExtent l="0" t="0" r="3175" b="2540"/>
-            <wp:docPr id="71" name="Рисунок 71"/>
+          <wp:inline distT="0" distB="0" distL="0" distR="0" wp14:anchorId="6643D4E2" wp14:editId="7A90BDFA">
+            <wp:extent cx="5940425" cy="2047240"/>
+            <wp:effectExtent l="0" t="0" r="3175" b="0"/>
+            <wp:docPr id="72" name="Рисунок 72"/>
             <wp:cNvGraphicFramePr>
               <a:graphicFrameLocks xmlns:a="http://schemas.openxmlformats.org/drawingml/2006/main" noChangeAspect="1"/>
             </wp:cNvGraphicFramePr>
@@ -3411,7 +3817,7 @@
                   <pic:spPr>
                     <a:xfrm>
                       <a:off x="0" y="0"/>
-                      <a:ext cx="5940425" cy="2702560"/>
+                      <a:ext cx="5940425" cy="2047240"/>
                     </a:xfrm>
                     <a:prstGeom prst="rect">
                       <a:avLst/>
@@ -3448,11 +3854,12 @@
           <w:shd w:val="clear" w:color="auto" w:fill="FFFFFF"/>
           <w:lang w:val="en-US"/>
         </w:rPr>
+        <w:lastRenderedPageBreak/>
         <w:drawing>
-          <wp:inline distT="0" distB="0" distL="0" distR="0" wp14:anchorId="6643D4E2" wp14:editId="7A90BDFA">
-            <wp:extent cx="5940425" cy="2047240"/>
-            <wp:effectExtent l="0" t="0" r="3175" b="0"/>
-            <wp:docPr id="72" name="Рисунок 72"/>
+          <wp:inline distT="0" distB="0" distL="0" distR="0" wp14:anchorId="34E66323" wp14:editId="11367FDE">
+            <wp:extent cx="5940425" cy="2527300"/>
+            <wp:effectExtent l="0" t="0" r="3175" b="6350"/>
+            <wp:docPr id="73" name="Рисунок 73"/>
             <wp:cNvGraphicFramePr>
               <a:graphicFrameLocks xmlns:a="http://schemas.openxmlformats.org/drawingml/2006/main" noChangeAspect="1"/>
             </wp:cNvGraphicFramePr>
@@ -3472,7 +3879,7 @@
                   <pic:spPr>
                     <a:xfrm>
                       <a:off x="0" y="0"/>
-                      <a:ext cx="5940425" cy="2047240"/>
+                      <a:ext cx="5940425" cy="2527300"/>
                     </a:xfrm>
                     <a:prstGeom prst="rect">
                       <a:avLst/>
@@ -3509,12 +3916,11 @@
           <w:shd w:val="clear" w:color="auto" w:fill="FFFFFF"/>
           <w:lang w:val="en-US"/>
         </w:rPr>
-        <w:lastRenderedPageBreak/>
         <w:drawing>
-          <wp:inline distT="0" distB="0" distL="0" distR="0" wp14:anchorId="34E66323" wp14:editId="11367FDE">
-            <wp:extent cx="5940425" cy="2527300"/>
-            <wp:effectExtent l="0" t="0" r="3175" b="6350"/>
-            <wp:docPr id="73" name="Рисунок 73"/>
+          <wp:inline distT="0" distB="0" distL="0" distR="0" wp14:anchorId="3127BFA1" wp14:editId="7F9E26E2">
+            <wp:extent cx="5940425" cy="2898775"/>
+            <wp:effectExtent l="0" t="0" r="3175" b="0"/>
+            <wp:docPr id="74" name="Рисунок 74"/>
             <wp:cNvGraphicFramePr>
               <a:graphicFrameLocks xmlns:a="http://schemas.openxmlformats.org/drawingml/2006/main" noChangeAspect="1"/>
             </wp:cNvGraphicFramePr>
@@ -3534,7 +3940,7 @@
                   <pic:spPr>
                     <a:xfrm>
                       <a:off x="0" y="0"/>
-                      <a:ext cx="5940425" cy="2527300"/>
+                      <a:ext cx="5940425" cy="2898775"/>
                     </a:xfrm>
                     <a:prstGeom prst="rect">
                       <a:avLst/>
@@ -3550,15 +3956,70 @@
     <w:p>
       <w:pPr>
         <w:pStyle w:val="a4"/>
-        <w:spacing w:after="0"/>
-        <w:ind w:left="0"/>
-        <w:rPr>
-          <w:rFonts w:ascii="Times New Roman" w:hAnsi="Times New Roman" w:cs="Times New Roman"/>
-          <w:color w:val="252525"/>
-          <w:sz w:val="24"/>
-          <w:szCs w:val="24"/>
-          <w:shd w:val="clear" w:color="auto" w:fill="FFFFFF"/>
-          <w:lang w:val="en-US"/>
+        <w:numPr>
+          <w:ilvl w:val="1"/>
+          <w:numId w:val="1"/>
+        </w:numPr>
+        <w:spacing w:after="0"/>
+        <w:ind w:left="0"/>
+        <w:rPr>
+          <w:rFonts w:ascii="Times New Roman" w:hAnsi="Times New Roman" w:cs="Times New Roman"/>
+          <w:color w:val="252525"/>
+          <w:sz w:val="24"/>
+          <w:szCs w:val="24"/>
+          <w:shd w:val="clear" w:color="auto" w:fill="FFFFFF"/>
+        </w:rPr>
+      </w:pPr>
+      <w:r>
+        <w:rPr>
+          <w:rFonts w:ascii="Times New Roman" w:hAnsi="Times New Roman" w:cs="Times New Roman"/>
+          <w:color w:val="252525"/>
+          <w:sz w:val="24"/>
+          <w:szCs w:val="24"/>
+          <w:shd w:val="clear" w:color="auto" w:fill="FFFFFF"/>
+        </w:rPr>
+        <w:t>найдите разницу в изменениях для каждого коммита</w:t>
+      </w:r>
+    </w:p>
+    <w:p>
+      <w:pPr>
+        <w:pStyle w:val="a4"/>
+        <w:numPr>
+          <w:ilvl w:val="1"/>
+          <w:numId w:val="1"/>
+        </w:numPr>
+        <w:spacing w:after="0"/>
+        <w:ind w:left="0"/>
+        <w:rPr>
+          <w:rFonts w:ascii="Times New Roman" w:hAnsi="Times New Roman" w:cs="Times New Roman"/>
+          <w:color w:val="252525"/>
+          <w:sz w:val="24"/>
+          <w:szCs w:val="24"/>
+          <w:shd w:val="clear" w:color="auto" w:fill="FFFFFF"/>
+        </w:rPr>
+      </w:pPr>
+      <w:r>
+        <w:rPr>
+          <w:rFonts w:ascii="Times New Roman" w:hAnsi="Times New Roman" w:cs="Times New Roman"/>
+          <w:color w:val="252525"/>
+          <w:sz w:val="24"/>
+          <w:szCs w:val="24"/>
+          <w:shd w:val="clear" w:color="auto" w:fill="FFFFFF"/>
+        </w:rPr>
+        <w:t>создайте новый файл test.txt и вставьте в него строчку 'номер варианта'. затем сделайте коммит и отмените его</w:t>
+      </w:r>
+    </w:p>
+    <w:p>
+      <w:pPr>
+        <w:pStyle w:val="a4"/>
+        <w:spacing w:after="0"/>
+        <w:ind w:left="0"/>
+        <w:rPr>
+          <w:rFonts w:ascii="Times New Roman" w:hAnsi="Times New Roman" w:cs="Times New Roman"/>
+          <w:color w:val="252525"/>
+          <w:sz w:val="24"/>
+          <w:szCs w:val="24"/>
+          <w:shd w:val="clear" w:color="auto" w:fill="FFFFFF"/>
         </w:rPr>
       </w:pPr>
       <w:r>
@@ -3569,13 +4030,12 @@
           <w:sz w:val="24"/>
           <w:szCs w:val="24"/>
           <w:shd w:val="clear" w:color="auto" w:fill="FFFFFF"/>
-          <w:lang w:val="en-US"/>
         </w:rPr>
         <w:drawing>
-          <wp:inline distT="0" distB="0" distL="0" distR="0" wp14:anchorId="3127BFA1" wp14:editId="7F9E26E2">
-            <wp:extent cx="5940425" cy="2898775"/>
-            <wp:effectExtent l="0" t="0" r="3175" b="0"/>
-            <wp:docPr id="74" name="Рисунок 74"/>
+          <wp:inline distT="0" distB="0" distL="0" distR="0" wp14:anchorId="0C07CF6B" wp14:editId="13426CA5">
+            <wp:extent cx="5940425" cy="2677160"/>
+            <wp:effectExtent l="0" t="0" r="3175" b="8890"/>
+            <wp:docPr id="75" name="Рисунок 75"/>
             <wp:cNvGraphicFramePr>
               <a:graphicFrameLocks xmlns:a="http://schemas.openxmlformats.org/drawingml/2006/main" noChangeAspect="1"/>
             </wp:cNvGraphicFramePr>
@@ -3595,7 +4055,7 @@
                   <pic:spPr>
                     <a:xfrm>
                       <a:off x="0" y="0"/>
-                      <a:ext cx="5940425" cy="2898775"/>
+                      <a:ext cx="5940425" cy="2677160"/>
                     </a:xfrm>
                     <a:prstGeom prst="rect">
                       <a:avLst/>
@@ -3611,62 +4071,6 @@
     <w:p>
       <w:pPr>
         <w:pStyle w:val="a4"/>
-        <w:numPr>
-          <w:ilvl w:val="1"/>
-          <w:numId w:val="1"/>
-        </w:numPr>
-        <w:spacing w:after="0"/>
-        <w:ind w:left="0"/>
-        <w:rPr>
-          <w:rFonts w:ascii="Times New Roman" w:hAnsi="Times New Roman" w:cs="Times New Roman"/>
-          <w:color w:val="252525"/>
-          <w:sz w:val="24"/>
-          <w:szCs w:val="24"/>
-          <w:shd w:val="clear" w:color="auto" w:fill="FFFFFF"/>
-        </w:rPr>
-      </w:pPr>
-      <w:r>
-        <w:rPr>
-          <w:rFonts w:ascii="Times New Roman" w:hAnsi="Times New Roman" w:cs="Times New Roman"/>
-          <w:color w:val="252525"/>
-          <w:sz w:val="24"/>
-          <w:szCs w:val="24"/>
-          <w:shd w:val="clear" w:color="auto" w:fill="FFFFFF"/>
-        </w:rPr>
-        <w:t>найдите разницу в изменениях для каждого коммита</w:t>
-      </w:r>
-    </w:p>
-    <w:p>
-      <w:pPr>
-        <w:pStyle w:val="a4"/>
-        <w:numPr>
-          <w:ilvl w:val="1"/>
-          <w:numId w:val="1"/>
-        </w:numPr>
-        <w:spacing w:after="0"/>
-        <w:ind w:left="0"/>
-        <w:rPr>
-          <w:rFonts w:ascii="Times New Roman" w:hAnsi="Times New Roman" w:cs="Times New Roman"/>
-          <w:color w:val="252525"/>
-          <w:sz w:val="24"/>
-          <w:szCs w:val="24"/>
-          <w:shd w:val="clear" w:color="auto" w:fill="FFFFFF"/>
-        </w:rPr>
-      </w:pPr>
-      <w:r>
-        <w:rPr>
-          <w:rFonts w:ascii="Times New Roman" w:hAnsi="Times New Roman" w:cs="Times New Roman"/>
-          <w:color w:val="252525"/>
-          <w:sz w:val="24"/>
-          <w:szCs w:val="24"/>
-          <w:shd w:val="clear" w:color="auto" w:fill="FFFFFF"/>
-        </w:rPr>
-        <w:t>создайте новый файл test.txt и вставьте в него строчку 'номер варианта'. затем сделайте коммит и отмените его</w:t>
-      </w:r>
-    </w:p>
-    <w:p>
-      <w:pPr>
-        <w:pStyle w:val="a4"/>
         <w:spacing w:after="0"/>
         <w:ind w:left="0"/>
         <w:rPr>
@@ -3686,11 +4090,12 @@
           <w:szCs w:val="24"/>
           <w:shd w:val="clear" w:color="auto" w:fill="FFFFFF"/>
         </w:rPr>
+        <w:lastRenderedPageBreak/>
         <w:drawing>
-          <wp:inline distT="0" distB="0" distL="0" distR="0" wp14:anchorId="0C07CF6B" wp14:editId="13426CA5">
-            <wp:extent cx="5940425" cy="2677160"/>
-            <wp:effectExtent l="0" t="0" r="3175" b="8890"/>
-            <wp:docPr id="75" name="Рисунок 75"/>
+          <wp:inline distT="0" distB="0" distL="0" distR="0" wp14:anchorId="68383BAB" wp14:editId="50FC5B51">
+            <wp:extent cx="5940425" cy="1995805"/>
+            <wp:effectExtent l="0" t="0" r="3175" b="4445"/>
+            <wp:docPr id="76" name="Рисунок 76"/>
             <wp:cNvGraphicFramePr>
               <a:graphicFrameLocks xmlns:a="http://schemas.openxmlformats.org/drawingml/2006/main" noChangeAspect="1"/>
             </wp:cNvGraphicFramePr>
@@ -3710,7 +4115,7 @@
                   <pic:spPr>
                     <a:xfrm>
                       <a:off x="0" y="0"/>
-                      <a:ext cx="5940425" cy="2677160"/>
+                      <a:ext cx="5940425" cy="1995805"/>
                     </a:xfrm>
                     <a:prstGeom prst="rect">
                       <a:avLst/>
@@ -3726,6 +4131,56 @@
     <w:p>
       <w:pPr>
         <w:pStyle w:val="a4"/>
+        <w:numPr>
+          <w:ilvl w:val="1"/>
+          <w:numId w:val="1"/>
+        </w:numPr>
+        <w:spacing w:after="0"/>
+        <w:ind w:left="0"/>
+        <w:rPr>
+          <w:rFonts w:ascii="Times New Roman" w:hAnsi="Times New Roman" w:cs="Times New Roman"/>
+          <w:color w:val="252525"/>
+          <w:sz w:val="24"/>
+          <w:szCs w:val="24"/>
+          <w:shd w:val="clear" w:color="auto" w:fill="FFFFFF"/>
+        </w:rPr>
+      </w:pPr>
+      <w:r>
+        <w:rPr>
+          <w:rFonts w:ascii="Times New Roman" w:hAnsi="Times New Roman" w:cs="Times New Roman"/>
+          <w:color w:val="252525"/>
+          <w:sz w:val="24"/>
+          <w:szCs w:val="24"/>
+          <w:shd w:val="clear" w:color="auto" w:fill="FFFFFF"/>
+        </w:rPr>
+        <w:t xml:space="preserve">проиндексируйте файл в вашем </w:t>
+      </w:r>
+      <w:proofErr w:type="spellStart"/>
+      <w:r>
+        <w:rPr>
+          <w:rFonts w:ascii="Times New Roman" w:hAnsi="Times New Roman" w:cs="Times New Roman"/>
+          <w:color w:val="252525"/>
+          <w:sz w:val="24"/>
+          <w:szCs w:val="24"/>
+          <w:shd w:val="clear" w:color="auto" w:fill="FFFFFF"/>
+        </w:rPr>
+        <w:t>Git</w:t>
+      </w:r>
+      <w:proofErr w:type="spellEnd"/>
+      <w:r>
+        <w:rPr>
+          <w:rFonts w:ascii="Times New Roman" w:hAnsi="Times New Roman" w:cs="Times New Roman"/>
+          <w:color w:val="252525"/>
+          <w:sz w:val="24"/>
+          <w:szCs w:val="24"/>
+          <w:shd w:val="clear" w:color="auto" w:fill="FFFFFF"/>
+        </w:rPr>
+        <w:t>-репозитории, затем отмените его индексацию</w:t>
+      </w:r>
+    </w:p>
+    <w:p>
+      <w:pPr>
+        <w:pStyle w:val="a4"/>
         <w:spacing w:after="0"/>
         <w:ind w:left="0"/>
         <w:rPr>
@@ -3745,12 +4200,11 @@
           <w:szCs w:val="24"/>
           <w:shd w:val="clear" w:color="auto" w:fill="FFFFFF"/>
         </w:rPr>
-        <w:lastRenderedPageBreak/>
         <w:drawing>
-          <wp:inline distT="0" distB="0" distL="0" distR="0" wp14:anchorId="68383BAB" wp14:editId="50FC5B51">
-            <wp:extent cx="5940425" cy="1995805"/>
-            <wp:effectExtent l="0" t="0" r="3175" b="4445"/>
-            <wp:docPr id="76" name="Рисунок 76"/>
+          <wp:inline distT="0" distB="0" distL="0" distR="0" wp14:anchorId="5CFA6CC1" wp14:editId="44878D17">
+            <wp:extent cx="5940425" cy="2402205"/>
+            <wp:effectExtent l="0" t="0" r="3175" b="0"/>
+            <wp:docPr id="77" name="Рисунок 77"/>
             <wp:cNvGraphicFramePr>
               <a:graphicFrameLocks xmlns:a="http://schemas.openxmlformats.org/drawingml/2006/main" noChangeAspect="1"/>
             </wp:cNvGraphicFramePr>
@@ -3770,7 +4224,7 @@
                   <pic:spPr>
                     <a:xfrm>
                       <a:off x="0" y="0"/>
-                      <a:ext cx="5940425" cy="1995805"/>
+                      <a:ext cx="5940425" cy="2402205"/>
                     </a:xfrm>
                     <a:prstGeom prst="rect">
                       <a:avLst/>
@@ -3786,34 +4240,6 @@
     <w:p>
       <w:pPr>
         <w:pStyle w:val="a4"/>
-        <w:numPr>
-          <w:ilvl w:val="1"/>
-          <w:numId w:val="1"/>
-        </w:numPr>
-        <w:spacing w:after="0"/>
-        <w:ind w:left="0"/>
-        <w:rPr>
-          <w:rFonts w:ascii="Times New Roman" w:hAnsi="Times New Roman" w:cs="Times New Roman"/>
-          <w:color w:val="252525"/>
-          <w:sz w:val="24"/>
-          <w:szCs w:val="24"/>
-          <w:shd w:val="clear" w:color="auto" w:fill="FFFFFF"/>
-        </w:rPr>
-      </w:pPr>
-      <w:r>
-        <w:rPr>
-          <w:rFonts w:ascii="Times New Roman" w:hAnsi="Times New Roman" w:cs="Times New Roman"/>
-          <w:color w:val="252525"/>
-          <w:sz w:val="24"/>
-          <w:szCs w:val="24"/>
-          <w:shd w:val="clear" w:color="auto" w:fill="FFFFFF"/>
-        </w:rPr>
-        <w:t>проиндексируйте файл в вашем Git-репозитории, затем отмените его индексацию</w:t>
-      </w:r>
-    </w:p>
-    <w:p>
-      <w:pPr>
-        <w:pStyle w:val="a4"/>
         <w:spacing w:after="0"/>
         <w:ind w:left="0"/>
         <w:rPr>
@@ -3834,10 +4260,10 @@
           <w:shd w:val="clear" w:color="auto" w:fill="FFFFFF"/>
         </w:rPr>
         <w:drawing>
-          <wp:inline distT="0" distB="0" distL="0" distR="0" wp14:anchorId="5CFA6CC1" wp14:editId="44878D17">
-            <wp:extent cx="5940425" cy="2402205"/>
-            <wp:effectExtent l="0" t="0" r="3175" b="0"/>
-            <wp:docPr id="77" name="Рисунок 77"/>
+          <wp:inline distT="0" distB="0" distL="0" distR="0" wp14:anchorId="47137FA1" wp14:editId="65F30015">
+            <wp:extent cx="5940425" cy="1958975"/>
+            <wp:effectExtent l="0" t="0" r="3175" b="3175"/>
+            <wp:docPr id="78" name="Рисунок 78"/>
             <wp:cNvGraphicFramePr>
               <a:graphicFrameLocks xmlns:a="http://schemas.openxmlformats.org/drawingml/2006/main" noChangeAspect="1"/>
             </wp:cNvGraphicFramePr>
@@ -3857,7 +4283,7 @@
                   <pic:spPr>
                     <a:xfrm>
                       <a:off x="0" y="0"/>
-                      <a:ext cx="5940425" cy="2402205"/>
+                      <a:ext cx="5940425" cy="1958975"/>
                     </a:xfrm>
                     <a:prstGeom prst="rect">
                       <a:avLst/>
@@ -3873,6 +4299,56 @@
     <w:p>
       <w:pPr>
         <w:pStyle w:val="a4"/>
+        <w:numPr>
+          <w:ilvl w:val="1"/>
+          <w:numId w:val="1"/>
+        </w:numPr>
+        <w:spacing w:after="0"/>
+        <w:ind w:left="0"/>
+        <w:rPr>
+          <w:rFonts w:ascii="Times New Roman" w:hAnsi="Times New Roman" w:cs="Times New Roman"/>
+          <w:color w:val="252525"/>
+          <w:sz w:val="24"/>
+          <w:szCs w:val="24"/>
+          <w:shd w:val="clear" w:color="auto" w:fill="FFFFFF"/>
+        </w:rPr>
+      </w:pPr>
+      <w:r>
+        <w:rPr>
+          <w:rFonts w:ascii="Times New Roman" w:hAnsi="Times New Roman" w:cs="Times New Roman"/>
+          <w:color w:val="252525"/>
+          <w:sz w:val="24"/>
+          <w:szCs w:val="24"/>
+          <w:shd w:val="clear" w:color="auto" w:fill="FFFFFF"/>
+        </w:rPr>
+        <w:t xml:space="preserve">внесите изменения в файл в вашем </w:t>
+      </w:r>
+      <w:proofErr w:type="spellStart"/>
+      <w:r>
+        <w:rPr>
+          <w:rFonts w:ascii="Times New Roman" w:hAnsi="Times New Roman" w:cs="Times New Roman"/>
+          <w:color w:val="252525"/>
+          <w:sz w:val="24"/>
+          <w:szCs w:val="24"/>
+          <w:shd w:val="clear" w:color="auto" w:fill="FFFFFF"/>
+        </w:rPr>
+        <w:t>Git</w:t>
+      </w:r>
+      <w:proofErr w:type="spellEnd"/>
+      <w:r>
+        <w:rPr>
+          <w:rFonts w:ascii="Times New Roman" w:hAnsi="Times New Roman" w:cs="Times New Roman"/>
+          <w:color w:val="252525"/>
+          <w:sz w:val="24"/>
+          <w:szCs w:val="24"/>
+          <w:shd w:val="clear" w:color="auto" w:fill="FFFFFF"/>
+        </w:rPr>
+        <w:t>-репозитории и затем верните его в исходное состояние.</w:t>
+      </w:r>
+    </w:p>
+    <w:p>
+      <w:pPr>
+        <w:pStyle w:val="a4"/>
         <w:spacing w:after="0"/>
         <w:ind w:left="0"/>
         <w:rPr>
@@ -3893,10 +4369,10 @@
           <w:shd w:val="clear" w:color="auto" w:fill="FFFFFF"/>
         </w:rPr>
         <w:drawing>
-          <wp:inline distT="0" distB="0" distL="0" distR="0" wp14:anchorId="47137FA1" wp14:editId="65F30015">
-            <wp:extent cx="5940425" cy="1958975"/>
-            <wp:effectExtent l="0" t="0" r="3175" b="3175"/>
-            <wp:docPr id="78" name="Рисунок 78"/>
+          <wp:inline distT="0" distB="0" distL="0" distR="0" wp14:anchorId="32540901" wp14:editId="64E22A39">
+            <wp:extent cx="5940425" cy="1023620"/>
+            <wp:effectExtent l="0" t="0" r="3175" b="5080"/>
+            <wp:docPr id="79" name="Рисунок 79"/>
             <wp:cNvGraphicFramePr>
               <a:graphicFrameLocks xmlns:a="http://schemas.openxmlformats.org/drawingml/2006/main" noChangeAspect="1"/>
             </wp:cNvGraphicFramePr>
@@ -3916,7 +4392,7 @@
                   <pic:spPr>
                     <a:xfrm>
                       <a:off x="0" y="0"/>
-                      <a:ext cx="5940425" cy="1958975"/>
+                      <a:ext cx="5940425" cy="1023620"/>
                     </a:xfrm>
                     <a:prstGeom prst="rect">
                       <a:avLst/>
@@ -3933,6 +4409,32 @@
       <w:pPr>
         <w:pStyle w:val="a4"/>
         <w:numPr>
+          <w:ilvl w:val="0"/>
+          <w:numId w:val="1"/>
+        </w:numPr>
+        <w:spacing w:after="0"/>
+        <w:ind w:left="0"/>
+        <w:rPr>
+          <w:rFonts w:ascii="Times New Roman" w:hAnsi="Times New Roman" w:cs="Times New Roman"/>
+          <w:i/>
+          <w:sz w:val="24"/>
+          <w:szCs w:val="24"/>
+        </w:rPr>
+      </w:pPr>
+      <w:r>
+        <w:rPr>
+          <w:rFonts w:ascii="Times New Roman" w:hAnsi="Times New Roman" w:cs="Times New Roman"/>
+          <w:i/>
+          <w:sz w:val="24"/>
+          <w:szCs w:val="24"/>
+        </w:rPr>
+        <w:t>Выполните следующие действия с удаленным репозиторием:</w:t>
+      </w:r>
+    </w:p>
+    <w:p>
+      <w:pPr>
+        <w:pStyle w:val="a4"/>
+        <w:numPr>
           <w:ilvl w:val="1"/>
           <w:numId w:val="1"/>
         </w:numPr>
@@ -3954,7 +4456,7 @@
           <w:szCs w:val="24"/>
           <w:shd w:val="clear" w:color="auto" w:fill="FFFFFF"/>
         </w:rPr>
-        <w:t>внесите изменения в файл в вашем Git-репозитории и затем верните его в исходное состояние.</w:t>
+        <w:t>создайте удаленный репозиторий (на github.com)</w:t>
       </w:r>
     </w:p>
     <w:p>
@@ -3980,10 +4482,10 @@
           <w:shd w:val="clear" w:color="auto" w:fill="FFFFFF"/>
         </w:rPr>
         <w:drawing>
-          <wp:inline distT="0" distB="0" distL="0" distR="0" wp14:anchorId="32540901" wp14:editId="64E22A39">
-            <wp:extent cx="5940425" cy="1023620"/>
-            <wp:effectExtent l="0" t="0" r="3175" b="5080"/>
-            <wp:docPr id="79" name="Рисунок 79"/>
+          <wp:inline distT="0" distB="0" distL="0" distR="0" wp14:anchorId="68ED5FEB" wp14:editId="3CD3A7BC">
+            <wp:extent cx="5940425" cy="444500"/>
+            <wp:effectExtent l="0" t="0" r="3175" b="0"/>
+            <wp:docPr id="80" name="Рисунок 80"/>
             <wp:cNvGraphicFramePr>
               <a:graphicFrameLocks xmlns:a="http://schemas.openxmlformats.org/drawingml/2006/main" noChangeAspect="1"/>
             </wp:cNvGraphicFramePr>
@@ -4003,7 +4505,7 @@
                   <pic:spPr>
                     <a:xfrm>
                       <a:off x="0" y="0"/>
-                      <a:ext cx="5940425" cy="1023620"/>
+                      <a:ext cx="5940425" cy="444500"/>
                     </a:xfrm>
                     <a:prstGeom prst="rect">
                       <a:avLst/>
@@ -4019,60 +4521,6 @@
     <w:p>
       <w:pPr>
         <w:pStyle w:val="a4"/>
-        <w:numPr>
-          <w:ilvl w:val="0"/>
-          <w:numId w:val="1"/>
-        </w:numPr>
-        <w:spacing w:after="0"/>
-        <w:ind w:left="0"/>
-        <w:rPr>
-          <w:rFonts w:ascii="Times New Roman" w:hAnsi="Times New Roman" w:cs="Times New Roman"/>
-          <w:i/>
-          <w:sz w:val="24"/>
-          <w:szCs w:val="24"/>
-        </w:rPr>
-      </w:pPr>
-      <w:r>
-        <w:rPr>
-          <w:rFonts w:ascii="Times New Roman" w:hAnsi="Times New Roman" w:cs="Times New Roman"/>
-          <w:i/>
-          <w:sz w:val="24"/>
-          <w:szCs w:val="24"/>
-        </w:rPr>
-        <w:t>Выполните следующие действия с удаленным репозиторием:</w:t>
-      </w:r>
-    </w:p>
-    <w:p>
-      <w:pPr>
-        <w:pStyle w:val="a4"/>
-        <w:numPr>
-          <w:ilvl w:val="1"/>
-          <w:numId w:val="1"/>
-        </w:numPr>
-        <w:spacing w:after="0"/>
-        <w:ind w:left="0"/>
-        <w:rPr>
-          <w:rFonts w:ascii="Times New Roman" w:hAnsi="Times New Roman" w:cs="Times New Roman"/>
-          <w:color w:val="252525"/>
-          <w:sz w:val="24"/>
-          <w:szCs w:val="24"/>
-          <w:shd w:val="clear" w:color="auto" w:fill="FFFFFF"/>
-        </w:rPr>
-      </w:pPr>
-      <w:r>
-        <w:rPr>
-          <w:rFonts w:ascii="Times New Roman" w:hAnsi="Times New Roman" w:cs="Times New Roman"/>
-          <w:color w:val="252525"/>
-          <w:sz w:val="24"/>
-          <w:szCs w:val="24"/>
-          <w:shd w:val="clear" w:color="auto" w:fill="FFFFFF"/>
-        </w:rPr>
-        <w:t>создайте удаленный репозиторий (на github.com)</w:t>
-      </w:r>
-    </w:p>
-    <w:p>
-      <w:pPr>
-        <w:pStyle w:val="a4"/>
         <w:spacing w:after="0"/>
         <w:ind w:left="0"/>
         <w:rPr>
@@ -4092,11 +4540,12 @@
           <w:szCs w:val="24"/>
           <w:shd w:val="clear" w:color="auto" w:fill="FFFFFF"/>
         </w:rPr>
+        <w:lastRenderedPageBreak/>
         <w:drawing>
-          <wp:inline distT="0" distB="0" distL="0" distR="0" wp14:anchorId="68ED5FEB" wp14:editId="3CD3A7BC">
-            <wp:extent cx="5940425" cy="444500"/>
-            <wp:effectExtent l="0" t="0" r="3175" b="0"/>
-            <wp:docPr id="80" name="Рисунок 80"/>
+          <wp:inline distT="0" distB="0" distL="0" distR="0" wp14:anchorId="25D80A0D" wp14:editId="19A19948">
+            <wp:extent cx="5940425" cy="2586990"/>
+            <wp:effectExtent l="0" t="0" r="3175" b="3810"/>
+            <wp:docPr id="81" name="Рисунок 81"/>
             <wp:cNvGraphicFramePr>
               <a:graphicFrameLocks xmlns:a="http://schemas.openxmlformats.org/drawingml/2006/main" noChangeAspect="1"/>
             </wp:cNvGraphicFramePr>
@@ -4116,7 +4565,7 @@
                   <pic:spPr>
                     <a:xfrm>
                       <a:off x="0" y="0"/>
-                      <a:ext cx="5940425" cy="444500"/>
+                      <a:ext cx="5940425" cy="2586990"/>
                     </a:xfrm>
                     <a:prstGeom prst="rect">
                       <a:avLst/>
@@ -4132,14 +4581,86 @@
     <w:p>
       <w:pPr>
         <w:pStyle w:val="a4"/>
-        <w:spacing w:after="0"/>
-        <w:ind w:left="0"/>
-        <w:rPr>
-          <w:rFonts w:ascii="Times New Roman" w:hAnsi="Times New Roman" w:cs="Times New Roman"/>
-          <w:color w:val="252525"/>
-          <w:sz w:val="24"/>
-          <w:szCs w:val="24"/>
-          <w:shd w:val="clear" w:color="auto" w:fill="FFFFFF"/>
+        <w:numPr>
+          <w:ilvl w:val="1"/>
+          <w:numId w:val="1"/>
+        </w:numPr>
+        <w:spacing w:after="0"/>
+        <w:ind w:left="0"/>
+        <w:rPr>
+          <w:rFonts w:ascii="Times New Roman" w:hAnsi="Times New Roman" w:cs="Times New Roman"/>
+          <w:color w:val="252525"/>
+          <w:sz w:val="24"/>
+          <w:szCs w:val="24"/>
+          <w:shd w:val="clear" w:color="auto" w:fill="FFFFFF"/>
+        </w:rPr>
+      </w:pPr>
+      <w:r>
+        <w:rPr>
+          <w:rFonts w:ascii="Times New Roman" w:hAnsi="Times New Roman" w:cs="Times New Roman"/>
+          <w:color w:val="252525"/>
+          <w:sz w:val="24"/>
+          <w:szCs w:val="24"/>
+          <w:shd w:val="clear" w:color="auto" w:fill="FFFFFF"/>
+        </w:rPr>
+        <w:t>просмотрите информацию о нем, внесите изменения и опять просмотрите (</w:t>
+      </w:r>
+      <w:proofErr w:type="spellStart"/>
+      <w:r>
+        <w:rPr>
+          <w:rFonts w:ascii="Times New Roman" w:hAnsi="Times New Roman" w:cs="Times New Roman"/>
+          <w:color w:val="252525"/>
+          <w:sz w:val="24"/>
+          <w:szCs w:val="24"/>
+          <w:shd w:val="clear" w:color="auto" w:fill="FFFFFF"/>
+        </w:rPr>
+        <w:t>remote</w:t>
+      </w:r>
+      <w:proofErr w:type="spellEnd"/>
+      <w:r>
+        <w:rPr>
+          <w:rFonts w:ascii="Times New Roman" w:hAnsi="Times New Roman" w:cs="Times New Roman"/>
+          <w:color w:val="252525"/>
+          <w:sz w:val="24"/>
+          <w:szCs w:val="24"/>
+          <w:shd w:val="clear" w:color="auto" w:fill="FFFFFF"/>
+        </w:rPr>
+        <w:t xml:space="preserve">, </w:t>
+      </w:r>
+      <w:r>
+        <w:rPr>
+          <w:rFonts w:ascii="Times New Roman" w:hAnsi="Times New Roman" w:cs="Times New Roman"/>
+          <w:color w:val="252525"/>
+          <w:sz w:val="24"/>
+          <w:szCs w:val="24"/>
+          <w:shd w:val="clear" w:color="auto" w:fill="FFFFFF"/>
+          <w:lang w:val="en-US"/>
+        </w:rPr>
+        <w:t>fetch</w:t>
+      </w:r>
+      <w:r>
+        <w:rPr>
+          <w:rFonts w:ascii="Times New Roman" w:hAnsi="Times New Roman" w:cs="Times New Roman"/>
+          <w:color w:val="252525"/>
+          <w:sz w:val="24"/>
+          <w:szCs w:val="24"/>
+          <w:shd w:val="clear" w:color="auto" w:fill="FFFFFF"/>
+        </w:rPr>
+        <w:t>).</w:t>
+      </w:r>
+    </w:p>
+    <w:p>
+      <w:pPr>
+        <w:pStyle w:val="a4"/>
+        <w:spacing w:after="0"/>
+        <w:ind w:left="0"/>
+        <w:rPr>
+          <w:rFonts w:ascii="Times New Roman" w:hAnsi="Times New Roman" w:cs="Times New Roman"/>
+          <w:color w:val="252525"/>
+          <w:sz w:val="24"/>
+          <w:szCs w:val="24"/>
+          <w:shd w:val="clear" w:color="auto" w:fill="FFFFFF"/>
+          <w:lang w:val="en-US"/>
         </w:rPr>
       </w:pPr>
       <w:r>
@@ -4150,13 +4671,13 @@
           <w:sz w:val="24"/>
           <w:szCs w:val="24"/>
           <w:shd w:val="clear" w:color="auto" w:fill="FFFFFF"/>
-        </w:rPr>
-        <w:lastRenderedPageBreak/>
+          <w:lang w:val="en-US"/>
+        </w:rPr>
         <w:drawing>
-          <wp:inline distT="0" distB="0" distL="0" distR="0" wp14:anchorId="25D80A0D" wp14:editId="19A19948">
-            <wp:extent cx="5940425" cy="2586990"/>
-            <wp:effectExtent l="0" t="0" r="3175" b="3810"/>
-            <wp:docPr id="81" name="Рисунок 81"/>
+          <wp:inline distT="0" distB="0" distL="0" distR="0" wp14:anchorId="7854B11E" wp14:editId="4FADF1EC">
+            <wp:extent cx="5940425" cy="728345"/>
+            <wp:effectExtent l="0" t="0" r="3175" b="0"/>
+            <wp:docPr id="7" name="Рисунок 7"/>
             <wp:cNvGraphicFramePr>
               <a:graphicFrameLocks xmlns:a="http://schemas.openxmlformats.org/drawingml/2006/main" noChangeAspect="1"/>
             </wp:cNvGraphicFramePr>
@@ -4176,7 +4697,7 @@
                   <pic:spPr>
                     <a:xfrm>
                       <a:off x="0" y="0"/>
-                      <a:ext cx="5940425" cy="2586990"/>
+                      <a:ext cx="5940425" cy="728345"/>
                     </a:xfrm>
                     <a:prstGeom prst="rect">
                       <a:avLst/>
@@ -4192,81 +4713,31 @@
     <w:p>
       <w:pPr>
         <w:pStyle w:val="a4"/>
-        <w:numPr>
-          <w:ilvl w:val="1"/>
-          <w:numId w:val="1"/>
-        </w:numPr>
-        <w:spacing w:after="0"/>
-        <w:ind w:left="0"/>
-        <w:rPr>
-          <w:rFonts w:ascii="Times New Roman" w:hAnsi="Times New Roman" w:cs="Times New Roman"/>
-          <w:color w:val="252525"/>
-          <w:sz w:val="24"/>
-          <w:szCs w:val="24"/>
-          <w:shd w:val="clear" w:color="auto" w:fill="FFFFFF"/>
-        </w:rPr>
-      </w:pPr>
-      <w:r>
-        <w:rPr>
-          <w:rFonts w:ascii="Times New Roman" w:hAnsi="Times New Roman" w:cs="Times New Roman"/>
-          <w:color w:val="252525"/>
-          <w:sz w:val="24"/>
-          <w:szCs w:val="24"/>
-          <w:shd w:val="clear" w:color="auto" w:fill="FFFFFF"/>
-        </w:rPr>
-        <w:t xml:space="preserve">просмотрите информацию о нем, внесите изменения и опять просмотрите (remote, </w:t>
-      </w:r>
-      <w:r>
-        <w:rPr>
-          <w:rFonts w:ascii="Times New Roman" w:hAnsi="Times New Roman" w:cs="Times New Roman"/>
+        <w:spacing w:after="0"/>
+        <w:ind w:left="0"/>
+        <w:rPr>
+          <w:rFonts w:ascii="Times New Roman" w:hAnsi="Times New Roman" w:cs="Times New Roman"/>
+          <w:color w:val="252525"/>
+          <w:sz w:val="24"/>
+          <w:szCs w:val="24"/>
+          <w:shd w:val="clear" w:color="auto" w:fill="FFFFFF"/>
+        </w:rPr>
+      </w:pPr>
+      <w:r>
+        <w:rPr>
+          <w:rFonts w:ascii="Times New Roman" w:hAnsi="Times New Roman" w:cs="Times New Roman"/>
+          <w:noProof/>
           <w:color w:val="252525"/>
           <w:sz w:val="24"/>
           <w:szCs w:val="24"/>
           <w:shd w:val="clear" w:color="auto" w:fill="FFFFFF"/>
           <w:lang w:val="en-US"/>
         </w:rPr>
-        <w:t>fetch</w:t>
-      </w:r>
-      <w:r>
-        <w:rPr>
-          <w:rFonts w:ascii="Times New Roman" w:hAnsi="Times New Roman" w:cs="Times New Roman"/>
-          <w:color w:val="252525"/>
-          <w:sz w:val="24"/>
-          <w:szCs w:val="24"/>
-          <w:shd w:val="clear" w:color="auto" w:fill="FFFFFF"/>
-        </w:rPr>
-        <w:t>).</w:t>
-      </w:r>
-    </w:p>
-    <w:p>
-      <w:pPr>
-        <w:pStyle w:val="a4"/>
-        <w:spacing w:after="0"/>
-        <w:ind w:left="0"/>
-        <w:rPr>
-          <w:rFonts w:ascii="Times New Roman" w:hAnsi="Times New Roman" w:cs="Times New Roman"/>
-          <w:color w:val="252525"/>
-          <w:sz w:val="24"/>
-          <w:szCs w:val="24"/>
-          <w:shd w:val="clear" w:color="auto" w:fill="FFFFFF"/>
-          <w:lang w:val="en-US"/>
-        </w:rPr>
-      </w:pPr>
-      <w:r>
-        <w:rPr>
-          <w:rFonts w:ascii="Times New Roman" w:hAnsi="Times New Roman" w:cs="Times New Roman"/>
-          <w:noProof/>
-          <w:color w:val="252525"/>
-          <w:sz w:val="24"/>
-          <w:szCs w:val="24"/>
-          <w:shd w:val="clear" w:color="auto" w:fill="FFFFFF"/>
-          <w:lang w:val="en-US"/>
-        </w:rPr>
         <w:drawing>
-          <wp:inline distT="0" distB="0" distL="0" distR="0" wp14:anchorId="7854B11E" wp14:editId="4FADF1EC">
-            <wp:extent cx="5940425" cy="728345"/>
+          <wp:inline distT="0" distB="0" distL="0" distR="0" wp14:anchorId="0049A5FE" wp14:editId="7ED393E1">
+            <wp:extent cx="5940425" cy="1166495"/>
             <wp:effectExtent l="0" t="0" r="3175" b="0"/>
-            <wp:docPr id="7" name="Рисунок 7"/>
+            <wp:docPr id="9" name="Рисунок 9"/>
             <wp:cNvGraphicFramePr>
               <a:graphicFrameLocks xmlns:a="http://schemas.openxmlformats.org/drawingml/2006/main" noChangeAspect="1"/>
             </wp:cNvGraphicFramePr>
@@ -4286,7 +4757,7 @@
                   <pic:spPr>
                     <a:xfrm>
                       <a:off x="0" y="0"/>
-                      <a:ext cx="5940425" cy="728345"/>
+                      <a:ext cx="5940425" cy="1166495"/>
                     </a:xfrm>
                     <a:prstGeom prst="rect">
                       <a:avLst/>
@@ -4320,13 +4791,12 @@
           <w:sz w:val="24"/>
           <w:szCs w:val="24"/>
           <w:shd w:val="clear" w:color="auto" w:fill="FFFFFF"/>
-          <w:lang w:val="en-US"/>
         </w:rPr>
         <w:drawing>
-          <wp:inline distT="0" distB="0" distL="0" distR="0" wp14:anchorId="0049A5FE" wp14:editId="7ED393E1">
-            <wp:extent cx="5940425" cy="1166495"/>
+          <wp:inline distT="0" distB="0" distL="0" distR="0" wp14:anchorId="389B1A96" wp14:editId="0629A6E0">
+            <wp:extent cx="5940425" cy="2996565"/>
             <wp:effectExtent l="0" t="0" r="3175" b="0"/>
-            <wp:docPr id="9" name="Рисунок 9"/>
+            <wp:docPr id="17" name="Рисунок 17"/>
             <wp:cNvGraphicFramePr>
               <a:graphicFrameLocks xmlns:a="http://schemas.openxmlformats.org/drawingml/2006/main" noChangeAspect="1"/>
             </wp:cNvGraphicFramePr>
@@ -4346,7 +4816,7 @@
                   <pic:spPr>
                     <a:xfrm>
                       <a:off x="0" y="0"/>
-                      <a:ext cx="5940425" cy="1166495"/>
+                      <a:ext cx="5940425" cy="2996565"/>
                     </a:xfrm>
                     <a:prstGeom prst="rect">
                       <a:avLst/>
@@ -4362,6 +4832,34 @@
     <w:p>
       <w:pPr>
         <w:pStyle w:val="a4"/>
+        <w:numPr>
+          <w:ilvl w:val="1"/>
+          <w:numId w:val="1"/>
+        </w:numPr>
+        <w:spacing w:after="0"/>
+        <w:ind w:left="0"/>
+        <w:rPr>
+          <w:rFonts w:ascii="Times New Roman" w:hAnsi="Times New Roman" w:cs="Times New Roman"/>
+          <w:color w:val="252525"/>
+          <w:sz w:val="24"/>
+          <w:szCs w:val="24"/>
+          <w:shd w:val="clear" w:color="auto" w:fill="FFFFFF"/>
+        </w:rPr>
+      </w:pPr>
+      <w:r>
+        <w:rPr>
+          <w:rFonts w:ascii="Times New Roman" w:hAnsi="Times New Roman" w:cs="Times New Roman"/>
+          <w:color w:val="252525"/>
+          <w:sz w:val="24"/>
+          <w:szCs w:val="24"/>
+          <w:shd w:val="clear" w:color="auto" w:fill="FFFFFF"/>
+        </w:rPr>
+        <w:t xml:space="preserve">измените несколько файлов в вашем проекте и перенесите их в удаленный репозиторий, </w:t>
+      </w:r>
+    </w:p>
+    <w:p>
+      <w:pPr>
+        <w:pStyle w:val="a4"/>
         <w:spacing w:after="0"/>
         <w:ind w:left="0"/>
         <w:rPr>
@@ -4382,10 +4880,10 @@
           <w:shd w:val="clear" w:color="auto" w:fill="FFFFFF"/>
         </w:rPr>
         <w:drawing>
-          <wp:inline distT="0" distB="0" distL="0" distR="0" wp14:anchorId="389B1A96" wp14:editId="0629A6E0">
-            <wp:extent cx="5940425" cy="2996565"/>
-            <wp:effectExtent l="0" t="0" r="3175" b="0"/>
-            <wp:docPr id="17" name="Рисунок 17"/>
+          <wp:inline distT="0" distB="0" distL="0" distR="0" wp14:anchorId="55F00603" wp14:editId="2BF1F74D">
+            <wp:extent cx="5940425" cy="398145"/>
+            <wp:effectExtent l="0" t="0" r="3175" b="1905"/>
+            <wp:docPr id="15" name="Рисунок 15"/>
             <wp:cNvGraphicFramePr>
               <a:graphicFrameLocks xmlns:a="http://schemas.openxmlformats.org/drawingml/2006/main" noChangeAspect="1"/>
             </wp:cNvGraphicFramePr>
@@ -4405,7 +4903,7 @@
                   <pic:spPr>
                     <a:xfrm>
                       <a:off x="0" y="0"/>
-                      <a:ext cx="5940425" cy="2996565"/>
+                      <a:ext cx="5940425" cy="398145"/>
                     </a:xfrm>
                     <a:prstGeom prst="rect">
                       <a:avLst/>
@@ -4421,57 +4919,32 @@
     <w:p>
       <w:pPr>
         <w:pStyle w:val="a4"/>
-        <w:numPr>
-          <w:ilvl w:val="1"/>
-          <w:numId w:val="1"/>
-        </w:numPr>
-        <w:spacing w:after="0"/>
-        <w:ind w:left="0"/>
-        <w:rPr>
-          <w:rFonts w:ascii="Times New Roman" w:hAnsi="Times New Roman" w:cs="Times New Roman"/>
-          <w:color w:val="252525"/>
-          <w:sz w:val="24"/>
-          <w:szCs w:val="24"/>
-          <w:shd w:val="clear" w:color="auto" w:fill="FFFFFF"/>
-        </w:rPr>
-      </w:pPr>
-      <w:r>
-        <w:rPr>
-          <w:rFonts w:ascii="Times New Roman" w:hAnsi="Times New Roman" w:cs="Times New Roman"/>
-          <w:color w:val="252525"/>
-          <w:sz w:val="24"/>
-          <w:szCs w:val="24"/>
-          <w:shd w:val="clear" w:color="auto" w:fill="FFFFFF"/>
-        </w:rPr>
-        <w:t xml:space="preserve">измените несколько файлов в вашем проекте и перенесите их в удаленный репозиторий, </w:t>
-      </w:r>
-    </w:p>
-    <w:p>
-      <w:pPr>
-        <w:pStyle w:val="a4"/>
-        <w:spacing w:after="0"/>
-        <w:ind w:left="0"/>
-        <w:rPr>
-          <w:rFonts w:ascii="Times New Roman" w:hAnsi="Times New Roman" w:cs="Times New Roman"/>
-          <w:color w:val="252525"/>
-          <w:sz w:val="24"/>
-          <w:szCs w:val="24"/>
-          <w:shd w:val="clear" w:color="auto" w:fill="FFFFFF"/>
-        </w:rPr>
-      </w:pPr>
-      <w:r>
-        <w:rPr>
-          <w:rFonts w:ascii="Times New Roman" w:hAnsi="Times New Roman" w:cs="Times New Roman"/>
-          <w:color w:val="252525"/>
-          <w:sz w:val="24"/>
-          <w:szCs w:val="24"/>
-          <w:shd w:val="clear" w:color="auto" w:fill="FFFFFF"/>
-        </w:rPr>
+        <w:spacing w:after="0"/>
+        <w:ind w:left="0"/>
+        <w:rPr>
+          <w:rFonts w:ascii="Times New Roman" w:hAnsi="Times New Roman" w:cs="Times New Roman"/>
+          <w:color w:val="252525"/>
+          <w:sz w:val="24"/>
+          <w:szCs w:val="24"/>
+          <w:shd w:val="clear" w:color="auto" w:fill="FFFFFF"/>
+          <w:lang w:val="en-US"/>
+        </w:rPr>
+      </w:pPr>
+      <w:r>
+        <w:rPr>
+          <w:rFonts w:ascii="Times New Roman" w:hAnsi="Times New Roman" w:cs="Times New Roman"/>
+          <w:noProof/>
+          <w:color w:val="252525"/>
+          <w:sz w:val="24"/>
+          <w:szCs w:val="24"/>
+          <w:shd w:val="clear" w:color="auto" w:fill="FFFFFF"/>
+        </w:rPr>
+        <w:lastRenderedPageBreak/>
         <w:drawing>
-          <wp:inline distT="0" distB="0" distL="0" distR="0" wp14:anchorId="55F00603" wp14:editId="2BF1F74D">
-            <wp:extent cx="5940425" cy="398145"/>
-            <wp:effectExtent l="0" t="0" r="3175" b="1905"/>
-            <wp:docPr id="15" name="Рисунок 15"/>
+          <wp:inline distT="0" distB="0" distL="0" distR="0" wp14:anchorId="05529C94" wp14:editId="5175C629">
+            <wp:extent cx="5940425" cy="2404110"/>
+            <wp:effectExtent l="0" t="0" r="3175" b="0"/>
+            <wp:docPr id="18" name="Рисунок 18"/>
             <wp:cNvGraphicFramePr>
               <a:graphicFrameLocks xmlns:a="http://schemas.openxmlformats.org/drawingml/2006/main" noChangeAspect="1"/>
             </wp:cNvGraphicFramePr>
@@ -4491,7 +4964,7 @@
                   <pic:spPr>
                     <a:xfrm>
                       <a:off x="0" y="0"/>
-                      <a:ext cx="5940425" cy="398145"/>
+                      <a:ext cx="5940425" cy="2404110"/>
                     </a:xfrm>
                     <a:prstGeom prst="rect">
                       <a:avLst/>
@@ -4521,17 +4994,18 @@
       <w:r>
         <w:rPr>
           <w:rFonts w:ascii="Times New Roman" w:hAnsi="Times New Roman" w:cs="Times New Roman"/>
-          <w:color w:val="252525"/>
-          <w:sz w:val="24"/>
-          <w:szCs w:val="24"/>
-          <w:shd w:val="clear" w:color="auto" w:fill="FFFFFF"/>
-        </w:rPr>
-        <w:lastRenderedPageBreak/>
+          <w:noProof/>
+          <w:color w:val="252525"/>
+          <w:sz w:val="24"/>
+          <w:szCs w:val="24"/>
+          <w:shd w:val="clear" w:color="auto" w:fill="FFFFFF"/>
+          <w:lang w:val="en-US"/>
+        </w:rPr>
         <w:drawing>
-          <wp:inline distT="0" distB="0" distL="0" distR="0" wp14:anchorId="05529C94" wp14:editId="5175C629">
-            <wp:extent cx="5940425" cy="2404110"/>
+          <wp:inline distT="0" distB="0" distL="0" distR="0" wp14:anchorId="74411D6C" wp14:editId="00A7F633">
+            <wp:extent cx="5940425" cy="1278255"/>
             <wp:effectExtent l="0" t="0" r="3175" b="0"/>
-            <wp:docPr id="18" name="Рисунок 18"/>
+            <wp:docPr id="33" name="Рисунок 33"/>
             <wp:cNvGraphicFramePr>
               <a:graphicFrameLocks xmlns:a="http://schemas.openxmlformats.org/drawingml/2006/main" noChangeAspect="1"/>
             </wp:cNvGraphicFramePr>
@@ -4551,7 +5025,7 @@
                   <pic:spPr>
                     <a:xfrm>
                       <a:off x="0" y="0"/>
-                      <a:ext cx="5940425" cy="2404110"/>
+                      <a:ext cx="5940425" cy="1278255"/>
                     </a:xfrm>
                     <a:prstGeom prst="rect">
                       <a:avLst/>
@@ -4567,31 +5041,58 @@
     <w:p>
       <w:pPr>
         <w:pStyle w:val="a4"/>
-        <w:spacing w:after="0"/>
-        <w:ind w:left="0"/>
-        <w:rPr>
-          <w:rFonts w:ascii="Times New Roman" w:hAnsi="Times New Roman" w:cs="Times New Roman"/>
-          <w:color w:val="252525"/>
-          <w:sz w:val="24"/>
-          <w:szCs w:val="24"/>
-          <w:shd w:val="clear" w:color="auto" w:fill="FFFFFF"/>
-          <w:lang w:val="en-US"/>
-        </w:rPr>
-      </w:pPr>
-      <w:r>
-        <w:rPr>
-          <w:rFonts w:ascii="Times New Roman" w:hAnsi="Times New Roman" w:cs="Times New Roman"/>
-          <w:color w:val="252525"/>
-          <w:sz w:val="24"/>
-          <w:szCs w:val="24"/>
-          <w:shd w:val="clear" w:color="auto" w:fill="FFFFFF"/>
-          <w:lang w:val="en-US"/>
+        <w:numPr>
+          <w:ilvl w:val="1"/>
+          <w:numId w:val="1"/>
+        </w:numPr>
+        <w:spacing w:after="0"/>
+        <w:ind w:left="0"/>
+        <w:rPr>
+          <w:rFonts w:ascii="Times New Roman" w:hAnsi="Times New Roman" w:cs="Times New Roman"/>
+          <w:color w:val="252525"/>
+          <w:sz w:val="24"/>
+          <w:szCs w:val="24"/>
+          <w:shd w:val="clear" w:color="auto" w:fill="FFFFFF"/>
+        </w:rPr>
+      </w:pPr>
+      <w:r>
+        <w:rPr>
+          <w:rFonts w:ascii="Times New Roman" w:hAnsi="Times New Roman" w:cs="Times New Roman"/>
+          <w:color w:val="252525"/>
+          <w:sz w:val="24"/>
+          <w:szCs w:val="24"/>
+          <w:shd w:val="clear" w:color="auto" w:fill="FFFFFF"/>
+        </w:rPr>
+        <w:t>переименуйте свой удаленный репозиторий</w:t>
+      </w:r>
+    </w:p>
+    <w:p>
+      <w:pPr>
+        <w:pStyle w:val="a4"/>
+        <w:spacing w:after="0"/>
+        <w:ind w:left="0"/>
+        <w:rPr>
+          <w:rFonts w:ascii="Times New Roman" w:hAnsi="Times New Roman" w:cs="Times New Roman"/>
+          <w:color w:val="252525"/>
+          <w:sz w:val="24"/>
+          <w:szCs w:val="24"/>
+          <w:shd w:val="clear" w:color="auto" w:fill="FFFFFF"/>
+        </w:rPr>
+      </w:pPr>
+      <w:r>
+        <w:rPr>
+          <w:rFonts w:ascii="Times New Roman" w:hAnsi="Times New Roman" w:cs="Times New Roman"/>
+          <w:noProof/>
+          <w:color w:val="252525"/>
+          <w:sz w:val="24"/>
+          <w:szCs w:val="24"/>
+          <w:shd w:val="clear" w:color="auto" w:fill="FFFFFF"/>
         </w:rPr>
         <w:drawing>
-          <wp:inline distT="0" distB="0" distL="0" distR="0" wp14:anchorId="74411D6C" wp14:editId="00A7F633">
-            <wp:extent cx="5940425" cy="1278255"/>
+          <wp:inline distT="0" distB="0" distL="0" distR="0" wp14:anchorId="6E970816" wp14:editId="1AA7E44E">
+            <wp:extent cx="5940425" cy="992505"/>
             <wp:effectExtent l="0" t="0" r="3175" b="0"/>
-            <wp:docPr id="33" name="Рисунок 33"/>
+            <wp:docPr id="34" name="Рисунок 34"/>
             <wp:cNvGraphicFramePr>
               <a:graphicFrameLocks xmlns:a="http://schemas.openxmlformats.org/drawingml/2006/main" noChangeAspect="1"/>
             </wp:cNvGraphicFramePr>
@@ -4611,7 +5112,7 @@
                   <pic:spPr>
                     <a:xfrm>
                       <a:off x="0" y="0"/>
-                      <a:ext cx="5940425" cy="1278255"/>
+                      <a:ext cx="5940425" cy="992505"/>
                     </a:xfrm>
                     <a:prstGeom prst="rect">
                       <a:avLst/>
@@ -4641,15 +5142,173 @@
           <w:shd w:val="clear" w:color="auto" w:fill="FFFFFF"/>
         </w:rPr>
       </w:pPr>
-      <w:r>
-        <w:rPr>
-          <w:rFonts w:ascii="Times New Roman" w:hAnsi="Times New Roman" w:cs="Times New Roman"/>
-          <w:color w:val="252525"/>
-          <w:sz w:val="24"/>
-          <w:szCs w:val="24"/>
-          <w:shd w:val="clear" w:color="auto" w:fill="FFFFFF"/>
-        </w:rPr>
-        <w:t>переименуйте свой удаленный репозиторий</w:t>
+      <w:proofErr w:type="spellStart"/>
+      <w:r>
+        <w:rPr>
+          <w:rFonts w:ascii="Times New Roman" w:hAnsi="Times New Roman" w:cs="Times New Roman"/>
+          <w:color w:val="252525"/>
+          <w:sz w:val="24"/>
+          <w:szCs w:val="24"/>
+          <w:shd w:val="clear" w:color="auto" w:fill="FFFFFF"/>
+          <w:lang w:val="en-US"/>
+        </w:rPr>
+        <w:t>получите</w:t>
+      </w:r>
+      <w:proofErr w:type="spellEnd"/>
+      <w:r>
+        <w:rPr>
+          <w:rFonts w:ascii="Times New Roman" w:hAnsi="Times New Roman" w:cs="Times New Roman"/>
+          <w:color w:val="252525"/>
+          <w:sz w:val="24"/>
+          <w:szCs w:val="24"/>
+          <w:shd w:val="clear" w:color="auto" w:fill="FFFFFF"/>
+          <w:lang w:val="en-US"/>
+        </w:rPr>
+        <w:t xml:space="preserve"> </w:t>
+      </w:r>
+      <w:proofErr w:type="spellStart"/>
+      <w:r>
+        <w:rPr>
+          <w:rFonts w:ascii="Times New Roman" w:hAnsi="Times New Roman" w:cs="Times New Roman"/>
+          <w:color w:val="252525"/>
+          <w:sz w:val="24"/>
+          <w:szCs w:val="24"/>
+          <w:shd w:val="clear" w:color="auto" w:fill="FFFFFF"/>
+          <w:lang w:val="en-US"/>
+        </w:rPr>
+        <w:t>данные</w:t>
+      </w:r>
+      <w:proofErr w:type="spellEnd"/>
+      <w:r>
+        <w:rPr>
+          <w:rFonts w:ascii="Times New Roman" w:hAnsi="Times New Roman" w:cs="Times New Roman"/>
+          <w:color w:val="252525"/>
+          <w:sz w:val="24"/>
+          <w:szCs w:val="24"/>
+          <w:shd w:val="clear" w:color="auto" w:fill="FFFFFF"/>
+          <w:lang w:val="en-US"/>
+        </w:rPr>
+        <w:t xml:space="preserve"> </w:t>
+      </w:r>
+      <w:proofErr w:type="spellStart"/>
+      <w:r>
+        <w:rPr>
+          <w:rFonts w:ascii="Times New Roman" w:hAnsi="Times New Roman" w:cs="Times New Roman"/>
+          <w:color w:val="252525"/>
+          <w:sz w:val="24"/>
+          <w:szCs w:val="24"/>
+          <w:shd w:val="clear" w:color="auto" w:fill="FFFFFF"/>
+          <w:lang w:val="en-US"/>
+        </w:rPr>
+        <w:t>из</w:t>
+      </w:r>
+      <w:proofErr w:type="spellEnd"/>
+      <w:r>
+        <w:rPr>
+          <w:rFonts w:ascii="Times New Roman" w:hAnsi="Times New Roman" w:cs="Times New Roman"/>
+          <w:color w:val="252525"/>
+          <w:sz w:val="24"/>
+          <w:szCs w:val="24"/>
+          <w:shd w:val="clear" w:color="auto" w:fill="FFFFFF"/>
+          <w:lang w:val="en-US"/>
+        </w:rPr>
+        <w:t xml:space="preserve"> </w:t>
+      </w:r>
+      <w:proofErr w:type="spellStart"/>
+      <w:r>
+        <w:rPr>
+          <w:rFonts w:ascii="Times New Roman" w:hAnsi="Times New Roman" w:cs="Times New Roman"/>
+          <w:color w:val="252525"/>
+          <w:sz w:val="24"/>
+          <w:szCs w:val="24"/>
+          <w:shd w:val="clear" w:color="auto" w:fill="FFFFFF"/>
+          <w:lang w:val="en-US"/>
+        </w:rPr>
+        <w:t>удаленного</w:t>
+      </w:r>
+      <w:proofErr w:type="spellEnd"/>
+      <w:r>
+        <w:rPr>
+          <w:rFonts w:ascii="Times New Roman" w:hAnsi="Times New Roman" w:cs="Times New Roman"/>
+          <w:color w:val="252525"/>
+          <w:sz w:val="24"/>
+          <w:szCs w:val="24"/>
+          <w:shd w:val="clear" w:color="auto" w:fill="FFFFFF"/>
+          <w:lang w:val="en-US"/>
+        </w:rPr>
+        <w:t xml:space="preserve"> </w:t>
+      </w:r>
+      <w:proofErr w:type="spellStart"/>
+      <w:r>
+        <w:rPr>
+          <w:rFonts w:ascii="Times New Roman" w:hAnsi="Times New Roman" w:cs="Times New Roman"/>
+          <w:color w:val="252525"/>
+          <w:sz w:val="24"/>
+          <w:szCs w:val="24"/>
+          <w:shd w:val="clear" w:color="auto" w:fill="FFFFFF"/>
+          <w:lang w:val="en-US"/>
+        </w:rPr>
+        <w:t>репозитория</w:t>
+      </w:r>
+      <w:proofErr w:type="spellEnd"/>
+    </w:p>
+    <w:p>
+      <w:pPr>
+        <w:pStyle w:val="a4"/>
+        <w:spacing w:after="0"/>
+        <w:ind w:left="0"/>
+        <w:rPr>
+          <w:rFonts w:ascii="Times New Roman" w:hAnsi="Times New Roman" w:cs="Times New Roman"/>
+          <w:color w:val="252525"/>
+          <w:sz w:val="24"/>
+          <w:szCs w:val="24"/>
+          <w:shd w:val="clear" w:color="auto" w:fill="FFFFFF"/>
+        </w:rPr>
+      </w:pPr>
+      <w:r>
+        <w:rPr>
+          <w:rFonts w:ascii="Times New Roman" w:hAnsi="Times New Roman" w:cs="Times New Roman"/>
+          <w:noProof/>
+          <w:color w:val="252525"/>
+          <w:sz w:val="24"/>
+          <w:szCs w:val="24"/>
+          <w:shd w:val="clear" w:color="auto" w:fill="FFFFFF"/>
+        </w:rPr>
+        <w:drawing>
+          <wp:inline distT="0" distB="0" distL="0" distR="0" wp14:anchorId="2ECECE6D" wp14:editId="2994A7B6">
+            <wp:extent cx="5940425" cy="329565"/>
+            <wp:effectExtent l="0" t="0" r="3175" b="0"/>
+            <wp:docPr id="35" name="Рисунок 35"/>
+            <wp:cNvGraphicFramePr>
+              <a:graphicFrameLocks xmlns:a="http://schemas.openxmlformats.org/drawingml/2006/main" noChangeAspect="1"/>
+            </wp:cNvGraphicFramePr>
+            <a:graphic xmlns:a="http://schemas.openxmlformats.org/drawingml/2006/main">
+              <a:graphicData uri="http://schemas.openxmlformats.org/drawingml/2006/picture">
+                <pic:pic xmlns:pic="http://schemas.openxmlformats.org/drawingml/2006/picture">
+                  <pic:nvPicPr>
+                    <pic:cNvPr id="1" name=""/>
+                    <pic:cNvPicPr/>
+                  </pic:nvPicPr>
+                  <pic:blipFill>
+                    <a:blip r:embed="rId64"/>
+                    <a:stretch>
+                      <a:fillRect/>
+                    </a:stretch>
+                  </pic:blipFill>
+                  <pic:spPr>
+                    <a:xfrm>
+                      <a:off x="0" y="0"/>
+                      <a:ext cx="5940425" cy="329565"/>
+                    </a:xfrm>
+                    <a:prstGeom prst="rect">
+                      <a:avLst/>
+                    </a:prstGeom>
+                  </pic:spPr>
+                </pic:pic>
+              </a:graphicData>
+            </a:graphic>
+          </wp:inline>
+        </w:drawing>
       </w:r>
     </w:p>
     <w:p>
@@ -4676,9 +5335,67 @@
           <w:sz w:val="24"/>
           <w:szCs w:val="24"/>
           <w:shd w:val="clear" w:color="auto" w:fill="FFFFFF"/>
-          <w:lang w:val="en-US"/>
-        </w:rPr>
-        <w:t>получите данные из удаленного репозитория</w:t>
+        </w:rPr>
+        <w:t>просмотреть историю изменений</w:t>
+      </w:r>
+    </w:p>
+    <w:p>
+      <w:pPr>
+        <w:pStyle w:val="a4"/>
+        <w:spacing w:after="0"/>
+        <w:ind w:left="0"/>
+        <w:rPr>
+          <w:rFonts w:ascii="Times New Roman" w:hAnsi="Times New Roman" w:cs="Times New Roman"/>
+          <w:color w:val="252525"/>
+          <w:sz w:val="24"/>
+          <w:szCs w:val="24"/>
+          <w:shd w:val="clear" w:color="auto" w:fill="FFFFFF"/>
+        </w:rPr>
+      </w:pPr>
+      <w:r>
+        <w:rPr>
+          <w:rFonts w:ascii="Times New Roman" w:hAnsi="Times New Roman" w:cs="Times New Roman"/>
+          <w:noProof/>
+          <w:color w:val="252525"/>
+          <w:sz w:val="24"/>
+          <w:szCs w:val="24"/>
+          <w:shd w:val="clear" w:color="auto" w:fill="FFFFFF"/>
+        </w:rPr>
+        <w:drawing>
+          <wp:inline distT="0" distB="0" distL="0" distR="0" wp14:anchorId="6C56321B" wp14:editId="1D26F204">
+            <wp:extent cx="5940425" cy="2571115"/>
+            <wp:effectExtent l="0" t="0" r="3175" b="635"/>
+            <wp:docPr id="36" name="Рисунок 36"/>
+            <wp:cNvGraphicFramePr>
+              <a:graphicFrameLocks xmlns:a="http://schemas.openxmlformats.org/drawingml/2006/main" noChangeAspect="1"/>
+            </wp:cNvGraphicFramePr>
+            <a:graphic xmlns:a="http://schemas.openxmlformats.org/drawingml/2006/main">
+              <a:graphicData uri="http://schemas.openxmlformats.org/drawingml/2006/picture">
+                <pic:pic xmlns:pic="http://schemas.openxmlformats.org/drawingml/2006/picture">
+                  <pic:nvPicPr>
+                    <pic:cNvPr id="1" name=""/>
+                    <pic:cNvPicPr/>
+                  </pic:nvPicPr>
+                  <pic:blipFill>
+                    <a:blip r:embed="rId65"/>
+                    <a:stretch>
+                      <a:fillRect/>
+                    </a:stretch>
+                  </pic:blipFill>
+                  <pic:spPr>
+                    <a:xfrm>
+                      <a:off x="0" y="0"/>
+                      <a:ext cx="5940425" cy="2571115"/>
+                    </a:xfrm>
+                    <a:prstGeom prst="rect">
+                      <a:avLst/>
+                    </a:prstGeom>
+                  </pic:spPr>
+                </pic:pic>
+              </a:graphicData>
+            </a:graphic>
+          </wp:inline>
+        </w:drawing>
       </w:r>
     </w:p>
     <w:p>
@@ -4706,7 +5423,204 @@
           <w:szCs w:val="24"/>
           <w:shd w:val="clear" w:color="auto" w:fill="FFFFFF"/>
         </w:rPr>
-        <w:t>просмотреть историю изменений</w:t>
+        <w:t xml:space="preserve">создайте дополнительную ветку 1 в удаленном </w:t>
+      </w:r>
+      <w:proofErr w:type="spellStart"/>
+      <w:r>
+        <w:rPr>
+          <w:rFonts w:ascii="Times New Roman" w:hAnsi="Times New Roman" w:cs="Times New Roman"/>
+          <w:color w:val="252525"/>
+          <w:sz w:val="24"/>
+          <w:szCs w:val="24"/>
+          <w:shd w:val="clear" w:color="auto" w:fill="FFFFFF"/>
+        </w:rPr>
+        <w:t>реппозитории</w:t>
+      </w:r>
+      <w:proofErr w:type="spellEnd"/>
+      <w:r>
+        <w:rPr>
+          <w:rFonts w:ascii="Times New Roman" w:hAnsi="Times New Roman" w:cs="Times New Roman"/>
+          <w:color w:val="252525"/>
+          <w:sz w:val="24"/>
+          <w:szCs w:val="24"/>
+          <w:shd w:val="clear" w:color="auto" w:fill="FFFFFF"/>
+        </w:rPr>
+        <w:t>, перенесите в нее два файла из другой ветки, удалите один из файлов</w:t>
+      </w:r>
+    </w:p>
+    <w:p>
+      <w:pPr>
+        <w:pStyle w:val="a4"/>
+        <w:spacing w:after="0"/>
+        <w:ind w:left="0"/>
+        <w:rPr>
+          <w:rFonts w:ascii="Times New Roman" w:hAnsi="Times New Roman" w:cs="Times New Roman"/>
+          <w:color w:val="252525"/>
+          <w:sz w:val="24"/>
+          <w:szCs w:val="24"/>
+          <w:shd w:val="clear" w:color="auto" w:fill="FFFFFF"/>
+        </w:rPr>
+      </w:pPr>
+      <w:r>
+        <w:rPr>
+          <w:rFonts w:ascii="Times New Roman" w:hAnsi="Times New Roman" w:cs="Times New Roman"/>
+          <w:color w:val="252525"/>
+          <w:sz w:val="24"/>
+          <w:szCs w:val="24"/>
+          <w:shd w:val="clear" w:color="auto" w:fill="FFFFFF"/>
+        </w:rPr>
+        <w:drawing>
+          <wp:inline distT="0" distB="0" distL="0" distR="0" wp14:anchorId="02572696" wp14:editId="2C9AD125">
+            <wp:extent cx="5940425" cy="614045"/>
+            <wp:effectExtent l="0" t="0" r="3175" b="0"/>
+            <wp:docPr id="37" name="Рисунок 37"/>
+            <wp:cNvGraphicFramePr>
+              <a:graphicFrameLocks xmlns:a="http://schemas.openxmlformats.org/drawingml/2006/main" noChangeAspect="1"/>
+            </wp:cNvGraphicFramePr>
+            <a:graphic xmlns:a="http://schemas.openxmlformats.org/drawingml/2006/main">
+              <a:graphicData uri="http://schemas.openxmlformats.org/drawingml/2006/picture">
+                <pic:pic xmlns:pic="http://schemas.openxmlformats.org/drawingml/2006/picture">
+                  <pic:nvPicPr>
+                    <pic:cNvPr id="1" name=""/>
+                    <pic:cNvPicPr/>
+                  </pic:nvPicPr>
+                  <pic:blipFill>
+                    <a:blip r:embed="rId66"/>
+                    <a:stretch>
+                      <a:fillRect/>
+                    </a:stretch>
+                  </pic:blipFill>
+                  <pic:spPr>
+                    <a:xfrm>
+                      <a:off x="0" y="0"/>
+                      <a:ext cx="5940425" cy="614045"/>
+                    </a:xfrm>
+                    <a:prstGeom prst="rect">
+                      <a:avLst/>
+                    </a:prstGeom>
+                  </pic:spPr>
+                </pic:pic>
+              </a:graphicData>
+            </a:graphic>
+          </wp:inline>
+        </w:drawing>
+      </w:r>
+    </w:p>
+    <w:p>
+      <w:pPr>
+        <w:pStyle w:val="a4"/>
+        <w:spacing w:after="0"/>
+        <w:ind w:left="0"/>
+        <w:rPr>
+          <w:rFonts w:ascii="Times New Roman" w:hAnsi="Times New Roman" w:cs="Times New Roman"/>
+          <w:color w:val="252525"/>
+          <w:sz w:val="24"/>
+          <w:szCs w:val="24"/>
+          <w:shd w:val="clear" w:color="auto" w:fill="FFFFFF"/>
+        </w:rPr>
+      </w:pPr>
+      <w:r>
+        <w:rPr>
+          <w:rFonts w:ascii="Times New Roman" w:hAnsi="Times New Roman" w:cs="Times New Roman"/>
+          <w:color w:val="252525"/>
+          <w:sz w:val="24"/>
+          <w:szCs w:val="24"/>
+          <w:shd w:val="clear" w:color="auto" w:fill="FFFFFF"/>
+        </w:rPr>
+        <w:lastRenderedPageBreak/>
+        <w:drawing>
+          <wp:inline distT="0" distB="0" distL="0" distR="0" wp14:anchorId="5B564962" wp14:editId="08946D45">
+            <wp:extent cx="5940425" cy="472440"/>
+            <wp:effectExtent l="0" t="0" r="3175" b="3810"/>
+            <wp:docPr id="38" name="Рисунок 38"/>
+            <wp:cNvGraphicFramePr>
+              <a:graphicFrameLocks xmlns:a="http://schemas.openxmlformats.org/drawingml/2006/main" noChangeAspect="1"/>
+            </wp:cNvGraphicFramePr>
+            <a:graphic xmlns:a="http://schemas.openxmlformats.org/drawingml/2006/main">
+              <a:graphicData uri="http://schemas.openxmlformats.org/drawingml/2006/picture">
+                <pic:pic xmlns:pic="http://schemas.openxmlformats.org/drawingml/2006/picture">
+                  <pic:nvPicPr>
+                    <pic:cNvPr id="1" name=""/>
+                    <pic:cNvPicPr/>
+                  </pic:nvPicPr>
+                  <pic:blipFill>
+                    <a:blip r:embed="rId67"/>
+                    <a:stretch>
+                      <a:fillRect/>
+                    </a:stretch>
+                  </pic:blipFill>
+                  <pic:spPr>
+                    <a:xfrm>
+                      <a:off x="0" y="0"/>
+                      <a:ext cx="5940425" cy="472440"/>
+                    </a:xfrm>
+                    <a:prstGeom prst="rect">
+                      <a:avLst/>
+                    </a:prstGeom>
+                  </pic:spPr>
+                </pic:pic>
+              </a:graphicData>
+            </a:graphic>
+          </wp:inline>
+        </w:drawing>
+      </w:r>
+    </w:p>
+    <w:p>
+      <w:pPr>
+        <w:pStyle w:val="a4"/>
+        <w:spacing w:after="0"/>
+        <w:ind w:left="0"/>
+        <w:rPr>
+          <w:rFonts w:ascii="Times New Roman" w:hAnsi="Times New Roman" w:cs="Times New Roman"/>
+          <w:color w:val="252525"/>
+          <w:sz w:val="24"/>
+          <w:szCs w:val="24"/>
+          <w:shd w:val="clear" w:color="auto" w:fill="FFFFFF"/>
+        </w:rPr>
+      </w:pPr>
+      <w:r>
+        <w:rPr>
+          <w:rFonts w:ascii="Times New Roman" w:hAnsi="Times New Roman" w:cs="Times New Roman"/>
+          <w:color w:val="252525"/>
+          <w:sz w:val="24"/>
+          <w:szCs w:val="24"/>
+          <w:shd w:val="clear" w:color="auto" w:fill="FFFFFF"/>
+        </w:rPr>
+        <w:drawing>
+          <wp:inline distT="0" distB="0" distL="0" distR="0" wp14:anchorId="68518F6B" wp14:editId="5EA9DAA0">
+            <wp:extent cx="5940425" cy="1422400"/>
+            <wp:effectExtent l="0" t="0" r="3175" b="6350"/>
+            <wp:docPr id="39" name="Рисунок 39"/>
+            <wp:cNvGraphicFramePr>
+              <a:graphicFrameLocks xmlns:a="http://schemas.openxmlformats.org/drawingml/2006/main" noChangeAspect="1"/>
+            </wp:cNvGraphicFramePr>
+            <a:graphic xmlns:a="http://schemas.openxmlformats.org/drawingml/2006/main">
+              <a:graphicData uri="http://schemas.openxmlformats.org/drawingml/2006/picture">
+                <pic:pic xmlns:pic="http://schemas.openxmlformats.org/drawingml/2006/picture">
+                  <pic:nvPicPr>
+                    <pic:cNvPr id="1" name=""/>
+                    <pic:cNvPicPr/>
+                  </pic:nvPicPr>
+                  <pic:blipFill>
+                    <a:blip r:embed="rId68"/>
+                    <a:stretch>
+                      <a:fillRect/>
+                    </a:stretch>
+                  </pic:blipFill>
+                  <pic:spPr>
+                    <a:xfrm>
+                      <a:off x="0" y="0"/>
+                      <a:ext cx="5940425" cy="1422400"/>
+                    </a:xfrm>
+                    <a:prstGeom prst="rect">
+                      <a:avLst/>
+                    </a:prstGeom>
+                  </pic:spPr>
+                </pic:pic>
+              </a:graphicData>
+            </a:graphic>
+          </wp:inline>
+        </w:drawing>
       </w:r>
     </w:p>
     <w:p>
@@ -4734,35 +5648,29 @@
           <w:szCs w:val="24"/>
           <w:shd w:val="clear" w:color="auto" w:fill="FFFFFF"/>
         </w:rPr>
-        <w:t>создайте дополнительную ветку 1 в удаленном реппозитории, перенесите в нее два файла из другой ветки, удалите один из файлов</w:t>
-      </w:r>
-    </w:p>
-    <w:p>
-      <w:pPr>
-        <w:pStyle w:val="a4"/>
-        <w:numPr>
-          <w:ilvl w:val="1"/>
-          <w:numId w:val="1"/>
-        </w:numPr>
-        <w:spacing w:after="0"/>
-        <w:ind w:left="0"/>
-        <w:rPr>
-          <w:rFonts w:ascii="Times New Roman" w:hAnsi="Times New Roman" w:cs="Times New Roman"/>
-          <w:color w:val="252525"/>
-          <w:sz w:val="24"/>
-          <w:szCs w:val="24"/>
-          <w:shd w:val="clear" w:color="auto" w:fill="FFFFFF"/>
-        </w:rPr>
-      </w:pPr>
-      <w:r>
-        <w:rPr>
-          <w:rFonts w:ascii="Times New Roman" w:hAnsi="Times New Roman" w:cs="Times New Roman"/>
-          <w:color w:val="252525"/>
-          <w:sz w:val="24"/>
-          <w:szCs w:val="24"/>
-          <w:shd w:val="clear" w:color="auto" w:fill="FFFFFF"/>
-        </w:rPr>
-        <w:t>создайте дополнительную ветку 2 в удаленном реппозитории, перенесите в нее два файла из вашего проекта, слить изменения в основную ветку, удалить дополнительную ветку 2</w:t>
+        <w:t xml:space="preserve">создайте дополнительную ветку 2 в удаленном </w:t>
+      </w:r>
+      <w:proofErr w:type="spellStart"/>
+      <w:r>
+        <w:rPr>
+          <w:rFonts w:ascii="Times New Roman" w:hAnsi="Times New Roman" w:cs="Times New Roman"/>
+          <w:color w:val="252525"/>
+          <w:sz w:val="24"/>
+          <w:szCs w:val="24"/>
+          <w:shd w:val="clear" w:color="auto" w:fill="FFFFFF"/>
+        </w:rPr>
+        <w:t>реппозитории</w:t>
+      </w:r>
+      <w:proofErr w:type="spellEnd"/>
+      <w:r>
+        <w:rPr>
+          <w:rFonts w:ascii="Times New Roman" w:hAnsi="Times New Roman" w:cs="Times New Roman"/>
+          <w:color w:val="252525"/>
+          <w:sz w:val="24"/>
+          <w:szCs w:val="24"/>
+          <w:shd w:val="clear" w:color="auto" w:fill="FFFFFF"/>
+        </w:rPr>
+        <w:t>, перенесите в нее два файла из вашего проекта, слить изменения в основную ветку, удалить дополнительную ветку 2</w:t>
       </w:r>
     </w:p>
     <w:p>

</xml_diff>

<commit_message>
fixed a report, added and then deleted branch2
</commit_message>
<xml_diff>
--- a/IGI/LR1/igi_1.docx
+++ b/IGI/LR1/igi_1.docx
@@ -70,23 +70,13 @@
         </w:rPr>
         <w:t>Цель</w:t>
       </w:r>
-      <w:proofErr w:type="gramStart"/>
-      <w:r>
-        <w:rPr>
-          <w:rFonts w:ascii="Times New Roman" w:hAnsi="Times New Roman" w:cs="Times New Roman"/>
-          <w:sz w:val="24"/>
-          <w:szCs w:val="24"/>
-        </w:rPr>
-        <w:t>: Познакомиться</w:t>
-      </w:r>
-      <w:proofErr w:type="gramEnd"/>
-      <w:r>
-        <w:rPr>
-          <w:rFonts w:ascii="Times New Roman" w:hAnsi="Times New Roman" w:cs="Times New Roman"/>
-          <w:sz w:val="24"/>
-          <w:szCs w:val="24"/>
-        </w:rPr>
-        <w:t xml:space="preserve"> с возможностями и получить практические навыки работы с системой контроля версий </w:t>
+      <w:r>
+        <w:rPr>
+          <w:rFonts w:ascii="Times New Roman" w:hAnsi="Times New Roman" w:cs="Times New Roman"/>
+          <w:sz w:val="24"/>
+          <w:szCs w:val="24"/>
+        </w:rPr>
+        <w:t xml:space="preserve">: Познакомиться с возможностями и получить практические навыки работы с системой контроля версий </w:t>
       </w:r>
       <w:r>
         <w:rPr>
@@ -187,53 +177,20 @@
           <w:szCs w:val="24"/>
           <w:shd w:val="clear" w:color="auto" w:fill="FFFFFF"/>
         </w:rPr>
-        <w:t xml:space="preserve">Подготовьте рабочее окружение в соответствии с типом вашей операционной </w:t>
-      </w:r>
-      <w:proofErr w:type="gramStart"/>
-      <w:r>
-        <w:rPr>
-          <w:rFonts w:ascii="Times New Roman" w:hAnsi="Times New Roman" w:cs="Times New Roman"/>
-          <w:i/>
-          <w:color w:val="252525"/>
-          <w:sz w:val="24"/>
-          <w:szCs w:val="24"/>
-          <w:shd w:val="clear" w:color="auto" w:fill="FFFFFF"/>
-        </w:rPr>
-        <w:t>системы(</w:t>
-      </w:r>
-      <w:proofErr w:type="gramEnd"/>
-      <w:r>
-        <w:fldChar w:fldCharType="begin"/>
-      </w:r>
-      <w:r>
-        <w:instrText xml:space="preserve"> HYPERLINK "ht</w:instrText>
-      </w:r>
-      <w:r>
-        <w:instrText xml:space="preserve">tps://smartiqa.ru/courses/git/lesson-1" </w:instrText>
-      </w:r>
-      <w:r>
-        <w:fldChar w:fldCharType="separate"/>
-      </w:r>
-      <w:r>
-        <w:rPr>
-          <w:rStyle w:val="a3"/>
-          <w:rFonts w:cs="Times New Roman"/>
-          <w:i/>
-          <w:sz w:val="24"/>
-          <w:shd w:val="clear" w:color="auto" w:fill="FFFFFF"/>
-        </w:rPr>
-        <w:t>https://smartiqa.ru/courses/git/lesson-1</w:t>
-      </w:r>
-      <w:r>
-        <w:rPr>
-          <w:rStyle w:val="a3"/>
-          <w:rFonts w:cs="Times New Roman"/>
-          <w:i/>
-          <w:sz w:val="24"/>
-          <w:shd w:val="clear" w:color="auto" w:fill="FFFFFF"/>
-        </w:rPr>
-        <w:fldChar w:fldCharType="end"/>
-      </w:r>
+        <w:t>Подготовьте рабочее окружение в соответствии с типом вашей операционной системы(</w:t>
+      </w:r>
+      <w:hyperlink r:id="rId5" w:history="1">
+        <w:r>
+          <w:rPr>
+            <w:rStyle w:val="a3"/>
+            <w:rFonts w:cs="Times New Roman"/>
+            <w:i/>
+            <w:sz w:val="24"/>
+            <w:shd w:val="clear" w:color="auto" w:fill="FFFFFF"/>
+          </w:rPr>
+          <w:t>https://smartiqa.ru/courses/git/lesson-1</w:t>
+        </w:r>
+      </w:hyperlink>
       <w:r>
         <w:rPr>
           <w:rFonts w:ascii="Times New Roman" w:hAnsi="Times New Roman" w:cs="Times New Roman"/>
@@ -269,20 +226,8 @@
           <w:szCs w:val="24"/>
           <w:shd w:val="clear" w:color="auto" w:fill="FFFFFF"/>
         </w:rPr>
-        <w:t xml:space="preserve">Установите </w:t>
-      </w:r>
-      <w:proofErr w:type="spellStart"/>
-      <w:r>
-        <w:rPr>
-          <w:rFonts w:ascii="Times New Roman" w:hAnsi="Times New Roman" w:cs="Times New Roman"/>
-          <w:color w:val="252525"/>
-          <w:sz w:val="24"/>
-          <w:szCs w:val="24"/>
-          <w:shd w:val="clear" w:color="auto" w:fill="FFFFFF"/>
-        </w:rPr>
-        <w:t>Git</w:t>
-      </w:r>
-      <w:proofErr w:type="spellEnd"/>
+        <w:t>Установите Git</w:t>
+      </w:r>
     </w:p>
     <w:p>
       <w:pPr>
@@ -315,100 +260,6 @@
                 <pic:pic xmlns:pic="http://schemas.openxmlformats.org/drawingml/2006/picture">
                   <pic:nvPicPr>
                     <pic:cNvPr id="0" name="Picture 2"/>
-                    <pic:cNvPicPr>
-                      <a:picLocks noChangeAspect="1" noChangeArrowheads="1"/>
-                    </pic:cNvPicPr>
-                  </pic:nvPicPr>
-                  <pic:blipFill>
-                    <a:blip r:embed="rId5">
-                      <a:extLst>
-                        <a:ext uri="{28A0092B-C50C-407E-A947-70E740481C1C}">
-                          <a14:useLocalDpi xmlns:a14="http://schemas.microsoft.com/office/drawing/2010/main" val="0"/>
-                        </a:ext>
-                      </a:extLst>
-                    </a:blip>
-                    <a:srcRect/>
-                    <a:stretch>
-                      <a:fillRect/>
-                    </a:stretch>
-                  </pic:blipFill>
-                  <pic:spPr bwMode="auto">
-                    <a:xfrm>
-                      <a:off x="0" y="0"/>
-                      <a:ext cx="2430965" cy="433719"/>
-                    </a:xfrm>
-                    <a:prstGeom prst="rect">
-                      <a:avLst/>
-                    </a:prstGeom>
-                    <a:noFill/>
-                    <a:ln>
-                      <a:noFill/>
-                    </a:ln>
-                  </pic:spPr>
-                </pic:pic>
-              </a:graphicData>
-            </a:graphic>
-          </wp:inline>
-        </w:drawing>
-      </w:r>
-    </w:p>
-    <w:p>
-      <w:pPr>
-        <w:pStyle w:val="a4"/>
-        <w:numPr>
-          <w:ilvl w:val="1"/>
-          <w:numId w:val="1"/>
-        </w:numPr>
-        <w:spacing w:after="0"/>
-        <w:ind w:left="0"/>
-        <w:rPr>
-          <w:rFonts w:ascii="Times New Roman" w:hAnsi="Times New Roman" w:cs="Times New Roman"/>
-          <w:sz w:val="24"/>
-          <w:szCs w:val="24"/>
-        </w:rPr>
-      </w:pPr>
-      <w:r>
-        <w:rPr>
-          <w:rFonts w:ascii="Times New Roman" w:hAnsi="Times New Roman" w:cs="Times New Roman"/>
-          <w:color w:val="252525"/>
-          <w:sz w:val="24"/>
-          <w:szCs w:val="24"/>
-          <w:shd w:val="clear" w:color="auto" w:fill="FFFFFF"/>
-        </w:rPr>
-        <w:t>Выполните базовую настройку</w:t>
-      </w:r>
-    </w:p>
-    <w:p>
-      <w:pPr>
-        <w:pStyle w:val="a4"/>
-        <w:spacing w:after="0"/>
-        <w:ind w:left="0"/>
-        <w:rPr>
-          <w:rFonts w:ascii="Times New Roman" w:hAnsi="Times New Roman" w:cs="Times New Roman"/>
-          <w:sz w:val="24"/>
-          <w:szCs w:val="24"/>
-        </w:rPr>
-      </w:pPr>
-      <w:r>
-        <w:rPr>
-          <w:rFonts w:ascii="Times New Roman" w:hAnsi="Times New Roman" w:cs="Times New Roman"/>
-          <w:noProof/>
-          <w:sz w:val="24"/>
-          <w:szCs w:val="24"/>
-        </w:rPr>
-        <w:drawing>
-          <wp:inline distT="0" distB="0" distL="0" distR="0" wp14:anchorId="48840351" wp14:editId="52949A19">
-            <wp:extent cx="2339340" cy="979856"/>
-            <wp:effectExtent l="0" t="0" r="3810" b="0"/>
-            <wp:docPr id="5" name="Рисунок 5"/>
-            <wp:cNvGraphicFramePr>
-              <a:graphicFrameLocks xmlns:a="http://schemas.openxmlformats.org/drawingml/2006/main" noChangeAspect="1"/>
-            </wp:cNvGraphicFramePr>
-            <a:graphic xmlns:a="http://schemas.openxmlformats.org/drawingml/2006/main">
-              <a:graphicData uri="http://schemas.openxmlformats.org/drawingml/2006/picture">
-                <pic:pic xmlns:pic="http://schemas.openxmlformats.org/drawingml/2006/picture">
-                  <pic:nvPicPr>
-                    <pic:cNvPr id="0" name="Picture 3"/>
                     <pic:cNvPicPr>
                       <a:picLocks noChangeAspect="1" noChangeArrowheads="1"/>
                     </pic:cNvPicPr>
@@ -429,7 +280,7 @@
                   <pic:spPr bwMode="auto">
                     <a:xfrm>
                       <a:off x="0" y="0"/>
-                      <a:ext cx="2397656" cy="1004282"/>
+                      <a:ext cx="2430965" cy="433719"/>
                     </a:xfrm>
                     <a:prstGeom prst="rect">
                       <a:avLst/>
@@ -449,94 +300,60 @@
     <w:p>
       <w:pPr>
         <w:pStyle w:val="a4"/>
-        <w:spacing w:after="0"/>
-        <w:ind w:left="0"/>
-        <w:rPr>
-          <w:rFonts w:ascii="Times New Roman" w:hAnsi="Times New Roman" w:cs="Times New Roman"/>
-          <w:sz w:val="24"/>
-          <w:szCs w:val="24"/>
-        </w:rPr>
-      </w:pPr>
-    </w:p>
-    <w:p>
-      <w:pPr>
-        <w:pStyle w:val="a4"/>
         <w:numPr>
-          <w:ilvl w:val="0"/>
+          <w:ilvl w:val="1"/>
           <w:numId w:val="1"/>
         </w:numPr>
         <w:spacing w:after="0"/>
         <w:ind w:left="0"/>
         <w:rPr>
           <w:rFonts w:ascii="Times New Roman" w:hAnsi="Times New Roman" w:cs="Times New Roman"/>
-          <w:i/>
-          <w:sz w:val="24"/>
-          <w:szCs w:val="24"/>
-        </w:rPr>
-      </w:pPr>
-      <w:r>
-        <w:rPr>
-          <w:rFonts w:ascii="Times New Roman" w:hAnsi="Times New Roman" w:cs="Times New Roman"/>
-          <w:i/>
-          <w:sz w:val="24"/>
-          <w:szCs w:val="24"/>
-        </w:rPr>
-        <w:t xml:space="preserve">Создайте структуру папок (использовать командную строку) и поместите в репозиторий </w:t>
-      </w:r>
-      <w:r>
-        <w:rPr>
-          <w:rFonts w:ascii="Times New Roman" w:hAnsi="Times New Roman" w:cs="Times New Roman"/>
-          <w:i/>
-          <w:sz w:val="24"/>
-          <w:szCs w:val="24"/>
-          <w:lang w:val="en-US"/>
-        </w:rPr>
-        <w:t>Git</w:t>
-      </w:r>
-      <w:r>
-        <w:rPr>
-          <w:rFonts w:ascii="Times New Roman" w:hAnsi="Times New Roman" w:cs="Times New Roman"/>
-          <w:i/>
-          <w:sz w:val="24"/>
-          <w:szCs w:val="24"/>
-        </w:rPr>
-        <w:t xml:space="preserve"> </w:t>
-      </w:r>
-      <w:r>
-        <w:rPr>
-          <w:rFonts w:ascii="Times New Roman" w:hAnsi="Times New Roman" w:cs="Times New Roman"/>
-          <w:i/>
-          <w:sz w:val="24"/>
-          <w:szCs w:val="24"/>
-        </w:rPr>
-        <w:t>на своем локальном компьютере:</w:t>
-      </w:r>
-    </w:p>
-    <w:p>
-      <w:pPr>
-        <w:pStyle w:val="a5"/>
-        <w:spacing w:before="0" w:beforeAutospacing="0" w:after="0" w:afterAutospacing="0"/>
-        <w:rPr>
-          <w:i/>
-        </w:rPr>
-      </w:pPr>
-      <w:r>
-        <w:rPr>
+          <w:sz w:val="24"/>
+          <w:szCs w:val="24"/>
+        </w:rPr>
+      </w:pPr>
+      <w:r>
+        <w:rPr>
+          <w:rFonts w:ascii="Times New Roman" w:hAnsi="Times New Roman" w:cs="Times New Roman"/>
+          <w:color w:val="252525"/>
+          <w:sz w:val="24"/>
+          <w:szCs w:val="24"/>
+          <w:shd w:val="clear" w:color="auto" w:fill="FFFFFF"/>
+        </w:rPr>
+        <w:t>Выполните базовую настройку</w:t>
+      </w:r>
+    </w:p>
+    <w:p>
+      <w:pPr>
+        <w:pStyle w:val="a4"/>
+        <w:spacing w:after="0"/>
+        <w:ind w:left="0"/>
+        <w:rPr>
+          <w:rFonts w:ascii="Times New Roman" w:hAnsi="Times New Roman" w:cs="Times New Roman"/>
+          <w:sz w:val="24"/>
+          <w:szCs w:val="24"/>
+        </w:rPr>
+      </w:pPr>
+      <w:r>
+        <w:rPr>
+          <w:rFonts w:ascii="Times New Roman" w:hAnsi="Times New Roman" w:cs="Times New Roman"/>
           <w:noProof/>
-        </w:rPr>
-        <w:drawing>
-          <wp:inline distT="0" distB="0" distL="0" distR="0" wp14:anchorId="1D93ECA5" wp14:editId="59104CCD">
-            <wp:extent cx="4441371" cy="686502"/>
-            <wp:effectExtent l="0" t="0" r="0" b="0"/>
-            <wp:docPr id="10" name="Рисунок 10"/>
-            <wp:cNvGraphicFramePr>
-              <a:graphicFrameLocks xmlns:a="http://schemas.openxmlformats.org/drawingml/2006/main" noChangeAspect="1"/>
-            </wp:cNvGraphicFramePr>
-            <a:graphic xmlns:a="http://schemas.openxmlformats.org/drawingml/2006/main">
-              <a:graphicData uri="http://schemas.openxmlformats.org/drawingml/2006/picture">
-                <pic:pic xmlns:pic="http://schemas.openxmlformats.org/drawingml/2006/picture">
-                  <pic:nvPicPr>
-                    <pic:cNvPr id="0" name="Picture 24"/>
+          <w:sz w:val="24"/>
+          <w:szCs w:val="24"/>
+        </w:rPr>
+        <w:drawing>
+          <wp:inline distT="0" distB="0" distL="0" distR="0" wp14:anchorId="48840351" wp14:editId="52949A19">
+            <wp:extent cx="2339340" cy="979856"/>
+            <wp:effectExtent l="0" t="0" r="3810" b="0"/>
+            <wp:docPr id="5" name="Рисунок 5"/>
+            <wp:cNvGraphicFramePr>
+              <a:graphicFrameLocks xmlns:a="http://schemas.openxmlformats.org/drawingml/2006/main" noChangeAspect="1"/>
+            </wp:cNvGraphicFramePr>
+            <a:graphic xmlns:a="http://schemas.openxmlformats.org/drawingml/2006/main">
+              <a:graphicData uri="http://schemas.openxmlformats.org/drawingml/2006/picture">
+                <pic:pic xmlns:pic="http://schemas.openxmlformats.org/drawingml/2006/picture">
+                  <pic:nvPicPr>
+                    <pic:cNvPr id="0" name="Picture 3"/>
                     <pic:cNvPicPr>
                       <a:picLocks noChangeAspect="1" noChangeArrowheads="1"/>
                     </pic:cNvPicPr>
@@ -557,7 +374,7 @@
                   <pic:spPr bwMode="auto">
                     <a:xfrm>
                       <a:off x="0" y="0"/>
-                      <a:ext cx="4494498" cy="694714"/>
+                      <a:ext cx="2397656" cy="1004282"/>
                     </a:xfrm>
                     <a:prstGeom prst="rect">
                       <a:avLst/>
@@ -573,11 +390,71 @@
           </wp:inline>
         </w:drawing>
       </w:r>
-      <w:r>
-        <w:rPr>
+    </w:p>
+    <w:p>
+      <w:pPr>
+        <w:pStyle w:val="a4"/>
+        <w:spacing w:after="0"/>
+        <w:ind w:left="0"/>
+        <w:rPr>
+          <w:rFonts w:ascii="Times New Roman" w:hAnsi="Times New Roman" w:cs="Times New Roman"/>
+          <w:sz w:val="24"/>
+          <w:szCs w:val="24"/>
+        </w:rPr>
+      </w:pPr>
+    </w:p>
+    <w:p>
+      <w:pPr>
+        <w:pStyle w:val="a4"/>
+        <w:numPr>
+          <w:ilvl w:val="0"/>
+          <w:numId w:val="1"/>
+        </w:numPr>
+        <w:spacing w:after="0"/>
+        <w:ind w:left="0"/>
+        <w:rPr>
+          <w:rFonts w:ascii="Times New Roman" w:hAnsi="Times New Roman" w:cs="Times New Roman"/>
           <w:i/>
+          <w:sz w:val="24"/>
+          <w:szCs w:val="24"/>
+        </w:rPr>
+      </w:pPr>
+      <w:r>
+        <w:rPr>
+          <w:rFonts w:ascii="Times New Roman" w:hAnsi="Times New Roman" w:cs="Times New Roman"/>
+          <w:i/>
+          <w:sz w:val="24"/>
+          <w:szCs w:val="24"/>
+        </w:rPr>
+        <w:t xml:space="preserve">Создайте структуру папок (использовать командную строку) и поместите в репозиторий </w:t>
+      </w:r>
+      <w:r>
+        <w:rPr>
+          <w:rFonts w:ascii="Times New Roman" w:hAnsi="Times New Roman" w:cs="Times New Roman"/>
+          <w:i/>
+          <w:sz w:val="24"/>
+          <w:szCs w:val="24"/>
+          <w:lang w:val="en-US"/>
+        </w:rPr>
+        <w:t>Git</w:t>
+      </w:r>
+      <w:r>
+        <w:rPr>
+          <w:rFonts w:ascii="Times New Roman" w:hAnsi="Times New Roman" w:cs="Times New Roman"/>
+          <w:i/>
+          <w:sz w:val="24"/>
+          <w:szCs w:val="24"/>
         </w:rPr>
         <w:t xml:space="preserve"> </w:t>
+      </w:r>
+      <w:r>
+        <w:rPr>
+          <w:rFonts w:ascii="Times New Roman" w:hAnsi="Times New Roman" w:cs="Times New Roman"/>
+          <w:i/>
+          <w:sz w:val="24"/>
+          <w:szCs w:val="24"/>
+        </w:rPr>
+        <w:t>на своем локальном компьютере:</w:t>
       </w:r>
     </w:p>
     <w:p>
@@ -585,7 +462,7 @@
         <w:pStyle w:val="a5"/>
         <w:spacing w:before="0" w:beforeAutospacing="0" w:after="0" w:afterAutospacing="0"/>
         <w:rPr>
-          <w:lang w:val="en-US"/>
+          <w:i/>
         </w:rPr>
       </w:pPr>
       <w:r>
@@ -593,18 +470,18 @@
           <w:noProof/>
         </w:rPr>
         <w:drawing>
-          <wp:inline distT="0" distB="0" distL="0" distR="0" wp14:anchorId="0A7F1F2C" wp14:editId="5C0E0DF1">
-            <wp:extent cx="4482935" cy="1725127"/>
-            <wp:effectExtent l="0" t="0" r="0" b="8890"/>
-            <wp:docPr id="11" name="Рисунок 11"/>
-            <wp:cNvGraphicFramePr>
-              <a:graphicFrameLocks xmlns:a="http://schemas.openxmlformats.org/drawingml/2006/main" noChangeAspect="1"/>
-            </wp:cNvGraphicFramePr>
-            <a:graphic xmlns:a="http://schemas.openxmlformats.org/drawingml/2006/main">
-              <a:graphicData uri="http://schemas.openxmlformats.org/drawingml/2006/picture">
-                <pic:pic xmlns:pic="http://schemas.openxmlformats.org/drawingml/2006/picture">
-                  <pic:nvPicPr>
-                    <pic:cNvPr id="0" name="Picture 26"/>
+          <wp:inline distT="0" distB="0" distL="0" distR="0" wp14:anchorId="1D93ECA5" wp14:editId="59104CCD">
+            <wp:extent cx="4441371" cy="686502"/>
+            <wp:effectExtent l="0" t="0" r="0" b="0"/>
+            <wp:docPr id="10" name="Рисунок 10"/>
+            <wp:cNvGraphicFramePr>
+              <a:graphicFrameLocks xmlns:a="http://schemas.openxmlformats.org/drawingml/2006/main" noChangeAspect="1"/>
+            </wp:cNvGraphicFramePr>
+            <a:graphic xmlns:a="http://schemas.openxmlformats.org/drawingml/2006/main">
+              <a:graphicData uri="http://schemas.openxmlformats.org/drawingml/2006/picture">
+                <pic:pic xmlns:pic="http://schemas.openxmlformats.org/drawingml/2006/picture">
+                  <pic:nvPicPr>
+                    <pic:cNvPr id="0" name="Picture 24"/>
                     <pic:cNvPicPr>
                       <a:picLocks noChangeAspect="1" noChangeArrowheads="1"/>
                     </pic:cNvPicPr>
@@ -625,7 +502,7 @@
                   <pic:spPr bwMode="auto">
                     <a:xfrm>
                       <a:off x="0" y="0"/>
-                      <a:ext cx="4525553" cy="1741527"/>
+                      <a:ext cx="4494498" cy="694714"/>
                     </a:xfrm>
                     <a:prstGeom prst="rect">
                       <a:avLst/>
@@ -641,29 +518,38 @@
           </wp:inline>
         </w:drawing>
       </w:r>
+      <w:r>
+        <w:rPr>
+          <w:i/>
+        </w:rPr>
+        <w:t xml:space="preserve"> </w:t>
+      </w:r>
     </w:p>
     <w:p>
       <w:pPr>
         <w:pStyle w:val="a5"/>
         <w:spacing w:before="0" w:beforeAutospacing="0" w:after="0" w:afterAutospacing="0"/>
+        <w:rPr>
+          <w:lang w:val="en-US"/>
+        </w:rPr>
       </w:pPr>
       <w:r>
         <w:rPr>
           <w:noProof/>
         </w:rPr>
         <w:drawing>
-          <wp:inline distT="0" distB="0" distL="0" distR="0" wp14:anchorId="02194A4D" wp14:editId="2B155A2B">
-            <wp:extent cx="4512623" cy="638665"/>
-            <wp:effectExtent l="0" t="0" r="2540" b="9525"/>
-            <wp:docPr id="12" name="Рисунок 12"/>
-            <wp:cNvGraphicFramePr>
-              <a:graphicFrameLocks xmlns:a="http://schemas.openxmlformats.org/drawingml/2006/main" noChangeAspect="1"/>
-            </wp:cNvGraphicFramePr>
-            <a:graphic xmlns:a="http://schemas.openxmlformats.org/drawingml/2006/main">
-              <a:graphicData uri="http://schemas.openxmlformats.org/drawingml/2006/picture">
-                <pic:pic xmlns:pic="http://schemas.openxmlformats.org/drawingml/2006/picture">
-                  <pic:nvPicPr>
-                    <pic:cNvPr id="0" name="Picture 27"/>
+          <wp:inline distT="0" distB="0" distL="0" distR="0" wp14:anchorId="0A7F1F2C" wp14:editId="5C0E0DF1">
+            <wp:extent cx="4482935" cy="1725127"/>
+            <wp:effectExtent l="0" t="0" r="0" b="8890"/>
+            <wp:docPr id="11" name="Рисунок 11"/>
+            <wp:cNvGraphicFramePr>
+              <a:graphicFrameLocks xmlns:a="http://schemas.openxmlformats.org/drawingml/2006/main" noChangeAspect="1"/>
+            </wp:cNvGraphicFramePr>
+            <a:graphic xmlns:a="http://schemas.openxmlformats.org/drawingml/2006/main">
+              <a:graphicData uri="http://schemas.openxmlformats.org/drawingml/2006/picture">
+                <pic:pic xmlns:pic="http://schemas.openxmlformats.org/drawingml/2006/picture">
+                  <pic:nvPicPr>
+                    <pic:cNvPr id="0" name="Picture 26"/>
                     <pic:cNvPicPr>
                       <a:picLocks noChangeAspect="1" noChangeArrowheads="1"/>
                     </pic:cNvPicPr>
@@ -684,7 +570,7 @@
                   <pic:spPr bwMode="auto">
                     <a:xfrm>
                       <a:off x="0" y="0"/>
-                      <a:ext cx="4638023" cy="656413"/>
+                      <a:ext cx="4525553" cy="1741527"/>
                     </a:xfrm>
                     <a:prstGeom prst="rect">
                       <a:avLst/>
@@ -711,18 +597,18 @@
           <w:noProof/>
         </w:rPr>
         <w:drawing>
-          <wp:inline distT="0" distB="0" distL="0" distR="0" wp14:anchorId="391614A0" wp14:editId="7BBE7726">
-            <wp:extent cx="4554187" cy="2195552"/>
-            <wp:effectExtent l="0" t="0" r="0" b="0"/>
-            <wp:docPr id="13" name="Рисунок 13"/>
-            <wp:cNvGraphicFramePr>
-              <a:graphicFrameLocks xmlns:a="http://schemas.openxmlformats.org/drawingml/2006/main" noChangeAspect="1"/>
-            </wp:cNvGraphicFramePr>
-            <a:graphic xmlns:a="http://schemas.openxmlformats.org/drawingml/2006/main">
-              <a:graphicData uri="http://schemas.openxmlformats.org/drawingml/2006/picture">
-                <pic:pic xmlns:pic="http://schemas.openxmlformats.org/drawingml/2006/picture">
-                  <pic:nvPicPr>
-                    <pic:cNvPr id="0" name="Picture 28"/>
+          <wp:inline distT="0" distB="0" distL="0" distR="0" wp14:anchorId="02194A4D" wp14:editId="2B155A2B">
+            <wp:extent cx="4512623" cy="638665"/>
+            <wp:effectExtent l="0" t="0" r="2540" b="9525"/>
+            <wp:docPr id="12" name="Рисунок 12"/>
+            <wp:cNvGraphicFramePr>
+              <a:graphicFrameLocks xmlns:a="http://schemas.openxmlformats.org/drawingml/2006/main" noChangeAspect="1"/>
+            </wp:cNvGraphicFramePr>
+            <a:graphic xmlns:a="http://schemas.openxmlformats.org/drawingml/2006/main">
+              <a:graphicData uri="http://schemas.openxmlformats.org/drawingml/2006/picture">
+                <pic:pic xmlns:pic="http://schemas.openxmlformats.org/drawingml/2006/picture">
+                  <pic:nvPicPr>
+                    <pic:cNvPr id="0" name="Picture 27"/>
                     <pic:cNvPicPr>
                       <a:picLocks noChangeAspect="1" noChangeArrowheads="1"/>
                     </pic:cNvPicPr>
@@ -743,7 +629,7 @@
                   <pic:spPr bwMode="auto">
                     <a:xfrm>
                       <a:off x="0" y="0"/>
-                      <a:ext cx="4576721" cy="2206416"/>
+                      <a:ext cx="4638023" cy="656413"/>
                     </a:xfrm>
                     <a:prstGeom prst="rect">
                       <a:avLst/>
@@ -769,20 +655,19 @@
         <w:rPr>
           <w:noProof/>
         </w:rPr>
-        <w:lastRenderedPageBreak/>
-        <w:drawing>
-          <wp:inline distT="0" distB="0" distL="0" distR="0" wp14:anchorId="0BCC518C" wp14:editId="2E5CB404">
-            <wp:extent cx="4672940" cy="538475"/>
+        <w:drawing>
+          <wp:inline distT="0" distB="0" distL="0" distR="0" wp14:anchorId="391614A0" wp14:editId="7BBE7726">
+            <wp:extent cx="4554187" cy="2195552"/>
             <wp:effectExtent l="0" t="0" r="0" b="0"/>
-            <wp:docPr id="16" name="Рисунок 16"/>
-            <wp:cNvGraphicFramePr>
-              <a:graphicFrameLocks xmlns:a="http://schemas.openxmlformats.org/drawingml/2006/main" noChangeAspect="1"/>
-            </wp:cNvGraphicFramePr>
-            <a:graphic xmlns:a="http://schemas.openxmlformats.org/drawingml/2006/main">
-              <a:graphicData uri="http://schemas.openxmlformats.org/drawingml/2006/picture">
-                <pic:pic xmlns:pic="http://schemas.openxmlformats.org/drawingml/2006/picture">
-                  <pic:nvPicPr>
-                    <pic:cNvPr id="0" name="Picture 35"/>
+            <wp:docPr id="13" name="Рисунок 13"/>
+            <wp:cNvGraphicFramePr>
+              <a:graphicFrameLocks xmlns:a="http://schemas.openxmlformats.org/drawingml/2006/main" noChangeAspect="1"/>
+            </wp:cNvGraphicFramePr>
+            <a:graphic xmlns:a="http://schemas.openxmlformats.org/drawingml/2006/main">
+              <a:graphicData uri="http://schemas.openxmlformats.org/drawingml/2006/picture">
+                <pic:pic xmlns:pic="http://schemas.openxmlformats.org/drawingml/2006/picture">
+                  <pic:nvPicPr>
+                    <pic:cNvPr id="0" name="Picture 28"/>
                     <pic:cNvPicPr>
                       <a:picLocks noChangeAspect="1" noChangeArrowheads="1"/>
                     </pic:cNvPicPr>
@@ -803,7 +688,7 @@
                   <pic:spPr bwMode="auto">
                     <a:xfrm>
                       <a:off x="0" y="0"/>
-                      <a:ext cx="4754740" cy="547901"/>
+                      <a:ext cx="4576721" cy="2206416"/>
                     </a:xfrm>
                     <a:prstGeom prst="rect">
                       <a:avLst/>
@@ -825,111 +710,24 @@
         <w:pStyle w:val="a5"/>
         <w:spacing w:before="0" w:beforeAutospacing="0" w:after="0" w:afterAutospacing="0"/>
       </w:pPr>
-    </w:p>
-    <w:p>
-      <w:pPr>
-        <w:pStyle w:val="a4"/>
-        <w:numPr>
-          <w:ilvl w:val="0"/>
-          <w:numId w:val="1"/>
-        </w:numPr>
-        <w:spacing w:after="0"/>
-        <w:ind w:left="0"/>
-        <w:rPr>
-          <w:rFonts w:ascii="Times New Roman" w:hAnsi="Times New Roman" w:cs="Times New Roman"/>
-          <w:i/>
-          <w:sz w:val="24"/>
-          <w:szCs w:val="24"/>
-        </w:rPr>
-      </w:pPr>
-      <w:r>
-        <w:rPr>
-          <w:rFonts w:ascii="Times New Roman" w:hAnsi="Times New Roman" w:cs="Times New Roman"/>
-          <w:i/>
-          <w:sz w:val="24"/>
-          <w:szCs w:val="24"/>
-        </w:rPr>
-        <w:t xml:space="preserve">Создайте репозиторий внутри папки </w:t>
-      </w:r>
-      <w:r>
-        <w:rPr>
-          <w:rFonts w:ascii="Times New Roman" w:hAnsi="Times New Roman" w:cs="Times New Roman"/>
-          <w:sz w:val="24"/>
-          <w:szCs w:val="24"/>
-          <w:lang w:val="en-US"/>
-        </w:rPr>
-        <w:t>LR</w:t>
-      </w:r>
-      <w:r>
-        <w:rPr>
-          <w:rFonts w:ascii="Times New Roman" w:hAnsi="Times New Roman" w:cs="Times New Roman"/>
-          <w:sz w:val="24"/>
-          <w:szCs w:val="24"/>
-        </w:rPr>
-        <w:t xml:space="preserve">1 </w:t>
-      </w:r>
-      <w:r>
-        <w:rPr>
-          <w:rFonts w:ascii="Times New Roman" w:hAnsi="Times New Roman" w:cs="Times New Roman"/>
-          <w:i/>
-          <w:sz w:val="24"/>
-          <w:szCs w:val="24"/>
-        </w:rPr>
-        <w:t>с помощью клонирования проекта с сайта github.com (</w:t>
-      </w:r>
-      <w:r>
-        <w:rPr>
-          <w:rFonts w:ascii="Courier New" w:hAnsi="Courier New" w:cs="Courier New"/>
-          <w:color w:val="333333"/>
-          <w:sz w:val="23"/>
-          <w:szCs w:val="23"/>
-          <w:shd w:val="clear" w:color="auto" w:fill="F8F8F8"/>
-        </w:rPr>
-        <w:t>https://github.com/smartiqaorg/geometric_lib</w:t>
-      </w:r>
-      <w:r>
-        <w:rPr>
-          <w:rFonts w:ascii="Times New Roman" w:hAnsi="Times New Roman" w:cs="Times New Roman"/>
-          <w:i/>
-          <w:sz w:val="24"/>
-          <w:szCs w:val="24"/>
-        </w:rPr>
-        <w:t>)</w:t>
-      </w:r>
-    </w:p>
-    <w:p>
-      <w:pPr>
-        <w:pStyle w:val="a4"/>
-        <w:spacing w:after="0"/>
-        <w:ind w:left="0"/>
-        <w:rPr>
-          <w:rFonts w:ascii="Times New Roman" w:hAnsi="Times New Roman" w:cs="Times New Roman"/>
-          <w:i/>
-          <w:sz w:val="24"/>
-          <w:szCs w:val="24"/>
-        </w:rPr>
-      </w:pPr>
-      <w:r>
-        <w:rPr>
-          <w:rFonts w:ascii="Times New Roman" w:hAnsi="Times New Roman" w:cs="Times New Roman"/>
-          <w:i/>
+      <w:r>
+        <w:rPr>
           <w:noProof/>
-          <w:sz w:val="24"/>
-          <w:szCs w:val="24"/>
-        </w:rPr>
-        <w:drawing>
-          <wp:inline distT="0" distB="0" distL="0" distR="0" wp14:anchorId="17D3836A" wp14:editId="53E9402F">
-            <wp:extent cx="4809506" cy="1191709"/>
-            <wp:effectExtent l="0" t="0" r="0" b="8890"/>
-            <wp:docPr id="14" name="Рисунок 14"/>
-            <wp:cNvGraphicFramePr>
-              <a:graphicFrameLocks xmlns:a="http://schemas.openxmlformats.org/drawingml/2006/main" noChangeAspect="1"/>
-            </wp:cNvGraphicFramePr>
-            <a:graphic xmlns:a="http://schemas.openxmlformats.org/drawingml/2006/main">
-              <a:graphicData uri="http://schemas.openxmlformats.org/drawingml/2006/picture">
-                <pic:pic xmlns:pic="http://schemas.openxmlformats.org/drawingml/2006/picture">
-                  <pic:nvPicPr>
-                    <pic:cNvPr id="0" name="Picture 29"/>
+        </w:rPr>
+        <w:lastRenderedPageBreak/>
+        <w:drawing>
+          <wp:inline distT="0" distB="0" distL="0" distR="0" wp14:anchorId="0BCC518C" wp14:editId="2E5CB404">
+            <wp:extent cx="4672940" cy="538475"/>
+            <wp:effectExtent l="0" t="0" r="0" b="0"/>
+            <wp:docPr id="16" name="Рисунок 16"/>
+            <wp:cNvGraphicFramePr>
+              <a:graphicFrameLocks xmlns:a="http://schemas.openxmlformats.org/drawingml/2006/main" noChangeAspect="1"/>
+            </wp:cNvGraphicFramePr>
+            <a:graphic xmlns:a="http://schemas.openxmlformats.org/drawingml/2006/main">
+              <a:graphicData uri="http://schemas.openxmlformats.org/drawingml/2006/picture">
+                <pic:pic xmlns:pic="http://schemas.openxmlformats.org/drawingml/2006/picture">
+                  <pic:nvPicPr>
+                    <pic:cNvPr id="0" name="Picture 35"/>
                     <pic:cNvPicPr>
                       <a:picLocks noChangeAspect="1" noChangeArrowheads="1"/>
                     </pic:cNvPicPr>
@@ -950,7 +748,7 @@
                   <pic:spPr bwMode="auto">
                     <a:xfrm>
                       <a:off x="0" y="0"/>
-                      <a:ext cx="4841922" cy="1199741"/>
+                      <a:ext cx="4754740" cy="547901"/>
                     </a:xfrm>
                     <a:prstGeom prst="rect">
                       <a:avLst/>
@@ -969,6 +767,12 @@
     </w:p>
     <w:p>
       <w:pPr>
+        <w:pStyle w:val="a5"/>
+        <w:spacing w:before="0" w:beforeAutospacing="0" w:after="0" w:afterAutospacing="0"/>
+      </w:pPr>
+    </w:p>
+    <w:p>
+      <w:pPr>
         <w:pStyle w:val="a4"/>
         <w:numPr>
           <w:ilvl w:val="0"/>
@@ -990,119 +794,87 @@
           <w:sz w:val="24"/>
           <w:szCs w:val="24"/>
         </w:rPr>
-        <w:t>Выполните следующие действия, каждый раз проверяя состояние файлов в локальном репозитории до и после выполнения операции:</w:t>
-      </w:r>
-    </w:p>
-    <w:p>
-      <w:pPr>
-        <w:pStyle w:val="a4"/>
-        <w:numPr>
-          <w:ilvl w:val="1"/>
-          <w:numId w:val="1"/>
-        </w:numPr>
-        <w:spacing w:after="0"/>
-        <w:ind w:left="0"/>
-        <w:rPr>
-          <w:rFonts w:ascii="Times New Roman" w:hAnsi="Times New Roman" w:cs="Times New Roman"/>
-          <w:color w:val="252525"/>
-          <w:sz w:val="24"/>
-          <w:szCs w:val="24"/>
-          <w:shd w:val="clear" w:color="auto" w:fill="FFFFFF"/>
-        </w:rPr>
-      </w:pPr>
-      <w:r>
-        <w:rPr>
-          <w:rFonts w:ascii="Times New Roman" w:hAnsi="Times New Roman" w:cs="Times New Roman"/>
-          <w:color w:val="252525"/>
-          <w:sz w:val="24"/>
-          <w:szCs w:val="24"/>
-          <w:shd w:val="clear" w:color="auto" w:fill="FFFFFF"/>
-        </w:rPr>
-        <w:t xml:space="preserve">сделайте индексацию нескольких файлов в вашем </w:t>
-      </w:r>
-      <w:proofErr w:type="spellStart"/>
-      <w:r>
-        <w:rPr>
-          <w:rFonts w:ascii="Times New Roman" w:hAnsi="Times New Roman" w:cs="Times New Roman"/>
-          <w:color w:val="252525"/>
-          <w:sz w:val="24"/>
-          <w:szCs w:val="24"/>
-          <w:shd w:val="clear" w:color="auto" w:fill="FFFFFF"/>
-        </w:rPr>
-        <w:t>Git</w:t>
-      </w:r>
-      <w:proofErr w:type="spellEnd"/>
-      <w:r>
-        <w:rPr>
-          <w:rFonts w:ascii="Times New Roman" w:hAnsi="Times New Roman" w:cs="Times New Roman"/>
-          <w:color w:val="252525"/>
-          <w:sz w:val="24"/>
-          <w:szCs w:val="24"/>
-          <w:shd w:val="clear" w:color="auto" w:fill="FFFFFF"/>
-        </w:rPr>
-        <w:t>-репозитории (</w:t>
-      </w:r>
-      <w:proofErr w:type="spellStart"/>
-      <w:r>
-        <w:rPr>
-          <w:rFonts w:ascii="Times New Roman" w:hAnsi="Times New Roman" w:cs="Times New Roman"/>
-          <w:color w:val="252525"/>
-          <w:sz w:val="24"/>
-          <w:szCs w:val="24"/>
-          <w:shd w:val="clear" w:color="auto" w:fill="FFFFFF"/>
-        </w:rPr>
-        <w:t>git</w:t>
-      </w:r>
-      <w:proofErr w:type="spellEnd"/>
-      <w:r>
-        <w:rPr>
-          <w:rFonts w:ascii="Times New Roman" w:hAnsi="Times New Roman" w:cs="Times New Roman"/>
-          <w:color w:val="252525"/>
-          <w:sz w:val="24"/>
-          <w:szCs w:val="24"/>
-          <w:shd w:val="clear" w:color="auto" w:fill="FFFFFF"/>
-        </w:rPr>
-        <w:t xml:space="preserve"> </w:t>
-      </w:r>
-      <w:proofErr w:type="spellStart"/>
-      <w:r>
-        <w:rPr>
-          <w:rFonts w:ascii="Times New Roman" w:hAnsi="Times New Roman" w:cs="Times New Roman"/>
-          <w:color w:val="252525"/>
-          <w:sz w:val="24"/>
-          <w:szCs w:val="24"/>
-          <w:shd w:val="clear" w:color="auto" w:fill="FFFFFF"/>
-        </w:rPr>
-        <w:t>add</w:t>
-      </w:r>
-      <w:proofErr w:type="spellEnd"/>
-      <w:r>
-        <w:rPr>
-          <w:rFonts w:ascii="Times New Roman" w:hAnsi="Times New Roman" w:cs="Times New Roman"/>
-          <w:color w:val="252525"/>
-          <w:sz w:val="24"/>
-          <w:szCs w:val="24"/>
-          <w:shd w:val="clear" w:color="auto" w:fill="FFFFFF"/>
-        </w:rPr>
-        <w:t xml:space="preserve"> …), </w:t>
-      </w:r>
-      <w:r>
-        <w:rPr>
+        <w:t xml:space="preserve">Создайте репозиторий внутри папки </w:t>
+      </w:r>
+      <w:r>
+        <w:rPr>
+          <w:rFonts w:ascii="Times New Roman" w:hAnsi="Times New Roman" w:cs="Times New Roman"/>
+          <w:sz w:val="24"/>
+          <w:szCs w:val="24"/>
+          <w:lang w:val="en-US"/>
+        </w:rPr>
+        <w:t>LR</w:t>
+      </w:r>
+      <w:r>
+        <w:rPr>
+          <w:rFonts w:ascii="Times New Roman" w:hAnsi="Times New Roman" w:cs="Times New Roman"/>
+          <w:sz w:val="24"/>
+          <w:szCs w:val="24"/>
+        </w:rPr>
+        <w:t xml:space="preserve">1 </w:t>
+      </w:r>
+      <w:r>
+        <w:rPr>
+          <w:rFonts w:ascii="Times New Roman" w:hAnsi="Times New Roman" w:cs="Times New Roman"/>
+          <w:i/>
+          <w:sz w:val="24"/>
+          <w:szCs w:val="24"/>
+        </w:rPr>
+        <w:t>с помощью клонирования проекта с сайта github.com (</w:t>
+      </w:r>
+      <w:r>
+        <w:rPr>
+          <w:rFonts w:ascii="Courier New" w:hAnsi="Courier New" w:cs="Courier New"/>
+          <w:color w:val="333333"/>
+          <w:sz w:val="23"/>
+          <w:szCs w:val="23"/>
+          <w:shd w:val="clear" w:color="auto" w:fill="F8F8F8"/>
+        </w:rPr>
+        <w:t>https://github.com/smartiqaorg/geometric_lib</w:t>
+      </w:r>
+      <w:r>
+        <w:rPr>
+          <w:rFonts w:ascii="Times New Roman" w:hAnsi="Times New Roman" w:cs="Times New Roman"/>
+          <w:i/>
+          <w:sz w:val="24"/>
+          <w:szCs w:val="24"/>
+        </w:rPr>
+        <w:t>)</w:t>
+      </w:r>
+    </w:p>
+    <w:p>
+      <w:pPr>
+        <w:pStyle w:val="a4"/>
+        <w:spacing w:after="0"/>
+        <w:ind w:left="0"/>
+        <w:rPr>
+          <w:rFonts w:ascii="Times New Roman" w:hAnsi="Times New Roman" w:cs="Times New Roman"/>
+          <w:i/>
+          <w:sz w:val="24"/>
+          <w:szCs w:val="24"/>
+        </w:rPr>
+      </w:pPr>
+      <w:r>
+        <w:rPr>
+          <w:rFonts w:ascii="Times New Roman" w:hAnsi="Times New Roman" w:cs="Times New Roman"/>
+          <w:i/>
           <w:noProof/>
-        </w:rPr>
-        <w:drawing>
-          <wp:inline distT="0" distB="0" distL="0" distR="0" wp14:anchorId="24E0795A" wp14:editId="5D8D7800">
-            <wp:extent cx="4809490" cy="2139722"/>
-            <wp:effectExtent l="0" t="0" r="0" b="0"/>
-            <wp:docPr id="19" name="Рисунок 19"/>
-            <wp:cNvGraphicFramePr>
-              <a:graphicFrameLocks xmlns:a="http://schemas.openxmlformats.org/drawingml/2006/main" noChangeAspect="1"/>
-            </wp:cNvGraphicFramePr>
-            <a:graphic xmlns:a="http://schemas.openxmlformats.org/drawingml/2006/main">
-              <a:graphicData uri="http://schemas.openxmlformats.org/drawingml/2006/picture">
-                <pic:pic xmlns:pic="http://schemas.openxmlformats.org/drawingml/2006/picture">
-                  <pic:nvPicPr>
-                    <pic:cNvPr id="0" name="Picture 47"/>
+          <w:sz w:val="24"/>
+          <w:szCs w:val="24"/>
+        </w:rPr>
+        <w:drawing>
+          <wp:inline distT="0" distB="0" distL="0" distR="0" wp14:anchorId="17D3836A" wp14:editId="53E9402F">
+            <wp:extent cx="4809506" cy="1191709"/>
+            <wp:effectExtent l="0" t="0" r="0" b="8890"/>
+            <wp:docPr id="14" name="Рисунок 14"/>
+            <wp:cNvGraphicFramePr>
+              <a:graphicFrameLocks xmlns:a="http://schemas.openxmlformats.org/drawingml/2006/main" noChangeAspect="1"/>
+            </wp:cNvGraphicFramePr>
+            <a:graphic xmlns:a="http://schemas.openxmlformats.org/drawingml/2006/main">
+              <a:graphicData uri="http://schemas.openxmlformats.org/drawingml/2006/picture">
+                <pic:pic xmlns:pic="http://schemas.openxmlformats.org/drawingml/2006/picture">
+                  <pic:nvPicPr>
+                    <pic:cNvPr id="0" name="Picture 29"/>
                     <pic:cNvPicPr>
                       <a:picLocks noChangeAspect="1" noChangeArrowheads="1"/>
                     </pic:cNvPicPr>
@@ -1123,7 +895,7 @@
                   <pic:spPr bwMode="auto">
                     <a:xfrm>
                       <a:off x="0" y="0"/>
-                      <a:ext cx="4831515" cy="2149521"/>
+                      <a:ext cx="4841922" cy="1199741"/>
                     </a:xfrm>
                     <a:prstGeom prst="rect">
                       <a:avLst/>
@@ -1143,38 +915,73 @@
     <w:p>
       <w:pPr>
         <w:pStyle w:val="a4"/>
-        <w:spacing w:after="0"/>
-        <w:ind w:left="0"/>
-        <w:rPr>
-          <w:rFonts w:ascii="Times New Roman" w:hAnsi="Times New Roman" w:cs="Times New Roman"/>
-          <w:color w:val="252525"/>
-          <w:sz w:val="24"/>
-          <w:szCs w:val="24"/>
-          <w:shd w:val="clear" w:color="auto" w:fill="FFFFFF"/>
-        </w:rPr>
-      </w:pPr>
-      <w:r>
-        <w:rPr>
-          <w:rFonts w:ascii="Times New Roman" w:hAnsi="Times New Roman" w:cs="Times New Roman"/>
+        <w:numPr>
+          <w:ilvl w:val="0"/>
+          <w:numId w:val="1"/>
+        </w:numPr>
+        <w:spacing w:after="0"/>
+        <w:ind w:left="0"/>
+        <w:rPr>
+          <w:rFonts w:ascii="Times New Roman" w:hAnsi="Times New Roman" w:cs="Times New Roman"/>
+          <w:i/>
+          <w:sz w:val="24"/>
+          <w:szCs w:val="24"/>
+        </w:rPr>
+      </w:pPr>
+      <w:r>
+        <w:rPr>
+          <w:rFonts w:ascii="Times New Roman" w:hAnsi="Times New Roman" w:cs="Times New Roman"/>
+          <w:i/>
+          <w:sz w:val="24"/>
+          <w:szCs w:val="24"/>
+        </w:rPr>
+        <w:t>Выполните следующие действия, каждый раз проверяя состояние файлов в локальном репозитории до и после выполнения операции:</w:t>
+      </w:r>
+    </w:p>
+    <w:p>
+      <w:pPr>
+        <w:pStyle w:val="a4"/>
+        <w:numPr>
+          <w:ilvl w:val="1"/>
+          <w:numId w:val="1"/>
+        </w:numPr>
+        <w:spacing w:after="0"/>
+        <w:ind w:left="0"/>
+        <w:rPr>
+          <w:rFonts w:ascii="Times New Roman" w:hAnsi="Times New Roman" w:cs="Times New Roman"/>
+          <w:color w:val="252525"/>
+          <w:sz w:val="24"/>
+          <w:szCs w:val="24"/>
+          <w:shd w:val="clear" w:color="auto" w:fill="FFFFFF"/>
+        </w:rPr>
+      </w:pPr>
+      <w:r>
+        <w:rPr>
+          <w:rFonts w:ascii="Times New Roman" w:hAnsi="Times New Roman" w:cs="Times New Roman"/>
+          <w:color w:val="252525"/>
+          <w:sz w:val="24"/>
+          <w:szCs w:val="24"/>
+          <w:shd w:val="clear" w:color="auto" w:fill="FFFFFF"/>
+        </w:rPr>
+        <w:t xml:space="preserve">сделайте индексацию нескольких файлов в вашем Git-репозитории (git add …), </w:t>
+      </w:r>
+      <w:r>
+        <w:rPr>
           <w:noProof/>
-          <w:color w:val="252525"/>
-          <w:sz w:val="24"/>
-          <w:szCs w:val="24"/>
-          <w:shd w:val="clear" w:color="auto" w:fill="FFFFFF"/>
-        </w:rPr>
-        <w:drawing>
-          <wp:inline distT="0" distB="0" distL="0" distR="0" wp14:anchorId="7E3BAFB3" wp14:editId="555886EE">
-            <wp:extent cx="4809490" cy="613332"/>
+        </w:rPr>
+        <w:drawing>
+          <wp:inline distT="0" distB="0" distL="0" distR="0" wp14:anchorId="24E0795A" wp14:editId="5D8D7800">
+            <wp:extent cx="4809490" cy="2139722"/>
             <wp:effectExtent l="0" t="0" r="0" b="0"/>
-            <wp:docPr id="22" name="Рисунок 22"/>
-            <wp:cNvGraphicFramePr>
-              <a:graphicFrameLocks xmlns:a="http://schemas.openxmlformats.org/drawingml/2006/main" noChangeAspect="1"/>
-            </wp:cNvGraphicFramePr>
-            <a:graphic xmlns:a="http://schemas.openxmlformats.org/drawingml/2006/main">
-              <a:graphicData uri="http://schemas.openxmlformats.org/drawingml/2006/picture">
-                <pic:pic xmlns:pic="http://schemas.openxmlformats.org/drawingml/2006/picture">
-                  <pic:nvPicPr>
-                    <pic:cNvPr id="0" name="Picture 51"/>
+            <wp:docPr id="19" name="Рисунок 19"/>
+            <wp:cNvGraphicFramePr>
+              <a:graphicFrameLocks xmlns:a="http://schemas.openxmlformats.org/drawingml/2006/main" noChangeAspect="1"/>
+            </wp:cNvGraphicFramePr>
+            <a:graphic xmlns:a="http://schemas.openxmlformats.org/drawingml/2006/main">
+              <a:graphicData uri="http://schemas.openxmlformats.org/drawingml/2006/picture">
+                <pic:pic xmlns:pic="http://schemas.openxmlformats.org/drawingml/2006/picture">
+                  <pic:nvPicPr>
+                    <pic:cNvPr id="0" name="Picture 47"/>
                     <pic:cNvPicPr>
                       <a:picLocks noChangeAspect="1" noChangeArrowheads="1"/>
                     </pic:cNvPicPr>
@@ -1195,7 +1002,7 @@
                   <pic:spPr bwMode="auto">
                     <a:xfrm>
                       <a:off x="0" y="0"/>
-                      <a:ext cx="4892294" cy="623892"/>
+                      <a:ext cx="4831515" cy="2149521"/>
                     </a:xfrm>
                     <a:prstGeom prst="rect">
                       <a:avLst/>
@@ -1235,18 +1042,18 @@
           <w:shd w:val="clear" w:color="auto" w:fill="FFFFFF"/>
         </w:rPr>
         <w:drawing>
-          <wp:inline distT="0" distB="0" distL="0" distR="0" wp14:anchorId="568F087E" wp14:editId="51CD806F">
-            <wp:extent cx="4809490" cy="1993200"/>
-            <wp:effectExtent l="0" t="0" r="0" b="7620"/>
-            <wp:docPr id="23" name="Рисунок 23"/>
-            <wp:cNvGraphicFramePr>
-              <a:graphicFrameLocks xmlns:a="http://schemas.openxmlformats.org/drawingml/2006/main" noChangeAspect="1"/>
-            </wp:cNvGraphicFramePr>
-            <a:graphic xmlns:a="http://schemas.openxmlformats.org/drawingml/2006/main">
-              <a:graphicData uri="http://schemas.openxmlformats.org/drawingml/2006/picture">
-                <pic:pic xmlns:pic="http://schemas.openxmlformats.org/drawingml/2006/picture">
-                  <pic:nvPicPr>
-                    <pic:cNvPr id="0" name="Picture 52"/>
+          <wp:inline distT="0" distB="0" distL="0" distR="0" wp14:anchorId="7E3BAFB3" wp14:editId="555886EE">
+            <wp:extent cx="4809490" cy="613332"/>
+            <wp:effectExtent l="0" t="0" r="0" b="0"/>
+            <wp:docPr id="22" name="Рисунок 22"/>
+            <wp:cNvGraphicFramePr>
+              <a:graphicFrameLocks xmlns:a="http://schemas.openxmlformats.org/drawingml/2006/main" noChangeAspect="1"/>
+            </wp:cNvGraphicFramePr>
+            <a:graphic xmlns:a="http://schemas.openxmlformats.org/drawingml/2006/main">
+              <a:graphicData uri="http://schemas.openxmlformats.org/drawingml/2006/picture">
+                <pic:pic xmlns:pic="http://schemas.openxmlformats.org/drawingml/2006/picture">
+                  <pic:nvPicPr>
+                    <pic:cNvPr id="0" name="Picture 51"/>
                     <pic:cNvPicPr>
                       <a:picLocks noChangeAspect="1" noChangeArrowheads="1"/>
                     </pic:cNvPicPr>
@@ -1267,7 +1074,7 @@
                   <pic:spPr bwMode="auto">
                     <a:xfrm>
                       <a:off x="0" y="0"/>
-                      <a:ext cx="4844312" cy="2007631"/>
+                      <a:ext cx="4892294" cy="623892"/>
                     </a:xfrm>
                     <a:prstGeom prst="rect">
                       <a:avLst/>
@@ -1287,34 +1094,6 @@
     <w:p>
       <w:pPr>
         <w:pStyle w:val="a4"/>
-        <w:numPr>
-          <w:ilvl w:val="1"/>
-          <w:numId w:val="1"/>
-        </w:numPr>
-        <w:spacing w:after="0"/>
-        <w:ind w:left="0"/>
-        <w:rPr>
-          <w:rFonts w:ascii="Times New Roman" w:hAnsi="Times New Roman" w:cs="Times New Roman"/>
-          <w:color w:val="252525"/>
-          <w:sz w:val="24"/>
-          <w:szCs w:val="24"/>
-          <w:shd w:val="clear" w:color="auto" w:fill="FFFFFF"/>
-        </w:rPr>
-      </w:pPr>
-      <w:r>
-        <w:rPr>
-          <w:rFonts w:ascii="Times New Roman" w:hAnsi="Times New Roman" w:cs="Times New Roman"/>
-          <w:color w:val="252525"/>
-          <w:sz w:val="24"/>
-          <w:szCs w:val="24"/>
-          <w:shd w:val="clear" w:color="auto" w:fill="FFFFFF"/>
-        </w:rPr>
-        <w:t xml:space="preserve">внесите изменения в файлы, </w:t>
-      </w:r>
-    </w:p>
-    <w:p>
-      <w:pPr>
-        <w:pStyle w:val="a4"/>
         <w:spacing w:after="0"/>
         <w:ind w:left="0"/>
         <w:rPr>
@@ -1335,18 +1114,18 @@
           <w:shd w:val="clear" w:color="auto" w:fill="FFFFFF"/>
         </w:rPr>
         <w:drawing>
-          <wp:inline distT="0" distB="0" distL="0" distR="0" wp14:anchorId="6EADABD3" wp14:editId="5FBC7BAA">
-            <wp:extent cx="4809490" cy="332629"/>
-            <wp:effectExtent l="0" t="0" r="0" b="0"/>
-            <wp:docPr id="21" name="Рисунок 21"/>
-            <wp:cNvGraphicFramePr>
-              <a:graphicFrameLocks xmlns:a="http://schemas.openxmlformats.org/drawingml/2006/main" noChangeAspect="1"/>
-            </wp:cNvGraphicFramePr>
-            <a:graphic xmlns:a="http://schemas.openxmlformats.org/drawingml/2006/main">
-              <a:graphicData uri="http://schemas.openxmlformats.org/drawingml/2006/picture">
-                <pic:pic xmlns:pic="http://schemas.openxmlformats.org/drawingml/2006/picture">
-                  <pic:nvPicPr>
-                    <pic:cNvPr id="0" name="Picture 50"/>
+          <wp:inline distT="0" distB="0" distL="0" distR="0" wp14:anchorId="568F087E" wp14:editId="51CD806F">
+            <wp:extent cx="4809490" cy="1993200"/>
+            <wp:effectExtent l="0" t="0" r="0" b="7620"/>
+            <wp:docPr id="23" name="Рисунок 23"/>
+            <wp:cNvGraphicFramePr>
+              <a:graphicFrameLocks xmlns:a="http://schemas.openxmlformats.org/drawingml/2006/main" noChangeAspect="1"/>
+            </wp:cNvGraphicFramePr>
+            <a:graphic xmlns:a="http://schemas.openxmlformats.org/drawingml/2006/main">
+              <a:graphicData uri="http://schemas.openxmlformats.org/drawingml/2006/picture">
+                <pic:pic xmlns:pic="http://schemas.openxmlformats.org/drawingml/2006/picture">
+                  <pic:nvPicPr>
+                    <pic:cNvPr id="0" name="Picture 52"/>
                     <pic:cNvPicPr>
                       <a:picLocks noChangeAspect="1" noChangeArrowheads="1"/>
                     </pic:cNvPicPr>
@@ -1367,7 +1146,7 @@
                   <pic:spPr bwMode="auto">
                     <a:xfrm>
                       <a:off x="0" y="0"/>
-                      <a:ext cx="4944374" cy="341958"/>
+                      <a:ext cx="4844312" cy="2007631"/>
                     </a:xfrm>
                     <a:prstGeom prst="rect">
                       <a:avLst/>
@@ -1387,6 +1166,34 @@
     <w:p>
       <w:pPr>
         <w:pStyle w:val="a4"/>
+        <w:numPr>
+          <w:ilvl w:val="1"/>
+          <w:numId w:val="1"/>
+        </w:numPr>
+        <w:spacing w:after="0"/>
+        <w:ind w:left="0"/>
+        <w:rPr>
+          <w:rFonts w:ascii="Times New Roman" w:hAnsi="Times New Roman" w:cs="Times New Roman"/>
+          <w:color w:val="252525"/>
+          <w:sz w:val="24"/>
+          <w:szCs w:val="24"/>
+          <w:shd w:val="clear" w:color="auto" w:fill="FFFFFF"/>
+        </w:rPr>
+      </w:pPr>
+      <w:r>
+        <w:rPr>
+          <w:rFonts w:ascii="Times New Roman" w:hAnsi="Times New Roman" w:cs="Times New Roman"/>
+          <w:color w:val="252525"/>
+          <w:sz w:val="24"/>
+          <w:szCs w:val="24"/>
+          <w:shd w:val="clear" w:color="auto" w:fill="FFFFFF"/>
+        </w:rPr>
+        <w:t xml:space="preserve">внесите изменения в файлы, </w:t>
+      </w:r>
+    </w:p>
+    <w:p>
+      <w:pPr>
+        <w:pStyle w:val="a4"/>
         <w:spacing w:after="0"/>
         <w:ind w:left="0"/>
         <w:rPr>
@@ -1406,26 +1213,25 @@
           <w:szCs w:val="24"/>
           <w:shd w:val="clear" w:color="auto" w:fill="FFFFFF"/>
         </w:rPr>
-        <w:lastRenderedPageBreak/>
-        <w:drawing>
-          <wp:inline distT="0" distB="0" distL="0" distR="0" wp14:anchorId="5175044F" wp14:editId="11332896">
-            <wp:extent cx="3482233" cy="2102740"/>
-            <wp:effectExtent l="0" t="0" r="4445" b="0"/>
-            <wp:docPr id="20" name="Рисунок 20"/>
-            <wp:cNvGraphicFramePr>
-              <a:graphicFrameLocks xmlns:a="http://schemas.openxmlformats.org/drawingml/2006/main" noChangeAspect="1"/>
-            </wp:cNvGraphicFramePr>
-            <a:graphic xmlns:a="http://schemas.openxmlformats.org/drawingml/2006/main">
-              <a:graphicData uri="http://schemas.openxmlformats.org/drawingml/2006/picture">
-                <pic:pic xmlns:pic="http://schemas.openxmlformats.org/drawingml/2006/picture">
-                  <pic:nvPicPr>
-                    <pic:cNvPr id="0" name="Picture 49"/>
+        <w:drawing>
+          <wp:inline distT="0" distB="0" distL="0" distR="0" wp14:anchorId="6EADABD3" wp14:editId="5FBC7BAA">
+            <wp:extent cx="4809490" cy="332629"/>
+            <wp:effectExtent l="0" t="0" r="0" b="0"/>
+            <wp:docPr id="21" name="Рисунок 21"/>
+            <wp:cNvGraphicFramePr>
+              <a:graphicFrameLocks xmlns:a="http://schemas.openxmlformats.org/drawingml/2006/main" noChangeAspect="1"/>
+            </wp:cNvGraphicFramePr>
+            <a:graphic xmlns:a="http://schemas.openxmlformats.org/drawingml/2006/main">
+              <a:graphicData uri="http://schemas.openxmlformats.org/drawingml/2006/picture">
+                <pic:pic xmlns:pic="http://schemas.openxmlformats.org/drawingml/2006/picture">
+                  <pic:nvPicPr>
+                    <pic:cNvPr id="0" name="Picture 50"/>
                     <pic:cNvPicPr>
                       <a:picLocks noChangeAspect="1" noChangeArrowheads="1"/>
                     </pic:cNvPicPr>
                   </pic:nvPicPr>
                   <pic:blipFill>
-                    <a:blip r:embed="rId17" cstate="print">
+                    <a:blip r:embed="rId17">
                       <a:extLst>
                         <a:ext uri="{28A0092B-C50C-407E-A947-70E740481C1C}">
                           <a14:useLocalDpi xmlns:a14="http://schemas.microsoft.com/office/drawing/2010/main" val="0"/>
@@ -1440,7 +1246,7 @@
                   <pic:spPr bwMode="auto">
                     <a:xfrm>
                       <a:off x="0" y="0"/>
-                      <a:ext cx="3493212" cy="2109369"/>
+                      <a:ext cx="4944374" cy="341958"/>
                     </a:xfrm>
                     <a:prstGeom prst="rect">
                       <a:avLst/>
@@ -1460,56 +1266,6 @@
     <w:p>
       <w:pPr>
         <w:pStyle w:val="a4"/>
-        <w:numPr>
-          <w:ilvl w:val="1"/>
-          <w:numId w:val="1"/>
-        </w:numPr>
-        <w:spacing w:after="0"/>
-        <w:ind w:left="0"/>
-        <w:rPr>
-          <w:rFonts w:ascii="Times New Roman" w:hAnsi="Times New Roman" w:cs="Times New Roman"/>
-          <w:color w:val="252525"/>
-          <w:sz w:val="24"/>
-          <w:szCs w:val="24"/>
-          <w:shd w:val="clear" w:color="auto" w:fill="FFFFFF"/>
-        </w:rPr>
-      </w:pPr>
-      <w:r>
-        <w:rPr>
-          <w:rFonts w:ascii="Times New Roman" w:hAnsi="Times New Roman" w:cs="Times New Roman"/>
-          <w:color w:val="252525"/>
-          <w:sz w:val="24"/>
-          <w:szCs w:val="24"/>
-          <w:shd w:val="clear" w:color="auto" w:fill="FFFFFF"/>
-        </w:rPr>
-        <w:t xml:space="preserve">выполните коммиты к </w:t>
-      </w:r>
-      <w:proofErr w:type="gramStart"/>
-      <w:r>
-        <w:rPr>
-          <w:rFonts w:ascii="Times New Roman" w:hAnsi="Times New Roman" w:cs="Times New Roman"/>
-          <w:color w:val="252525"/>
-          <w:sz w:val="24"/>
-          <w:szCs w:val="24"/>
-          <w:shd w:val="clear" w:color="auto" w:fill="FFFFFF"/>
-        </w:rPr>
-        <w:t>проиндексированным  файлам</w:t>
-      </w:r>
-      <w:proofErr w:type="gramEnd"/>
-      <w:r>
-        <w:rPr>
-          <w:rFonts w:ascii="Times New Roman" w:hAnsi="Times New Roman" w:cs="Times New Roman"/>
-          <w:color w:val="252525"/>
-          <w:sz w:val="24"/>
-          <w:szCs w:val="24"/>
-          <w:shd w:val="clear" w:color="auto" w:fill="FFFFFF"/>
-        </w:rPr>
-        <w:t xml:space="preserve">, </w:t>
-      </w:r>
-    </w:p>
-    <w:p>
-      <w:pPr>
-        <w:pStyle w:val="a4"/>
         <w:spacing w:after="0"/>
         <w:ind w:left="0"/>
         <w:rPr>
@@ -1529,25 +1285,26 @@
           <w:szCs w:val="24"/>
           <w:shd w:val="clear" w:color="auto" w:fill="FFFFFF"/>
         </w:rPr>
-        <w:drawing>
-          <wp:inline distT="0" distB="0" distL="0" distR="0" wp14:anchorId="7740B4CE" wp14:editId="5708AF6E">
-            <wp:extent cx="5251450" cy="1909720"/>
-            <wp:effectExtent l="0" t="0" r="6350" b="0"/>
-            <wp:docPr id="24" name="Рисунок 24"/>
-            <wp:cNvGraphicFramePr>
-              <a:graphicFrameLocks xmlns:a="http://schemas.openxmlformats.org/drawingml/2006/main" noChangeAspect="1"/>
-            </wp:cNvGraphicFramePr>
-            <a:graphic xmlns:a="http://schemas.openxmlformats.org/drawingml/2006/main">
-              <a:graphicData uri="http://schemas.openxmlformats.org/drawingml/2006/picture">
-                <pic:pic xmlns:pic="http://schemas.openxmlformats.org/drawingml/2006/picture">
-                  <pic:nvPicPr>
-                    <pic:cNvPr id="0" name="Picture 53"/>
+        <w:lastRenderedPageBreak/>
+        <w:drawing>
+          <wp:inline distT="0" distB="0" distL="0" distR="0" wp14:anchorId="5175044F" wp14:editId="11332896">
+            <wp:extent cx="3482233" cy="2102740"/>
+            <wp:effectExtent l="0" t="0" r="4445" b="0"/>
+            <wp:docPr id="20" name="Рисунок 20"/>
+            <wp:cNvGraphicFramePr>
+              <a:graphicFrameLocks xmlns:a="http://schemas.openxmlformats.org/drawingml/2006/main" noChangeAspect="1"/>
+            </wp:cNvGraphicFramePr>
+            <a:graphic xmlns:a="http://schemas.openxmlformats.org/drawingml/2006/main">
+              <a:graphicData uri="http://schemas.openxmlformats.org/drawingml/2006/picture">
+                <pic:pic xmlns:pic="http://schemas.openxmlformats.org/drawingml/2006/picture">
+                  <pic:nvPicPr>
+                    <pic:cNvPr id="0" name="Picture 49"/>
                     <pic:cNvPicPr>
                       <a:picLocks noChangeAspect="1" noChangeArrowheads="1"/>
                     </pic:cNvPicPr>
                   </pic:nvPicPr>
                   <pic:blipFill>
-                    <a:blip r:embed="rId18">
+                    <a:blip r:embed="rId18" cstate="print">
                       <a:extLst>
                         <a:ext uri="{28A0092B-C50C-407E-A947-70E740481C1C}">
                           <a14:useLocalDpi xmlns:a14="http://schemas.microsoft.com/office/drawing/2010/main" val="0"/>
@@ -1562,7 +1319,7 @@
                   <pic:spPr bwMode="auto">
                     <a:xfrm>
                       <a:off x="0" y="0"/>
-                      <a:ext cx="5266285" cy="1915115"/>
+                      <a:ext cx="3493212" cy="2109369"/>
                     </a:xfrm>
                     <a:prstGeom prst="rect">
                       <a:avLst/>
@@ -1604,7 +1361,7 @@
           <w:szCs w:val="24"/>
           <w:shd w:val="clear" w:color="auto" w:fill="FFFFFF"/>
         </w:rPr>
-        <w:t>добавьте и удалите файлы (один и группу файлов с определенным расширением)</w:t>
+        <w:t xml:space="preserve">выполните коммиты к проиндексированным  файлам, </w:t>
       </w:r>
     </w:p>
     <w:p>
@@ -1630,18 +1387,18 @@
           <w:shd w:val="clear" w:color="auto" w:fill="FFFFFF"/>
         </w:rPr>
         <w:drawing>
-          <wp:inline distT="0" distB="0" distL="0" distR="0" wp14:anchorId="70B8190D" wp14:editId="180C1716">
-            <wp:extent cx="5251656" cy="1207516"/>
+          <wp:inline distT="0" distB="0" distL="0" distR="0" wp14:anchorId="7740B4CE" wp14:editId="5708AF6E">
+            <wp:extent cx="5251450" cy="1909720"/>
             <wp:effectExtent l="0" t="0" r="6350" b="0"/>
-            <wp:docPr id="25" name="Рисунок 25"/>
-            <wp:cNvGraphicFramePr>
-              <a:graphicFrameLocks xmlns:a="http://schemas.openxmlformats.org/drawingml/2006/main" noChangeAspect="1"/>
-            </wp:cNvGraphicFramePr>
-            <a:graphic xmlns:a="http://schemas.openxmlformats.org/drawingml/2006/main">
-              <a:graphicData uri="http://schemas.openxmlformats.org/drawingml/2006/picture">
-                <pic:pic xmlns:pic="http://schemas.openxmlformats.org/drawingml/2006/picture">
-                  <pic:nvPicPr>
-                    <pic:cNvPr id="0" name="Picture 54"/>
+            <wp:docPr id="24" name="Рисунок 24"/>
+            <wp:cNvGraphicFramePr>
+              <a:graphicFrameLocks xmlns:a="http://schemas.openxmlformats.org/drawingml/2006/main" noChangeAspect="1"/>
+            </wp:cNvGraphicFramePr>
+            <a:graphic xmlns:a="http://schemas.openxmlformats.org/drawingml/2006/main">
+              <a:graphicData uri="http://schemas.openxmlformats.org/drawingml/2006/picture">
+                <pic:pic xmlns:pic="http://schemas.openxmlformats.org/drawingml/2006/picture">
+                  <pic:nvPicPr>
+                    <pic:cNvPr id="0" name="Picture 53"/>
                     <pic:cNvPicPr>
                       <a:picLocks noChangeAspect="1" noChangeArrowheads="1"/>
                     </pic:cNvPicPr>
@@ -1662,7 +1419,7 @@
                   <pic:spPr bwMode="auto">
                     <a:xfrm>
                       <a:off x="0" y="0"/>
-                      <a:ext cx="5290523" cy="1216453"/>
+                      <a:ext cx="5266285" cy="1915115"/>
                     </a:xfrm>
                     <a:prstGeom prst="rect">
                       <a:avLst/>
@@ -1682,6 +1439,34 @@
     <w:p>
       <w:pPr>
         <w:pStyle w:val="a4"/>
+        <w:numPr>
+          <w:ilvl w:val="1"/>
+          <w:numId w:val="1"/>
+        </w:numPr>
+        <w:spacing w:after="0"/>
+        <w:ind w:left="0"/>
+        <w:rPr>
+          <w:rFonts w:ascii="Times New Roman" w:hAnsi="Times New Roman" w:cs="Times New Roman"/>
+          <w:color w:val="252525"/>
+          <w:sz w:val="24"/>
+          <w:szCs w:val="24"/>
+          <w:shd w:val="clear" w:color="auto" w:fill="FFFFFF"/>
+        </w:rPr>
+      </w:pPr>
+      <w:r>
+        <w:rPr>
+          <w:rFonts w:ascii="Times New Roman" w:hAnsi="Times New Roman" w:cs="Times New Roman"/>
+          <w:color w:val="252525"/>
+          <w:sz w:val="24"/>
+          <w:szCs w:val="24"/>
+          <w:shd w:val="clear" w:color="auto" w:fill="FFFFFF"/>
+        </w:rPr>
+        <w:t>добавьте и удалите файлы (один и группу файлов с определенным расширением)</w:t>
+      </w:r>
+    </w:p>
+    <w:p>
+      <w:pPr>
+        <w:pStyle w:val="a4"/>
         <w:spacing w:after="0"/>
         <w:ind w:left="0"/>
         <w:rPr>
@@ -1702,18 +1487,18 @@
           <w:shd w:val="clear" w:color="auto" w:fill="FFFFFF"/>
         </w:rPr>
         <w:drawing>
-          <wp:inline distT="0" distB="0" distL="0" distR="0" wp14:anchorId="33C184BD" wp14:editId="39032309">
-            <wp:extent cx="5221968" cy="1440716"/>
-            <wp:effectExtent l="0" t="0" r="0" b="7620"/>
-            <wp:docPr id="26" name="Рисунок 26"/>
-            <wp:cNvGraphicFramePr>
-              <a:graphicFrameLocks xmlns:a="http://schemas.openxmlformats.org/drawingml/2006/main" noChangeAspect="1"/>
-            </wp:cNvGraphicFramePr>
-            <a:graphic xmlns:a="http://schemas.openxmlformats.org/drawingml/2006/main">
-              <a:graphicData uri="http://schemas.openxmlformats.org/drawingml/2006/picture">
-                <pic:pic xmlns:pic="http://schemas.openxmlformats.org/drawingml/2006/picture">
-                  <pic:nvPicPr>
-                    <pic:cNvPr id="0" name="Picture 55"/>
+          <wp:inline distT="0" distB="0" distL="0" distR="0" wp14:anchorId="70B8190D" wp14:editId="180C1716">
+            <wp:extent cx="5251656" cy="1207516"/>
+            <wp:effectExtent l="0" t="0" r="6350" b="0"/>
+            <wp:docPr id="25" name="Рисунок 25"/>
+            <wp:cNvGraphicFramePr>
+              <a:graphicFrameLocks xmlns:a="http://schemas.openxmlformats.org/drawingml/2006/main" noChangeAspect="1"/>
+            </wp:cNvGraphicFramePr>
+            <a:graphic xmlns:a="http://schemas.openxmlformats.org/drawingml/2006/main">
+              <a:graphicData uri="http://schemas.openxmlformats.org/drawingml/2006/picture">
+                <pic:pic xmlns:pic="http://schemas.openxmlformats.org/drawingml/2006/picture">
+                  <pic:nvPicPr>
+                    <pic:cNvPr id="0" name="Picture 54"/>
                     <pic:cNvPicPr>
                       <a:picLocks noChangeAspect="1" noChangeArrowheads="1"/>
                     </pic:cNvPicPr>
@@ -1734,7 +1519,7 @@
                   <pic:spPr bwMode="auto">
                     <a:xfrm>
                       <a:off x="0" y="0"/>
-                      <a:ext cx="5262067" cy="1451779"/>
+                      <a:ext cx="5290523" cy="1216453"/>
                     </a:xfrm>
                     <a:prstGeom prst="rect">
                       <a:avLst/>
@@ -1774,18 +1559,18 @@
           <w:shd w:val="clear" w:color="auto" w:fill="FFFFFF"/>
         </w:rPr>
         <w:drawing>
-          <wp:inline distT="0" distB="0" distL="0" distR="0" wp14:anchorId="781A7957" wp14:editId="4425C71E">
-            <wp:extent cx="5180405" cy="683337"/>
-            <wp:effectExtent l="0" t="0" r="1270" b="2540"/>
-            <wp:docPr id="28" name="Рисунок 28"/>
-            <wp:cNvGraphicFramePr>
-              <a:graphicFrameLocks xmlns:a="http://schemas.openxmlformats.org/drawingml/2006/main" noChangeAspect="1"/>
-            </wp:cNvGraphicFramePr>
-            <a:graphic xmlns:a="http://schemas.openxmlformats.org/drawingml/2006/main">
-              <a:graphicData uri="http://schemas.openxmlformats.org/drawingml/2006/picture">
-                <pic:pic xmlns:pic="http://schemas.openxmlformats.org/drawingml/2006/picture">
-                  <pic:nvPicPr>
-                    <pic:cNvPr id="0" name="Picture 57"/>
+          <wp:inline distT="0" distB="0" distL="0" distR="0" wp14:anchorId="33C184BD" wp14:editId="39032309">
+            <wp:extent cx="5221968" cy="1440716"/>
+            <wp:effectExtent l="0" t="0" r="0" b="7620"/>
+            <wp:docPr id="26" name="Рисунок 26"/>
+            <wp:cNvGraphicFramePr>
+              <a:graphicFrameLocks xmlns:a="http://schemas.openxmlformats.org/drawingml/2006/main" noChangeAspect="1"/>
+            </wp:cNvGraphicFramePr>
+            <a:graphic xmlns:a="http://schemas.openxmlformats.org/drawingml/2006/main">
+              <a:graphicData uri="http://schemas.openxmlformats.org/drawingml/2006/picture">
+                <pic:pic xmlns:pic="http://schemas.openxmlformats.org/drawingml/2006/picture">
+                  <pic:nvPicPr>
+                    <pic:cNvPr id="0" name="Picture 55"/>
                     <pic:cNvPicPr>
                       <a:picLocks noChangeAspect="1" noChangeArrowheads="1"/>
                     </pic:cNvPicPr>
@@ -1806,7 +1591,7 @@
                   <pic:spPr bwMode="auto">
                     <a:xfrm>
                       <a:off x="0" y="0"/>
-                      <a:ext cx="5250409" cy="692571"/>
+                      <a:ext cx="5262067" cy="1451779"/>
                     </a:xfrm>
                     <a:prstGeom prst="rect">
                       <a:avLst/>
@@ -1846,18 +1631,18 @@
           <w:shd w:val="clear" w:color="auto" w:fill="FFFFFF"/>
         </w:rPr>
         <w:drawing>
-          <wp:inline distT="0" distB="0" distL="0" distR="0" wp14:anchorId="7D08247F" wp14:editId="57C1DBCF">
-            <wp:extent cx="5269469" cy="728882"/>
-            <wp:effectExtent l="0" t="0" r="0" b="0"/>
-            <wp:docPr id="29" name="Рисунок 29"/>
-            <wp:cNvGraphicFramePr>
-              <a:graphicFrameLocks xmlns:a="http://schemas.openxmlformats.org/drawingml/2006/main" noChangeAspect="1"/>
-            </wp:cNvGraphicFramePr>
-            <a:graphic xmlns:a="http://schemas.openxmlformats.org/drawingml/2006/main">
-              <a:graphicData uri="http://schemas.openxmlformats.org/drawingml/2006/picture">
-                <pic:pic xmlns:pic="http://schemas.openxmlformats.org/drawingml/2006/picture">
-                  <pic:nvPicPr>
-                    <pic:cNvPr id="0" name="Picture 58"/>
+          <wp:inline distT="0" distB="0" distL="0" distR="0" wp14:anchorId="781A7957" wp14:editId="4425C71E">
+            <wp:extent cx="5180405" cy="683337"/>
+            <wp:effectExtent l="0" t="0" r="1270" b="2540"/>
+            <wp:docPr id="28" name="Рисунок 28"/>
+            <wp:cNvGraphicFramePr>
+              <a:graphicFrameLocks xmlns:a="http://schemas.openxmlformats.org/drawingml/2006/main" noChangeAspect="1"/>
+            </wp:cNvGraphicFramePr>
+            <a:graphic xmlns:a="http://schemas.openxmlformats.org/drawingml/2006/main">
+              <a:graphicData uri="http://schemas.openxmlformats.org/drawingml/2006/picture">
+                <pic:pic xmlns:pic="http://schemas.openxmlformats.org/drawingml/2006/picture">
+                  <pic:nvPicPr>
+                    <pic:cNvPr id="0" name="Picture 57"/>
                     <pic:cNvPicPr>
                       <a:picLocks noChangeAspect="1" noChangeArrowheads="1"/>
                     </pic:cNvPicPr>
@@ -1878,7 +1663,7 @@
                   <pic:spPr bwMode="auto">
                     <a:xfrm>
                       <a:off x="0" y="0"/>
-                      <a:ext cx="5295211" cy="732443"/>
+                      <a:ext cx="5250409" cy="692571"/>
                     </a:xfrm>
                     <a:prstGeom prst="rect">
                       <a:avLst/>
@@ -1898,34 +1683,6 @@
     <w:p>
       <w:pPr>
         <w:pStyle w:val="a4"/>
-        <w:numPr>
-          <w:ilvl w:val="1"/>
-          <w:numId w:val="1"/>
-        </w:numPr>
-        <w:spacing w:after="0"/>
-        <w:ind w:left="0"/>
-        <w:rPr>
-          <w:rFonts w:ascii="Times New Roman" w:hAnsi="Times New Roman" w:cs="Times New Roman"/>
-          <w:color w:val="252525"/>
-          <w:sz w:val="24"/>
-          <w:szCs w:val="24"/>
-          <w:shd w:val="clear" w:color="auto" w:fill="FFFFFF"/>
-        </w:rPr>
-      </w:pPr>
-      <w:r>
-        <w:rPr>
-          <w:rFonts w:ascii="Times New Roman" w:hAnsi="Times New Roman" w:cs="Times New Roman"/>
-          <w:color w:val="252525"/>
-          <w:sz w:val="24"/>
-          <w:szCs w:val="24"/>
-          <w:shd w:val="clear" w:color="auto" w:fill="FFFFFF"/>
-        </w:rPr>
-        <w:t>переименуйте файлы</w:t>
-      </w:r>
-    </w:p>
-    <w:p>
-      <w:pPr>
-        <w:pStyle w:val="a4"/>
         <w:spacing w:after="0"/>
         <w:ind w:left="0"/>
         <w:rPr>
@@ -1945,20 +1702,19 @@
           <w:szCs w:val="24"/>
           <w:shd w:val="clear" w:color="auto" w:fill="FFFFFF"/>
         </w:rPr>
-        <w:lastRenderedPageBreak/>
-        <w:drawing>
-          <wp:inline distT="0" distB="0" distL="0" distR="0" wp14:anchorId="1AD566F5" wp14:editId="68529C67">
-            <wp:extent cx="5126966" cy="2159299"/>
+        <w:drawing>
+          <wp:inline distT="0" distB="0" distL="0" distR="0" wp14:anchorId="7D08247F" wp14:editId="57C1DBCF">
+            <wp:extent cx="5269469" cy="728882"/>
             <wp:effectExtent l="0" t="0" r="0" b="0"/>
-            <wp:docPr id="27" name="Рисунок 27"/>
-            <wp:cNvGraphicFramePr>
-              <a:graphicFrameLocks xmlns:a="http://schemas.openxmlformats.org/drawingml/2006/main" noChangeAspect="1"/>
-            </wp:cNvGraphicFramePr>
-            <a:graphic xmlns:a="http://schemas.openxmlformats.org/drawingml/2006/main">
-              <a:graphicData uri="http://schemas.openxmlformats.org/drawingml/2006/picture">
-                <pic:pic xmlns:pic="http://schemas.openxmlformats.org/drawingml/2006/picture">
-                  <pic:nvPicPr>
-                    <pic:cNvPr id="0" name="Picture 56"/>
+            <wp:docPr id="29" name="Рисунок 29"/>
+            <wp:cNvGraphicFramePr>
+              <a:graphicFrameLocks xmlns:a="http://schemas.openxmlformats.org/drawingml/2006/main" noChangeAspect="1"/>
+            </wp:cNvGraphicFramePr>
+            <a:graphic xmlns:a="http://schemas.openxmlformats.org/drawingml/2006/main">
+              <a:graphicData uri="http://schemas.openxmlformats.org/drawingml/2006/picture">
+                <pic:pic xmlns:pic="http://schemas.openxmlformats.org/drawingml/2006/picture">
+                  <pic:nvPicPr>
+                    <pic:cNvPr id="0" name="Picture 58"/>
                     <pic:cNvPicPr>
                       <a:picLocks noChangeAspect="1" noChangeArrowheads="1"/>
                     </pic:cNvPicPr>
@@ -1979,7 +1735,7 @@
                   <pic:spPr bwMode="auto">
                     <a:xfrm>
                       <a:off x="0" y="0"/>
-                      <a:ext cx="5135413" cy="2162856"/>
+                      <a:ext cx="5295211" cy="732443"/>
                     </a:xfrm>
                     <a:prstGeom prst="rect">
                       <a:avLst/>
@@ -1999,6 +1755,34 @@
     <w:p>
       <w:pPr>
         <w:pStyle w:val="a4"/>
+        <w:numPr>
+          <w:ilvl w:val="1"/>
+          <w:numId w:val="1"/>
+        </w:numPr>
+        <w:spacing w:after="0"/>
+        <w:ind w:left="0"/>
+        <w:rPr>
+          <w:rFonts w:ascii="Times New Roman" w:hAnsi="Times New Roman" w:cs="Times New Roman"/>
+          <w:color w:val="252525"/>
+          <w:sz w:val="24"/>
+          <w:szCs w:val="24"/>
+          <w:shd w:val="clear" w:color="auto" w:fill="FFFFFF"/>
+        </w:rPr>
+      </w:pPr>
+      <w:r>
+        <w:rPr>
+          <w:rFonts w:ascii="Times New Roman" w:hAnsi="Times New Roman" w:cs="Times New Roman"/>
+          <w:color w:val="252525"/>
+          <w:sz w:val="24"/>
+          <w:szCs w:val="24"/>
+          <w:shd w:val="clear" w:color="auto" w:fill="FFFFFF"/>
+        </w:rPr>
+        <w:t>переименуйте файлы</w:t>
+      </w:r>
+    </w:p>
+    <w:p>
+      <w:pPr>
+        <w:pStyle w:val="a4"/>
         <w:spacing w:after="0"/>
         <w:ind w:left="0"/>
         <w:rPr>
@@ -2018,19 +1802,20 @@
           <w:szCs w:val="24"/>
           <w:shd w:val="clear" w:color="auto" w:fill="FFFFFF"/>
         </w:rPr>
-        <w:drawing>
-          <wp:inline distT="0" distB="0" distL="0" distR="0" wp14:anchorId="14F244C6" wp14:editId="1E99C186">
-            <wp:extent cx="5144779" cy="1519511"/>
-            <wp:effectExtent l="0" t="0" r="0" b="5080"/>
-            <wp:docPr id="30" name="Рисунок 30"/>
-            <wp:cNvGraphicFramePr>
-              <a:graphicFrameLocks xmlns:a="http://schemas.openxmlformats.org/drawingml/2006/main" noChangeAspect="1"/>
-            </wp:cNvGraphicFramePr>
-            <a:graphic xmlns:a="http://schemas.openxmlformats.org/drawingml/2006/main">
-              <a:graphicData uri="http://schemas.openxmlformats.org/drawingml/2006/picture">
-                <pic:pic xmlns:pic="http://schemas.openxmlformats.org/drawingml/2006/picture">
-                  <pic:nvPicPr>
-                    <pic:cNvPr id="0" name="Picture 59"/>
+        <w:lastRenderedPageBreak/>
+        <w:drawing>
+          <wp:inline distT="0" distB="0" distL="0" distR="0" wp14:anchorId="1AD566F5" wp14:editId="68529C67">
+            <wp:extent cx="5126966" cy="2159299"/>
+            <wp:effectExtent l="0" t="0" r="0" b="0"/>
+            <wp:docPr id="27" name="Рисунок 27"/>
+            <wp:cNvGraphicFramePr>
+              <a:graphicFrameLocks xmlns:a="http://schemas.openxmlformats.org/drawingml/2006/main" noChangeAspect="1"/>
+            </wp:cNvGraphicFramePr>
+            <a:graphic xmlns:a="http://schemas.openxmlformats.org/drawingml/2006/main">
+              <a:graphicData uri="http://schemas.openxmlformats.org/drawingml/2006/picture">
+                <pic:pic xmlns:pic="http://schemas.openxmlformats.org/drawingml/2006/picture">
+                  <pic:nvPicPr>
+                    <pic:cNvPr id="0" name="Picture 56"/>
                     <pic:cNvPicPr>
                       <a:picLocks noChangeAspect="1" noChangeArrowheads="1"/>
                     </pic:cNvPicPr>
@@ -2051,7 +1836,7 @@
                   <pic:spPr bwMode="auto">
                     <a:xfrm>
                       <a:off x="0" y="0"/>
-                      <a:ext cx="5170802" cy="1527197"/>
+                      <a:ext cx="5135413" cy="2162856"/>
                     </a:xfrm>
                     <a:prstGeom prst="rect">
                       <a:avLst/>
@@ -2071,6 +1856,78 @@
     <w:p>
       <w:pPr>
         <w:pStyle w:val="a4"/>
+        <w:spacing w:after="0"/>
+        <w:ind w:left="0"/>
+        <w:rPr>
+          <w:rFonts w:ascii="Times New Roman" w:hAnsi="Times New Roman" w:cs="Times New Roman"/>
+          <w:color w:val="252525"/>
+          <w:sz w:val="24"/>
+          <w:szCs w:val="24"/>
+          <w:shd w:val="clear" w:color="auto" w:fill="FFFFFF"/>
+        </w:rPr>
+      </w:pPr>
+      <w:r>
+        <w:rPr>
+          <w:rFonts w:ascii="Times New Roman" w:hAnsi="Times New Roman" w:cs="Times New Roman"/>
+          <w:noProof/>
+          <w:color w:val="252525"/>
+          <w:sz w:val="24"/>
+          <w:szCs w:val="24"/>
+          <w:shd w:val="clear" w:color="auto" w:fill="FFFFFF"/>
+        </w:rPr>
+        <w:drawing>
+          <wp:inline distT="0" distB="0" distL="0" distR="0" wp14:anchorId="14F244C6" wp14:editId="1E99C186">
+            <wp:extent cx="5144779" cy="1519511"/>
+            <wp:effectExtent l="0" t="0" r="0" b="5080"/>
+            <wp:docPr id="30" name="Рисунок 30"/>
+            <wp:cNvGraphicFramePr>
+              <a:graphicFrameLocks xmlns:a="http://schemas.openxmlformats.org/drawingml/2006/main" noChangeAspect="1"/>
+            </wp:cNvGraphicFramePr>
+            <a:graphic xmlns:a="http://schemas.openxmlformats.org/drawingml/2006/main">
+              <a:graphicData uri="http://schemas.openxmlformats.org/drawingml/2006/picture">
+                <pic:pic xmlns:pic="http://schemas.openxmlformats.org/drawingml/2006/picture">
+                  <pic:nvPicPr>
+                    <pic:cNvPr id="0" name="Picture 59"/>
+                    <pic:cNvPicPr>
+                      <a:picLocks noChangeAspect="1" noChangeArrowheads="1"/>
+                    </pic:cNvPicPr>
+                  </pic:nvPicPr>
+                  <pic:blipFill>
+                    <a:blip r:embed="rId25">
+                      <a:extLst>
+                        <a:ext uri="{28A0092B-C50C-407E-A947-70E740481C1C}">
+                          <a14:useLocalDpi xmlns:a14="http://schemas.microsoft.com/office/drawing/2010/main" val="0"/>
+                        </a:ext>
+                      </a:extLst>
+                    </a:blip>
+                    <a:srcRect/>
+                    <a:stretch>
+                      <a:fillRect/>
+                    </a:stretch>
+                  </pic:blipFill>
+                  <pic:spPr bwMode="auto">
+                    <a:xfrm>
+                      <a:off x="0" y="0"/>
+                      <a:ext cx="5170802" cy="1527197"/>
+                    </a:xfrm>
+                    <a:prstGeom prst="rect">
+                      <a:avLst/>
+                    </a:prstGeom>
+                    <a:noFill/>
+                    <a:ln>
+                      <a:noFill/>
+                    </a:ln>
+                  </pic:spPr>
+                </pic:pic>
+              </a:graphicData>
+            </a:graphic>
+          </wp:inline>
+        </w:drawing>
+      </w:r>
+    </w:p>
+    <w:p>
+      <w:pPr>
+        <w:pStyle w:val="a4"/>
         <w:numPr>
           <w:ilvl w:val="1"/>
           <w:numId w:val="1"/>
@@ -2155,7 +2012,7 @@
                     <pic:cNvPicPr/>
                   </pic:nvPicPr>
                   <pic:blipFill>
-                    <a:blip r:embed="rId25"/>
+                    <a:blip r:embed="rId26"/>
                     <a:stretch>
                       <a:fillRect/>
                     </a:stretch>
@@ -2214,7 +2071,7 @@
                     <pic:cNvPicPr/>
                   </pic:nvPicPr>
                   <pic:blipFill>
-                    <a:blip r:embed="rId26"/>
+                    <a:blip r:embed="rId27"/>
                     <a:stretch>
                       <a:fillRect/>
                     </a:stretch>
@@ -2275,7 +2132,7 @@
                     <pic:cNvPicPr/>
                   </pic:nvPicPr>
                   <pic:blipFill>
-                    <a:blip r:embed="rId27"/>
+                    <a:blip r:embed="rId28"/>
                     <a:stretch>
                       <a:fillRect/>
                     </a:stretch>
@@ -2335,7 +2192,7 @@
                     <pic:cNvPicPr/>
                   </pic:nvPicPr>
                   <pic:blipFill>
-                    <a:blip r:embed="rId28"/>
+                    <a:blip r:embed="rId29"/>
                     <a:stretch>
                       <a:fillRect/>
                     </a:stretch>
@@ -2408,7 +2265,7 @@
                     <pic:cNvPicPr/>
                   </pic:nvPicPr>
                   <pic:blipFill>
-                    <a:blip r:embed="rId29"/>
+                    <a:blip r:embed="rId30"/>
                     <a:stretch>
                       <a:fillRect/>
                     </a:stretch>
@@ -2468,7 +2325,7 @@
                     <pic:cNvPicPr/>
                   </pic:nvPicPr>
                   <pic:blipFill>
-                    <a:blip r:embed="rId30"/>
+                    <a:blip r:embed="rId31"/>
                     <a:stretch>
                       <a:fillRect/>
                     </a:stretch>
@@ -2527,7 +2384,7 @@
                     <pic:cNvPicPr/>
                   </pic:nvPicPr>
                   <pic:blipFill>
-                    <a:blip r:embed="rId31"/>
+                    <a:blip r:embed="rId32"/>
                     <a:stretch>
                       <a:fillRect/>
                     </a:stretch>
@@ -2586,7 +2443,7 @@
                     <pic:cNvPicPr/>
                   </pic:nvPicPr>
                   <pic:blipFill>
-                    <a:blip r:embed="rId32"/>
+                    <a:blip r:embed="rId33"/>
                     <a:stretch>
                       <a:fillRect/>
                     </a:stretch>
@@ -2646,163 +2503,9 @@
           <w:szCs w:val="24"/>
           <w:shd w:val="clear" w:color="auto" w:fill="FFFFFF"/>
         </w:rPr>
-        <w:t xml:space="preserve">выведите историю коммитов: полностью и с ограничением вывода – отобрать только последние,  до и после указанной даты, по автору файлов, коммитов (флаги n, </w:t>
-      </w:r>
-      <w:proofErr w:type="spellStart"/>
-      <w:r>
-        <w:rPr>
-          <w:rFonts w:ascii="Times New Roman" w:hAnsi="Times New Roman" w:cs="Times New Roman"/>
-          <w:color w:val="252525"/>
-          <w:sz w:val="24"/>
-          <w:szCs w:val="24"/>
-          <w:shd w:val="clear" w:color="auto" w:fill="FFFFFF"/>
-        </w:rPr>
-        <w:t>since</w:t>
-      </w:r>
-      <w:proofErr w:type="spellEnd"/>
-      <w:r>
-        <w:rPr>
-          <w:rFonts w:ascii="Times New Roman" w:hAnsi="Times New Roman" w:cs="Times New Roman"/>
-          <w:color w:val="252525"/>
-          <w:sz w:val="24"/>
-          <w:szCs w:val="24"/>
-          <w:shd w:val="clear" w:color="auto" w:fill="FFFFFF"/>
-        </w:rPr>
-        <w:t xml:space="preserve">, </w:t>
-      </w:r>
-      <w:proofErr w:type="spellStart"/>
-      <w:r>
-        <w:rPr>
-          <w:rFonts w:ascii="Times New Roman" w:hAnsi="Times New Roman" w:cs="Times New Roman"/>
-          <w:color w:val="252525"/>
-          <w:sz w:val="24"/>
-          <w:szCs w:val="24"/>
-          <w:shd w:val="clear" w:color="auto" w:fill="FFFFFF"/>
-        </w:rPr>
-        <w:t>after</w:t>
-      </w:r>
-      <w:proofErr w:type="spellEnd"/>
-      <w:r>
-        <w:rPr>
-          <w:rFonts w:ascii="Times New Roman" w:hAnsi="Times New Roman" w:cs="Times New Roman"/>
-          <w:color w:val="252525"/>
-          <w:sz w:val="24"/>
-          <w:szCs w:val="24"/>
-          <w:shd w:val="clear" w:color="auto" w:fill="FFFFFF"/>
-        </w:rPr>
-        <w:t xml:space="preserve">, </w:t>
-      </w:r>
-      <w:proofErr w:type="spellStart"/>
-      <w:r>
-        <w:rPr>
-          <w:rFonts w:ascii="Times New Roman" w:hAnsi="Times New Roman" w:cs="Times New Roman"/>
-          <w:color w:val="252525"/>
-          <w:sz w:val="24"/>
-          <w:szCs w:val="24"/>
-          <w:shd w:val="clear" w:color="auto" w:fill="FFFFFF"/>
-        </w:rPr>
-        <w:t>until</w:t>
-      </w:r>
-      <w:proofErr w:type="spellEnd"/>
-      <w:r>
-        <w:rPr>
-          <w:rFonts w:ascii="Times New Roman" w:hAnsi="Times New Roman" w:cs="Times New Roman"/>
-          <w:color w:val="252525"/>
-          <w:sz w:val="24"/>
-          <w:szCs w:val="24"/>
-          <w:shd w:val="clear" w:color="auto" w:fill="FFFFFF"/>
-        </w:rPr>
-        <w:t xml:space="preserve">, </w:t>
-      </w:r>
-      <w:proofErr w:type="spellStart"/>
-      <w:r>
-        <w:rPr>
-          <w:rFonts w:ascii="Times New Roman" w:hAnsi="Times New Roman" w:cs="Times New Roman"/>
-          <w:color w:val="252525"/>
-          <w:sz w:val="24"/>
-          <w:szCs w:val="24"/>
-          <w:shd w:val="clear" w:color="auto" w:fill="FFFFFF"/>
-        </w:rPr>
-        <w:t>before</w:t>
-      </w:r>
-      <w:proofErr w:type="spellEnd"/>
-      <w:r>
-        <w:rPr>
-          <w:rFonts w:ascii="Times New Roman" w:hAnsi="Times New Roman" w:cs="Times New Roman"/>
-          <w:color w:val="252525"/>
-          <w:sz w:val="24"/>
-          <w:szCs w:val="24"/>
-          <w:shd w:val="clear" w:color="auto" w:fill="FFFFFF"/>
-        </w:rPr>
-        <w:t xml:space="preserve">, </w:t>
-      </w:r>
-      <w:proofErr w:type="spellStart"/>
-      <w:r>
-        <w:rPr>
-          <w:rFonts w:ascii="Times New Roman" w:hAnsi="Times New Roman" w:cs="Times New Roman"/>
-          <w:color w:val="252525"/>
-          <w:sz w:val="24"/>
-          <w:szCs w:val="24"/>
-          <w:shd w:val="clear" w:color="auto" w:fill="FFFFFF"/>
-        </w:rPr>
-        <w:t>author</w:t>
-      </w:r>
-      <w:proofErr w:type="spellEnd"/>
-      <w:r>
-        <w:rPr>
-          <w:rFonts w:ascii="Times New Roman" w:hAnsi="Times New Roman" w:cs="Times New Roman"/>
-          <w:color w:val="252525"/>
-          <w:sz w:val="24"/>
-          <w:szCs w:val="24"/>
-          <w:shd w:val="clear" w:color="auto" w:fill="FFFFFF"/>
-        </w:rPr>
-        <w:t xml:space="preserve">, </w:t>
-      </w:r>
-      <w:proofErr w:type="spellStart"/>
-      <w:r>
-        <w:rPr>
-          <w:rFonts w:ascii="Times New Roman" w:hAnsi="Times New Roman" w:cs="Times New Roman"/>
-          <w:color w:val="252525"/>
-          <w:sz w:val="24"/>
-          <w:szCs w:val="24"/>
-          <w:shd w:val="clear" w:color="auto" w:fill="FFFFFF"/>
-        </w:rPr>
-        <w:t>committer</w:t>
-      </w:r>
-      <w:proofErr w:type="spellEnd"/>
-      <w:r>
-        <w:rPr>
-          <w:rFonts w:ascii="Times New Roman" w:hAnsi="Times New Roman" w:cs="Times New Roman"/>
-          <w:color w:val="252525"/>
-          <w:sz w:val="24"/>
-          <w:szCs w:val="24"/>
-          <w:shd w:val="clear" w:color="auto" w:fill="FFFFFF"/>
-        </w:rPr>
-        <w:t xml:space="preserve">, </w:t>
-      </w:r>
-      <w:proofErr w:type="spellStart"/>
-      <w:r>
-        <w:rPr>
-          <w:rFonts w:ascii="Times New Roman" w:hAnsi="Times New Roman" w:cs="Times New Roman"/>
-          <w:color w:val="252525"/>
-          <w:sz w:val="24"/>
-          <w:szCs w:val="24"/>
-          <w:shd w:val="clear" w:color="auto" w:fill="FFFFFF"/>
-        </w:rPr>
-        <w:t>grep</w:t>
-      </w:r>
-      <w:proofErr w:type="spellEnd"/>
-      <w:r>
-        <w:rPr>
-          <w:rFonts w:ascii="Times New Roman" w:hAnsi="Times New Roman" w:cs="Times New Roman"/>
-          <w:color w:val="252525"/>
-          <w:sz w:val="24"/>
-          <w:szCs w:val="24"/>
-          <w:shd w:val="clear" w:color="auto" w:fill="FFFFFF"/>
-        </w:rPr>
-        <w:t xml:space="preserve">) </w:t>
-      </w:r>
-      <w:hyperlink r:id="rId33" w:history="1">
+        <w:t xml:space="preserve">выведите историю коммитов: полностью и с ограничением вывода – отобрать только последние,  до и после указанной даты, по автору файлов, коммитов (флаги n, since, after, until, before, author, committer, grep) </w:t>
+      </w:r>
+      <w:hyperlink r:id="rId34" w:history="1">
         <w:r>
           <w:rPr>
             <w:rStyle w:val="a3"/>
@@ -2863,7 +2566,7 @@
                     <pic:cNvPicPr/>
                   </pic:nvPicPr>
                   <pic:blipFill>
-                    <a:blip r:embed="rId34"/>
+                    <a:blip r:embed="rId35"/>
                     <a:stretch>
                       <a:fillRect/>
                     </a:stretch>
@@ -2922,7 +2625,7 @@
                     <pic:cNvPicPr/>
                   </pic:nvPicPr>
                   <pic:blipFill>
-                    <a:blip r:embed="rId35"/>
+                    <a:blip r:embed="rId36"/>
                     <a:stretch>
                       <a:fillRect/>
                     </a:stretch>
@@ -2982,7 +2685,7 @@
                     <pic:cNvPicPr/>
                   </pic:nvPicPr>
                   <pic:blipFill>
-                    <a:blip r:embed="rId36"/>
+                    <a:blip r:embed="rId37"/>
                     <a:stretch>
                       <a:fillRect/>
                     </a:stretch>
@@ -3043,7 +2746,7 @@
                     <pic:cNvPicPr/>
                   </pic:nvPicPr>
                   <pic:blipFill>
-                    <a:blip r:embed="rId37"/>
+                    <a:blip r:embed="rId38"/>
                     <a:stretch>
                       <a:fillRect/>
                     </a:stretch>
@@ -3103,7 +2806,7 @@
                     <pic:cNvPicPr/>
                   </pic:nvPicPr>
                   <pic:blipFill>
-                    <a:blip r:embed="rId38"/>
+                    <a:blip r:embed="rId39"/>
                     <a:stretch>
                       <a:fillRect/>
                     </a:stretch>
@@ -3162,7 +2865,7 @@
                     <pic:cNvPicPr/>
                   </pic:nvPicPr>
                   <pic:blipFill>
-                    <a:blip r:embed="rId39"/>
+                    <a:blip r:embed="rId40"/>
                     <a:stretch>
                       <a:fillRect/>
                     </a:stretch>
@@ -3221,7 +2924,7 @@
                     <pic:cNvPicPr/>
                   </pic:nvPicPr>
                   <pic:blipFill>
-                    <a:blip r:embed="rId40"/>
+                    <a:blip r:embed="rId41"/>
                     <a:stretch>
                       <a:fillRect/>
                     </a:stretch>
@@ -3281,7 +2984,7 @@
                     <pic:cNvPicPr/>
                   </pic:nvPicPr>
                   <pic:blipFill>
-                    <a:blip r:embed="rId41"/>
+                    <a:blip r:embed="rId42"/>
                     <a:stretch>
                       <a:fillRect/>
                     </a:stretch>
@@ -3411,55 +3114,7 @@
           <w:shd w:val="clear" w:color="auto" w:fill="FFFFFF"/>
           <w:lang w:val="en-US"/>
         </w:rPr>
-        <w:t xml:space="preserve"> git log: </w:t>
-      </w:r>
-      <w:proofErr w:type="gramStart"/>
-      <w:r>
-        <w:rPr>
-          <w:rFonts w:ascii="Times New Roman" w:hAnsi="Times New Roman" w:cs="Times New Roman"/>
-          <w:color w:val="252525"/>
-          <w:sz w:val="24"/>
-          <w:szCs w:val="24"/>
-          <w:shd w:val="clear" w:color="auto" w:fill="FFFFFF"/>
-          <w:lang w:val="en-US"/>
-        </w:rPr>
-        <w:t>p ,</w:t>
-      </w:r>
-      <w:proofErr w:type="gramEnd"/>
-      <w:r>
-        <w:rPr>
-          <w:rFonts w:ascii="Times New Roman" w:hAnsi="Times New Roman" w:cs="Times New Roman"/>
-          <w:color w:val="252525"/>
-          <w:sz w:val="24"/>
-          <w:szCs w:val="24"/>
-          <w:shd w:val="clear" w:color="auto" w:fill="FFFFFF"/>
-          <w:lang w:val="en-US"/>
-        </w:rPr>
-        <w:t xml:space="preserve"> stat ,</w:t>
-      </w:r>
-      <w:proofErr w:type="spellStart"/>
-      <w:r>
-        <w:rPr>
-          <w:rFonts w:ascii="Times New Roman" w:hAnsi="Times New Roman" w:cs="Times New Roman"/>
-          <w:color w:val="252525"/>
-          <w:sz w:val="24"/>
-          <w:szCs w:val="24"/>
-          <w:shd w:val="clear" w:color="auto" w:fill="FFFFFF"/>
-          <w:lang w:val="en-US"/>
-        </w:rPr>
-        <w:t>shortstat</w:t>
-      </w:r>
-      <w:proofErr w:type="spellEnd"/>
-      <w:r>
-        <w:rPr>
-          <w:rFonts w:ascii="Times New Roman" w:hAnsi="Times New Roman" w:cs="Times New Roman"/>
-          <w:color w:val="252525"/>
-          <w:sz w:val="24"/>
-          <w:szCs w:val="24"/>
-          <w:shd w:val="clear" w:color="auto" w:fill="FFFFFF"/>
-          <w:lang w:val="en-US"/>
-        </w:rPr>
-        <w:t xml:space="preserve">, name-only, name-status, relative-date, pretty, graph, </w:t>
+        <w:t xml:space="preserve"> git log: p , stat ,shortstat, name-only, name-status, relative-date, pretty, graph, </w:t>
       </w:r>
     </w:p>
     <w:p>
@@ -3502,7 +3157,7 @@
                     <pic:cNvPicPr/>
                   </pic:nvPicPr>
                   <pic:blipFill>
-                    <a:blip r:embed="rId42"/>
+                    <a:blip r:embed="rId43"/>
                     <a:stretch>
                       <a:fillRect/>
                     </a:stretch>
@@ -3564,7 +3219,7 @@
                     <pic:cNvPicPr/>
                   </pic:nvPicPr>
                   <pic:blipFill>
-                    <a:blip r:embed="rId43"/>
+                    <a:blip r:embed="rId44"/>
                     <a:stretch>
                       <a:fillRect/>
                     </a:stretch>
@@ -3625,7 +3280,7 @@
                     <pic:cNvPicPr/>
                   </pic:nvPicPr>
                   <pic:blipFill>
-                    <a:blip r:embed="rId44"/>
+                    <a:blip r:embed="rId45"/>
                     <a:stretch>
                       <a:fillRect/>
                     </a:stretch>
@@ -3687,7 +3342,7 @@
                     <pic:cNvPicPr/>
                   </pic:nvPicPr>
                   <pic:blipFill>
-                    <a:blip r:embed="rId45"/>
+                    <a:blip r:embed="rId46"/>
                     <a:stretch>
                       <a:fillRect/>
                     </a:stretch>
@@ -3748,7 +3403,7 @@
                     <pic:cNvPicPr/>
                   </pic:nvPicPr>
                   <pic:blipFill>
-                    <a:blip r:embed="rId46"/>
+                    <a:blip r:embed="rId47"/>
                     <a:stretch>
                       <a:fillRect/>
                     </a:stretch>
@@ -3809,7 +3464,7 @@
                     <pic:cNvPicPr/>
                   </pic:nvPicPr>
                   <pic:blipFill>
-                    <a:blip r:embed="rId47"/>
+                    <a:blip r:embed="rId48"/>
                     <a:stretch>
                       <a:fillRect/>
                     </a:stretch>
@@ -3871,7 +3526,7 @@
                     <pic:cNvPicPr/>
                   </pic:nvPicPr>
                   <pic:blipFill>
-                    <a:blip r:embed="rId48"/>
+                    <a:blip r:embed="rId49"/>
                     <a:stretch>
                       <a:fillRect/>
                     </a:stretch>
@@ -3932,7 +3587,7 @@
                     <pic:cNvPicPr/>
                   </pic:nvPicPr>
                   <pic:blipFill>
-                    <a:blip r:embed="rId49"/>
+                    <a:blip r:embed="rId50"/>
                     <a:stretch>
                       <a:fillRect/>
                     </a:stretch>
@@ -4047,7 +3702,7 @@
                     <pic:cNvPicPr/>
                   </pic:nvPicPr>
                   <pic:blipFill>
-                    <a:blip r:embed="rId50"/>
+                    <a:blip r:embed="rId51"/>
                     <a:stretch>
                       <a:fillRect/>
                     </a:stretch>
@@ -4107,7 +3762,7 @@
                     <pic:cNvPicPr/>
                   </pic:nvPicPr>
                   <pic:blipFill>
-                    <a:blip r:embed="rId51"/>
+                    <a:blip r:embed="rId52"/>
                     <a:stretch>
                       <a:fillRect/>
                     </a:stretch>
@@ -4153,29 +3808,7 @@
           <w:szCs w:val="24"/>
           <w:shd w:val="clear" w:color="auto" w:fill="FFFFFF"/>
         </w:rPr>
-        <w:t xml:space="preserve">проиндексируйте файл в вашем </w:t>
-      </w:r>
-      <w:proofErr w:type="spellStart"/>
-      <w:r>
-        <w:rPr>
-          <w:rFonts w:ascii="Times New Roman" w:hAnsi="Times New Roman" w:cs="Times New Roman"/>
-          <w:color w:val="252525"/>
-          <w:sz w:val="24"/>
-          <w:szCs w:val="24"/>
-          <w:shd w:val="clear" w:color="auto" w:fill="FFFFFF"/>
-        </w:rPr>
-        <w:t>Git</w:t>
-      </w:r>
-      <w:proofErr w:type="spellEnd"/>
-      <w:r>
-        <w:rPr>
-          <w:rFonts w:ascii="Times New Roman" w:hAnsi="Times New Roman" w:cs="Times New Roman"/>
-          <w:color w:val="252525"/>
-          <w:sz w:val="24"/>
-          <w:szCs w:val="24"/>
-          <w:shd w:val="clear" w:color="auto" w:fill="FFFFFF"/>
-        </w:rPr>
-        <w:t>-репозитории, затем отмените его индексацию</w:t>
+        <w:t>проиндексируйте файл в вашем Git-репозитории, затем отмените его индексацию</w:t>
       </w:r>
     </w:p>
     <w:p>
@@ -4216,7 +3849,7 @@
                     <pic:cNvPicPr/>
                   </pic:nvPicPr>
                   <pic:blipFill>
-                    <a:blip r:embed="rId52"/>
+                    <a:blip r:embed="rId53"/>
                     <a:stretch>
                       <a:fillRect/>
                     </a:stretch>
@@ -4275,7 +3908,7 @@
                     <pic:cNvPicPr/>
                   </pic:nvPicPr>
                   <pic:blipFill>
-                    <a:blip r:embed="rId53"/>
+                    <a:blip r:embed="rId54"/>
                     <a:stretch>
                       <a:fillRect/>
                     </a:stretch>
@@ -4321,29 +3954,7 @@
           <w:szCs w:val="24"/>
           <w:shd w:val="clear" w:color="auto" w:fill="FFFFFF"/>
         </w:rPr>
-        <w:t xml:space="preserve">внесите изменения в файл в вашем </w:t>
-      </w:r>
-      <w:proofErr w:type="spellStart"/>
-      <w:r>
-        <w:rPr>
-          <w:rFonts w:ascii="Times New Roman" w:hAnsi="Times New Roman" w:cs="Times New Roman"/>
-          <w:color w:val="252525"/>
-          <w:sz w:val="24"/>
-          <w:szCs w:val="24"/>
-          <w:shd w:val="clear" w:color="auto" w:fill="FFFFFF"/>
-        </w:rPr>
-        <w:t>Git</w:t>
-      </w:r>
-      <w:proofErr w:type="spellEnd"/>
-      <w:r>
-        <w:rPr>
-          <w:rFonts w:ascii="Times New Roman" w:hAnsi="Times New Roman" w:cs="Times New Roman"/>
-          <w:color w:val="252525"/>
-          <w:sz w:val="24"/>
-          <w:szCs w:val="24"/>
-          <w:shd w:val="clear" w:color="auto" w:fill="FFFFFF"/>
-        </w:rPr>
-        <w:t>-репозитории и затем верните его в исходное состояние.</w:t>
+        <w:t>внесите изменения в файл в вашем Git-репозитории и затем верните его в исходное состояние.</w:t>
       </w:r>
     </w:p>
     <w:p>
@@ -4384,7 +3995,7 @@
                     <pic:cNvPicPr/>
                   </pic:nvPicPr>
                   <pic:blipFill>
-                    <a:blip r:embed="rId54"/>
+                    <a:blip r:embed="rId55"/>
                     <a:stretch>
                       <a:fillRect/>
                     </a:stretch>
@@ -4497,7 +4108,7 @@
                     <pic:cNvPicPr/>
                   </pic:nvPicPr>
                   <pic:blipFill>
-                    <a:blip r:embed="rId55"/>
+                    <a:blip r:embed="rId56"/>
                     <a:stretch>
                       <a:fillRect/>
                     </a:stretch>
@@ -4557,7 +4168,7 @@
                     <pic:cNvPicPr/>
                   </pic:nvPicPr>
                   <pic:blipFill>
-                    <a:blip r:embed="rId56"/>
+                    <a:blip r:embed="rId57"/>
                     <a:stretch>
                       <a:fillRect/>
                     </a:stretch>
@@ -4603,29 +4214,7 @@
           <w:szCs w:val="24"/>
           <w:shd w:val="clear" w:color="auto" w:fill="FFFFFF"/>
         </w:rPr>
-        <w:t>просмотрите информацию о нем, внесите изменения и опять просмотрите (</w:t>
-      </w:r>
-      <w:proofErr w:type="spellStart"/>
-      <w:r>
-        <w:rPr>
-          <w:rFonts w:ascii="Times New Roman" w:hAnsi="Times New Roman" w:cs="Times New Roman"/>
-          <w:color w:val="252525"/>
-          <w:sz w:val="24"/>
-          <w:szCs w:val="24"/>
-          <w:shd w:val="clear" w:color="auto" w:fill="FFFFFF"/>
-        </w:rPr>
-        <w:t>remote</w:t>
-      </w:r>
-      <w:proofErr w:type="spellEnd"/>
-      <w:r>
-        <w:rPr>
-          <w:rFonts w:ascii="Times New Roman" w:hAnsi="Times New Roman" w:cs="Times New Roman"/>
-          <w:color w:val="252525"/>
-          <w:sz w:val="24"/>
-          <w:szCs w:val="24"/>
-          <w:shd w:val="clear" w:color="auto" w:fill="FFFFFF"/>
-        </w:rPr>
-        <w:t xml:space="preserve">, </w:t>
+        <w:t xml:space="preserve">просмотрите информацию о нем, внесите изменения и опять просмотрите (remote, </w:t>
       </w:r>
       <w:r>
         <w:rPr>
@@ -4689,7 +4278,7 @@
                     <pic:cNvPicPr/>
                   </pic:nvPicPr>
                   <pic:blipFill>
-                    <a:blip r:embed="rId57"/>
+                    <a:blip r:embed="rId58"/>
                     <a:stretch>
                       <a:fillRect/>
                     </a:stretch>
@@ -4749,7 +4338,7 @@
                     <pic:cNvPicPr/>
                   </pic:nvPicPr>
                   <pic:blipFill>
-                    <a:blip r:embed="rId58"/>
+                    <a:blip r:embed="rId59"/>
                     <a:stretch>
                       <a:fillRect/>
                     </a:stretch>
@@ -4808,7 +4397,7 @@
                     <pic:cNvPicPr/>
                   </pic:nvPicPr>
                   <pic:blipFill>
-                    <a:blip r:embed="rId59"/>
+                    <a:blip r:embed="rId60"/>
                     <a:stretch>
                       <a:fillRect/>
                     </a:stretch>
@@ -4895,7 +4484,7 @@
                     <pic:cNvPicPr/>
                   </pic:nvPicPr>
                   <pic:blipFill>
-                    <a:blip r:embed="rId60"/>
+                    <a:blip r:embed="rId61"/>
                     <a:stretch>
                       <a:fillRect/>
                     </a:stretch>
@@ -4956,7 +4545,7 @@
                     <pic:cNvPicPr/>
                   </pic:nvPicPr>
                   <pic:blipFill>
-                    <a:blip r:embed="rId61"/>
+                    <a:blip r:embed="rId62"/>
                     <a:stretch>
                       <a:fillRect/>
                     </a:stretch>
@@ -5017,7 +4606,7 @@
                     <pic:cNvPicPr/>
                   </pic:nvPicPr>
                   <pic:blipFill>
-                    <a:blip r:embed="rId62"/>
+                    <a:blip r:embed="rId63"/>
                     <a:stretch>
                       <a:fillRect/>
                     </a:stretch>
@@ -5104,7 +4693,7 @@
                     <pic:cNvPicPr/>
                   </pic:nvPicPr>
                   <pic:blipFill>
-                    <a:blip r:embed="rId63"/>
+                    <a:blip r:embed="rId64"/>
                     <a:stretch>
                       <a:fillRect/>
                     </a:stretch>
@@ -5142,7 +4731,6 @@
           <w:shd w:val="clear" w:color="auto" w:fill="FFFFFF"/>
         </w:rPr>
       </w:pPr>
-      <w:proofErr w:type="spellStart"/>
       <w:r>
         <w:rPr>
           <w:rFonts w:ascii="Times New Roman" w:hAnsi="Times New Roman" w:cs="Times New Roman"/>
@@ -5152,105 +4740,8 @@
           <w:shd w:val="clear" w:color="auto" w:fill="FFFFFF"/>
           <w:lang w:val="en-US"/>
         </w:rPr>
-        <w:t>получите</w:t>
-      </w:r>
-      <w:proofErr w:type="spellEnd"/>
-      <w:r>
-        <w:rPr>
-          <w:rFonts w:ascii="Times New Roman" w:hAnsi="Times New Roman" w:cs="Times New Roman"/>
-          <w:color w:val="252525"/>
-          <w:sz w:val="24"/>
-          <w:szCs w:val="24"/>
-          <w:shd w:val="clear" w:color="auto" w:fill="FFFFFF"/>
-          <w:lang w:val="en-US"/>
-        </w:rPr>
-        <w:t xml:space="preserve"> </w:t>
-      </w:r>
-      <w:proofErr w:type="spellStart"/>
-      <w:r>
-        <w:rPr>
-          <w:rFonts w:ascii="Times New Roman" w:hAnsi="Times New Roman" w:cs="Times New Roman"/>
-          <w:color w:val="252525"/>
-          <w:sz w:val="24"/>
-          <w:szCs w:val="24"/>
-          <w:shd w:val="clear" w:color="auto" w:fill="FFFFFF"/>
-          <w:lang w:val="en-US"/>
-        </w:rPr>
-        <w:t>данные</w:t>
-      </w:r>
-      <w:proofErr w:type="spellEnd"/>
-      <w:r>
-        <w:rPr>
-          <w:rFonts w:ascii="Times New Roman" w:hAnsi="Times New Roman" w:cs="Times New Roman"/>
-          <w:color w:val="252525"/>
-          <w:sz w:val="24"/>
-          <w:szCs w:val="24"/>
-          <w:shd w:val="clear" w:color="auto" w:fill="FFFFFF"/>
-          <w:lang w:val="en-US"/>
-        </w:rPr>
-        <w:t xml:space="preserve"> </w:t>
-      </w:r>
-      <w:proofErr w:type="spellStart"/>
-      <w:r>
-        <w:rPr>
-          <w:rFonts w:ascii="Times New Roman" w:hAnsi="Times New Roman" w:cs="Times New Roman"/>
-          <w:color w:val="252525"/>
-          <w:sz w:val="24"/>
-          <w:szCs w:val="24"/>
-          <w:shd w:val="clear" w:color="auto" w:fill="FFFFFF"/>
-          <w:lang w:val="en-US"/>
-        </w:rPr>
-        <w:t>из</w:t>
-      </w:r>
-      <w:proofErr w:type="spellEnd"/>
-      <w:r>
-        <w:rPr>
-          <w:rFonts w:ascii="Times New Roman" w:hAnsi="Times New Roman" w:cs="Times New Roman"/>
-          <w:color w:val="252525"/>
-          <w:sz w:val="24"/>
-          <w:szCs w:val="24"/>
-          <w:shd w:val="clear" w:color="auto" w:fill="FFFFFF"/>
-          <w:lang w:val="en-US"/>
-        </w:rPr>
-        <w:t xml:space="preserve"> </w:t>
-      </w:r>
-      <w:proofErr w:type="spellStart"/>
-      <w:r>
-        <w:rPr>
-          <w:rFonts w:ascii="Times New Roman" w:hAnsi="Times New Roman" w:cs="Times New Roman"/>
-          <w:color w:val="252525"/>
-          <w:sz w:val="24"/>
-          <w:szCs w:val="24"/>
-          <w:shd w:val="clear" w:color="auto" w:fill="FFFFFF"/>
-          <w:lang w:val="en-US"/>
-        </w:rPr>
-        <w:t>удаленного</w:t>
-      </w:r>
-      <w:proofErr w:type="spellEnd"/>
-      <w:r>
-        <w:rPr>
-          <w:rFonts w:ascii="Times New Roman" w:hAnsi="Times New Roman" w:cs="Times New Roman"/>
-          <w:color w:val="252525"/>
-          <w:sz w:val="24"/>
-          <w:szCs w:val="24"/>
-          <w:shd w:val="clear" w:color="auto" w:fill="FFFFFF"/>
-          <w:lang w:val="en-US"/>
-        </w:rPr>
-        <w:t xml:space="preserve"> </w:t>
-      </w:r>
-      <w:proofErr w:type="spellStart"/>
-      <w:r>
-        <w:rPr>
-          <w:rFonts w:ascii="Times New Roman" w:hAnsi="Times New Roman" w:cs="Times New Roman"/>
-          <w:color w:val="252525"/>
-          <w:sz w:val="24"/>
-          <w:szCs w:val="24"/>
-          <w:shd w:val="clear" w:color="auto" w:fill="FFFFFF"/>
-          <w:lang w:val="en-US"/>
-        </w:rPr>
-        <w:t>репозитория</w:t>
-      </w:r>
-      <w:proofErr w:type="spellEnd"/>
+        <w:t>получите данные из удаленного репозитория</w:t>
+      </w:r>
     </w:p>
     <w:p>
       <w:pPr>
@@ -5290,7 +4781,7 @@
                     <pic:cNvPicPr/>
                   </pic:nvPicPr>
                   <pic:blipFill>
-                    <a:blip r:embed="rId64"/>
+                    <a:blip r:embed="rId65"/>
                     <a:stretch>
                       <a:fillRect/>
                     </a:stretch>
@@ -5377,7 +4868,7 @@
                     <pic:cNvPicPr/>
                   </pic:nvPicPr>
                   <pic:blipFill>
-                    <a:blip r:embed="rId65"/>
+                    <a:blip r:embed="rId66"/>
                     <a:stretch>
                       <a:fillRect/>
                     </a:stretch>
@@ -5423,47 +4914,26 @@
           <w:szCs w:val="24"/>
           <w:shd w:val="clear" w:color="auto" w:fill="FFFFFF"/>
         </w:rPr>
-        <w:t xml:space="preserve">создайте дополнительную ветку 1 в удаленном </w:t>
-      </w:r>
-      <w:proofErr w:type="spellStart"/>
-      <w:r>
-        <w:rPr>
-          <w:rFonts w:ascii="Times New Roman" w:hAnsi="Times New Roman" w:cs="Times New Roman"/>
-          <w:color w:val="252525"/>
-          <w:sz w:val="24"/>
-          <w:szCs w:val="24"/>
-          <w:shd w:val="clear" w:color="auto" w:fill="FFFFFF"/>
-        </w:rPr>
-        <w:t>реппозитории</w:t>
-      </w:r>
-      <w:proofErr w:type="spellEnd"/>
-      <w:r>
-        <w:rPr>
-          <w:rFonts w:ascii="Times New Roman" w:hAnsi="Times New Roman" w:cs="Times New Roman"/>
-          <w:color w:val="252525"/>
-          <w:sz w:val="24"/>
-          <w:szCs w:val="24"/>
-          <w:shd w:val="clear" w:color="auto" w:fill="FFFFFF"/>
-        </w:rPr>
-        <w:t>, перенесите в нее два файла из другой ветки, удалите один из файлов</w:t>
-      </w:r>
-    </w:p>
-    <w:p>
-      <w:pPr>
-        <w:pStyle w:val="a4"/>
-        <w:spacing w:after="0"/>
-        <w:ind w:left="0"/>
-        <w:rPr>
-          <w:rFonts w:ascii="Times New Roman" w:hAnsi="Times New Roman" w:cs="Times New Roman"/>
-          <w:color w:val="252525"/>
-          <w:sz w:val="24"/>
-          <w:szCs w:val="24"/>
-          <w:shd w:val="clear" w:color="auto" w:fill="FFFFFF"/>
-        </w:rPr>
-      </w:pPr>
-      <w:r>
-        <w:rPr>
-          <w:rFonts w:ascii="Times New Roman" w:hAnsi="Times New Roman" w:cs="Times New Roman"/>
+        <w:t>создайте дополнительную ветку 1 в удаленном реппозитории, перенесите в нее два файла из другой ветки, удалите один из файлов</w:t>
+      </w:r>
+    </w:p>
+    <w:p>
+      <w:pPr>
+        <w:pStyle w:val="a4"/>
+        <w:spacing w:after="0"/>
+        <w:ind w:left="0"/>
+        <w:rPr>
+          <w:rFonts w:ascii="Times New Roman" w:hAnsi="Times New Roman" w:cs="Times New Roman"/>
+          <w:color w:val="252525"/>
+          <w:sz w:val="24"/>
+          <w:szCs w:val="24"/>
+          <w:shd w:val="clear" w:color="auto" w:fill="FFFFFF"/>
+        </w:rPr>
+      </w:pPr>
+      <w:r>
+        <w:rPr>
+          <w:rFonts w:ascii="Times New Roman" w:hAnsi="Times New Roman" w:cs="Times New Roman"/>
+          <w:noProof/>
           <w:color w:val="252525"/>
           <w:sz w:val="24"/>
           <w:szCs w:val="24"/>
@@ -5485,7 +4955,7 @@
                     <pic:cNvPicPr/>
                   </pic:nvPicPr>
                   <pic:blipFill>
-                    <a:blip r:embed="rId66"/>
+                    <a:blip r:embed="rId67"/>
                     <a:stretch>
                       <a:fillRect/>
                     </a:stretch>
@@ -5522,6 +4992,7 @@
       <w:r>
         <w:rPr>
           <w:rFonts w:ascii="Times New Roman" w:hAnsi="Times New Roman" w:cs="Times New Roman"/>
+          <w:noProof/>
           <w:color w:val="252525"/>
           <w:sz w:val="24"/>
           <w:szCs w:val="24"/>
@@ -5544,7 +5015,7 @@
                     <pic:cNvPicPr/>
                   </pic:nvPicPr>
                   <pic:blipFill>
-                    <a:blip r:embed="rId67"/>
+                    <a:blip r:embed="rId68"/>
                     <a:stretch>
                       <a:fillRect/>
                     </a:stretch>
@@ -5581,6 +5052,7 @@
       <w:r>
         <w:rPr>
           <w:rFonts w:ascii="Times New Roman" w:hAnsi="Times New Roman" w:cs="Times New Roman"/>
+          <w:noProof/>
           <w:color w:val="252525"/>
           <w:sz w:val="24"/>
           <w:szCs w:val="24"/>
@@ -5602,7 +5074,7 @@
                     <pic:cNvPicPr/>
                   </pic:nvPicPr>
                   <pic:blipFill>
-                    <a:blip r:embed="rId68"/>
+                    <a:blip r:embed="rId69"/>
                     <a:stretch>
                       <a:fillRect/>
                     </a:stretch>
@@ -5648,35 +5120,419 @@
           <w:szCs w:val="24"/>
           <w:shd w:val="clear" w:color="auto" w:fill="FFFFFF"/>
         </w:rPr>
-        <w:t xml:space="preserve">создайте дополнительную ветку 2 в удаленном </w:t>
-      </w:r>
-      <w:proofErr w:type="spellStart"/>
-      <w:r>
-        <w:rPr>
-          <w:rFonts w:ascii="Times New Roman" w:hAnsi="Times New Roman" w:cs="Times New Roman"/>
-          <w:color w:val="252525"/>
-          <w:sz w:val="24"/>
-          <w:szCs w:val="24"/>
-          <w:shd w:val="clear" w:color="auto" w:fill="FFFFFF"/>
-        </w:rPr>
-        <w:t>реппозитории</w:t>
-      </w:r>
-      <w:proofErr w:type="spellEnd"/>
-      <w:r>
-        <w:rPr>
-          <w:rFonts w:ascii="Times New Roman" w:hAnsi="Times New Roman" w:cs="Times New Roman"/>
-          <w:color w:val="252525"/>
-          <w:sz w:val="24"/>
-          <w:szCs w:val="24"/>
-          <w:shd w:val="clear" w:color="auto" w:fill="FFFFFF"/>
-        </w:rPr>
-        <w:t>, перенесите в нее два файла из вашего проекта, слить изменения в основную ветку, удалить дополнительную ветку 2</w:t>
-      </w:r>
-    </w:p>
-    <w:p>
-      <w:pPr>
-        <w:spacing w:after="0"/>
-      </w:pPr>
+        <w:t>создайте дополнительную ветку 2 в удаленном реппозитории, перенесите в нее два файла из вашего проекта, слить изменения в основную ветку, удалить дополнительную ветку 2</w:t>
+      </w:r>
+    </w:p>
+    <w:p>
+      <w:pPr>
+        <w:pStyle w:val="a4"/>
+        <w:spacing w:after="0"/>
+        <w:ind w:left="0"/>
+        <w:rPr>
+          <w:rFonts w:ascii="Times New Roman" w:hAnsi="Times New Roman" w:cs="Times New Roman"/>
+          <w:color w:val="252525"/>
+          <w:sz w:val="24"/>
+          <w:szCs w:val="24"/>
+          <w:shd w:val="clear" w:color="auto" w:fill="FFFFFF"/>
+        </w:rPr>
+      </w:pPr>
+      <w:r>
+        <w:rPr>
+          <w:rFonts w:ascii="Times New Roman" w:hAnsi="Times New Roman" w:cs="Times New Roman"/>
+          <w:color w:val="252525"/>
+          <w:sz w:val="24"/>
+          <w:szCs w:val="24"/>
+          <w:shd w:val="clear" w:color="auto" w:fill="FFFFFF"/>
+        </w:rPr>
+        <w:drawing>
+          <wp:inline distT="0" distB="0" distL="0" distR="0" wp14:anchorId="24EC8037" wp14:editId="73B3697B">
+            <wp:extent cx="5940425" cy="335280"/>
+            <wp:effectExtent l="0" t="0" r="3175" b="7620"/>
+            <wp:docPr id="40" name="Рисунок 40"/>
+            <wp:cNvGraphicFramePr>
+              <a:graphicFrameLocks xmlns:a="http://schemas.openxmlformats.org/drawingml/2006/main" noChangeAspect="1"/>
+            </wp:cNvGraphicFramePr>
+            <a:graphic xmlns:a="http://schemas.openxmlformats.org/drawingml/2006/main">
+              <a:graphicData uri="http://schemas.openxmlformats.org/drawingml/2006/picture">
+                <pic:pic xmlns:pic="http://schemas.openxmlformats.org/drawingml/2006/picture">
+                  <pic:nvPicPr>
+                    <pic:cNvPr id="1" name=""/>
+                    <pic:cNvPicPr/>
+                  </pic:nvPicPr>
+                  <pic:blipFill>
+                    <a:blip r:embed="rId70"/>
+                    <a:stretch>
+                      <a:fillRect/>
+                    </a:stretch>
+                  </pic:blipFill>
+                  <pic:spPr>
+                    <a:xfrm>
+                      <a:off x="0" y="0"/>
+                      <a:ext cx="5940425" cy="335280"/>
+                    </a:xfrm>
+                    <a:prstGeom prst="rect">
+                      <a:avLst/>
+                    </a:prstGeom>
+                  </pic:spPr>
+                </pic:pic>
+              </a:graphicData>
+            </a:graphic>
+          </wp:inline>
+        </w:drawing>
+      </w:r>
+    </w:p>
+    <w:p>
+      <w:pPr>
+        <w:pStyle w:val="a4"/>
+        <w:spacing w:after="0"/>
+        <w:ind w:left="0"/>
+        <w:rPr>
+          <w:rFonts w:ascii="Times New Roman" w:hAnsi="Times New Roman" w:cs="Times New Roman"/>
+          <w:color w:val="252525"/>
+          <w:sz w:val="24"/>
+          <w:szCs w:val="24"/>
+          <w:shd w:val="clear" w:color="auto" w:fill="FFFFFF"/>
+        </w:rPr>
+      </w:pPr>
+      <w:r>
+        <w:rPr>
+          <w:rFonts w:ascii="Times New Roman" w:hAnsi="Times New Roman" w:cs="Times New Roman"/>
+          <w:color w:val="252525"/>
+          <w:sz w:val="24"/>
+          <w:szCs w:val="24"/>
+          <w:shd w:val="clear" w:color="auto" w:fill="FFFFFF"/>
+        </w:rPr>
+        <w:drawing>
+          <wp:inline distT="0" distB="0" distL="0" distR="0" wp14:anchorId="4FF55547" wp14:editId="2ABA570D">
+            <wp:extent cx="5940425" cy="788670"/>
+            <wp:effectExtent l="0" t="0" r="3175" b="0"/>
+            <wp:docPr id="41" name="Рисунок 41"/>
+            <wp:cNvGraphicFramePr>
+              <a:graphicFrameLocks xmlns:a="http://schemas.openxmlformats.org/drawingml/2006/main" noChangeAspect="1"/>
+            </wp:cNvGraphicFramePr>
+            <a:graphic xmlns:a="http://schemas.openxmlformats.org/drawingml/2006/main">
+              <a:graphicData uri="http://schemas.openxmlformats.org/drawingml/2006/picture">
+                <pic:pic xmlns:pic="http://schemas.openxmlformats.org/drawingml/2006/picture">
+                  <pic:nvPicPr>
+                    <pic:cNvPr id="1" name=""/>
+                    <pic:cNvPicPr/>
+                  </pic:nvPicPr>
+                  <pic:blipFill>
+                    <a:blip r:embed="rId71"/>
+                    <a:stretch>
+                      <a:fillRect/>
+                    </a:stretch>
+                  </pic:blipFill>
+                  <pic:spPr>
+                    <a:xfrm>
+                      <a:off x="0" y="0"/>
+                      <a:ext cx="5940425" cy="788670"/>
+                    </a:xfrm>
+                    <a:prstGeom prst="rect">
+                      <a:avLst/>
+                    </a:prstGeom>
+                  </pic:spPr>
+                </pic:pic>
+              </a:graphicData>
+            </a:graphic>
+          </wp:inline>
+        </w:drawing>
+      </w:r>
+    </w:p>
+    <w:p>
+      <w:pPr>
+        <w:spacing w:after="0"/>
+      </w:pPr>
+      <w:r>
+        <w:drawing>
+          <wp:inline distT="0" distB="0" distL="0" distR="0" wp14:anchorId="6AE47F8C" wp14:editId="4BF6AF55">
+            <wp:extent cx="5940425" cy="3515360"/>
+            <wp:effectExtent l="0" t="0" r="3175" b="8890"/>
+            <wp:docPr id="42" name="Рисунок 42"/>
+            <wp:cNvGraphicFramePr>
+              <a:graphicFrameLocks xmlns:a="http://schemas.openxmlformats.org/drawingml/2006/main" noChangeAspect="1"/>
+            </wp:cNvGraphicFramePr>
+            <a:graphic xmlns:a="http://schemas.openxmlformats.org/drawingml/2006/main">
+              <a:graphicData uri="http://schemas.openxmlformats.org/drawingml/2006/picture">
+                <pic:pic xmlns:pic="http://schemas.openxmlformats.org/drawingml/2006/picture">
+                  <pic:nvPicPr>
+                    <pic:cNvPr id="1" name=""/>
+                    <pic:cNvPicPr/>
+                  </pic:nvPicPr>
+                  <pic:blipFill>
+                    <a:blip r:embed="rId72"/>
+                    <a:stretch>
+                      <a:fillRect/>
+                    </a:stretch>
+                  </pic:blipFill>
+                  <pic:spPr>
+                    <a:xfrm>
+                      <a:off x="0" y="0"/>
+                      <a:ext cx="5940425" cy="3515360"/>
+                    </a:xfrm>
+                    <a:prstGeom prst="rect">
+                      <a:avLst/>
+                    </a:prstGeom>
+                  </pic:spPr>
+                </pic:pic>
+              </a:graphicData>
+            </a:graphic>
+          </wp:inline>
+        </w:drawing>
+      </w:r>
+    </w:p>
+    <w:p>
+      <w:pPr>
+        <w:spacing w:after="0"/>
+      </w:pPr>
+      <w:r>
+        <w:drawing>
+          <wp:inline distT="0" distB="0" distL="0" distR="0" wp14:anchorId="250E536E" wp14:editId="1D9AA6F1">
+            <wp:extent cx="5940425" cy="1341120"/>
+            <wp:effectExtent l="0" t="0" r="3175" b="0"/>
+            <wp:docPr id="43" name="Рисунок 43"/>
+            <wp:cNvGraphicFramePr>
+              <a:graphicFrameLocks xmlns:a="http://schemas.openxmlformats.org/drawingml/2006/main" noChangeAspect="1"/>
+            </wp:cNvGraphicFramePr>
+            <a:graphic xmlns:a="http://schemas.openxmlformats.org/drawingml/2006/main">
+              <a:graphicData uri="http://schemas.openxmlformats.org/drawingml/2006/picture">
+                <pic:pic xmlns:pic="http://schemas.openxmlformats.org/drawingml/2006/picture">
+                  <pic:nvPicPr>
+                    <pic:cNvPr id="1" name=""/>
+                    <pic:cNvPicPr/>
+                  </pic:nvPicPr>
+                  <pic:blipFill>
+                    <a:blip r:embed="rId73"/>
+                    <a:stretch>
+                      <a:fillRect/>
+                    </a:stretch>
+                  </pic:blipFill>
+                  <pic:spPr>
+                    <a:xfrm>
+                      <a:off x="0" y="0"/>
+                      <a:ext cx="5940425" cy="1341120"/>
+                    </a:xfrm>
+                    <a:prstGeom prst="rect">
+                      <a:avLst/>
+                    </a:prstGeom>
+                  </pic:spPr>
+                </pic:pic>
+              </a:graphicData>
+            </a:graphic>
+          </wp:inline>
+        </w:drawing>
+      </w:r>
+    </w:p>
+    <w:p>
+      <w:pPr>
+        <w:spacing w:after="0"/>
+      </w:pPr>
+      <w:r>
+        <w:drawing>
+          <wp:inline distT="0" distB="0" distL="0" distR="0" wp14:anchorId="53E63922" wp14:editId="45B552FD">
+            <wp:extent cx="5940425" cy="550545"/>
+            <wp:effectExtent l="0" t="0" r="3175" b="1905"/>
+            <wp:docPr id="44" name="Рисунок 44"/>
+            <wp:cNvGraphicFramePr>
+              <a:graphicFrameLocks xmlns:a="http://schemas.openxmlformats.org/drawingml/2006/main" noChangeAspect="1"/>
+            </wp:cNvGraphicFramePr>
+            <a:graphic xmlns:a="http://schemas.openxmlformats.org/drawingml/2006/main">
+              <a:graphicData uri="http://schemas.openxmlformats.org/drawingml/2006/picture">
+                <pic:pic xmlns:pic="http://schemas.openxmlformats.org/drawingml/2006/picture">
+                  <pic:nvPicPr>
+                    <pic:cNvPr id="1" name=""/>
+                    <pic:cNvPicPr/>
+                  </pic:nvPicPr>
+                  <pic:blipFill>
+                    <a:blip r:embed="rId74"/>
+                    <a:stretch>
+                      <a:fillRect/>
+                    </a:stretch>
+                  </pic:blipFill>
+                  <pic:spPr>
+                    <a:xfrm>
+                      <a:off x="0" y="0"/>
+                      <a:ext cx="5940425" cy="550545"/>
+                    </a:xfrm>
+                    <a:prstGeom prst="rect">
+                      <a:avLst/>
+                    </a:prstGeom>
+                  </pic:spPr>
+                </pic:pic>
+              </a:graphicData>
+            </a:graphic>
+          </wp:inline>
+        </w:drawing>
+      </w:r>
+    </w:p>
+    <w:p>
+      <w:pPr>
+        <w:spacing w:after="0"/>
+      </w:pPr>
+      <w:r>
+        <w:lastRenderedPageBreak/>
+        <w:drawing>
+          <wp:inline distT="0" distB="0" distL="0" distR="0" wp14:anchorId="3C6B78E7" wp14:editId="0ED37CC5">
+            <wp:extent cx="5940425" cy="927100"/>
+            <wp:effectExtent l="0" t="0" r="3175" b="6350"/>
+            <wp:docPr id="46" name="Рисунок 46"/>
+            <wp:cNvGraphicFramePr>
+              <a:graphicFrameLocks xmlns:a="http://schemas.openxmlformats.org/drawingml/2006/main" noChangeAspect="1"/>
+            </wp:cNvGraphicFramePr>
+            <a:graphic xmlns:a="http://schemas.openxmlformats.org/drawingml/2006/main">
+              <a:graphicData uri="http://schemas.openxmlformats.org/drawingml/2006/picture">
+                <pic:pic xmlns:pic="http://schemas.openxmlformats.org/drawingml/2006/picture">
+                  <pic:nvPicPr>
+                    <pic:cNvPr id="1" name=""/>
+                    <pic:cNvPicPr/>
+                  </pic:nvPicPr>
+                  <pic:blipFill>
+                    <a:blip r:embed="rId75"/>
+                    <a:stretch>
+                      <a:fillRect/>
+                    </a:stretch>
+                  </pic:blipFill>
+                  <pic:spPr>
+                    <a:xfrm>
+                      <a:off x="0" y="0"/>
+                      <a:ext cx="5940425" cy="927100"/>
+                    </a:xfrm>
+                    <a:prstGeom prst="rect">
+                      <a:avLst/>
+                    </a:prstGeom>
+                  </pic:spPr>
+                </pic:pic>
+              </a:graphicData>
+            </a:graphic>
+          </wp:inline>
+        </w:drawing>
+      </w:r>
+    </w:p>
+    <w:p>
+      <w:pPr>
+        <w:spacing w:after="0"/>
+      </w:pPr>
+      <w:r>
+        <w:drawing>
+          <wp:inline distT="0" distB="0" distL="0" distR="0" wp14:anchorId="1602D20B" wp14:editId="4683BC3A">
+            <wp:extent cx="5940425" cy="755015"/>
+            <wp:effectExtent l="0" t="0" r="3175" b="6985"/>
+            <wp:docPr id="47" name="Рисунок 47"/>
+            <wp:cNvGraphicFramePr>
+              <a:graphicFrameLocks xmlns:a="http://schemas.openxmlformats.org/drawingml/2006/main" noChangeAspect="1"/>
+            </wp:cNvGraphicFramePr>
+            <a:graphic xmlns:a="http://schemas.openxmlformats.org/drawingml/2006/main">
+              <a:graphicData uri="http://schemas.openxmlformats.org/drawingml/2006/picture">
+                <pic:pic xmlns:pic="http://schemas.openxmlformats.org/drawingml/2006/picture">
+                  <pic:nvPicPr>
+                    <pic:cNvPr id="1" name=""/>
+                    <pic:cNvPicPr/>
+                  </pic:nvPicPr>
+                  <pic:blipFill>
+                    <a:blip r:embed="rId76"/>
+                    <a:stretch>
+                      <a:fillRect/>
+                    </a:stretch>
+                  </pic:blipFill>
+                  <pic:spPr>
+                    <a:xfrm>
+                      <a:off x="0" y="0"/>
+                      <a:ext cx="5940425" cy="755015"/>
+                    </a:xfrm>
+                    <a:prstGeom prst="rect">
+                      <a:avLst/>
+                    </a:prstGeom>
+                  </pic:spPr>
+                </pic:pic>
+              </a:graphicData>
+            </a:graphic>
+          </wp:inline>
+        </w:drawing>
+      </w:r>
+    </w:p>
+    <w:p>
+      <w:pPr>
+        <w:spacing w:after="0"/>
+      </w:pPr>
+      <w:r>
+        <w:drawing>
+          <wp:inline distT="0" distB="0" distL="0" distR="0" wp14:anchorId="448F1A82" wp14:editId="4F23FF30">
+            <wp:extent cx="5940425" cy="1102995"/>
+            <wp:effectExtent l="0" t="0" r="3175" b="1905"/>
+            <wp:docPr id="48" name="Рисунок 48"/>
+            <wp:cNvGraphicFramePr>
+              <a:graphicFrameLocks xmlns:a="http://schemas.openxmlformats.org/drawingml/2006/main" noChangeAspect="1"/>
+            </wp:cNvGraphicFramePr>
+            <a:graphic xmlns:a="http://schemas.openxmlformats.org/drawingml/2006/main">
+              <a:graphicData uri="http://schemas.openxmlformats.org/drawingml/2006/picture">
+                <pic:pic xmlns:pic="http://schemas.openxmlformats.org/drawingml/2006/picture">
+                  <pic:nvPicPr>
+                    <pic:cNvPr id="1" name=""/>
+                    <pic:cNvPicPr/>
+                  </pic:nvPicPr>
+                  <pic:blipFill>
+                    <a:blip r:embed="rId77"/>
+                    <a:stretch>
+                      <a:fillRect/>
+                    </a:stretch>
+                  </pic:blipFill>
+                  <pic:spPr>
+                    <a:xfrm>
+                      <a:off x="0" y="0"/>
+                      <a:ext cx="5940425" cy="1102995"/>
+                    </a:xfrm>
+                    <a:prstGeom prst="rect">
+                      <a:avLst/>
+                    </a:prstGeom>
+                  </pic:spPr>
+                </pic:pic>
+              </a:graphicData>
+            </a:graphic>
+          </wp:inline>
+        </w:drawing>
+      </w:r>
+    </w:p>
+    <w:p>
+      <w:pPr>
+        <w:spacing w:after="0"/>
+      </w:pPr>
+      <w:r>
+        <w:drawing>
+          <wp:inline distT="0" distB="0" distL="0" distR="0" wp14:anchorId="502161EE" wp14:editId="43A826EF">
+            <wp:extent cx="5940425" cy="3357880"/>
+            <wp:effectExtent l="0" t="0" r="3175" b="0"/>
+            <wp:docPr id="49" name="Рисунок 49"/>
+            <wp:cNvGraphicFramePr>
+              <a:graphicFrameLocks xmlns:a="http://schemas.openxmlformats.org/drawingml/2006/main" noChangeAspect="1"/>
+            </wp:cNvGraphicFramePr>
+            <a:graphic xmlns:a="http://schemas.openxmlformats.org/drawingml/2006/main">
+              <a:graphicData uri="http://schemas.openxmlformats.org/drawingml/2006/picture">
+                <pic:pic xmlns:pic="http://schemas.openxmlformats.org/drawingml/2006/picture">
+                  <pic:nvPicPr>
+                    <pic:cNvPr id="1" name=""/>
+                    <pic:cNvPicPr/>
+                  </pic:nvPicPr>
+                  <pic:blipFill>
+                    <a:blip r:embed="rId78"/>
+                    <a:stretch>
+                      <a:fillRect/>
+                    </a:stretch>
+                  </pic:blipFill>
+                  <pic:spPr>
+                    <a:xfrm>
+                      <a:off x="0" y="0"/>
+                      <a:ext cx="5940425" cy="3357880"/>
+                    </a:xfrm>
+                    <a:prstGeom prst="rect">
+                      <a:avLst/>
+                    </a:prstGeom>
+                  </pic:spPr>
+                </pic:pic>
+              </a:graphicData>
+            </a:graphic>
+          </wp:inline>
+        </w:drawing>
+      </w:r>
     </w:p>
     <w:sectPr>
       <w:pgSz w:w="11906" w:h="16838"/>

</xml_diff>

<commit_message>
added files for individual working and finished the report
</commit_message>
<xml_diff>
--- a/IGI/LR1/igi_1.docx
+++ b/IGI/LR1/igi_1.docx
@@ -70,13 +70,23 @@
         </w:rPr>
         <w:t>Цель</w:t>
       </w:r>
-      <w:r>
-        <w:rPr>
-          <w:rFonts w:ascii="Times New Roman" w:hAnsi="Times New Roman" w:cs="Times New Roman"/>
-          <w:sz w:val="24"/>
-          <w:szCs w:val="24"/>
-        </w:rPr>
-        <w:t xml:space="preserve">: Познакомиться с возможностями и получить практические навыки работы с системой контроля версий </w:t>
+      <w:proofErr w:type="gramStart"/>
+      <w:r>
+        <w:rPr>
+          <w:rFonts w:ascii="Times New Roman" w:hAnsi="Times New Roman" w:cs="Times New Roman"/>
+          <w:sz w:val="24"/>
+          <w:szCs w:val="24"/>
+        </w:rPr>
+        <w:t>: Познакомиться</w:t>
+      </w:r>
+      <w:proofErr w:type="gramEnd"/>
+      <w:r>
+        <w:rPr>
+          <w:rFonts w:ascii="Times New Roman" w:hAnsi="Times New Roman" w:cs="Times New Roman"/>
+          <w:sz w:val="24"/>
+          <w:szCs w:val="24"/>
+        </w:rPr>
+        <w:t xml:space="preserve"> с возможностями и получить практические навыки работы с системой контроля версий </w:t>
       </w:r>
       <w:r>
         <w:rPr>
@@ -177,20 +187,53 @@
           <w:szCs w:val="24"/>
           <w:shd w:val="clear" w:color="auto" w:fill="FFFFFF"/>
         </w:rPr>
-        <w:t>Подготовьте рабочее окружение в соответствии с типом вашей операционной системы(</w:t>
-      </w:r>
-      <w:hyperlink r:id="rId5" w:history="1">
-        <w:r>
-          <w:rPr>
-            <w:rStyle w:val="a3"/>
-            <w:rFonts w:cs="Times New Roman"/>
-            <w:i/>
-            <w:sz w:val="24"/>
-            <w:shd w:val="clear" w:color="auto" w:fill="FFFFFF"/>
-          </w:rPr>
-          <w:t>https://smartiqa.ru/courses/git/lesson-1</w:t>
-        </w:r>
-      </w:hyperlink>
+        <w:t xml:space="preserve">Подготовьте рабочее окружение в соответствии с типом вашей операционной </w:t>
+      </w:r>
+      <w:proofErr w:type="gramStart"/>
+      <w:r>
+        <w:rPr>
+          <w:rFonts w:ascii="Times New Roman" w:hAnsi="Times New Roman" w:cs="Times New Roman"/>
+          <w:i/>
+          <w:color w:val="252525"/>
+          <w:sz w:val="24"/>
+          <w:szCs w:val="24"/>
+          <w:shd w:val="clear" w:color="auto" w:fill="FFFFFF"/>
+        </w:rPr>
+        <w:t>системы(</w:t>
+      </w:r>
+      <w:proofErr w:type="gramEnd"/>
+      <w:r>
+        <w:fldChar w:fldCharType="begin"/>
+      </w:r>
+      <w:r>
+        <w:instrText xml:space="preserve"> HYPERLINK "ht</w:instrText>
+      </w:r>
+      <w:r>
+        <w:instrText xml:space="preserve">tps://smartiqa.ru/courses/git/lesson-1" </w:instrText>
+      </w:r>
+      <w:r>
+        <w:fldChar w:fldCharType="separate"/>
+      </w:r>
+      <w:r>
+        <w:rPr>
+          <w:rStyle w:val="a3"/>
+          <w:rFonts w:cs="Times New Roman"/>
+          <w:i/>
+          <w:sz w:val="24"/>
+          <w:shd w:val="clear" w:color="auto" w:fill="FFFFFF"/>
+        </w:rPr>
+        <w:t>https://smartiqa.ru/courses/git/lesson-1</w:t>
+      </w:r>
+      <w:r>
+        <w:rPr>
+          <w:rStyle w:val="a3"/>
+          <w:rFonts w:cs="Times New Roman"/>
+          <w:i/>
+          <w:sz w:val="24"/>
+          <w:shd w:val="clear" w:color="auto" w:fill="FFFFFF"/>
+        </w:rPr>
+        <w:fldChar w:fldCharType="end"/>
+      </w:r>
       <w:r>
         <w:rPr>
           <w:rFonts w:ascii="Times New Roman" w:hAnsi="Times New Roman" w:cs="Times New Roman"/>
@@ -1361,7 +1404,29 @@
           <w:szCs w:val="24"/>
           <w:shd w:val="clear" w:color="auto" w:fill="FFFFFF"/>
         </w:rPr>
-        <w:t xml:space="preserve">выполните коммиты к проиндексированным  файлам, </w:t>
+        <w:t xml:space="preserve">выполните коммиты к </w:t>
+      </w:r>
+      <w:proofErr w:type="gramStart"/>
+      <w:r>
+        <w:rPr>
+          <w:rFonts w:ascii="Times New Roman" w:hAnsi="Times New Roman" w:cs="Times New Roman"/>
+          <w:color w:val="252525"/>
+          <w:sz w:val="24"/>
+          <w:szCs w:val="24"/>
+          <w:shd w:val="clear" w:color="auto" w:fill="FFFFFF"/>
+        </w:rPr>
+        <w:t>проиндексированным  файлам</w:t>
+      </w:r>
+      <w:proofErr w:type="gramEnd"/>
+      <w:r>
+        <w:rPr>
+          <w:rFonts w:ascii="Times New Roman" w:hAnsi="Times New Roman" w:cs="Times New Roman"/>
+          <w:color w:val="252525"/>
+          <w:sz w:val="24"/>
+          <w:szCs w:val="24"/>
+          <w:shd w:val="clear" w:color="auto" w:fill="FFFFFF"/>
+        </w:rPr>
+        <w:t xml:space="preserve">, </w:t>
       </w:r>
     </w:p>
     <w:p>
@@ -3114,7 +3179,31 @@
           <w:shd w:val="clear" w:color="auto" w:fill="FFFFFF"/>
           <w:lang w:val="en-US"/>
         </w:rPr>
-        <w:t xml:space="preserve"> git log: p , stat ,shortstat, name-only, name-status, relative-date, pretty, graph, </w:t>
+        <w:t xml:space="preserve"> git log: </w:t>
+      </w:r>
+      <w:proofErr w:type="gramStart"/>
+      <w:r>
+        <w:rPr>
+          <w:rFonts w:ascii="Times New Roman" w:hAnsi="Times New Roman" w:cs="Times New Roman"/>
+          <w:color w:val="252525"/>
+          <w:sz w:val="24"/>
+          <w:szCs w:val="24"/>
+          <w:shd w:val="clear" w:color="auto" w:fill="FFFFFF"/>
+          <w:lang w:val="en-US"/>
+        </w:rPr>
+        <w:t>p ,</w:t>
+      </w:r>
+      <w:proofErr w:type="gramEnd"/>
+      <w:r>
+        <w:rPr>
+          <w:rFonts w:ascii="Times New Roman" w:hAnsi="Times New Roman" w:cs="Times New Roman"/>
+          <w:color w:val="252525"/>
+          <w:sz w:val="24"/>
+          <w:szCs w:val="24"/>
+          <w:shd w:val="clear" w:color="auto" w:fill="FFFFFF"/>
+          <w:lang w:val="en-US"/>
+        </w:rPr>
+        <w:t xml:space="preserve"> stat ,shortstat, name-only, name-status, relative-date, pretty, graph, </w:t>
       </w:r>
     </w:p>
     <w:p>
@@ -5139,6 +5228,7 @@
       <w:r>
         <w:rPr>
           <w:rFonts w:ascii="Times New Roman" w:hAnsi="Times New Roman" w:cs="Times New Roman"/>
+          <w:noProof/>
           <w:color w:val="252525"/>
           <w:sz w:val="24"/>
           <w:szCs w:val="24"/>
@@ -5197,6 +5287,7 @@
       <w:r>
         <w:rPr>
           <w:rFonts w:ascii="Times New Roman" w:hAnsi="Times New Roman" w:cs="Times New Roman"/>
+          <w:noProof/>
           <w:color w:val="252525"/>
           <w:sz w:val="24"/>
           <w:szCs w:val="24"/>
@@ -5244,6 +5335,9 @@
         <w:spacing w:after="0"/>
       </w:pPr>
       <w:r>
+        <w:rPr>
+          <w:noProof/>
+        </w:rPr>
         <w:drawing>
           <wp:inline distT="0" distB="0" distL="0" distR="0" wp14:anchorId="6AE47F8C" wp14:editId="4BF6AF55">
             <wp:extent cx="5940425" cy="3515360"/>
@@ -5286,6 +5380,9 @@
         <w:spacing w:after="0"/>
       </w:pPr>
       <w:r>
+        <w:rPr>
+          <w:noProof/>
+        </w:rPr>
         <w:drawing>
           <wp:inline distT="0" distB="0" distL="0" distR="0" wp14:anchorId="250E536E" wp14:editId="1D9AA6F1">
             <wp:extent cx="5940425" cy="1341120"/>
@@ -5328,6 +5425,9 @@
         <w:spacing w:after="0"/>
       </w:pPr>
       <w:r>
+        <w:rPr>
+          <w:noProof/>
+        </w:rPr>
         <w:drawing>
           <wp:inline distT="0" distB="0" distL="0" distR="0" wp14:anchorId="53E63922" wp14:editId="45B552FD">
             <wp:extent cx="5940425" cy="550545"/>
@@ -5370,6 +5470,9 @@
         <w:spacing w:after="0"/>
       </w:pPr>
       <w:r>
+        <w:rPr>
+          <w:noProof/>
+        </w:rPr>
         <w:lastRenderedPageBreak/>
         <w:drawing>
           <wp:inline distT="0" distB="0" distL="0" distR="0" wp14:anchorId="3C6B78E7" wp14:editId="0ED37CC5">
@@ -5413,8 +5516,11 @@
         <w:spacing w:after="0"/>
       </w:pPr>
       <w:r>
-        <w:drawing>
-          <wp:inline distT="0" distB="0" distL="0" distR="0" wp14:anchorId="1602D20B" wp14:editId="4683BC3A">
+        <w:rPr>
+          <w:noProof/>
+        </w:rPr>
+        <w:drawing>
+          <wp:inline distT="0" distB="0" distL="0" distR="0" wp14:anchorId="1602D20B" wp14:editId="59DF8BF3">
             <wp:extent cx="5940425" cy="755015"/>
             <wp:effectExtent l="0" t="0" r="3175" b="6985"/>
             <wp:docPr id="47" name="Рисунок 47"/>
@@ -5455,8 +5561,11 @@
         <w:spacing w:after="0"/>
       </w:pPr>
       <w:r>
-        <w:drawing>
-          <wp:inline distT="0" distB="0" distL="0" distR="0" wp14:anchorId="448F1A82" wp14:editId="4F23FF30">
+        <w:rPr>
+          <w:noProof/>
+        </w:rPr>
+        <w:drawing>
+          <wp:inline distT="0" distB="0" distL="0" distR="0" wp14:anchorId="448F1A82" wp14:editId="50676696">
             <wp:extent cx="5940425" cy="1102995"/>
             <wp:effectExtent l="0" t="0" r="3175" b="1905"/>
             <wp:docPr id="48" name="Рисунок 48"/>
@@ -5495,12 +5604,104 @@
     <w:p>
       <w:pPr>
         <w:spacing w:after="0"/>
-      </w:pPr>
-      <w:r>
-        <w:drawing>
-          <wp:inline distT="0" distB="0" distL="0" distR="0" wp14:anchorId="502161EE" wp14:editId="43A826EF">
-            <wp:extent cx="5940425" cy="3357880"/>
-            <wp:effectExtent l="0" t="0" r="3175" b="0"/>
+        <w:rPr>
+          <w:noProof/>
+        </w:rPr>
+      </w:pPr>
+    </w:p>
+    <w:p>
+      <w:pPr>
+        <w:spacing w:after="0"/>
+        <w:rPr>
+          <w:rFonts w:ascii="Times New Roman" w:hAnsi="Times New Roman" w:cs="Times New Roman"/>
+          <w:sz w:val="28"/>
+          <w:szCs w:val="28"/>
+        </w:rPr>
+      </w:pPr>
+      <w:r>
+        <w:rPr>
+          <w:rFonts w:ascii="Times New Roman" w:hAnsi="Times New Roman" w:cs="Times New Roman"/>
+          <w:sz w:val="28"/>
+          <w:szCs w:val="28"/>
+        </w:rPr>
+        <w:t>6.</w:t>
+      </w:r>
+      <w:r>
+        <w:rPr>
+          <w:rFonts w:ascii="Times New Roman" w:hAnsi="Times New Roman" w:cs="Times New Roman"/>
+          <w:sz w:val="28"/>
+          <w:szCs w:val="28"/>
+        </w:rPr>
+        <w:t xml:space="preserve"> </w:t>
+      </w:r>
+      <w:r>
+        <w:rPr>
+          <w:rFonts w:ascii="Times New Roman" w:hAnsi="Times New Roman" w:cs="Times New Roman"/>
+          <w:sz w:val="28"/>
+          <w:szCs w:val="28"/>
+        </w:rPr>
+        <w:t>Сгенерируйте в DeepSeek файл html и файл css для сайта визитки компании или человека с областью занятости на выбор. Создайте публичный репозиторий на github и загрузите туда оба сгенерированных файла.</w:t>
+      </w:r>
+    </w:p>
+    <w:p>
+      <w:pPr>
+        <w:spacing w:after="0"/>
+        <w:rPr>
+          <w:rFonts w:ascii="Times New Roman" w:hAnsi="Times New Roman" w:cs="Times New Roman"/>
+          <w:sz w:val="28"/>
+          <w:szCs w:val="28"/>
+        </w:rPr>
+      </w:pPr>
+    </w:p>
+    <w:p>
+      <w:pPr>
+        <w:spacing w:after="0"/>
+        <w:rPr>
+          <w:rFonts w:ascii="Times New Roman" w:hAnsi="Times New Roman" w:cs="Times New Roman"/>
+          <w:sz w:val="28"/>
+          <w:szCs w:val="28"/>
+        </w:rPr>
+      </w:pPr>
+      <w:hyperlink r:id="rId78" w:history="1">
+        <w:r>
+          <w:rPr>
+            <w:rStyle w:val="a3"/>
+            <w:rFonts w:ascii="Times New Roman" w:hAnsi="Times New Roman" w:cs="Times New Roman"/>
+            <w:sz w:val="28"/>
+            <w:szCs w:val="28"/>
+          </w:rPr>
+          <w:t>https://kseniavscode.github.io/website_from_gpt</w:t>
+        </w:r>
+        <w:r>
+          <w:rPr>
+            <w:rStyle w:val="a3"/>
+            <w:rFonts w:ascii="Times New Roman" w:hAnsi="Times New Roman" w:cs="Times New Roman"/>
+            <w:sz w:val="28"/>
+            <w:szCs w:val="28"/>
+          </w:rPr>
+          <w:t>/</w:t>
+        </w:r>
+      </w:hyperlink>
+    </w:p>
+    <w:p>
+      <w:pPr>
+        <w:spacing w:after="0"/>
+        <w:rPr>
+          <w:rFonts w:ascii="Times New Roman" w:hAnsi="Times New Roman" w:cs="Times New Roman"/>
+          <w:sz w:val="28"/>
+          <w:szCs w:val="28"/>
+        </w:rPr>
+      </w:pPr>
+      <w:r>
+        <w:rPr>
+          <w:rFonts w:ascii="Times New Roman" w:hAnsi="Times New Roman" w:cs="Times New Roman"/>
+          <w:sz w:val="28"/>
+          <w:szCs w:val="28"/>
+        </w:rPr>
+        <w:drawing>
+          <wp:inline distT="0" distB="0" distL="0" distR="0" wp14:anchorId="5AF3C4AB" wp14:editId="03A52B6B">
+            <wp:extent cx="5940425" cy="475615"/>
+            <wp:effectExtent l="0" t="0" r="3175" b="635"/>
             <wp:docPr id="49" name="Рисунок 49"/>
             <wp:cNvGraphicFramePr>
               <a:graphicFrameLocks xmlns:a="http://schemas.openxmlformats.org/drawingml/2006/main" noChangeAspect="1"/>
@@ -5513,7 +5714,7 @@
                     <pic:cNvPicPr/>
                   </pic:nvPicPr>
                   <pic:blipFill>
-                    <a:blip r:embed="rId78"/>
+                    <a:blip r:embed="rId79"/>
                     <a:stretch>
                       <a:fillRect/>
                     </a:stretch>
@@ -5521,7 +5722,278 @@
                   <pic:spPr>
                     <a:xfrm>
                       <a:off x="0" y="0"/>
-                      <a:ext cx="5940425" cy="3357880"/>
+                      <a:ext cx="5940425" cy="475615"/>
+                    </a:xfrm>
+                    <a:prstGeom prst="rect">
+                      <a:avLst/>
+                    </a:prstGeom>
+                  </pic:spPr>
+                </pic:pic>
+              </a:graphicData>
+            </a:graphic>
+          </wp:inline>
+        </w:drawing>
+      </w:r>
+    </w:p>
+    <w:p>
+      <w:pPr>
+        <w:spacing w:after="0"/>
+        <w:rPr>
+          <w:rFonts w:ascii="Times New Roman" w:hAnsi="Times New Roman" w:cs="Times New Roman"/>
+          <w:sz w:val="28"/>
+          <w:szCs w:val="28"/>
+        </w:rPr>
+      </w:pPr>
+      <w:r>
+        <w:rPr>
+          <w:rFonts w:ascii="Times New Roman" w:hAnsi="Times New Roman" w:cs="Times New Roman"/>
+          <w:sz w:val="28"/>
+          <w:szCs w:val="28"/>
+        </w:rPr>
+        <w:drawing>
+          <wp:inline distT="0" distB="0" distL="0" distR="0" wp14:anchorId="45E1EBE2" wp14:editId="623B4A95">
+            <wp:extent cx="5940425" cy="1801495"/>
+            <wp:effectExtent l="0" t="0" r="3175" b="8255"/>
+            <wp:docPr id="50" name="Рисунок 50"/>
+            <wp:cNvGraphicFramePr>
+              <a:graphicFrameLocks xmlns:a="http://schemas.openxmlformats.org/drawingml/2006/main" noChangeAspect="1"/>
+            </wp:cNvGraphicFramePr>
+            <a:graphic xmlns:a="http://schemas.openxmlformats.org/drawingml/2006/main">
+              <a:graphicData uri="http://schemas.openxmlformats.org/drawingml/2006/picture">
+                <pic:pic xmlns:pic="http://schemas.openxmlformats.org/drawingml/2006/picture">
+                  <pic:nvPicPr>
+                    <pic:cNvPr id="1" name=""/>
+                    <pic:cNvPicPr/>
+                  </pic:nvPicPr>
+                  <pic:blipFill>
+                    <a:blip r:embed="rId80"/>
+                    <a:stretch>
+                      <a:fillRect/>
+                    </a:stretch>
+                  </pic:blipFill>
+                  <pic:spPr>
+                    <a:xfrm>
+                      <a:off x="0" y="0"/>
+                      <a:ext cx="5940425" cy="1801495"/>
+                    </a:xfrm>
+                    <a:prstGeom prst="rect">
+                      <a:avLst/>
+                    </a:prstGeom>
+                  </pic:spPr>
+                </pic:pic>
+              </a:graphicData>
+            </a:graphic>
+          </wp:inline>
+        </w:drawing>
+      </w:r>
+    </w:p>
+    <w:p>
+      <w:pPr>
+        <w:spacing w:after="0"/>
+        <w:rPr>
+          <w:rFonts w:ascii="Times New Roman" w:hAnsi="Times New Roman" w:cs="Times New Roman"/>
+          <w:sz w:val="28"/>
+          <w:szCs w:val="28"/>
+        </w:rPr>
+      </w:pPr>
+      <w:r>
+        <w:rPr>
+          <w:rFonts w:ascii="Times New Roman" w:hAnsi="Times New Roman" w:cs="Times New Roman"/>
+          <w:sz w:val="28"/>
+          <w:szCs w:val="28"/>
+        </w:rPr>
+        <w:drawing>
+          <wp:inline distT="0" distB="0" distL="0" distR="0" wp14:anchorId="0C8D5740" wp14:editId="473EF26D">
+            <wp:extent cx="5940425" cy="1567180"/>
+            <wp:effectExtent l="0" t="0" r="3175" b="0"/>
+            <wp:docPr id="53" name="Рисунок 53"/>
+            <wp:cNvGraphicFramePr>
+              <a:graphicFrameLocks xmlns:a="http://schemas.openxmlformats.org/drawingml/2006/main" noChangeAspect="1"/>
+            </wp:cNvGraphicFramePr>
+            <a:graphic xmlns:a="http://schemas.openxmlformats.org/drawingml/2006/main">
+              <a:graphicData uri="http://schemas.openxmlformats.org/drawingml/2006/picture">
+                <pic:pic xmlns:pic="http://schemas.openxmlformats.org/drawingml/2006/picture">
+                  <pic:nvPicPr>
+                    <pic:cNvPr id="1" name=""/>
+                    <pic:cNvPicPr/>
+                  </pic:nvPicPr>
+                  <pic:blipFill>
+                    <a:blip r:embed="rId81"/>
+                    <a:stretch>
+                      <a:fillRect/>
+                    </a:stretch>
+                  </pic:blipFill>
+                  <pic:spPr>
+                    <a:xfrm>
+                      <a:off x="0" y="0"/>
+                      <a:ext cx="5940425" cy="1567180"/>
+                    </a:xfrm>
+                    <a:prstGeom prst="rect">
+                      <a:avLst/>
+                    </a:prstGeom>
+                  </pic:spPr>
+                </pic:pic>
+              </a:graphicData>
+            </a:graphic>
+          </wp:inline>
+        </w:drawing>
+      </w:r>
+    </w:p>
+    <w:p>
+      <w:pPr>
+        <w:spacing w:after="0"/>
+        <w:rPr>
+          <w:rFonts w:ascii="Times New Roman" w:hAnsi="Times New Roman" w:cs="Times New Roman"/>
+          <w:sz w:val="28"/>
+          <w:szCs w:val="28"/>
+        </w:rPr>
+      </w:pPr>
+      <w:r>
+        <w:rPr>
+          <w:rFonts w:ascii="Times New Roman" w:hAnsi="Times New Roman" w:cs="Times New Roman"/>
+          <w:sz w:val="28"/>
+          <w:szCs w:val="28"/>
+        </w:rPr>
+        <w:t>Индивидуальное задание:</w:t>
+      </w:r>
+    </w:p>
+    <w:p>
+      <w:pPr>
+        <w:spacing w:after="0"/>
+        <w:rPr>
+          <w:rFonts w:ascii="Times New Roman" w:hAnsi="Times New Roman" w:cs="Times New Roman"/>
+          <w:sz w:val="28"/>
+          <w:szCs w:val="28"/>
+        </w:rPr>
+      </w:pPr>
+      <w:r>
+        <w:rPr>
+          <w:noProof/>
+        </w:rPr>
+        <w:drawing>
+          <wp:inline distT="0" distB="0" distL="0" distR="0" wp14:anchorId="60C17EAE" wp14:editId="70996A85">
+            <wp:extent cx="5940425" cy="509270"/>
+            <wp:effectExtent l="0" t="0" r="3175" b="5080"/>
+            <wp:docPr id="52" name="Рисунок 52"/>
+            <wp:cNvGraphicFramePr>
+              <a:graphicFrameLocks xmlns:a="http://schemas.openxmlformats.org/drawingml/2006/main" noChangeAspect="1"/>
+            </wp:cNvGraphicFramePr>
+            <a:graphic xmlns:a="http://schemas.openxmlformats.org/drawingml/2006/main">
+              <a:graphicData uri="http://schemas.openxmlformats.org/drawingml/2006/picture">
+                <pic:pic xmlns:pic="http://schemas.openxmlformats.org/drawingml/2006/picture">
+                  <pic:nvPicPr>
+                    <pic:cNvPr id="1" name=""/>
+                    <pic:cNvPicPr/>
+                  </pic:nvPicPr>
+                  <pic:blipFill>
+                    <a:blip r:embed="rId82"/>
+                    <a:stretch>
+                      <a:fillRect/>
+                    </a:stretch>
+                  </pic:blipFill>
+                  <pic:spPr>
+                    <a:xfrm>
+                      <a:off x="0" y="0"/>
+                      <a:ext cx="5940425" cy="509270"/>
+                    </a:xfrm>
+                    <a:prstGeom prst="rect">
+                      <a:avLst/>
+                    </a:prstGeom>
+                  </pic:spPr>
+                </pic:pic>
+              </a:graphicData>
+            </a:graphic>
+          </wp:inline>
+        </w:drawing>
+      </w:r>
+    </w:p>
+    <w:p>
+      <w:pPr>
+        <w:spacing w:after="0"/>
+        <w:rPr>
+          <w:rFonts w:ascii="Times New Roman" w:hAnsi="Times New Roman" w:cs="Times New Roman"/>
+          <w:sz w:val="28"/>
+          <w:szCs w:val="28"/>
+        </w:rPr>
+      </w:pPr>
+      <w:r>
+        <w:rPr>
+          <w:rFonts w:ascii="Times New Roman" w:hAnsi="Times New Roman" w:cs="Times New Roman"/>
+          <w:noProof/>
+          <w:sz w:val="28"/>
+          <w:szCs w:val="28"/>
+        </w:rPr>
+        <w:lastRenderedPageBreak/>
+        <w:drawing>
+          <wp:inline distT="0" distB="0" distL="0" distR="0" wp14:anchorId="20730DC8" wp14:editId="40AAD436">
+            <wp:extent cx="3657600" cy="2133569"/>
+            <wp:effectExtent l="0" t="0" r="0" b="635"/>
+            <wp:docPr id="51" name="Рисунок 51"/>
+            <wp:cNvGraphicFramePr>
+              <a:graphicFrameLocks xmlns:a="http://schemas.openxmlformats.org/drawingml/2006/main" noChangeAspect="1"/>
+            </wp:cNvGraphicFramePr>
+            <a:graphic xmlns:a="http://schemas.openxmlformats.org/drawingml/2006/main">
+              <a:graphicData uri="http://schemas.openxmlformats.org/drawingml/2006/picture">
+                <pic:pic xmlns:pic="http://schemas.openxmlformats.org/drawingml/2006/picture">
+                  <pic:nvPicPr>
+                    <pic:cNvPr id="1" name=""/>
+                    <pic:cNvPicPr/>
+                  </pic:nvPicPr>
+                  <pic:blipFill>
+                    <a:blip r:embed="rId83"/>
+                    <a:stretch>
+                      <a:fillRect/>
+                    </a:stretch>
+                  </pic:blipFill>
+                  <pic:spPr>
+                    <a:xfrm>
+                      <a:off x="0" y="0"/>
+                      <a:ext cx="3681882" cy="2147733"/>
+                    </a:xfrm>
+                    <a:prstGeom prst="rect">
+                      <a:avLst/>
+                    </a:prstGeom>
+                  </pic:spPr>
+                </pic:pic>
+              </a:graphicData>
+            </a:graphic>
+          </wp:inline>
+        </w:drawing>
+      </w:r>
+    </w:p>
+    <w:p>
+      <w:pPr>
+        <w:spacing w:after="0"/>
+      </w:pPr>
+      <w:r>
+        <w:rPr>
+          <w:noProof/>
+        </w:rPr>
+        <w:drawing>
+          <wp:inline distT="0" distB="0" distL="0" distR="0" wp14:anchorId="553C91E7" wp14:editId="0FB626A2">
+            <wp:extent cx="5664529" cy="4330594"/>
+            <wp:effectExtent l="0" t="0" r="0" b="0"/>
+            <wp:docPr id="45" name="Рисунок 45"/>
+            <wp:cNvGraphicFramePr>
+              <a:graphicFrameLocks xmlns:a="http://schemas.openxmlformats.org/drawingml/2006/main" noChangeAspect="1"/>
+            </wp:cNvGraphicFramePr>
+            <a:graphic xmlns:a="http://schemas.openxmlformats.org/drawingml/2006/main">
+              <a:graphicData uri="http://schemas.openxmlformats.org/drawingml/2006/picture">
+                <pic:pic xmlns:pic="http://schemas.openxmlformats.org/drawingml/2006/picture">
+                  <pic:nvPicPr>
+                    <pic:cNvPr id="1" name=""/>
+                    <pic:cNvPicPr/>
+                  </pic:nvPicPr>
+                  <pic:blipFill>
+                    <a:blip r:embed="rId84"/>
+                    <a:stretch>
+                      <a:fillRect/>
+                    </a:stretch>
+                  </pic:blipFill>
+                  <pic:spPr>
+                    <a:xfrm>
+                      <a:off x="0" y="0"/>
+                      <a:ext cx="5667097" cy="4332557"/>
                     </a:xfrm>
                     <a:prstGeom prst="rect">
                       <a:avLst/>
@@ -6566,4 +7038,16 @@
     </a:ext>
   </a:extLst>
 </a:theme>
+</file>
+
+<file path=customXml/item1.xml><?xml version="1.0" encoding="utf-8"?>
+<b:Sources xmlns:b="http://schemas.openxmlformats.org/officeDocument/2006/bibliography" xmlns="http://schemas.openxmlformats.org/officeDocument/2006/bibliography" SelectedStyle="\APASixthEditionOfficeOnline.xsl" StyleName="APA" Version="6"/>
+</file>
+
+<file path=customXml/itemProps1.xml><?xml version="1.0" encoding="utf-8"?>
+<ds:datastoreItem xmlns:ds="http://schemas.openxmlformats.org/officeDocument/2006/customXml" ds:itemID="{930CBE6D-53DA-4FA4-82ED-F2B5F29717B4}">
+  <ds:schemaRefs>
+    <ds:schemaRef ds:uri="http://schemas.openxmlformats.org/officeDocument/2006/bibliography"/>
+  </ds:schemaRefs>
+</ds:datastoreItem>
 </file>
</xml_diff>